<commit_message>
Refresh the printable User Guide and Acceptance Test (franchise coordinators, 6-Pack Card, Franchise AR, memos, deposit slips, waybills, margin analysis, password change)
Co-Authored-By: Claude Sonnet 5.5 <noreply@anthropic.com>
Claude-Session: https://claude.ai/code/session_01611rAAsm4xgneCTG3N9mPf
</commit_message>
<xml_diff>
--- a/docs/acceptance-test/per-user/01-admin.docx
+++ b/docs/acceptance-test/per-user/01-admin.docx
@@ -117,7 +117,7 @@
           <w:sz w:val="18"/>
           <w:szCs w:val="18"/>
         </w:rPr>
-        <w:t xml:space="preserve">  ·  23 checks</w:t>
+        <w:t xml:space="preserve">  ·  32 checks</w:t>
       </w:r>
     </w:p>
     <w:tbl>
@@ -6885,6 +6885,2719 @@
                 <w:szCs w:val="19"/>
               </w:rPr>
               <w:t xml:space="preserve">The release form number (AI-…) is made and HR is notified.</w:t>
+            </w:r>
+          </w:p>
+        </w:tc>
+        <w:tc>
+          <w:tcPr>
+            <w:tcW w:type="dxa" w:w="620"/>
+            <w:tcBorders>
+              <w:top w:val="single" w:color="C9D0DC" w:sz="4"/>
+              <w:left w:val="single" w:color="C9D0DC" w:sz="4"/>
+              <w:bottom w:val="single" w:color="C9D0DC" w:sz="4"/>
+              <w:right w:val="single" w:color="C9D0DC" w:sz="4"/>
+            </w:tcBorders>
+            <w:tcMar>
+              <w:top w:type="dxa" w:w="70"/>
+              <w:left w:type="dxa" w:w="100"/>
+              <w:bottom w:type="dxa" w:w="70"/>
+              <w:right w:type="dxa" w:w="100"/>
+            </w:tcMar>
+            <w:vAlign w:val="center"/>
+          </w:tcPr>
+          <w:p>
+            <w:pPr>
+              <w:spacing w:after="0" w:before="0" w:line="264"/>
+              <w:jc w:val="center"/>
+            </w:pPr>
+            <w:r>
+              <w:rPr>
+                <w:rFonts w:ascii="Arial" w:cs="Arial" w:eastAsia="Arial" w:hAnsi="Arial"/>
+                <w:sz w:val="30"/>
+                <w:szCs w:val="30"/>
+              </w:rPr>
+              <w:t xml:space="preserve">☐</w:t>
+            </w:r>
+          </w:p>
+        </w:tc>
+        <w:tc>
+          <w:tcPr>
+            <w:tcW w:type="dxa" w:w="620"/>
+            <w:tcBorders>
+              <w:top w:val="single" w:color="C9D0DC" w:sz="4"/>
+              <w:left w:val="single" w:color="C9D0DC" w:sz="4"/>
+              <w:bottom w:val="single" w:color="C9D0DC" w:sz="4"/>
+              <w:right w:val="single" w:color="C9D0DC" w:sz="4"/>
+            </w:tcBorders>
+            <w:tcMar>
+              <w:top w:type="dxa" w:w="70"/>
+              <w:left w:type="dxa" w:w="100"/>
+              <w:bottom w:type="dxa" w:w="70"/>
+              <w:right w:type="dxa" w:w="100"/>
+            </w:tcMar>
+            <w:vAlign w:val="center"/>
+          </w:tcPr>
+          <w:p>
+            <w:pPr>
+              <w:spacing w:after="0" w:before="0" w:line="264"/>
+              <w:jc w:val="center"/>
+            </w:pPr>
+            <w:r>
+              <w:rPr>
+                <w:rFonts w:ascii="Arial" w:cs="Arial" w:eastAsia="Arial" w:hAnsi="Arial"/>
+                <w:sz w:val="30"/>
+                <w:szCs w:val="30"/>
+              </w:rPr>
+              <w:t xml:space="preserve">☐</w:t>
+            </w:r>
+          </w:p>
+        </w:tc>
+        <w:tc>
+          <w:tcPr>
+            <w:tcW w:type="dxa" w:w="620"/>
+            <w:tcBorders>
+              <w:top w:val="single" w:color="C9D0DC" w:sz="4"/>
+              <w:left w:val="single" w:color="C9D0DC" w:sz="4"/>
+              <w:bottom w:val="single" w:color="C9D0DC" w:sz="4"/>
+              <w:right w:val="single" w:color="C9D0DC" w:sz="4"/>
+            </w:tcBorders>
+            <w:tcMar>
+              <w:top w:type="dxa" w:w="70"/>
+              <w:left w:type="dxa" w:w="100"/>
+              <w:bottom w:type="dxa" w:w="70"/>
+              <w:right w:type="dxa" w:w="100"/>
+            </w:tcMar>
+            <w:vAlign w:val="center"/>
+          </w:tcPr>
+          <w:p>
+            <w:pPr>
+              <w:spacing w:after="0" w:before="0" w:line="264"/>
+              <w:jc w:val="center"/>
+            </w:pPr>
+            <w:r>
+              <w:rPr>
+                <w:rFonts w:ascii="Arial" w:cs="Arial" w:eastAsia="Arial" w:hAnsi="Arial"/>
+                <w:sz w:val="30"/>
+                <w:szCs w:val="30"/>
+              </w:rPr>
+              <w:t xml:space="preserve">☐</w:t>
+            </w:r>
+          </w:p>
+        </w:tc>
+        <w:tc>
+          <w:tcPr>
+            <w:tcW w:type="dxa" w:w="2040"/>
+            <w:tcBorders>
+              <w:top w:val="single" w:color="C9D0DC" w:sz="4"/>
+              <w:left w:val="single" w:color="C9D0DC" w:sz="4"/>
+              <w:bottom w:val="single" w:color="C9D0DC" w:sz="4"/>
+              <w:right w:val="single" w:color="C9D0DC" w:sz="4"/>
+            </w:tcBorders>
+            <w:tcMar>
+              <w:top w:type="dxa" w:w="70"/>
+              <w:left w:type="dxa" w:w="100"/>
+              <w:bottom w:type="dxa" w:w="70"/>
+              <w:right w:type="dxa" w:w="100"/>
+            </w:tcMar>
+            <w:vAlign w:val="top"/>
+          </w:tcPr>
+          <w:p>
+            <w:pPr>
+              <w:spacing w:after="0" w:before="0" w:line="264"/>
+            </w:pPr>
+            <w:r>
+              <w:rPr>
+                <w:rFonts w:ascii="Arial" w:cs="Arial" w:eastAsia="Arial" w:hAnsi="Arial"/>
+                <w:sz w:val="19"/>
+                <w:szCs w:val="19"/>
+              </w:rPr>
+              <w:t xml:space="preserve"> </w:t>
+            </w:r>
+          </w:p>
+        </w:tc>
+      </w:tr>
+      <w:tr>
+        <w:trPr>
+          <w:cantSplit/>
+        </w:trPr>
+        <w:tc>
+          <w:tcPr>
+            <w:tcW w:type="dxa" w:w="860"/>
+            <w:tcBorders>
+              <w:top w:val="single" w:color="C9D0DC" w:sz="4"/>
+              <w:left w:val="single" w:color="C9D0DC" w:sz="4"/>
+              <w:bottom w:val="single" w:color="C9D0DC" w:sz="4"/>
+              <w:right w:val="single" w:color="C9D0DC" w:sz="4"/>
+            </w:tcBorders>
+            <w:tcMar>
+              <w:top w:type="dxa" w:w="70"/>
+              <w:left w:type="dxa" w:w="100"/>
+              <w:bottom w:type="dxa" w:w="70"/>
+              <w:right w:type="dxa" w:w="100"/>
+            </w:tcMar>
+            <w:vAlign w:val="top"/>
+          </w:tcPr>
+          <w:p>
+            <w:pPr>
+              <w:spacing w:after="0" w:before="0" w:line="264"/>
+            </w:pPr>
+            <w:r>
+              <w:rPr>
+                <w:rFonts w:ascii="Arial" w:cs="Arial" w:eastAsia="Arial" w:hAnsi="Arial"/>
+                <w:b/>
+                <w:bCs/>
+                <w:color w:val="5B6477"/>
+                <w:sz w:val="16"/>
+                <w:szCs w:val="16"/>
+              </w:rPr>
+              <w:t xml:space="preserve">AD-22</w:t>
+            </w:r>
+          </w:p>
+        </w:tc>
+        <w:tc>
+          <w:tcPr>
+            <w:tcW w:type="dxa" w:w="5480"/>
+            <w:tcBorders>
+              <w:top w:val="single" w:color="C9D0DC" w:sz="4"/>
+              <w:left w:val="single" w:color="C9D0DC" w:sz="4"/>
+              <w:bottom w:val="single" w:color="C9D0DC" w:sz="4"/>
+              <w:right w:val="single" w:color="C9D0DC" w:sz="4"/>
+            </w:tcBorders>
+            <w:tcMar>
+              <w:top w:type="dxa" w:w="70"/>
+              <w:left w:type="dxa" w:w="100"/>
+              <w:bottom w:type="dxa" w:w="70"/>
+              <w:right w:type="dxa" w:w="100"/>
+            </w:tcMar>
+            <w:vAlign w:val="top"/>
+          </w:tcPr>
+          <w:p>
+            <w:pPr>
+              <w:spacing w:after="40" w:before="0" w:line="264"/>
+            </w:pPr>
+            <w:r>
+              <w:rPr>
+                <w:rFonts w:ascii="Arial" w:cs="Arial" w:eastAsia="Arial" w:hAnsi="Arial"/>
+                <w:b/>
+                <w:bCs/>
+                <w:sz w:val="20"/>
+                <w:szCs w:val="20"/>
+              </w:rPr>
+              <w:t xml:space="preserve">Credit-card and e-commerce prices</w:t>
+            </w:r>
+          </w:p>
+          <w:p>
+            <w:pPr>
+              <w:spacing w:after="40" w:before="0" w:line="264"/>
+            </w:pPr>
+            <w:r>
+              <w:rPr>
+                <w:rFonts w:ascii="Arial" w:cs="Arial" w:eastAsia="Arial" w:hAnsi="Arial"/>
+                <w:i/>
+                <w:iCs/>
+                <w:color w:val="5B6477"/>
+                <w:sz w:val="15"/>
+                <w:szCs w:val="15"/>
+              </w:rPr>
+              <w:t xml:space="preserve">Flow F11 · E-commerce order to payout</w:t>
+            </w:r>
+          </w:p>
+          <w:p>
+            <w:pPr>
+              <w:spacing w:after="20" w:before="0" w:line="264"/>
+            </w:pPr>
+            <w:r>
+              <w:rPr>
+                <w:rFonts w:ascii="Arial" w:cs="Arial" w:eastAsia="Arial" w:hAnsi="Arial"/>
+                <w:color w:val="5B6477"/>
+                <w:sz w:val="19"/>
+                <w:szCs w:val="19"/>
+              </w:rPr>
+              <w:t xml:space="preserve">1.  </w:t>
+            </w:r>
+            <w:r>
+              <w:rPr>
+                <w:rFonts w:ascii="Arial" w:cs="Arial" w:eastAsia="Arial" w:hAnsi="Arial"/>
+                <w:sz w:val="19"/>
+                <w:szCs w:val="19"/>
+              </w:rPr>
+              <w:t xml:space="preserve">Open E-com &amp; Card Prices.</w:t>
+            </w:r>
+          </w:p>
+          <w:p>
+            <w:pPr>
+              <w:spacing w:after="20" w:before="0" w:line="264"/>
+            </w:pPr>
+            <w:r>
+              <w:rPr>
+                <w:rFonts w:ascii="Arial" w:cs="Arial" w:eastAsia="Arial" w:hAnsi="Arial"/>
+                <w:color w:val="5B6477"/>
+                <w:sz w:val="19"/>
+                <w:szCs w:val="19"/>
+              </w:rPr>
+              <w:t xml:space="preserve">2.  </w:t>
+            </w:r>
+            <w:r>
+              <w:rPr>
+                <w:rFonts w:ascii="Arial" w:cs="Arial" w:eastAsia="Arial" w:hAnsi="Arial"/>
+                <w:sz w:val="19"/>
+                <w:szCs w:val="19"/>
+              </w:rPr>
+              <w:t xml:space="preserve">Set the Card fee % (4) and choose SRP ÷ (1 − %) → Save prices.</w:t>
+            </w:r>
+          </w:p>
+          <w:p>
+            <w:pPr>
+              <w:spacing w:after="20" w:before="0" w:line="264"/>
+            </w:pPr>
+            <w:r>
+              <w:rPr>
+                <w:rFonts w:ascii="Arial" w:cs="Arial" w:eastAsia="Arial" w:hAnsi="Arial"/>
+                <w:color w:val="5B6477"/>
+                <w:sz w:val="19"/>
+                <w:szCs w:val="19"/>
+              </w:rPr>
+              <w:t xml:space="preserve">3.  </w:t>
+            </w:r>
+            <w:r>
+              <w:rPr>
+                <w:rFonts w:ascii="Arial" w:cs="Arial" w:eastAsia="Arial" w:hAnsi="Arial"/>
+                <w:sz w:val="19"/>
+                <w:szCs w:val="19"/>
+              </w:rPr>
+              <w:t xml:space="preserve">Change one TikTok, one Shopee and one Lazada price → Save prices. Or import the masterlist (.xlsx).</w:t>
+            </w:r>
+          </w:p>
+          <w:p>
+            <w:pPr>
+              <w:spacing w:after="20" w:before="0" w:line="264"/>
+            </w:pPr>
+            <w:r>
+              <w:rPr>
+                <w:rFonts w:ascii="Arial" w:cs="Arial" w:eastAsia="Arial" w:hAnsi="Arial"/>
+                <w:color w:val="5B6477"/>
+                <w:sz w:val="19"/>
+                <w:szCs w:val="19"/>
+              </w:rPr>
+              <w:t xml:space="preserve">4.  </w:t>
+            </w:r>
+            <w:r>
+              <w:rPr>
+                <w:rFonts w:ascii="Arial" w:cs="Arial" w:eastAsia="Arial" w:hAnsi="Arial"/>
+                <w:sz w:val="19"/>
+                <w:szCs w:val="19"/>
+              </w:rPr>
+              <w:t xml:space="preserve">Open New Sale as a sales account and pay one item by credit card.</w:t>
+            </w:r>
+          </w:p>
+          <w:p>
+            <w:pPr>
+              <w:spacing w:after="0" w:before="60" w:line="264"/>
+            </w:pPr>
+            <w:r>
+              <w:rPr>
+                <w:rFonts w:ascii="Arial" w:cs="Arial" w:eastAsia="Arial" w:hAnsi="Arial"/>
+                <w:b/>
+                <w:bCs/>
+                <w:color w:val="0B1F3A"/>
+                <w:sz w:val="19"/>
+                <w:szCs w:val="19"/>
+              </w:rPr>
+              <w:t xml:space="preserve">You should see: </w:t>
+            </w:r>
+            <w:r>
+              <w:rPr>
+                <w:rFonts w:ascii="Arial" w:cs="Arial" w:eastAsia="Arial" w:hAnsi="Arial"/>
+                <w:sz w:val="19"/>
+                <w:szCs w:val="19"/>
+              </w:rPr>
+              <w:t xml:space="preserve">Prices keep their centavos (no rounding). The card sale uses the credit-card price; a platform sale uses that platform price list.</w:t>
+            </w:r>
+          </w:p>
+        </w:tc>
+        <w:tc>
+          <w:tcPr>
+            <w:tcW w:type="dxa" w:w="620"/>
+            <w:tcBorders>
+              <w:top w:val="single" w:color="C9D0DC" w:sz="4"/>
+              <w:left w:val="single" w:color="C9D0DC" w:sz="4"/>
+              <w:bottom w:val="single" w:color="C9D0DC" w:sz="4"/>
+              <w:right w:val="single" w:color="C9D0DC" w:sz="4"/>
+            </w:tcBorders>
+            <w:tcMar>
+              <w:top w:type="dxa" w:w="70"/>
+              <w:left w:type="dxa" w:w="100"/>
+              <w:bottom w:type="dxa" w:w="70"/>
+              <w:right w:type="dxa" w:w="100"/>
+            </w:tcMar>
+            <w:vAlign w:val="center"/>
+          </w:tcPr>
+          <w:p>
+            <w:pPr>
+              <w:spacing w:after="0" w:before="0" w:line="264"/>
+              <w:jc w:val="center"/>
+            </w:pPr>
+            <w:r>
+              <w:rPr>
+                <w:rFonts w:ascii="Arial" w:cs="Arial" w:eastAsia="Arial" w:hAnsi="Arial"/>
+                <w:sz w:val="30"/>
+                <w:szCs w:val="30"/>
+              </w:rPr>
+              <w:t xml:space="preserve">☐</w:t>
+            </w:r>
+          </w:p>
+        </w:tc>
+        <w:tc>
+          <w:tcPr>
+            <w:tcW w:type="dxa" w:w="620"/>
+            <w:tcBorders>
+              <w:top w:val="single" w:color="C9D0DC" w:sz="4"/>
+              <w:left w:val="single" w:color="C9D0DC" w:sz="4"/>
+              <w:bottom w:val="single" w:color="C9D0DC" w:sz="4"/>
+              <w:right w:val="single" w:color="C9D0DC" w:sz="4"/>
+            </w:tcBorders>
+            <w:tcMar>
+              <w:top w:type="dxa" w:w="70"/>
+              <w:left w:type="dxa" w:w="100"/>
+              <w:bottom w:type="dxa" w:w="70"/>
+              <w:right w:type="dxa" w:w="100"/>
+            </w:tcMar>
+            <w:vAlign w:val="center"/>
+          </w:tcPr>
+          <w:p>
+            <w:pPr>
+              <w:spacing w:after="0" w:before="0" w:line="264"/>
+              <w:jc w:val="center"/>
+            </w:pPr>
+            <w:r>
+              <w:rPr>
+                <w:rFonts w:ascii="Arial" w:cs="Arial" w:eastAsia="Arial" w:hAnsi="Arial"/>
+                <w:sz w:val="30"/>
+                <w:szCs w:val="30"/>
+              </w:rPr>
+              <w:t xml:space="preserve">☐</w:t>
+            </w:r>
+          </w:p>
+        </w:tc>
+        <w:tc>
+          <w:tcPr>
+            <w:tcW w:type="dxa" w:w="620"/>
+            <w:tcBorders>
+              <w:top w:val="single" w:color="C9D0DC" w:sz="4"/>
+              <w:left w:val="single" w:color="C9D0DC" w:sz="4"/>
+              <w:bottom w:val="single" w:color="C9D0DC" w:sz="4"/>
+              <w:right w:val="single" w:color="C9D0DC" w:sz="4"/>
+            </w:tcBorders>
+            <w:tcMar>
+              <w:top w:type="dxa" w:w="70"/>
+              <w:left w:type="dxa" w:w="100"/>
+              <w:bottom w:type="dxa" w:w="70"/>
+              <w:right w:type="dxa" w:w="100"/>
+            </w:tcMar>
+            <w:vAlign w:val="center"/>
+          </w:tcPr>
+          <w:p>
+            <w:pPr>
+              <w:spacing w:after="0" w:before="0" w:line="264"/>
+              <w:jc w:val="center"/>
+            </w:pPr>
+            <w:r>
+              <w:rPr>
+                <w:rFonts w:ascii="Arial" w:cs="Arial" w:eastAsia="Arial" w:hAnsi="Arial"/>
+                <w:sz w:val="30"/>
+                <w:szCs w:val="30"/>
+              </w:rPr>
+              <w:t xml:space="preserve">☐</w:t>
+            </w:r>
+          </w:p>
+        </w:tc>
+        <w:tc>
+          <w:tcPr>
+            <w:tcW w:type="dxa" w:w="2040"/>
+            <w:tcBorders>
+              <w:top w:val="single" w:color="C9D0DC" w:sz="4"/>
+              <w:left w:val="single" w:color="C9D0DC" w:sz="4"/>
+              <w:bottom w:val="single" w:color="C9D0DC" w:sz="4"/>
+              <w:right w:val="single" w:color="C9D0DC" w:sz="4"/>
+            </w:tcBorders>
+            <w:tcMar>
+              <w:top w:type="dxa" w:w="70"/>
+              <w:left w:type="dxa" w:w="100"/>
+              <w:bottom w:type="dxa" w:w="70"/>
+              <w:right w:type="dxa" w:w="100"/>
+            </w:tcMar>
+            <w:vAlign w:val="top"/>
+          </w:tcPr>
+          <w:p>
+            <w:pPr>
+              <w:spacing w:after="0" w:before="0" w:line="264"/>
+            </w:pPr>
+            <w:r>
+              <w:rPr>
+                <w:rFonts w:ascii="Arial" w:cs="Arial" w:eastAsia="Arial" w:hAnsi="Arial"/>
+                <w:sz w:val="19"/>
+                <w:szCs w:val="19"/>
+              </w:rPr>
+              <w:t xml:space="preserve"> </w:t>
+            </w:r>
+          </w:p>
+        </w:tc>
+      </w:tr>
+      <w:tr>
+        <w:trPr>
+          <w:cantSplit/>
+        </w:trPr>
+        <w:tc>
+          <w:tcPr>
+            <w:tcW w:type="dxa" w:w="860"/>
+            <w:tcBorders>
+              <w:top w:val="single" w:color="C9D0DC" w:sz="4"/>
+              <w:left w:val="single" w:color="C9D0DC" w:sz="4"/>
+              <w:bottom w:val="single" w:color="C9D0DC" w:sz="4"/>
+              <w:right w:val="single" w:color="C9D0DC" w:sz="4"/>
+            </w:tcBorders>
+            <w:tcMar>
+              <w:top w:type="dxa" w:w="70"/>
+              <w:left w:type="dxa" w:w="100"/>
+              <w:bottom w:type="dxa" w:w="70"/>
+              <w:right w:type="dxa" w:w="100"/>
+            </w:tcMar>
+            <w:vAlign w:val="top"/>
+          </w:tcPr>
+          <w:p>
+            <w:pPr>
+              <w:spacing w:after="0" w:before="0" w:line="264"/>
+            </w:pPr>
+            <w:r>
+              <w:rPr>
+                <w:rFonts w:ascii="Arial" w:cs="Arial" w:eastAsia="Arial" w:hAnsi="Arial"/>
+                <w:b/>
+                <w:bCs/>
+                <w:color w:val="5B6477"/>
+                <w:sz w:val="16"/>
+                <w:szCs w:val="16"/>
+              </w:rPr>
+              <w:t xml:space="preserve">AD-23</w:t>
+            </w:r>
+          </w:p>
+        </w:tc>
+        <w:tc>
+          <w:tcPr>
+            <w:tcW w:type="dxa" w:w="5480"/>
+            <w:tcBorders>
+              <w:top w:val="single" w:color="C9D0DC" w:sz="4"/>
+              <w:left w:val="single" w:color="C9D0DC" w:sz="4"/>
+              <w:bottom w:val="single" w:color="C9D0DC" w:sz="4"/>
+              <w:right w:val="single" w:color="C9D0DC" w:sz="4"/>
+            </w:tcBorders>
+            <w:tcMar>
+              <w:top w:type="dxa" w:w="70"/>
+              <w:left w:type="dxa" w:w="100"/>
+              <w:bottom w:type="dxa" w:w="70"/>
+              <w:right w:type="dxa" w:w="100"/>
+            </w:tcMar>
+            <w:vAlign w:val="top"/>
+          </w:tcPr>
+          <w:p>
+            <w:pPr>
+              <w:spacing w:after="40" w:before="0" w:line="264"/>
+            </w:pPr>
+            <w:r>
+              <w:rPr>
+                <w:rFonts w:ascii="Arial" w:cs="Arial" w:eastAsia="Arial" w:hAnsi="Arial"/>
+                <w:b/>
+                <w:bCs/>
+                <w:sz w:val="20"/>
+                <w:szCs w:val="20"/>
+              </w:rPr>
+              <w:t xml:space="preserve">Franchise AR: extension and waiving charges</w:t>
+            </w:r>
+          </w:p>
+          <w:p>
+            <w:pPr>
+              <w:spacing w:after="40" w:before="0" w:line="264"/>
+            </w:pPr>
+            <w:r>
+              <w:rPr>
+                <w:rFonts w:ascii="Arial" w:cs="Arial" w:eastAsia="Arial" w:hAnsi="Arial"/>
+                <w:i/>
+                <w:iCs/>
+                <w:color w:val="5B6477"/>
+                <w:sz w:val="15"/>
+                <w:szCs w:val="15"/>
+              </w:rPr>
+              <w:t xml:space="preserve">Flow F21 · Franchise AR: penalty, extension, payment</w:t>
+            </w:r>
+          </w:p>
+          <w:p>
+            <w:pPr>
+              <w:spacing w:after="20" w:before="0" w:line="264"/>
+            </w:pPr>
+            <w:r>
+              <w:rPr>
+                <w:rFonts w:ascii="Arial" w:cs="Arial" w:eastAsia="Arial" w:hAnsi="Arial"/>
+                <w:color w:val="5B6477"/>
+                <w:sz w:val="19"/>
+                <w:szCs w:val="19"/>
+              </w:rPr>
+              <w:t xml:space="preserve">1.  </w:t>
+            </w:r>
+            <w:r>
+              <w:rPr>
+                <w:rFonts w:ascii="Arial" w:cs="Arial" w:eastAsia="Arial" w:hAnsi="Arial"/>
+                <w:sz w:val="19"/>
+                <w:szCs w:val="19"/>
+              </w:rPr>
+              <w:t xml:space="preserve">Open Franchise AR → a franchise with an overdue invoice.</w:t>
+            </w:r>
+          </w:p>
+          <w:p>
+            <w:pPr>
+              <w:spacing w:after="20" w:before="0" w:line="264"/>
+            </w:pPr>
+            <w:r>
+              <w:rPr>
+                <w:rFonts w:ascii="Arial" w:cs="Arial" w:eastAsia="Arial" w:hAnsi="Arial"/>
+                <w:color w:val="5B6477"/>
+                <w:sz w:val="19"/>
+                <w:szCs w:val="19"/>
+              </w:rPr>
+              <w:t xml:space="preserve">2.  </w:t>
+            </w:r>
+            <w:r>
+              <w:rPr>
+                <w:rFonts w:ascii="Arial" w:cs="Arial" w:eastAsia="Arial" w:hAnsi="Arial"/>
+                <w:sz w:val="19"/>
+                <w:szCs w:val="19"/>
+              </w:rPr>
+              <w:t xml:space="preserve">Read the penalty (2% once) and interest (0.1% a day) and the total due today.</w:t>
+            </w:r>
+          </w:p>
+          <w:p>
+            <w:pPr>
+              <w:spacing w:after="20" w:before="0" w:line="264"/>
+            </w:pPr>
+            <w:r>
+              <w:rPr>
+                <w:rFonts w:ascii="Arial" w:cs="Arial" w:eastAsia="Arial" w:hAnsi="Arial"/>
+                <w:color w:val="5B6477"/>
+                <w:sz w:val="19"/>
+                <w:szCs w:val="19"/>
+              </w:rPr>
+              <w:t xml:space="preserve">3.  </w:t>
+            </w:r>
+            <w:r>
+              <w:rPr>
+                <w:rFonts w:ascii="Arial" w:cs="Arial" w:eastAsia="Arial" w:hAnsi="Arial"/>
+                <w:sz w:val="19"/>
+                <w:szCs w:val="19"/>
+              </w:rPr>
+              <w:t xml:space="preserve">Open My Approvals → Franchise AR extension → read the reason → Approve (or Reject with a reason).</w:t>
+            </w:r>
+          </w:p>
+          <w:p>
+            <w:pPr>
+              <w:spacing w:after="20" w:before="0" w:line="264"/>
+            </w:pPr>
+            <w:r>
+              <w:rPr>
+                <w:rFonts w:ascii="Arial" w:cs="Arial" w:eastAsia="Arial" w:hAnsi="Arial"/>
+                <w:color w:val="5B6477"/>
+                <w:sz w:val="19"/>
+                <w:szCs w:val="19"/>
+              </w:rPr>
+              <w:t xml:space="preserve">4.  </w:t>
+            </w:r>
+            <w:r>
+              <w:rPr>
+                <w:rFonts w:ascii="Arial" w:cs="Arial" w:eastAsia="Arial" w:hAnsi="Arial"/>
+                <w:sz w:val="19"/>
+                <w:szCs w:val="19"/>
+              </w:rPr>
+              <w:t xml:space="preserve">On the invoice press Waive charges, type an amount and a reason.</w:t>
+            </w:r>
+          </w:p>
+          <w:p>
+            <w:pPr>
+              <w:spacing w:after="0" w:before="60" w:line="264"/>
+            </w:pPr>
+            <w:r>
+              <w:rPr>
+                <w:rFonts w:ascii="Arial" w:cs="Arial" w:eastAsia="Arial" w:hAnsi="Arial"/>
+                <w:b/>
+                <w:bCs/>
+                <w:color w:val="0B1F3A"/>
+                <w:sz w:val="19"/>
+                <w:szCs w:val="19"/>
+              </w:rPr>
+              <w:t xml:space="preserve">You should see: </w:t>
+            </w:r>
+            <w:r>
+              <w:rPr>
+                <w:rFonts w:ascii="Arial" w:cs="Arial" w:eastAsia="Arial" w:hAnsi="Arial"/>
+                <w:sz w:val="19"/>
+                <w:szCs w:val="19"/>
+              </w:rPr>
+              <w:t xml:space="preserve">The new due date applies from the approved request. Penalty and interest are recalculated and the waiver is recorded with your name. Accounting, the auditors, the Franchise Coordinators and the franchise owner are told.</w:t>
+            </w:r>
+          </w:p>
+        </w:tc>
+        <w:tc>
+          <w:tcPr>
+            <w:tcW w:type="dxa" w:w="620"/>
+            <w:tcBorders>
+              <w:top w:val="single" w:color="C9D0DC" w:sz="4"/>
+              <w:left w:val="single" w:color="C9D0DC" w:sz="4"/>
+              <w:bottom w:val="single" w:color="C9D0DC" w:sz="4"/>
+              <w:right w:val="single" w:color="C9D0DC" w:sz="4"/>
+            </w:tcBorders>
+            <w:tcMar>
+              <w:top w:type="dxa" w:w="70"/>
+              <w:left w:type="dxa" w:w="100"/>
+              <w:bottom w:type="dxa" w:w="70"/>
+              <w:right w:type="dxa" w:w="100"/>
+            </w:tcMar>
+            <w:vAlign w:val="center"/>
+          </w:tcPr>
+          <w:p>
+            <w:pPr>
+              <w:spacing w:after="0" w:before="0" w:line="264"/>
+              <w:jc w:val="center"/>
+            </w:pPr>
+            <w:r>
+              <w:rPr>
+                <w:rFonts w:ascii="Arial" w:cs="Arial" w:eastAsia="Arial" w:hAnsi="Arial"/>
+                <w:sz w:val="30"/>
+                <w:szCs w:val="30"/>
+              </w:rPr>
+              <w:t xml:space="preserve">☐</w:t>
+            </w:r>
+          </w:p>
+        </w:tc>
+        <w:tc>
+          <w:tcPr>
+            <w:tcW w:type="dxa" w:w="620"/>
+            <w:tcBorders>
+              <w:top w:val="single" w:color="C9D0DC" w:sz="4"/>
+              <w:left w:val="single" w:color="C9D0DC" w:sz="4"/>
+              <w:bottom w:val="single" w:color="C9D0DC" w:sz="4"/>
+              <w:right w:val="single" w:color="C9D0DC" w:sz="4"/>
+            </w:tcBorders>
+            <w:tcMar>
+              <w:top w:type="dxa" w:w="70"/>
+              <w:left w:type="dxa" w:w="100"/>
+              <w:bottom w:type="dxa" w:w="70"/>
+              <w:right w:type="dxa" w:w="100"/>
+            </w:tcMar>
+            <w:vAlign w:val="center"/>
+          </w:tcPr>
+          <w:p>
+            <w:pPr>
+              <w:spacing w:after="0" w:before="0" w:line="264"/>
+              <w:jc w:val="center"/>
+            </w:pPr>
+            <w:r>
+              <w:rPr>
+                <w:rFonts w:ascii="Arial" w:cs="Arial" w:eastAsia="Arial" w:hAnsi="Arial"/>
+                <w:sz w:val="30"/>
+                <w:szCs w:val="30"/>
+              </w:rPr>
+              <w:t xml:space="preserve">☐</w:t>
+            </w:r>
+          </w:p>
+        </w:tc>
+        <w:tc>
+          <w:tcPr>
+            <w:tcW w:type="dxa" w:w="620"/>
+            <w:tcBorders>
+              <w:top w:val="single" w:color="C9D0DC" w:sz="4"/>
+              <w:left w:val="single" w:color="C9D0DC" w:sz="4"/>
+              <w:bottom w:val="single" w:color="C9D0DC" w:sz="4"/>
+              <w:right w:val="single" w:color="C9D0DC" w:sz="4"/>
+            </w:tcBorders>
+            <w:tcMar>
+              <w:top w:type="dxa" w:w="70"/>
+              <w:left w:type="dxa" w:w="100"/>
+              <w:bottom w:type="dxa" w:w="70"/>
+              <w:right w:type="dxa" w:w="100"/>
+            </w:tcMar>
+            <w:vAlign w:val="center"/>
+          </w:tcPr>
+          <w:p>
+            <w:pPr>
+              <w:spacing w:after="0" w:before="0" w:line="264"/>
+              <w:jc w:val="center"/>
+            </w:pPr>
+            <w:r>
+              <w:rPr>
+                <w:rFonts w:ascii="Arial" w:cs="Arial" w:eastAsia="Arial" w:hAnsi="Arial"/>
+                <w:sz w:val="30"/>
+                <w:szCs w:val="30"/>
+              </w:rPr>
+              <w:t xml:space="preserve">☐</w:t>
+            </w:r>
+          </w:p>
+        </w:tc>
+        <w:tc>
+          <w:tcPr>
+            <w:tcW w:type="dxa" w:w="2040"/>
+            <w:tcBorders>
+              <w:top w:val="single" w:color="C9D0DC" w:sz="4"/>
+              <w:left w:val="single" w:color="C9D0DC" w:sz="4"/>
+              <w:bottom w:val="single" w:color="C9D0DC" w:sz="4"/>
+              <w:right w:val="single" w:color="C9D0DC" w:sz="4"/>
+            </w:tcBorders>
+            <w:tcMar>
+              <w:top w:type="dxa" w:w="70"/>
+              <w:left w:type="dxa" w:w="100"/>
+              <w:bottom w:type="dxa" w:w="70"/>
+              <w:right w:type="dxa" w:w="100"/>
+            </w:tcMar>
+            <w:vAlign w:val="top"/>
+          </w:tcPr>
+          <w:p>
+            <w:pPr>
+              <w:spacing w:after="0" w:before="0" w:line="264"/>
+            </w:pPr>
+            <w:r>
+              <w:rPr>
+                <w:rFonts w:ascii="Arial" w:cs="Arial" w:eastAsia="Arial" w:hAnsi="Arial"/>
+                <w:sz w:val="19"/>
+                <w:szCs w:val="19"/>
+              </w:rPr>
+              <w:t xml:space="preserve"> </w:t>
+            </w:r>
+          </w:p>
+        </w:tc>
+      </w:tr>
+      <w:tr>
+        <w:trPr>
+          <w:cantSplit/>
+        </w:trPr>
+        <w:tc>
+          <w:tcPr>
+            <w:tcW w:type="dxa" w:w="860"/>
+            <w:tcBorders>
+              <w:top w:val="single" w:color="C9D0DC" w:sz="4"/>
+              <w:left w:val="single" w:color="C9D0DC" w:sz="4"/>
+              <w:bottom w:val="single" w:color="C9D0DC" w:sz="4"/>
+              <w:right w:val="single" w:color="C9D0DC" w:sz="4"/>
+            </w:tcBorders>
+            <w:tcMar>
+              <w:top w:type="dxa" w:w="70"/>
+              <w:left w:type="dxa" w:w="100"/>
+              <w:bottom w:type="dxa" w:w="70"/>
+              <w:right w:type="dxa" w:w="100"/>
+            </w:tcMar>
+            <w:vAlign w:val="top"/>
+          </w:tcPr>
+          <w:p>
+            <w:pPr>
+              <w:spacing w:after="0" w:before="0" w:line="264"/>
+            </w:pPr>
+            <w:r>
+              <w:rPr>
+                <w:rFonts w:ascii="Arial" w:cs="Arial" w:eastAsia="Arial" w:hAnsi="Arial"/>
+                <w:b/>
+                <w:bCs/>
+                <w:color w:val="5B6477"/>
+                <w:sz w:val="16"/>
+                <w:szCs w:val="16"/>
+              </w:rPr>
+              <w:t xml:space="preserve">AD-24</w:t>
+            </w:r>
+          </w:p>
+        </w:tc>
+        <w:tc>
+          <w:tcPr>
+            <w:tcW w:type="dxa" w:w="5480"/>
+            <w:tcBorders>
+              <w:top w:val="single" w:color="C9D0DC" w:sz="4"/>
+              <w:left w:val="single" w:color="C9D0DC" w:sz="4"/>
+              <w:bottom w:val="single" w:color="C9D0DC" w:sz="4"/>
+              <w:right w:val="single" w:color="C9D0DC" w:sz="4"/>
+            </w:tcBorders>
+            <w:tcMar>
+              <w:top w:type="dxa" w:w="70"/>
+              <w:left w:type="dxa" w:w="100"/>
+              <w:bottom w:type="dxa" w:w="70"/>
+              <w:right w:type="dxa" w:w="100"/>
+            </w:tcMar>
+            <w:vAlign w:val="top"/>
+          </w:tcPr>
+          <w:p>
+            <w:pPr>
+              <w:spacing w:after="40" w:before="0" w:line="264"/>
+            </w:pPr>
+            <w:r>
+              <w:rPr>
+                <w:rFonts w:ascii="Arial" w:cs="Arial" w:eastAsia="Arial" w:hAnsi="Arial"/>
+                <w:b/>
+                <w:bCs/>
+                <w:sz w:val="20"/>
+                <w:szCs w:val="20"/>
+              </w:rPr>
+              <w:t xml:space="preserve">6-Pack Card override request</w:t>
+            </w:r>
+          </w:p>
+          <w:p>
+            <w:pPr>
+              <w:spacing w:after="40" w:before="0" w:line="264"/>
+            </w:pPr>
+            <w:r>
+              <w:rPr>
+                <w:rFonts w:ascii="Arial" w:cs="Arial" w:eastAsia="Arial" w:hAnsi="Arial"/>
+                <w:i/>
+                <w:iCs/>
+                <w:color w:val="5B6477"/>
+                <w:sz w:val="15"/>
+                <w:szCs w:val="15"/>
+              </w:rPr>
+              <w:t xml:space="preserve">Flow F23 · 6-Pack Card and the override</w:t>
+            </w:r>
+          </w:p>
+          <w:p>
+            <w:pPr>
+              <w:spacing w:after="20" w:before="0" w:line="264"/>
+            </w:pPr>
+            <w:r>
+              <w:rPr>
+                <w:rFonts w:ascii="Arial" w:cs="Arial" w:eastAsia="Arial" w:hAnsi="Arial"/>
+                <w:color w:val="5B6477"/>
+                <w:sz w:val="19"/>
+                <w:szCs w:val="19"/>
+              </w:rPr>
+              <w:t xml:space="preserve">1.  </w:t>
+            </w:r>
+            <w:r>
+              <w:rPr>
+                <w:rFonts w:ascii="Arial" w:cs="Arial" w:eastAsia="Arial" w:hAnsi="Arial"/>
+                <w:sz w:val="19"/>
+                <w:szCs w:val="19"/>
+              </w:rPr>
+              <w:t xml:space="preserve">Open My Approvals → 6-Pack Card override sent by the Head Auditor.</w:t>
+            </w:r>
+          </w:p>
+          <w:p>
+            <w:pPr>
+              <w:spacing w:after="20" w:before="0" w:line="264"/>
+            </w:pPr>
+            <w:r>
+              <w:rPr>
+                <w:rFonts w:ascii="Arial" w:cs="Arial" w:eastAsia="Arial" w:hAnsi="Arial"/>
+                <w:color w:val="5B6477"/>
+                <w:sz w:val="19"/>
+                <w:szCs w:val="19"/>
+              </w:rPr>
+              <w:t xml:space="preserve">2.  </w:t>
+            </w:r>
+            <w:r>
+              <w:rPr>
+                <w:rFonts w:ascii="Arial" w:cs="Arial" w:eastAsia="Arial" w:hAnsi="Arial"/>
+                <w:sz w:val="19"/>
+                <w:szCs w:val="19"/>
+              </w:rPr>
+              <w:t xml:space="preserve">Read the branch, what is known about the customer and the reason → Approve.</w:t>
+            </w:r>
+          </w:p>
+          <w:p>
+            <w:pPr>
+              <w:spacing w:after="0" w:before="60" w:line="264"/>
+            </w:pPr>
+            <w:r>
+              <w:rPr>
+                <w:rFonts w:ascii="Arial" w:cs="Arial" w:eastAsia="Arial" w:hAnsi="Arial"/>
+                <w:b/>
+                <w:bCs/>
+                <w:color w:val="0B1F3A"/>
+                <w:sz w:val="19"/>
+                <w:szCs w:val="19"/>
+              </w:rPr>
+              <w:t xml:space="preserve">You should see: </w:t>
+            </w:r>
+            <w:r>
+              <w:rPr>
+                <w:rFonts w:ascii="Arial" w:cs="Arial" w:eastAsia="Arial" w:hAnsi="Arial"/>
+                <w:sz w:val="19"/>
+                <w:szCs w:val="19"/>
+              </w:rPr>
+              <w:t xml:space="preserve">The card is booked as usual (₱300 expense for the branch) and marked as an override. Rejecting needs a reason.</w:t>
+            </w:r>
+          </w:p>
+        </w:tc>
+        <w:tc>
+          <w:tcPr>
+            <w:tcW w:type="dxa" w:w="620"/>
+            <w:tcBorders>
+              <w:top w:val="single" w:color="C9D0DC" w:sz="4"/>
+              <w:left w:val="single" w:color="C9D0DC" w:sz="4"/>
+              <w:bottom w:val="single" w:color="C9D0DC" w:sz="4"/>
+              <w:right w:val="single" w:color="C9D0DC" w:sz="4"/>
+            </w:tcBorders>
+            <w:tcMar>
+              <w:top w:type="dxa" w:w="70"/>
+              <w:left w:type="dxa" w:w="100"/>
+              <w:bottom w:type="dxa" w:w="70"/>
+              <w:right w:type="dxa" w:w="100"/>
+            </w:tcMar>
+            <w:vAlign w:val="center"/>
+          </w:tcPr>
+          <w:p>
+            <w:pPr>
+              <w:spacing w:after="0" w:before="0" w:line="264"/>
+              <w:jc w:val="center"/>
+            </w:pPr>
+            <w:r>
+              <w:rPr>
+                <w:rFonts w:ascii="Arial" w:cs="Arial" w:eastAsia="Arial" w:hAnsi="Arial"/>
+                <w:sz w:val="30"/>
+                <w:szCs w:val="30"/>
+              </w:rPr>
+              <w:t xml:space="preserve">☐</w:t>
+            </w:r>
+          </w:p>
+        </w:tc>
+        <w:tc>
+          <w:tcPr>
+            <w:tcW w:type="dxa" w:w="620"/>
+            <w:tcBorders>
+              <w:top w:val="single" w:color="C9D0DC" w:sz="4"/>
+              <w:left w:val="single" w:color="C9D0DC" w:sz="4"/>
+              <w:bottom w:val="single" w:color="C9D0DC" w:sz="4"/>
+              <w:right w:val="single" w:color="C9D0DC" w:sz="4"/>
+            </w:tcBorders>
+            <w:tcMar>
+              <w:top w:type="dxa" w:w="70"/>
+              <w:left w:type="dxa" w:w="100"/>
+              <w:bottom w:type="dxa" w:w="70"/>
+              <w:right w:type="dxa" w:w="100"/>
+            </w:tcMar>
+            <w:vAlign w:val="center"/>
+          </w:tcPr>
+          <w:p>
+            <w:pPr>
+              <w:spacing w:after="0" w:before="0" w:line="264"/>
+              <w:jc w:val="center"/>
+            </w:pPr>
+            <w:r>
+              <w:rPr>
+                <w:rFonts w:ascii="Arial" w:cs="Arial" w:eastAsia="Arial" w:hAnsi="Arial"/>
+                <w:sz w:val="30"/>
+                <w:szCs w:val="30"/>
+              </w:rPr>
+              <w:t xml:space="preserve">☐</w:t>
+            </w:r>
+          </w:p>
+        </w:tc>
+        <w:tc>
+          <w:tcPr>
+            <w:tcW w:type="dxa" w:w="620"/>
+            <w:tcBorders>
+              <w:top w:val="single" w:color="C9D0DC" w:sz="4"/>
+              <w:left w:val="single" w:color="C9D0DC" w:sz="4"/>
+              <w:bottom w:val="single" w:color="C9D0DC" w:sz="4"/>
+              <w:right w:val="single" w:color="C9D0DC" w:sz="4"/>
+            </w:tcBorders>
+            <w:tcMar>
+              <w:top w:type="dxa" w:w="70"/>
+              <w:left w:type="dxa" w:w="100"/>
+              <w:bottom w:type="dxa" w:w="70"/>
+              <w:right w:type="dxa" w:w="100"/>
+            </w:tcMar>
+            <w:vAlign w:val="center"/>
+          </w:tcPr>
+          <w:p>
+            <w:pPr>
+              <w:spacing w:after="0" w:before="0" w:line="264"/>
+              <w:jc w:val="center"/>
+            </w:pPr>
+            <w:r>
+              <w:rPr>
+                <w:rFonts w:ascii="Arial" w:cs="Arial" w:eastAsia="Arial" w:hAnsi="Arial"/>
+                <w:sz w:val="30"/>
+                <w:szCs w:val="30"/>
+              </w:rPr>
+              <w:t xml:space="preserve">☐</w:t>
+            </w:r>
+          </w:p>
+        </w:tc>
+        <w:tc>
+          <w:tcPr>
+            <w:tcW w:type="dxa" w:w="2040"/>
+            <w:tcBorders>
+              <w:top w:val="single" w:color="C9D0DC" w:sz="4"/>
+              <w:left w:val="single" w:color="C9D0DC" w:sz="4"/>
+              <w:bottom w:val="single" w:color="C9D0DC" w:sz="4"/>
+              <w:right w:val="single" w:color="C9D0DC" w:sz="4"/>
+            </w:tcBorders>
+            <w:tcMar>
+              <w:top w:type="dxa" w:w="70"/>
+              <w:left w:type="dxa" w:w="100"/>
+              <w:bottom w:type="dxa" w:w="70"/>
+              <w:right w:type="dxa" w:w="100"/>
+            </w:tcMar>
+            <w:vAlign w:val="top"/>
+          </w:tcPr>
+          <w:p>
+            <w:pPr>
+              <w:spacing w:after="0" w:before="0" w:line="264"/>
+            </w:pPr>
+            <w:r>
+              <w:rPr>
+                <w:rFonts w:ascii="Arial" w:cs="Arial" w:eastAsia="Arial" w:hAnsi="Arial"/>
+                <w:sz w:val="19"/>
+                <w:szCs w:val="19"/>
+              </w:rPr>
+              <w:t xml:space="preserve"> </w:t>
+            </w:r>
+          </w:p>
+        </w:tc>
+      </w:tr>
+      <w:tr>
+        <w:trPr>
+          <w:cantSplit/>
+        </w:trPr>
+        <w:tc>
+          <w:tcPr>
+            <w:tcW w:type="dxa" w:w="860"/>
+            <w:tcBorders>
+              <w:top w:val="single" w:color="C9D0DC" w:sz="4"/>
+              <w:left w:val="single" w:color="C9D0DC" w:sz="4"/>
+              <w:bottom w:val="single" w:color="C9D0DC" w:sz="4"/>
+              <w:right w:val="single" w:color="C9D0DC" w:sz="4"/>
+            </w:tcBorders>
+            <w:tcMar>
+              <w:top w:type="dxa" w:w="70"/>
+              <w:left w:type="dxa" w:w="100"/>
+              <w:bottom w:type="dxa" w:w="70"/>
+              <w:right w:type="dxa" w:w="100"/>
+            </w:tcMar>
+            <w:vAlign w:val="top"/>
+          </w:tcPr>
+          <w:p>
+            <w:pPr>
+              <w:spacing w:after="0" w:before="0" w:line="264"/>
+            </w:pPr>
+            <w:r>
+              <w:rPr>
+                <w:rFonts w:ascii="Arial" w:cs="Arial" w:eastAsia="Arial" w:hAnsi="Arial"/>
+                <w:b/>
+                <w:bCs/>
+                <w:color w:val="5B6477"/>
+                <w:sz w:val="16"/>
+                <w:szCs w:val="16"/>
+              </w:rPr>
+              <w:t xml:space="preserve">AD-25</w:t>
+            </w:r>
+          </w:p>
+        </w:tc>
+        <w:tc>
+          <w:tcPr>
+            <w:tcW w:type="dxa" w:w="5480"/>
+            <w:tcBorders>
+              <w:top w:val="single" w:color="C9D0DC" w:sz="4"/>
+              <w:left w:val="single" w:color="C9D0DC" w:sz="4"/>
+              <w:bottom w:val="single" w:color="C9D0DC" w:sz="4"/>
+              <w:right w:val="single" w:color="C9D0DC" w:sz="4"/>
+            </w:tcBorders>
+            <w:tcMar>
+              <w:top w:type="dxa" w:w="70"/>
+              <w:left w:type="dxa" w:w="100"/>
+              <w:bottom w:type="dxa" w:w="70"/>
+              <w:right w:type="dxa" w:w="100"/>
+            </w:tcMar>
+            <w:vAlign w:val="top"/>
+          </w:tcPr>
+          <w:p>
+            <w:pPr>
+              <w:spacing w:after="40" w:before="0" w:line="264"/>
+            </w:pPr>
+            <w:r>
+              <w:rPr>
+                <w:rFonts w:ascii="Arial" w:cs="Arial" w:eastAsia="Arial" w:hAnsi="Arial"/>
+                <w:b/>
+                <w:bCs/>
+                <w:sz w:val="20"/>
+                <w:szCs w:val="20"/>
+              </w:rPr>
+              <w:t xml:space="preserve">E-commerce margin analysis and ad expenses</w:t>
+            </w:r>
+          </w:p>
+          <w:p>
+            <w:pPr>
+              <w:spacing w:after="40" w:before="0" w:line="264"/>
+            </w:pPr>
+            <w:r>
+              <w:rPr>
+                <w:rFonts w:ascii="Arial" w:cs="Arial" w:eastAsia="Arial" w:hAnsi="Arial"/>
+                <w:i/>
+                <w:iCs/>
+                <w:color w:val="5B6477"/>
+                <w:sz w:val="15"/>
+                <w:szCs w:val="15"/>
+              </w:rPr>
+              <w:t xml:space="preserve">Flow F11 · E-commerce order to payout</w:t>
+            </w:r>
+          </w:p>
+          <w:p>
+            <w:pPr>
+              <w:spacing w:after="20" w:before="0" w:line="264"/>
+            </w:pPr>
+            <w:r>
+              <w:rPr>
+                <w:rFonts w:ascii="Arial" w:cs="Arial" w:eastAsia="Arial" w:hAnsi="Arial"/>
+                <w:color w:val="5B6477"/>
+                <w:sz w:val="19"/>
+                <w:szCs w:val="19"/>
+              </w:rPr>
+              <w:t xml:space="preserve">1.  </w:t>
+            </w:r>
+            <w:r>
+              <w:rPr>
+                <w:rFonts w:ascii="Arial" w:cs="Arial" w:eastAsia="Arial" w:hAnsi="Arial"/>
+                <w:sz w:val="19"/>
+                <w:szCs w:val="19"/>
+              </w:rPr>
+              <w:t xml:space="preserve">Open E-com Margin Analysis → choose a month and platform.</w:t>
+            </w:r>
+          </w:p>
+          <w:p>
+            <w:pPr>
+              <w:spacing w:after="20" w:before="0" w:line="264"/>
+            </w:pPr>
+            <w:r>
+              <w:rPr>
+                <w:rFonts w:ascii="Arial" w:cs="Arial" w:eastAsia="Arial" w:hAnsi="Arial"/>
+                <w:color w:val="5B6477"/>
+                <w:sz w:val="19"/>
+                <w:szCs w:val="19"/>
+              </w:rPr>
+              <w:t xml:space="preserve">2.  </w:t>
+            </w:r>
+            <w:r>
+              <w:rPr>
+                <w:rFonts w:ascii="Arial" w:cs="Arial" w:eastAsia="Arial" w:hAnsi="Arial"/>
+                <w:sz w:val="19"/>
+                <w:szCs w:val="19"/>
+              </w:rPr>
+              <w:t xml:space="preserve">Read Where the money goes (gross sales, platform fees, shipping, withholding tax, cost, contribution, margin).</w:t>
+            </w:r>
+          </w:p>
+          <w:p>
+            <w:pPr>
+              <w:spacing w:after="20" w:before="0" w:line="264"/>
+            </w:pPr>
+            <w:r>
+              <w:rPr>
+                <w:rFonts w:ascii="Arial" w:cs="Arial" w:eastAsia="Arial" w:hAnsi="Arial"/>
+                <w:color w:val="5B6477"/>
+                <w:sz w:val="19"/>
+                <w:szCs w:val="19"/>
+              </w:rPr>
+              <w:t xml:space="preserve">3.  </w:t>
+            </w:r>
+            <w:r>
+              <w:rPr>
+                <w:rFonts w:ascii="Arial" w:cs="Arial" w:eastAsia="Arial" w:hAnsi="Arial"/>
+                <w:sz w:val="19"/>
+                <w:szCs w:val="19"/>
+              </w:rPr>
+              <w:t xml:space="preserve">Press Add ad expense, type the platform, amount, reference and paid from → save.</w:t>
+            </w:r>
+          </w:p>
+          <w:p>
+            <w:pPr>
+              <w:spacing w:after="20" w:before="0" w:line="264"/>
+            </w:pPr>
+            <w:r>
+              <w:rPr>
+                <w:rFonts w:ascii="Arial" w:cs="Arial" w:eastAsia="Arial" w:hAnsi="Arial"/>
+                <w:color w:val="5B6477"/>
+                <w:sz w:val="19"/>
+                <w:szCs w:val="19"/>
+              </w:rPr>
+              <w:t xml:space="preserve">4.  </w:t>
+            </w:r>
+            <w:r>
+              <w:rPr>
+                <w:rFonts w:ascii="Arial" w:cs="Arial" w:eastAsia="Arial" w:hAnsi="Arial"/>
+                <w:sz w:val="19"/>
+                <w:szCs w:val="19"/>
+              </w:rPr>
+              <w:t xml:space="preserve">Type a Target margin % and read Is the pricing right? and the Price for target.</w:t>
+            </w:r>
+          </w:p>
+          <w:p>
+            <w:pPr>
+              <w:spacing w:after="0" w:before="60" w:line="264"/>
+            </w:pPr>
+            <w:r>
+              <w:rPr>
+                <w:rFonts w:ascii="Arial" w:cs="Arial" w:eastAsia="Arial" w:hAnsi="Arial"/>
+                <w:b/>
+                <w:bCs/>
+                <w:color w:val="0B1F3A"/>
+                <w:sz w:val="19"/>
+                <w:szCs w:val="19"/>
+              </w:rPr>
+              <w:t xml:space="preserve">You should see: </w:t>
+            </w:r>
+            <w:r>
+              <w:rPr>
+                <w:rFonts w:ascii="Arial" w:cs="Arial" w:eastAsia="Arial" w:hAnsi="Arial"/>
+                <w:sz w:val="19"/>
+                <w:szCs w:val="19"/>
+              </w:rPr>
+              <w:t xml:space="preserve">The ad expense is booked as advertising expense and reduces the contribution and margin at once. The suggested price for the target margin is shown, with each product.</w:t>
+            </w:r>
+          </w:p>
+        </w:tc>
+        <w:tc>
+          <w:tcPr>
+            <w:tcW w:type="dxa" w:w="620"/>
+            <w:tcBorders>
+              <w:top w:val="single" w:color="C9D0DC" w:sz="4"/>
+              <w:left w:val="single" w:color="C9D0DC" w:sz="4"/>
+              <w:bottom w:val="single" w:color="C9D0DC" w:sz="4"/>
+              <w:right w:val="single" w:color="C9D0DC" w:sz="4"/>
+            </w:tcBorders>
+            <w:tcMar>
+              <w:top w:type="dxa" w:w="70"/>
+              <w:left w:type="dxa" w:w="100"/>
+              <w:bottom w:type="dxa" w:w="70"/>
+              <w:right w:type="dxa" w:w="100"/>
+            </w:tcMar>
+            <w:vAlign w:val="center"/>
+          </w:tcPr>
+          <w:p>
+            <w:pPr>
+              <w:spacing w:after="0" w:before="0" w:line="264"/>
+              <w:jc w:val="center"/>
+            </w:pPr>
+            <w:r>
+              <w:rPr>
+                <w:rFonts w:ascii="Arial" w:cs="Arial" w:eastAsia="Arial" w:hAnsi="Arial"/>
+                <w:sz w:val="30"/>
+                <w:szCs w:val="30"/>
+              </w:rPr>
+              <w:t xml:space="preserve">☐</w:t>
+            </w:r>
+          </w:p>
+        </w:tc>
+        <w:tc>
+          <w:tcPr>
+            <w:tcW w:type="dxa" w:w="620"/>
+            <w:tcBorders>
+              <w:top w:val="single" w:color="C9D0DC" w:sz="4"/>
+              <w:left w:val="single" w:color="C9D0DC" w:sz="4"/>
+              <w:bottom w:val="single" w:color="C9D0DC" w:sz="4"/>
+              <w:right w:val="single" w:color="C9D0DC" w:sz="4"/>
+            </w:tcBorders>
+            <w:tcMar>
+              <w:top w:type="dxa" w:w="70"/>
+              <w:left w:type="dxa" w:w="100"/>
+              <w:bottom w:type="dxa" w:w="70"/>
+              <w:right w:type="dxa" w:w="100"/>
+            </w:tcMar>
+            <w:vAlign w:val="center"/>
+          </w:tcPr>
+          <w:p>
+            <w:pPr>
+              <w:spacing w:after="0" w:before="0" w:line="264"/>
+              <w:jc w:val="center"/>
+            </w:pPr>
+            <w:r>
+              <w:rPr>
+                <w:rFonts w:ascii="Arial" w:cs="Arial" w:eastAsia="Arial" w:hAnsi="Arial"/>
+                <w:sz w:val="30"/>
+                <w:szCs w:val="30"/>
+              </w:rPr>
+              <w:t xml:space="preserve">☐</w:t>
+            </w:r>
+          </w:p>
+        </w:tc>
+        <w:tc>
+          <w:tcPr>
+            <w:tcW w:type="dxa" w:w="620"/>
+            <w:tcBorders>
+              <w:top w:val="single" w:color="C9D0DC" w:sz="4"/>
+              <w:left w:val="single" w:color="C9D0DC" w:sz="4"/>
+              <w:bottom w:val="single" w:color="C9D0DC" w:sz="4"/>
+              <w:right w:val="single" w:color="C9D0DC" w:sz="4"/>
+            </w:tcBorders>
+            <w:tcMar>
+              <w:top w:type="dxa" w:w="70"/>
+              <w:left w:type="dxa" w:w="100"/>
+              <w:bottom w:type="dxa" w:w="70"/>
+              <w:right w:type="dxa" w:w="100"/>
+            </w:tcMar>
+            <w:vAlign w:val="center"/>
+          </w:tcPr>
+          <w:p>
+            <w:pPr>
+              <w:spacing w:after="0" w:before="0" w:line="264"/>
+              <w:jc w:val="center"/>
+            </w:pPr>
+            <w:r>
+              <w:rPr>
+                <w:rFonts w:ascii="Arial" w:cs="Arial" w:eastAsia="Arial" w:hAnsi="Arial"/>
+                <w:sz w:val="30"/>
+                <w:szCs w:val="30"/>
+              </w:rPr>
+              <w:t xml:space="preserve">☐</w:t>
+            </w:r>
+          </w:p>
+        </w:tc>
+        <w:tc>
+          <w:tcPr>
+            <w:tcW w:type="dxa" w:w="2040"/>
+            <w:tcBorders>
+              <w:top w:val="single" w:color="C9D0DC" w:sz="4"/>
+              <w:left w:val="single" w:color="C9D0DC" w:sz="4"/>
+              <w:bottom w:val="single" w:color="C9D0DC" w:sz="4"/>
+              <w:right w:val="single" w:color="C9D0DC" w:sz="4"/>
+            </w:tcBorders>
+            <w:tcMar>
+              <w:top w:type="dxa" w:w="70"/>
+              <w:left w:type="dxa" w:w="100"/>
+              <w:bottom w:type="dxa" w:w="70"/>
+              <w:right w:type="dxa" w:w="100"/>
+            </w:tcMar>
+            <w:vAlign w:val="top"/>
+          </w:tcPr>
+          <w:p>
+            <w:pPr>
+              <w:spacing w:after="0" w:before="0" w:line="264"/>
+            </w:pPr>
+            <w:r>
+              <w:rPr>
+                <w:rFonts w:ascii="Arial" w:cs="Arial" w:eastAsia="Arial" w:hAnsi="Arial"/>
+                <w:sz w:val="19"/>
+                <w:szCs w:val="19"/>
+              </w:rPr>
+              <w:t xml:space="preserve"> </w:t>
+            </w:r>
+          </w:p>
+        </w:tc>
+      </w:tr>
+      <w:tr>
+        <w:trPr>
+          <w:cantSplit/>
+        </w:trPr>
+        <w:tc>
+          <w:tcPr>
+            <w:tcW w:type="dxa" w:w="860"/>
+            <w:tcBorders>
+              <w:top w:val="single" w:color="C9D0DC" w:sz="4"/>
+              <w:left w:val="single" w:color="C9D0DC" w:sz="4"/>
+              <w:bottom w:val="single" w:color="C9D0DC" w:sz="4"/>
+              <w:right w:val="single" w:color="C9D0DC" w:sz="4"/>
+            </w:tcBorders>
+            <w:tcMar>
+              <w:top w:type="dxa" w:w="70"/>
+              <w:left w:type="dxa" w:w="100"/>
+              <w:bottom w:type="dxa" w:w="70"/>
+              <w:right w:type="dxa" w:w="100"/>
+            </w:tcMar>
+            <w:vAlign w:val="top"/>
+          </w:tcPr>
+          <w:p>
+            <w:pPr>
+              <w:spacing w:after="0" w:before="0" w:line="264"/>
+            </w:pPr>
+            <w:r>
+              <w:rPr>
+                <w:rFonts w:ascii="Arial" w:cs="Arial" w:eastAsia="Arial" w:hAnsi="Arial"/>
+                <w:b/>
+                <w:bCs/>
+                <w:color w:val="5B6477"/>
+                <w:sz w:val="16"/>
+                <w:szCs w:val="16"/>
+              </w:rPr>
+              <w:t xml:space="preserve">AD-26</w:t>
+            </w:r>
+          </w:p>
+        </w:tc>
+        <w:tc>
+          <w:tcPr>
+            <w:tcW w:type="dxa" w:w="5480"/>
+            <w:tcBorders>
+              <w:top w:val="single" w:color="C9D0DC" w:sz="4"/>
+              <w:left w:val="single" w:color="C9D0DC" w:sz="4"/>
+              <w:bottom w:val="single" w:color="C9D0DC" w:sz="4"/>
+              <w:right w:val="single" w:color="C9D0DC" w:sz="4"/>
+            </w:tcBorders>
+            <w:tcMar>
+              <w:top w:type="dxa" w:w="70"/>
+              <w:left w:type="dxa" w:w="100"/>
+              <w:bottom w:type="dxa" w:w="70"/>
+              <w:right w:type="dxa" w:w="100"/>
+            </w:tcMar>
+            <w:vAlign w:val="top"/>
+          </w:tcPr>
+          <w:p>
+            <w:pPr>
+              <w:spacing w:after="40" w:before="0" w:line="264"/>
+            </w:pPr>
+            <w:r>
+              <w:rPr>
+                <w:rFonts w:ascii="Arial" w:cs="Arial" w:eastAsia="Arial" w:hAnsi="Arial"/>
+                <w:b/>
+                <w:bCs/>
+                <w:sz w:val="20"/>
+                <w:szCs w:val="20"/>
+              </w:rPr>
+              <w:t xml:space="preserve">Write a memorandum as the Owner</w:t>
+            </w:r>
+          </w:p>
+          <w:p>
+            <w:pPr>
+              <w:spacing w:after="40" w:before="0" w:line="264"/>
+            </w:pPr>
+            <w:r>
+              <w:rPr>
+                <w:rFonts w:ascii="Arial" w:cs="Arial" w:eastAsia="Arial" w:hAnsi="Arial"/>
+                <w:i/>
+                <w:iCs/>
+                <w:color w:val="5B6477"/>
+                <w:sz w:val="15"/>
+                <w:szCs w:val="15"/>
+              </w:rPr>
+              <w:t xml:space="preserve">Flow F24 · Memorandum</w:t>
+            </w:r>
+          </w:p>
+          <w:p>
+            <w:pPr>
+              <w:spacing w:after="20" w:before="0" w:line="264"/>
+            </w:pPr>
+            <w:r>
+              <w:rPr>
+                <w:rFonts w:ascii="Arial" w:cs="Arial" w:eastAsia="Arial" w:hAnsi="Arial"/>
+                <w:color w:val="5B6477"/>
+                <w:sz w:val="19"/>
+                <w:szCs w:val="19"/>
+              </w:rPr>
+              <w:t xml:space="preserve">1.  </w:t>
+            </w:r>
+            <w:r>
+              <w:rPr>
+                <w:rFonts w:ascii="Arial" w:cs="Arial" w:eastAsia="Arial" w:hAnsi="Arial"/>
+                <w:sz w:val="19"/>
+                <w:szCs w:val="19"/>
+              </w:rPr>
+              <w:t xml:space="preserve">Open Memorandums → Write a memo.</w:t>
+            </w:r>
+          </w:p>
+          <w:p>
+            <w:pPr>
+              <w:spacing w:after="20" w:before="0" w:line="264"/>
+            </w:pPr>
+            <w:r>
+              <w:rPr>
+                <w:rFonts w:ascii="Arial" w:cs="Arial" w:eastAsia="Arial" w:hAnsi="Arial"/>
+                <w:color w:val="5B6477"/>
+                <w:sz w:val="19"/>
+                <w:szCs w:val="19"/>
+              </w:rPr>
+              <w:t xml:space="preserve">2.  </w:t>
+            </w:r>
+            <w:r>
+              <w:rPr>
+                <w:rFonts w:ascii="Arial" w:cs="Arial" w:eastAsia="Arial" w:hAnsi="Arial"/>
+                <w:sz w:val="19"/>
+                <w:szCs w:val="19"/>
+              </w:rPr>
+              <w:t xml:space="preserve">Choose Who it is for (for example franchise owners), type RE, the memo, add a table if wanted.</w:t>
+            </w:r>
+          </w:p>
+          <w:p>
+            <w:pPr>
+              <w:spacing w:after="20" w:before="0" w:line="264"/>
+            </w:pPr>
+            <w:r>
+              <w:rPr>
+                <w:rFonts w:ascii="Arial" w:cs="Arial" w:eastAsia="Arial" w:hAnsi="Arial"/>
+                <w:color w:val="5B6477"/>
+                <w:sz w:val="19"/>
+                <w:szCs w:val="19"/>
+              </w:rPr>
+              <w:t xml:space="preserve">3.  </w:t>
+            </w:r>
+            <w:r>
+              <w:rPr>
+                <w:rFonts w:ascii="Arial" w:cs="Arial" w:eastAsia="Arial" w:hAnsi="Arial"/>
+                <w:sz w:val="19"/>
+                <w:szCs w:val="19"/>
+              </w:rPr>
+              <w:t xml:space="preserve">Check the signers: AL MARVIN VINLUAN (President) and MICAH VINLUAN (Manager) must already be there. Add one more signer → Issue the memo.</w:t>
+            </w:r>
+          </w:p>
+          <w:p>
+            <w:pPr>
+              <w:spacing w:after="20" w:before="0" w:line="264"/>
+            </w:pPr>
+            <w:r>
+              <w:rPr>
+                <w:rFonts w:ascii="Arial" w:cs="Arial" w:eastAsia="Arial" w:hAnsi="Arial"/>
+                <w:color w:val="5B6477"/>
+                <w:sz w:val="19"/>
+                <w:szCs w:val="19"/>
+              </w:rPr>
+              <w:t xml:space="preserve">4.  </w:t>
+            </w:r>
+            <w:r>
+              <w:rPr>
+                <w:rFonts w:ascii="Arial" w:cs="Arial" w:eastAsia="Arial" w:hAnsi="Arial"/>
+                <w:sz w:val="19"/>
+                <w:szCs w:val="19"/>
+              </w:rPr>
+              <w:t xml:space="preserve">Press Print / download PDF.</w:t>
+            </w:r>
+          </w:p>
+          <w:p>
+            <w:pPr>
+              <w:spacing w:after="0" w:before="60" w:line="264"/>
+            </w:pPr>
+            <w:r>
+              <w:rPr>
+                <w:rFonts w:ascii="Arial" w:cs="Arial" w:eastAsia="Arial" w:hAnsi="Arial"/>
+                <w:b/>
+                <w:bCs/>
+                <w:color w:val="0B1F3A"/>
+                <w:sz w:val="19"/>
+                <w:szCs w:val="19"/>
+              </w:rPr>
+              <w:t xml:space="preserve">You should see: </w:t>
+            </w:r>
+            <w:r>
+              <w:rPr>
+                <w:rFonts w:ascii="Arial" w:cs="Arial" w:eastAsia="Arial" w:hAnsi="Arial"/>
+                <w:sz w:val="19"/>
+                <w:szCs w:val="19"/>
+              </w:rPr>
+              <w:t xml:space="preserve">The memo is numbered by itself (for example 2026-Q4-001) and printed on the letterhead. Everyone addressed gets a notice.</w:t>
+            </w:r>
+          </w:p>
+        </w:tc>
+        <w:tc>
+          <w:tcPr>
+            <w:tcW w:type="dxa" w:w="620"/>
+            <w:tcBorders>
+              <w:top w:val="single" w:color="C9D0DC" w:sz="4"/>
+              <w:left w:val="single" w:color="C9D0DC" w:sz="4"/>
+              <w:bottom w:val="single" w:color="C9D0DC" w:sz="4"/>
+              <w:right w:val="single" w:color="C9D0DC" w:sz="4"/>
+            </w:tcBorders>
+            <w:tcMar>
+              <w:top w:type="dxa" w:w="70"/>
+              <w:left w:type="dxa" w:w="100"/>
+              <w:bottom w:type="dxa" w:w="70"/>
+              <w:right w:type="dxa" w:w="100"/>
+            </w:tcMar>
+            <w:vAlign w:val="center"/>
+          </w:tcPr>
+          <w:p>
+            <w:pPr>
+              <w:spacing w:after="0" w:before="0" w:line="264"/>
+              <w:jc w:val="center"/>
+            </w:pPr>
+            <w:r>
+              <w:rPr>
+                <w:rFonts w:ascii="Arial" w:cs="Arial" w:eastAsia="Arial" w:hAnsi="Arial"/>
+                <w:sz w:val="30"/>
+                <w:szCs w:val="30"/>
+              </w:rPr>
+              <w:t xml:space="preserve">☐</w:t>
+            </w:r>
+          </w:p>
+        </w:tc>
+        <w:tc>
+          <w:tcPr>
+            <w:tcW w:type="dxa" w:w="620"/>
+            <w:tcBorders>
+              <w:top w:val="single" w:color="C9D0DC" w:sz="4"/>
+              <w:left w:val="single" w:color="C9D0DC" w:sz="4"/>
+              <w:bottom w:val="single" w:color="C9D0DC" w:sz="4"/>
+              <w:right w:val="single" w:color="C9D0DC" w:sz="4"/>
+            </w:tcBorders>
+            <w:tcMar>
+              <w:top w:type="dxa" w:w="70"/>
+              <w:left w:type="dxa" w:w="100"/>
+              <w:bottom w:type="dxa" w:w="70"/>
+              <w:right w:type="dxa" w:w="100"/>
+            </w:tcMar>
+            <w:vAlign w:val="center"/>
+          </w:tcPr>
+          <w:p>
+            <w:pPr>
+              <w:spacing w:after="0" w:before="0" w:line="264"/>
+              <w:jc w:val="center"/>
+            </w:pPr>
+            <w:r>
+              <w:rPr>
+                <w:rFonts w:ascii="Arial" w:cs="Arial" w:eastAsia="Arial" w:hAnsi="Arial"/>
+                <w:sz w:val="30"/>
+                <w:szCs w:val="30"/>
+              </w:rPr>
+              <w:t xml:space="preserve">☐</w:t>
+            </w:r>
+          </w:p>
+        </w:tc>
+        <w:tc>
+          <w:tcPr>
+            <w:tcW w:type="dxa" w:w="620"/>
+            <w:tcBorders>
+              <w:top w:val="single" w:color="C9D0DC" w:sz="4"/>
+              <w:left w:val="single" w:color="C9D0DC" w:sz="4"/>
+              <w:bottom w:val="single" w:color="C9D0DC" w:sz="4"/>
+              <w:right w:val="single" w:color="C9D0DC" w:sz="4"/>
+            </w:tcBorders>
+            <w:tcMar>
+              <w:top w:type="dxa" w:w="70"/>
+              <w:left w:type="dxa" w:w="100"/>
+              <w:bottom w:type="dxa" w:w="70"/>
+              <w:right w:type="dxa" w:w="100"/>
+            </w:tcMar>
+            <w:vAlign w:val="center"/>
+          </w:tcPr>
+          <w:p>
+            <w:pPr>
+              <w:spacing w:after="0" w:before="0" w:line="264"/>
+              <w:jc w:val="center"/>
+            </w:pPr>
+            <w:r>
+              <w:rPr>
+                <w:rFonts w:ascii="Arial" w:cs="Arial" w:eastAsia="Arial" w:hAnsi="Arial"/>
+                <w:sz w:val="30"/>
+                <w:szCs w:val="30"/>
+              </w:rPr>
+              <w:t xml:space="preserve">☐</w:t>
+            </w:r>
+          </w:p>
+        </w:tc>
+        <w:tc>
+          <w:tcPr>
+            <w:tcW w:type="dxa" w:w="2040"/>
+            <w:tcBorders>
+              <w:top w:val="single" w:color="C9D0DC" w:sz="4"/>
+              <w:left w:val="single" w:color="C9D0DC" w:sz="4"/>
+              <w:bottom w:val="single" w:color="C9D0DC" w:sz="4"/>
+              <w:right w:val="single" w:color="C9D0DC" w:sz="4"/>
+            </w:tcBorders>
+            <w:tcMar>
+              <w:top w:type="dxa" w:w="70"/>
+              <w:left w:type="dxa" w:w="100"/>
+              <w:bottom w:type="dxa" w:w="70"/>
+              <w:right w:type="dxa" w:w="100"/>
+            </w:tcMar>
+            <w:vAlign w:val="top"/>
+          </w:tcPr>
+          <w:p>
+            <w:pPr>
+              <w:spacing w:after="0" w:before="0" w:line="264"/>
+            </w:pPr>
+            <w:r>
+              <w:rPr>
+                <w:rFonts w:ascii="Arial" w:cs="Arial" w:eastAsia="Arial" w:hAnsi="Arial"/>
+                <w:sz w:val="19"/>
+                <w:szCs w:val="19"/>
+              </w:rPr>
+              <w:t xml:space="preserve"> </w:t>
+            </w:r>
+          </w:p>
+        </w:tc>
+      </w:tr>
+      <w:tr>
+        <w:trPr>
+          <w:cantSplit/>
+        </w:trPr>
+        <w:tc>
+          <w:tcPr>
+            <w:tcW w:type="dxa" w:w="860"/>
+            <w:tcBorders>
+              <w:top w:val="single" w:color="C9D0DC" w:sz="4"/>
+              <w:left w:val="single" w:color="C9D0DC" w:sz="4"/>
+              <w:bottom w:val="single" w:color="C9D0DC" w:sz="4"/>
+              <w:right w:val="single" w:color="C9D0DC" w:sz="4"/>
+            </w:tcBorders>
+            <w:tcMar>
+              <w:top w:type="dxa" w:w="70"/>
+              <w:left w:type="dxa" w:w="100"/>
+              <w:bottom w:type="dxa" w:w="70"/>
+              <w:right w:type="dxa" w:w="100"/>
+            </w:tcMar>
+            <w:vAlign w:val="top"/>
+          </w:tcPr>
+          <w:p>
+            <w:pPr>
+              <w:spacing w:after="0" w:before="0" w:line="264"/>
+            </w:pPr>
+            <w:r>
+              <w:rPr>
+                <w:rFonts w:ascii="Arial" w:cs="Arial" w:eastAsia="Arial" w:hAnsi="Arial"/>
+                <w:b/>
+                <w:bCs/>
+                <w:color w:val="5B6477"/>
+                <w:sz w:val="16"/>
+                <w:szCs w:val="16"/>
+              </w:rPr>
+              <w:t xml:space="preserve">AD-27</w:t>
+            </w:r>
+          </w:p>
+        </w:tc>
+        <w:tc>
+          <w:tcPr>
+            <w:tcW w:type="dxa" w:w="5480"/>
+            <w:tcBorders>
+              <w:top w:val="single" w:color="C9D0DC" w:sz="4"/>
+              <w:left w:val="single" w:color="C9D0DC" w:sz="4"/>
+              <w:bottom w:val="single" w:color="C9D0DC" w:sz="4"/>
+              <w:right w:val="single" w:color="C9D0DC" w:sz="4"/>
+            </w:tcBorders>
+            <w:tcMar>
+              <w:top w:type="dxa" w:w="70"/>
+              <w:left w:type="dxa" w:w="100"/>
+              <w:bottom w:type="dxa" w:w="70"/>
+              <w:right w:type="dxa" w:w="100"/>
+            </w:tcMar>
+            <w:vAlign w:val="top"/>
+          </w:tcPr>
+          <w:p>
+            <w:pPr>
+              <w:spacing w:after="40" w:before="0" w:line="264"/>
+            </w:pPr>
+            <w:r>
+              <w:rPr>
+                <w:rFonts w:ascii="Arial" w:cs="Arial" w:eastAsia="Arial" w:hAnsi="Arial"/>
+                <w:b/>
+                <w:bCs/>
+                <w:sz w:val="20"/>
+                <w:szCs w:val="20"/>
+              </w:rPr>
+              <w:t xml:space="preserve">Add an employee or user and HR is told</w:t>
+            </w:r>
+          </w:p>
+          <w:p>
+            <w:pPr>
+              <w:spacing w:after="20" w:before="0" w:line="264"/>
+            </w:pPr>
+            <w:r>
+              <w:rPr>
+                <w:rFonts w:ascii="Arial" w:cs="Arial" w:eastAsia="Arial" w:hAnsi="Arial"/>
+                <w:color w:val="5B6477"/>
+                <w:sz w:val="19"/>
+                <w:szCs w:val="19"/>
+              </w:rPr>
+              <w:t xml:space="preserve">1.  </w:t>
+            </w:r>
+            <w:r>
+              <w:rPr>
+                <w:rFonts w:ascii="Arial" w:cs="Arial" w:eastAsia="Arial" w:hAnsi="Arial"/>
+                <w:sz w:val="19"/>
+                <w:szCs w:val="19"/>
+              </w:rPr>
+              <w:t xml:space="preserve">Open Users &amp; Roles → New user (or Employees → Add) and save.</w:t>
+            </w:r>
+          </w:p>
+          <w:p>
+            <w:pPr>
+              <w:spacing w:after="20" w:before="0" w:line="264"/>
+            </w:pPr>
+            <w:r>
+              <w:rPr>
+                <w:rFonts w:ascii="Arial" w:cs="Arial" w:eastAsia="Arial" w:hAnsi="Arial"/>
+                <w:color w:val="5B6477"/>
+                <w:sz w:val="19"/>
+                <w:szCs w:val="19"/>
+              </w:rPr>
+              <w:t xml:space="preserve">2.  </w:t>
+            </w:r>
+            <w:r>
+              <w:rPr>
+                <w:rFonts w:ascii="Arial" w:cs="Arial" w:eastAsia="Arial" w:hAnsi="Arial"/>
+                <w:sz w:val="19"/>
+                <w:szCs w:val="19"/>
+              </w:rPr>
+              <w:t xml:space="preserve">Sign in as hr.staff and open Notifications.</w:t>
+            </w:r>
+          </w:p>
+          <w:p>
+            <w:pPr>
+              <w:spacing w:after="0" w:before="60" w:line="264"/>
+            </w:pPr>
+            <w:r>
+              <w:rPr>
+                <w:rFonts w:ascii="Arial" w:cs="Arial" w:eastAsia="Arial" w:hAnsi="Arial"/>
+                <w:b/>
+                <w:bCs/>
+                <w:color w:val="0B1F3A"/>
+                <w:sz w:val="19"/>
+                <w:szCs w:val="19"/>
+              </w:rPr>
+              <w:t xml:space="preserve">You should see: </w:t>
+            </w:r>
+            <w:r>
+              <w:rPr>
+                <w:rFonts w:ascii="Arial" w:cs="Arial" w:eastAsia="Arial" w:hAnsi="Arial"/>
+                <w:sz w:val="19"/>
+                <w:szCs w:val="19"/>
+              </w:rPr>
+              <w:t xml:space="preserve">HR has a notice naming the new user or employee and who added them.</w:t>
+            </w:r>
+          </w:p>
+        </w:tc>
+        <w:tc>
+          <w:tcPr>
+            <w:tcW w:type="dxa" w:w="620"/>
+            <w:tcBorders>
+              <w:top w:val="single" w:color="C9D0DC" w:sz="4"/>
+              <w:left w:val="single" w:color="C9D0DC" w:sz="4"/>
+              <w:bottom w:val="single" w:color="C9D0DC" w:sz="4"/>
+              <w:right w:val="single" w:color="C9D0DC" w:sz="4"/>
+            </w:tcBorders>
+            <w:tcMar>
+              <w:top w:type="dxa" w:w="70"/>
+              <w:left w:type="dxa" w:w="100"/>
+              <w:bottom w:type="dxa" w:w="70"/>
+              <w:right w:type="dxa" w:w="100"/>
+            </w:tcMar>
+            <w:vAlign w:val="center"/>
+          </w:tcPr>
+          <w:p>
+            <w:pPr>
+              <w:spacing w:after="0" w:before="0" w:line="264"/>
+              <w:jc w:val="center"/>
+            </w:pPr>
+            <w:r>
+              <w:rPr>
+                <w:rFonts w:ascii="Arial" w:cs="Arial" w:eastAsia="Arial" w:hAnsi="Arial"/>
+                <w:sz w:val="30"/>
+                <w:szCs w:val="30"/>
+              </w:rPr>
+              <w:t xml:space="preserve">☐</w:t>
+            </w:r>
+          </w:p>
+        </w:tc>
+        <w:tc>
+          <w:tcPr>
+            <w:tcW w:type="dxa" w:w="620"/>
+            <w:tcBorders>
+              <w:top w:val="single" w:color="C9D0DC" w:sz="4"/>
+              <w:left w:val="single" w:color="C9D0DC" w:sz="4"/>
+              <w:bottom w:val="single" w:color="C9D0DC" w:sz="4"/>
+              <w:right w:val="single" w:color="C9D0DC" w:sz="4"/>
+            </w:tcBorders>
+            <w:tcMar>
+              <w:top w:type="dxa" w:w="70"/>
+              <w:left w:type="dxa" w:w="100"/>
+              <w:bottom w:type="dxa" w:w="70"/>
+              <w:right w:type="dxa" w:w="100"/>
+            </w:tcMar>
+            <w:vAlign w:val="center"/>
+          </w:tcPr>
+          <w:p>
+            <w:pPr>
+              <w:spacing w:after="0" w:before="0" w:line="264"/>
+              <w:jc w:val="center"/>
+            </w:pPr>
+            <w:r>
+              <w:rPr>
+                <w:rFonts w:ascii="Arial" w:cs="Arial" w:eastAsia="Arial" w:hAnsi="Arial"/>
+                <w:sz w:val="30"/>
+                <w:szCs w:val="30"/>
+              </w:rPr>
+              <w:t xml:space="preserve">☐</w:t>
+            </w:r>
+          </w:p>
+        </w:tc>
+        <w:tc>
+          <w:tcPr>
+            <w:tcW w:type="dxa" w:w="620"/>
+            <w:tcBorders>
+              <w:top w:val="single" w:color="C9D0DC" w:sz="4"/>
+              <w:left w:val="single" w:color="C9D0DC" w:sz="4"/>
+              <w:bottom w:val="single" w:color="C9D0DC" w:sz="4"/>
+              <w:right w:val="single" w:color="C9D0DC" w:sz="4"/>
+            </w:tcBorders>
+            <w:tcMar>
+              <w:top w:type="dxa" w:w="70"/>
+              <w:left w:type="dxa" w:w="100"/>
+              <w:bottom w:type="dxa" w:w="70"/>
+              <w:right w:type="dxa" w:w="100"/>
+            </w:tcMar>
+            <w:vAlign w:val="center"/>
+          </w:tcPr>
+          <w:p>
+            <w:pPr>
+              <w:spacing w:after="0" w:before="0" w:line="264"/>
+              <w:jc w:val="center"/>
+            </w:pPr>
+            <w:r>
+              <w:rPr>
+                <w:rFonts w:ascii="Arial" w:cs="Arial" w:eastAsia="Arial" w:hAnsi="Arial"/>
+                <w:sz w:val="30"/>
+                <w:szCs w:val="30"/>
+              </w:rPr>
+              <w:t xml:space="preserve">☐</w:t>
+            </w:r>
+          </w:p>
+        </w:tc>
+        <w:tc>
+          <w:tcPr>
+            <w:tcW w:type="dxa" w:w="2040"/>
+            <w:tcBorders>
+              <w:top w:val="single" w:color="C9D0DC" w:sz="4"/>
+              <w:left w:val="single" w:color="C9D0DC" w:sz="4"/>
+              <w:bottom w:val="single" w:color="C9D0DC" w:sz="4"/>
+              <w:right w:val="single" w:color="C9D0DC" w:sz="4"/>
+            </w:tcBorders>
+            <w:tcMar>
+              <w:top w:type="dxa" w:w="70"/>
+              <w:left w:type="dxa" w:w="100"/>
+              <w:bottom w:type="dxa" w:w="70"/>
+              <w:right w:type="dxa" w:w="100"/>
+            </w:tcMar>
+            <w:vAlign w:val="top"/>
+          </w:tcPr>
+          <w:p>
+            <w:pPr>
+              <w:spacing w:after="0" w:before="0" w:line="264"/>
+            </w:pPr>
+            <w:r>
+              <w:rPr>
+                <w:rFonts w:ascii="Arial" w:cs="Arial" w:eastAsia="Arial" w:hAnsi="Arial"/>
+                <w:sz w:val="19"/>
+                <w:szCs w:val="19"/>
+              </w:rPr>
+              <w:t xml:space="preserve"> </w:t>
+            </w:r>
+          </w:p>
+        </w:tc>
+      </w:tr>
+      <w:tr>
+        <w:trPr>
+          <w:cantSplit/>
+        </w:trPr>
+        <w:tc>
+          <w:tcPr>
+            <w:tcW w:type="dxa" w:w="860"/>
+            <w:tcBorders>
+              <w:top w:val="single" w:color="C9D0DC" w:sz="4"/>
+              <w:left w:val="single" w:color="C9D0DC" w:sz="4"/>
+              <w:bottom w:val="single" w:color="C9D0DC" w:sz="4"/>
+              <w:right w:val="single" w:color="C9D0DC" w:sz="4"/>
+            </w:tcBorders>
+            <w:tcMar>
+              <w:top w:type="dxa" w:w="70"/>
+              <w:left w:type="dxa" w:w="100"/>
+              <w:bottom w:type="dxa" w:w="70"/>
+              <w:right w:type="dxa" w:w="100"/>
+            </w:tcMar>
+            <w:vAlign w:val="top"/>
+          </w:tcPr>
+          <w:p>
+            <w:pPr>
+              <w:spacing w:after="0" w:before="0" w:line="264"/>
+            </w:pPr>
+            <w:r>
+              <w:rPr>
+                <w:rFonts w:ascii="Arial" w:cs="Arial" w:eastAsia="Arial" w:hAnsi="Arial"/>
+                <w:b/>
+                <w:bCs/>
+                <w:color w:val="5B6477"/>
+                <w:sz w:val="16"/>
+                <w:szCs w:val="16"/>
+              </w:rPr>
+              <w:t xml:space="preserve">AD-28</w:t>
+            </w:r>
+          </w:p>
+        </w:tc>
+        <w:tc>
+          <w:tcPr>
+            <w:tcW w:type="dxa" w:w="5480"/>
+            <w:tcBorders>
+              <w:top w:val="single" w:color="C9D0DC" w:sz="4"/>
+              <w:left w:val="single" w:color="C9D0DC" w:sz="4"/>
+              <w:bottom w:val="single" w:color="C9D0DC" w:sz="4"/>
+              <w:right w:val="single" w:color="C9D0DC" w:sz="4"/>
+            </w:tcBorders>
+            <w:tcMar>
+              <w:top w:type="dxa" w:w="70"/>
+              <w:left w:type="dxa" w:w="100"/>
+              <w:bottom w:type="dxa" w:w="70"/>
+              <w:right w:type="dxa" w:w="100"/>
+            </w:tcMar>
+            <w:vAlign w:val="top"/>
+          </w:tcPr>
+          <w:p>
+            <w:pPr>
+              <w:spacing w:after="40" w:before="0" w:line="264"/>
+            </w:pPr>
+            <w:r>
+              <w:rPr>
+                <w:rFonts w:ascii="Arial" w:cs="Arial" w:eastAsia="Arial" w:hAnsi="Arial"/>
+                <w:b/>
+                <w:bCs/>
+                <w:sz w:val="20"/>
+                <w:szCs w:val="20"/>
+              </w:rPr>
+              <w:t xml:space="preserve">Approve a deposit slip check as the Owner</w:t>
+            </w:r>
+          </w:p>
+          <w:p>
+            <w:pPr>
+              <w:spacing w:after="40" w:before="0" w:line="264"/>
+            </w:pPr>
+            <w:r>
+              <w:rPr>
+                <w:rFonts w:ascii="Arial" w:cs="Arial" w:eastAsia="Arial" w:hAnsi="Arial"/>
+                <w:i/>
+                <w:iCs/>
+                <w:color w:val="5B6477"/>
+                <w:sz w:val="15"/>
+                <w:szCs w:val="15"/>
+              </w:rPr>
+              <w:t xml:space="preserve">Flow F22 · Cash deposit slip and its two checks</w:t>
+            </w:r>
+          </w:p>
+          <w:p>
+            <w:pPr>
+              <w:spacing w:after="20" w:before="0" w:line="264"/>
+            </w:pPr>
+            <w:r>
+              <w:rPr>
+                <w:rFonts w:ascii="Arial" w:cs="Arial" w:eastAsia="Arial" w:hAnsi="Arial"/>
+                <w:color w:val="5B6477"/>
+                <w:sz w:val="19"/>
+                <w:szCs w:val="19"/>
+              </w:rPr>
+              <w:t xml:space="preserve">1.  </w:t>
+            </w:r>
+            <w:r>
+              <w:rPr>
+                <w:rFonts w:ascii="Arial" w:cs="Arial" w:eastAsia="Arial" w:hAnsi="Arial"/>
+                <w:sz w:val="19"/>
+                <w:szCs w:val="19"/>
+              </w:rPr>
+              <w:t xml:space="preserve">Open My Approvals → Cash deposit slip (audit or accounting).</w:t>
+            </w:r>
+          </w:p>
+          <w:p>
+            <w:pPr>
+              <w:spacing w:after="20" w:before="0" w:line="264"/>
+            </w:pPr>
+            <w:r>
+              <w:rPr>
+                <w:rFonts w:ascii="Arial" w:cs="Arial" w:eastAsia="Arial" w:hAnsi="Arial"/>
+                <w:color w:val="5B6477"/>
+                <w:sz w:val="19"/>
+                <w:szCs w:val="19"/>
+              </w:rPr>
+              <w:t xml:space="preserve">2.  </w:t>
+            </w:r>
+            <w:r>
+              <w:rPr>
+                <w:rFonts w:ascii="Arial" w:cs="Arial" w:eastAsia="Arial" w:hAnsi="Arial"/>
+                <w:sz w:val="19"/>
+                <w:szCs w:val="19"/>
+              </w:rPr>
+              <w:t xml:space="preserve">Open the slip, compare amount, bank and date → Approve (or Reject with a reason).</w:t>
+            </w:r>
+          </w:p>
+          <w:p>
+            <w:pPr>
+              <w:spacing w:after="0" w:before="60" w:line="264"/>
+            </w:pPr>
+            <w:r>
+              <w:rPr>
+                <w:rFonts w:ascii="Arial" w:cs="Arial" w:eastAsia="Arial" w:hAnsi="Arial"/>
+                <w:b/>
+                <w:bCs/>
+                <w:color w:val="0B1F3A"/>
+                <w:sz w:val="19"/>
+                <w:szCs w:val="19"/>
+              </w:rPr>
+              <w:t xml:space="preserve">You should see: </w:t>
+            </w:r>
+            <w:r>
+              <w:rPr>
+                <w:rFonts w:ascii="Arial" w:cs="Arial" w:eastAsia="Arial" w:hAnsi="Arial"/>
+                <w:sz w:val="19"/>
+                <w:szCs w:val="19"/>
+              </w:rPr>
+              <w:t xml:space="preserve">The Owner may decide in place of the Audit or Accounting Associate. The decision is recorded with your name.</w:t>
+            </w:r>
+          </w:p>
+        </w:tc>
+        <w:tc>
+          <w:tcPr>
+            <w:tcW w:type="dxa" w:w="620"/>
+            <w:tcBorders>
+              <w:top w:val="single" w:color="C9D0DC" w:sz="4"/>
+              <w:left w:val="single" w:color="C9D0DC" w:sz="4"/>
+              <w:bottom w:val="single" w:color="C9D0DC" w:sz="4"/>
+              <w:right w:val="single" w:color="C9D0DC" w:sz="4"/>
+            </w:tcBorders>
+            <w:tcMar>
+              <w:top w:type="dxa" w:w="70"/>
+              <w:left w:type="dxa" w:w="100"/>
+              <w:bottom w:type="dxa" w:w="70"/>
+              <w:right w:type="dxa" w:w="100"/>
+            </w:tcMar>
+            <w:vAlign w:val="center"/>
+          </w:tcPr>
+          <w:p>
+            <w:pPr>
+              <w:spacing w:after="0" w:before="0" w:line="264"/>
+              <w:jc w:val="center"/>
+            </w:pPr>
+            <w:r>
+              <w:rPr>
+                <w:rFonts w:ascii="Arial" w:cs="Arial" w:eastAsia="Arial" w:hAnsi="Arial"/>
+                <w:sz w:val="30"/>
+                <w:szCs w:val="30"/>
+              </w:rPr>
+              <w:t xml:space="preserve">☐</w:t>
+            </w:r>
+          </w:p>
+        </w:tc>
+        <w:tc>
+          <w:tcPr>
+            <w:tcW w:type="dxa" w:w="620"/>
+            <w:tcBorders>
+              <w:top w:val="single" w:color="C9D0DC" w:sz="4"/>
+              <w:left w:val="single" w:color="C9D0DC" w:sz="4"/>
+              <w:bottom w:val="single" w:color="C9D0DC" w:sz="4"/>
+              <w:right w:val="single" w:color="C9D0DC" w:sz="4"/>
+            </w:tcBorders>
+            <w:tcMar>
+              <w:top w:type="dxa" w:w="70"/>
+              <w:left w:type="dxa" w:w="100"/>
+              <w:bottom w:type="dxa" w:w="70"/>
+              <w:right w:type="dxa" w:w="100"/>
+            </w:tcMar>
+            <w:vAlign w:val="center"/>
+          </w:tcPr>
+          <w:p>
+            <w:pPr>
+              <w:spacing w:after="0" w:before="0" w:line="264"/>
+              <w:jc w:val="center"/>
+            </w:pPr>
+            <w:r>
+              <w:rPr>
+                <w:rFonts w:ascii="Arial" w:cs="Arial" w:eastAsia="Arial" w:hAnsi="Arial"/>
+                <w:sz w:val="30"/>
+                <w:szCs w:val="30"/>
+              </w:rPr>
+              <w:t xml:space="preserve">☐</w:t>
+            </w:r>
+          </w:p>
+        </w:tc>
+        <w:tc>
+          <w:tcPr>
+            <w:tcW w:type="dxa" w:w="620"/>
+            <w:tcBorders>
+              <w:top w:val="single" w:color="C9D0DC" w:sz="4"/>
+              <w:left w:val="single" w:color="C9D0DC" w:sz="4"/>
+              <w:bottom w:val="single" w:color="C9D0DC" w:sz="4"/>
+              <w:right w:val="single" w:color="C9D0DC" w:sz="4"/>
+            </w:tcBorders>
+            <w:tcMar>
+              <w:top w:type="dxa" w:w="70"/>
+              <w:left w:type="dxa" w:w="100"/>
+              <w:bottom w:type="dxa" w:w="70"/>
+              <w:right w:type="dxa" w:w="100"/>
+            </w:tcMar>
+            <w:vAlign w:val="center"/>
+          </w:tcPr>
+          <w:p>
+            <w:pPr>
+              <w:spacing w:after="0" w:before="0" w:line="264"/>
+              <w:jc w:val="center"/>
+            </w:pPr>
+            <w:r>
+              <w:rPr>
+                <w:rFonts w:ascii="Arial" w:cs="Arial" w:eastAsia="Arial" w:hAnsi="Arial"/>
+                <w:sz w:val="30"/>
+                <w:szCs w:val="30"/>
+              </w:rPr>
+              <w:t xml:space="preserve">☐</w:t>
+            </w:r>
+          </w:p>
+        </w:tc>
+        <w:tc>
+          <w:tcPr>
+            <w:tcW w:type="dxa" w:w="2040"/>
+            <w:tcBorders>
+              <w:top w:val="single" w:color="C9D0DC" w:sz="4"/>
+              <w:left w:val="single" w:color="C9D0DC" w:sz="4"/>
+              <w:bottom w:val="single" w:color="C9D0DC" w:sz="4"/>
+              <w:right w:val="single" w:color="C9D0DC" w:sz="4"/>
+            </w:tcBorders>
+            <w:tcMar>
+              <w:top w:type="dxa" w:w="70"/>
+              <w:left w:type="dxa" w:w="100"/>
+              <w:bottom w:type="dxa" w:w="70"/>
+              <w:right w:type="dxa" w:w="100"/>
+            </w:tcMar>
+            <w:vAlign w:val="top"/>
+          </w:tcPr>
+          <w:p>
+            <w:pPr>
+              <w:spacing w:after="0" w:before="0" w:line="264"/>
+            </w:pPr>
+            <w:r>
+              <w:rPr>
+                <w:rFonts w:ascii="Arial" w:cs="Arial" w:eastAsia="Arial" w:hAnsi="Arial"/>
+                <w:sz w:val="19"/>
+                <w:szCs w:val="19"/>
+              </w:rPr>
+              <w:t xml:space="preserve"> </w:t>
+            </w:r>
+          </w:p>
+        </w:tc>
+      </w:tr>
+      <w:tr>
+        <w:trPr>
+          <w:cantSplit/>
+        </w:trPr>
+        <w:tc>
+          <w:tcPr>
+            <w:tcW w:type="dxa" w:w="860"/>
+            <w:tcBorders>
+              <w:top w:val="single" w:color="C9D0DC" w:sz="4"/>
+              <w:left w:val="single" w:color="C9D0DC" w:sz="4"/>
+              <w:bottom w:val="single" w:color="C9D0DC" w:sz="4"/>
+              <w:right w:val="single" w:color="C9D0DC" w:sz="4"/>
+            </w:tcBorders>
+            <w:tcMar>
+              <w:top w:type="dxa" w:w="70"/>
+              <w:left w:type="dxa" w:w="100"/>
+              <w:bottom w:type="dxa" w:w="70"/>
+              <w:right w:type="dxa" w:w="100"/>
+            </w:tcMar>
+            <w:vAlign w:val="top"/>
+          </w:tcPr>
+          <w:p>
+            <w:pPr>
+              <w:spacing w:after="0" w:before="0" w:line="264"/>
+            </w:pPr>
+            <w:r>
+              <w:rPr>
+                <w:rFonts w:ascii="Arial" w:cs="Arial" w:eastAsia="Arial" w:hAnsi="Arial"/>
+                <w:b/>
+                <w:bCs/>
+                <w:color w:val="5B6477"/>
+                <w:sz w:val="16"/>
+                <w:szCs w:val="16"/>
+              </w:rPr>
+              <w:t xml:space="preserve">AD-29</w:t>
+            </w:r>
+          </w:p>
+        </w:tc>
+        <w:tc>
+          <w:tcPr>
+            <w:tcW w:type="dxa" w:w="5480"/>
+            <w:tcBorders>
+              <w:top w:val="single" w:color="C9D0DC" w:sz="4"/>
+              <w:left w:val="single" w:color="C9D0DC" w:sz="4"/>
+              <w:bottom w:val="single" w:color="C9D0DC" w:sz="4"/>
+              <w:right w:val="single" w:color="C9D0DC" w:sz="4"/>
+            </w:tcBorders>
+            <w:tcMar>
+              <w:top w:type="dxa" w:w="70"/>
+              <w:left w:type="dxa" w:w="100"/>
+              <w:bottom w:type="dxa" w:w="70"/>
+              <w:right w:type="dxa" w:w="100"/>
+            </w:tcMar>
+            <w:vAlign w:val="top"/>
+          </w:tcPr>
+          <w:p>
+            <w:pPr>
+              <w:spacing w:after="40" w:before="0" w:line="264"/>
+            </w:pPr>
+            <w:r>
+              <w:rPr>
+                <w:rFonts w:ascii="Arial" w:cs="Arial" w:eastAsia="Arial" w:hAnsi="Arial"/>
+                <w:b/>
+                <w:bCs/>
+                <w:sz w:val="20"/>
+                <w:szCs w:val="20"/>
+              </w:rPr>
+              <w:t xml:space="preserve">Waybill report</w:t>
+            </w:r>
+          </w:p>
+          <w:p>
+            <w:pPr>
+              <w:spacing w:after="40" w:before="0" w:line="264"/>
+            </w:pPr>
+            <w:r>
+              <w:rPr>
+                <w:rFonts w:ascii="Arial" w:cs="Arial" w:eastAsia="Arial" w:hAnsi="Arial"/>
+                <w:i/>
+                <w:iCs/>
+                <w:color w:val="5B6477"/>
+                <w:sz w:val="15"/>
+                <w:szCs w:val="15"/>
+              </w:rPr>
+              <w:t xml:space="preserve">Flow F25 · Waybills to e-commerce report</w:t>
+            </w:r>
+          </w:p>
+          <w:p>
+            <w:pPr>
+              <w:spacing w:after="20" w:before="0" w:line="264"/>
+            </w:pPr>
+            <w:r>
+              <w:rPr>
+                <w:rFonts w:ascii="Arial" w:cs="Arial" w:eastAsia="Arial" w:hAnsi="Arial"/>
+                <w:color w:val="5B6477"/>
+                <w:sz w:val="19"/>
+                <w:szCs w:val="19"/>
+              </w:rPr>
+              <w:t xml:space="preserve">1.  </w:t>
+            </w:r>
+            <w:r>
+              <w:rPr>
+                <w:rFonts w:ascii="Arial" w:cs="Arial" w:eastAsia="Arial" w:hAnsi="Arial"/>
+                <w:sz w:val="19"/>
+                <w:szCs w:val="19"/>
+              </w:rPr>
+              <w:t xml:space="preserve">Open Waybill Report → upload the TikTok / Shopee / Lazada label PDFs.</w:t>
+            </w:r>
+          </w:p>
+          <w:p>
+            <w:pPr>
+              <w:spacing w:after="20" w:before="0" w:line="264"/>
+            </w:pPr>
+            <w:r>
+              <w:rPr>
+                <w:rFonts w:ascii="Arial" w:cs="Arial" w:eastAsia="Arial" w:hAnsi="Arial"/>
+                <w:color w:val="5B6477"/>
+                <w:sz w:val="19"/>
+                <w:szCs w:val="19"/>
+              </w:rPr>
+              <w:t xml:space="preserve">2.  </w:t>
+            </w:r>
+            <w:r>
+              <w:rPr>
+                <w:rFonts w:ascii="Arial" w:cs="Arial" w:eastAsia="Arial" w:hAnsi="Arial"/>
+                <w:sz w:val="19"/>
+                <w:szCs w:val="19"/>
+              </w:rPr>
+              <w:t xml:space="preserve">Choose the product for each → Confirm. Read SRP, platform fees and order income. Press Download Excel.</w:t>
+            </w:r>
+          </w:p>
+          <w:p>
+            <w:pPr>
+              <w:spacing w:after="0" w:before="60" w:line="264"/>
+            </w:pPr>
+            <w:r>
+              <w:rPr>
+                <w:rFonts w:ascii="Arial" w:cs="Arial" w:eastAsia="Arial" w:hAnsi="Arial"/>
+                <w:b/>
+                <w:bCs/>
+                <w:color w:val="0B1F3A"/>
+                <w:sz w:val="19"/>
+                <w:szCs w:val="19"/>
+              </w:rPr>
+              <w:t xml:space="preserve">You should see: </w:t>
+            </w:r>
+            <w:r>
+              <w:rPr>
+                <w:rFonts w:ascii="Arial" w:cs="Arial" w:eastAsia="Arial" w:hAnsi="Arial"/>
+                <w:sz w:val="19"/>
+                <w:szCs w:val="19"/>
+              </w:rPr>
+              <w:t xml:space="preserve">SRP comes from the platform price list with centavos. Fees use the rates under Platform fee rates used. The same platform and weight is filled in next time.</w:t>
+            </w:r>
+          </w:p>
+        </w:tc>
+        <w:tc>
+          <w:tcPr>
+            <w:tcW w:type="dxa" w:w="620"/>
+            <w:tcBorders>
+              <w:top w:val="single" w:color="C9D0DC" w:sz="4"/>
+              <w:left w:val="single" w:color="C9D0DC" w:sz="4"/>
+              <w:bottom w:val="single" w:color="C9D0DC" w:sz="4"/>
+              <w:right w:val="single" w:color="C9D0DC" w:sz="4"/>
+            </w:tcBorders>
+            <w:tcMar>
+              <w:top w:type="dxa" w:w="70"/>
+              <w:left w:type="dxa" w:w="100"/>
+              <w:bottom w:type="dxa" w:w="70"/>
+              <w:right w:type="dxa" w:w="100"/>
+            </w:tcMar>
+            <w:vAlign w:val="center"/>
+          </w:tcPr>
+          <w:p>
+            <w:pPr>
+              <w:spacing w:after="0" w:before="0" w:line="264"/>
+              <w:jc w:val="center"/>
+            </w:pPr>
+            <w:r>
+              <w:rPr>
+                <w:rFonts w:ascii="Arial" w:cs="Arial" w:eastAsia="Arial" w:hAnsi="Arial"/>
+                <w:sz w:val="30"/>
+                <w:szCs w:val="30"/>
+              </w:rPr>
+              <w:t xml:space="preserve">☐</w:t>
+            </w:r>
+          </w:p>
+        </w:tc>
+        <w:tc>
+          <w:tcPr>
+            <w:tcW w:type="dxa" w:w="620"/>
+            <w:tcBorders>
+              <w:top w:val="single" w:color="C9D0DC" w:sz="4"/>
+              <w:left w:val="single" w:color="C9D0DC" w:sz="4"/>
+              <w:bottom w:val="single" w:color="C9D0DC" w:sz="4"/>
+              <w:right w:val="single" w:color="C9D0DC" w:sz="4"/>
+            </w:tcBorders>
+            <w:tcMar>
+              <w:top w:type="dxa" w:w="70"/>
+              <w:left w:type="dxa" w:w="100"/>
+              <w:bottom w:type="dxa" w:w="70"/>
+              <w:right w:type="dxa" w:w="100"/>
+            </w:tcMar>
+            <w:vAlign w:val="center"/>
+          </w:tcPr>
+          <w:p>
+            <w:pPr>
+              <w:spacing w:after="0" w:before="0" w:line="264"/>
+              <w:jc w:val="center"/>
+            </w:pPr>
+            <w:r>
+              <w:rPr>
+                <w:rFonts w:ascii="Arial" w:cs="Arial" w:eastAsia="Arial" w:hAnsi="Arial"/>
+                <w:sz w:val="30"/>
+                <w:szCs w:val="30"/>
+              </w:rPr>
+              <w:t xml:space="preserve">☐</w:t>
+            </w:r>
+          </w:p>
+        </w:tc>
+        <w:tc>
+          <w:tcPr>
+            <w:tcW w:type="dxa" w:w="620"/>
+            <w:tcBorders>
+              <w:top w:val="single" w:color="C9D0DC" w:sz="4"/>
+              <w:left w:val="single" w:color="C9D0DC" w:sz="4"/>
+              <w:bottom w:val="single" w:color="C9D0DC" w:sz="4"/>
+              <w:right w:val="single" w:color="C9D0DC" w:sz="4"/>
+            </w:tcBorders>
+            <w:tcMar>
+              <w:top w:type="dxa" w:w="70"/>
+              <w:left w:type="dxa" w:w="100"/>
+              <w:bottom w:type="dxa" w:w="70"/>
+              <w:right w:type="dxa" w:w="100"/>
+            </w:tcMar>
+            <w:vAlign w:val="center"/>
+          </w:tcPr>
+          <w:p>
+            <w:pPr>
+              <w:spacing w:after="0" w:before="0" w:line="264"/>
+              <w:jc w:val="center"/>
+            </w:pPr>
+            <w:r>
+              <w:rPr>
+                <w:rFonts w:ascii="Arial" w:cs="Arial" w:eastAsia="Arial" w:hAnsi="Arial"/>
+                <w:sz w:val="30"/>
+                <w:szCs w:val="30"/>
+              </w:rPr>
+              <w:t xml:space="preserve">☐</w:t>
+            </w:r>
+          </w:p>
+        </w:tc>
+        <w:tc>
+          <w:tcPr>
+            <w:tcW w:type="dxa" w:w="2040"/>
+            <w:tcBorders>
+              <w:top w:val="single" w:color="C9D0DC" w:sz="4"/>
+              <w:left w:val="single" w:color="C9D0DC" w:sz="4"/>
+              <w:bottom w:val="single" w:color="C9D0DC" w:sz="4"/>
+              <w:right w:val="single" w:color="C9D0DC" w:sz="4"/>
+            </w:tcBorders>
+            <w:tcMar>
+              <w:top w:type="dxa" w:w="70"/>
+              <w:left w:type="dxa" w:w="100"/>
+              <w:bottom w:type="dxa" w:w="70"/>
+              <w:right w:type="dxa" w:w="100"/>
+            </w:tcMar>
+            <w:vAlign w:val="top"/>
+          </w:tcPr>
+          <w:p>
+            <w:pPr>
+              <w:spacing w:after="0" w:before="0" w:line="264"/>
+            </w:pPr>
+            <w:r>
+              <w:rPr>
+                <w:rFonts w:ascii="Arial" w:cs="Arial" w:eastAsia="Arial" w:hAnsi="Arial"/>
+                <w:sz w:val="19"/>
+                <w:szCs w:val="19"/>
+              </w:rPr>
+              <w:t xml:space="preserve"> </w:t>
+            </w:r>
+          </w:p>
+        </w:tc>
+      </w:tr>
+      <w:tr>
+        <w:trPr>
+          <w:cantSplit/>
+        </w:trPr>
+        <w:tc>
+          <w:tcPr>
+            <w:tcW w:type="dxa" w:w="860"/>
+            <w:tcBorders>
+              <w:top w:val="single" w:color="C9D0DC" w:sz="4"/>
+              <w:left w:val="single" w:color="C9D0DC" w:sz="4"/>
+              <w:bottom w:val="single" w:color="C9D0DC" w:sz="4"/>
+              <w:right w:val="single" w:color="C9D0DC" w:sz="4"/>
+            </w:tcBorders>
+            <w:tcMar>
+              <w:top w:type="dxa" w:w="70"/>
+              <w:left w:type="dxa" w:w="100"/>
+              <w:bottom w:type="dxa" w:w="70"/>
+              <w:right w:type="dxa" w:w="100"/>
+            </w:tcMar>
+            <w:vAlign w:val="top"/>
+          </w:tcPr>
+          <w:p>
+            <w:pPr>
+              <w:spacing w:after="0" w:before="0" w:line="264"/>
+            </w:pPr>
+            <w:r>
+              <w:rPr>
+                <w:rFonts w:ascii="Arial" w:cs="Arial" w:eastAsia="Arial" w:hAnsi="Arial"/>
+                <w:b/>
+                <w:bCs/>
+                <w:color w:val="5B6477"/>
+                <w:sz w:val="16"/>
+                <w:szCs w:val="16"/>
+              </w:rPr>
+              <w:t xml:space="preserve">AD-30</w:t>
+            </w:r>
+          </w:p>
+        </w:tc>
+        <w:tc>
+          <w:tcPr>
+            <w:tcW w:type="dxa" w:w="5480"/>
+            <w:tcBorders>
+              <w:top w:val="single" w:color="C9D0DC" w:sz="4"/>
+              <w:left w:val="single" w:color="C9D0DC" w:sz="4"/>
+              <w:bottom w:val="single" w:color="C9D0DC" w:sz="4"/>
+              <w:right w:val="single" w:color="C9D0DC" w:sz="4"/>
+            </w:tcBorders>
+            <w:tcMar>
+              <w:top w:type="dxa" w:w="70"/>
+              <w:left w:type="dxa" w:w="100"/>
+              <w:bottom w:type="dxa" w:w="70"/>
+              <w:right w:type="dxa" w:w="100"/>
+            </w:tcMar>
+            <w:vAlign w:val="top"/>
+          </w:tcPr>
+          <w:p>
+            <w:pPr>
+              <w:spacing w:after="40" w:before="0" w:line="264"/>
+            </w:pPr>
+            <w:r>
+              <w:rPr>
+                <w:rFonts w:ascii="Arial" w:cs="Arial" w:eastAsia="Arial" w:hAnsi="Arial"/>
+                <w:b/>
+                <w:bCs/>
+                <w:sz w:val="20"/>
+                <w:szCs w:val="20"/>
+              </w:rPr>
+              <w:t xml:space="preserve">Change your own password</w:t>
+            </w:r>
+          </w:p>
+          <w:p>
+            <w:pPr>
+              <w:spacing w:after="20" w:before="0" w:line="264"/>
+            </w:pPr>
+            <w:r>
+              <w:rPr>
+                <w:rFonts w:ascii="Arial" w:cs="Arial" w:eastAsia="Arial" w:hAnsi="Arial"/>
+                <w:color w:val="5B6477"/>
+                <w:sz w:val="19"/>
+                <w:szCs w:val="19"/>
+              </w:rPr>
+              <w:t xml:space="preserve">1.  </w:t>
+            </w:r>
+            <w:r>
+              <w:rPr>
+                <w:rFonts w:ascii="Arial" w:cs="Arial" w:eastAsia="Arial" w:hAnsi="Arial"/>
+                <w:sz w:val="19"/>
+                <w:szCs w:val="19"/>
+              </w:rPr>
+              <w:t xml:space="preserve">Press the key icon at the top right (Change my password).</w:t>
+            </w:r>
+          </w:p>
+          <w:p>
+            <w:pPr>
+              <w:spacing w:after="20" w:before="0" w:line="264"/>
+            </w:pPr>
+            <w:r>
+              <w:rPr>
+                <w:rFonts w:ascii="Arial" w:cs="Arial" w:eastAsia="Arial" w:hAnsi="Arial"/>
+                <w:color w:val="5B6477"/>
+                <w:sz w:val="19"/>
+                <w:szCs w:val="19"/>
+              </w:rPr>
+              <w:t xml:space="preserve">2.  </w:t>
+            </w:r>
+            <w:r>
+              <w:rPr>
+                <w:rFonts w:ascii="Arial" w:cs="Arial" w:eastAsia="Arial" w:hAnsi="Arial"/>
+                <w:sz w:val="19"/>
+                <w:szCs w:val="19"/>
+              </w:rPr>
+              <w:t xml:space="preserve">Type the current password and a new one of 10 or more characters, twice → Change password.</w:t>
+            </w:r>
+          </w:p>
+          <w:p>
+            <w:pPr>
+              <w:spacing w:after="20" w:before="0" w:line="264"/>
+            </w:pPr>
+            <w:r>
+              <w:rPr>
+                <w:rFonts w:ascii="Arial" w:cs="Arial" w:eastAsia="Arial" w:hAnsi="Arial"/>
+                <w:color w:val="5B6477"/>
+                <w:sz w:val="19"/>
+                <w:szCs w:val="19"/>
+              </w:rPr>
+              <w:t xml:space="preserve">3.  </w:t>
+            </w:r>
+            <w:r>
+              <w:rPr>
+                <w:rFonts w:ascii="Arial" w:cs="Arial" w:eastAsia="Arial" w:hAnsi="Arial"/>
+                <w:sz w:val="19"/>
+                <w:szCs w:val="19"/>
+              </w:rPr>
+              <w:t xml:space="preserve">Sign out and sign in again with the new password. Then change it back to ChangeMe!2026 for the next tester.</w:t>
+            </w:r>
+          </w:p>
+          <w:p>
+            <w:pPr>
+              <w:spacing w:after="0" w:before="60" w:line="264"/>
+            </w:pPr>
+            <w:r>
+              <w:rPr>
+                <w:rFonts w:ascii="Arial" w:cs="Arial" w:eastAsia="Arial" w:hAnsi="Arial"/>
+                <w:b/>
+                <w:bCs/>
+                <w:color w:val="0B1F3A"/>
+                <w:sz w:val="19"/>
+                <w:szCs w:val="19"/>
+              </w:rPr>
+              <w:t xml:space="preserve">You should see: </w:t>
+            </w:r>
+            <w:r>
+              <w:rPr>
+                <w:rFonts w:ascii="Arial" w:cs="Arial" w:eastAsia="Arial" w:hAnsi="Arial"/>
+                <w:sz w:val="19"/>
+                <w:szCs w:val="19"/>
+              </w:rPr>
+              <w:t xml:space="preserve">The new password works. Nobody else can see it. HR receives a notice that you changed it (not the password).</w:t>
             </w:r>
           </w:p>
         </w:tc>
@@ -7088,7 +9801,7 @@
                 <w:sz w:val="17"/>
                 <w:szCs w:val="17"/>
               </w:rPr>
-              <w:t xml:space="preserve">Passed (of 23)</w:t>
+              <w:t xml:space="preserve">Passed (of 32)</w:t>
             </w:r>
           </w:p>
         </w:tc>

</xml_diff>

<commit_message>
Sales to franchises for sales associates and the Franchise Coordinator; franchise shipping charge to follow (own franchise invoice, Owner-approved changes, 2-day reminders); plastic prices; guides and acceptance tests updated
Co-Authored-By: Claude Sonnet 5.5 <noreply@anthropic.com>
Claude-Session: https://claude.ai/code/session_01611rAAsm4xgneCTG3N9mPf
</commit_message>
<xml_diff>
--- a/docs/acceptance-test/per-user/01-admin.docx
+++ b/docs/acceptance-test/per-user/01-admin.docx
@@ -117,7 +117,7 @@
           <w:sz w:val="18"/>
           <w:szCs w:val="18"/>
         </w:rPr>
-        <w:t xml:space="preserve">  ·  32 checks</w:t>
+        <w:t xml:space="preserve">  ·  33 checks</w:t>
       </w:r>
     </w:p>
     <w:tbl>
@@ -9598,6 +9598,267 @@
                 <w:szCs w:val="19"/>
               </w:rPr>
               <w:t xml:space="preserve">The new password works. Nobody else can see it. HR receives a notice that you changed it (not the password).</w:t>
+            </w:r>
+          </w:p>
+        </w:tc>
+        <w:tc>
+          <w:tcPr>
+            <w:tcW w:type="dxa" w:w="620"/>
+            <w:tcBorders>
+              <w:top w:val="single" w:color="C9D0DC" w:sz="4"/>
+              <w:left w:val="single" w:color="C9D0DC" w:sz="4"/>
+              <w:bottom w:val="single" w:color="C9D0DC" w:sz="4"/>
+              <w:right w:val="single" w:color="C9D0DC" w:sz="4"/>
+            </w:tcBorders>
+            <w:tcMar>
+              <w:top w:type="dxa" w:w="70"/>
+              <w:left w:type="dxa" w:w="100"/>
+              <w:bottom w:type="dxa" w:w="70"/>
+              <w:right w:type="dxa" w:w="100"/>
+            </w:tcMar>
+            <w:vAlign w:val="center"/>
+          </w:tcPr>
+          <w:p>
+            <w:pPr>
+              <w:spacing w:after="0" w:before="0" w:line="264"/>
+              <w:jc w:val="center"/>
+            </w:pPr>
+            <w:r>
+              <w:rPr>
+                <w:rFonts w:ascii="Arial" w:cs="Arial" w:eastAsia="Arial" w:hAnsi="Arial"/>
+                <w:sz w:val="30"/>
+                <w:szCs w:val="30"/>
+              </w:rPr>
+              <w:t xml:space="preserve">☐</w:t>
+            </w:r>
+          </w:p>
+        </w:tc>
+        <w:tc>
+          <w:tcPr>
+            <w:tcW w:type="dxa" w:w="620"/>
+            <w:tcBorders>
+              <w:top w:val="single" w:color="C9D0DC" w:sz="4"/>
+              <w:left w:val="single" w:color="C9D0DC" w:sz="4"/>
+              <w:bottom w:val="single" w:color="C9D0DC" w:sz="4"/>
+              <w:right w:val="single" w:color="C9D0DC" w:sz="4"/>
+            </w:tcBorders>
+            <w:tcMar>
+              <w:top w:type="dxa" w:w="70"/>
+              <w:left w:type="dxa" w:w="100"/>
+              <w:bottom w:type="dxa" w:w="70"/>
+              <w:right w:type="dxa" w:w="100"/>
+            </w:tcMar>
+            <w:vAlign w:val="center"/>
+          </w:tcPr>
+          <w:p>
+            <w:pPr>
+              <w:spacing w:after="0" w:before="0" w:line="264"/>
+              <w:jc w:val="center"/>
+            </w:pPr>
+            <w:r>
+              <w:rPr>
+                <w:rFonts w:ascii="Arial" w:cs="Arial" w:eastAsia="Arial" w:hAnsi="Arial"/>
+                <w:sz w:val="30"/>
+                <w:szCs w:val="30"/>
+              </w:rPr>
+              <w:t xml:space="preserve">☐</w:t>
+            </w:r>
+          </w:p>
+        </w:tc>
+        <w:tc>
+          <w:tcPr>
+            <w:tcW w:type="dxa" w:w="620"/>
+            <w:tcBorders>
+              <w:top w:val="single" w:color="C9D0DC" w:sz="4"/>
+              <w:left w:val="single" w:color="C9D0DC" w:sz="4"/>
+              <w:bottom w:val="single" w:color="C9D0DC" w:sz="4"/>
+              <w:right w:val="single" w:color="C9D0DC" w:sz="4"/>
+            </w:tcBorders>
+            <w:tcMar>
+              <w:top w:type="dxa" w:w="70"/>
+              <w:left w:type="dxa" w:w="100"/>
+              <w:bottom w:type="dxa" w:w="70"/>
+              <w:right w:type="dxa" w:w="100"/>
+            </w:tcMar>
+            <w:vAlign w:val="center"/>
+          </w:tcPr>
+          <w:p>
+            <w:pPr>
+              <w:spacing w:after="0" w:before="0" w:line="264"/>
+              <w:jc w:val="center"/>
+            </w:pPr>
+            <w:r>
+              <w:rPr>
+                <w:rFonts w:ascii="Arial" w:cs="Arial" w:eastAsia="Arial" w:hAnsi="Arial"/>
+                <w:sz w:val="30"/>
+                <w:szCs w:val="30"/>
+              </w:rPr>
+              <w:t xml:space="preserve">☐</w:t>
+            </w:r>
+          </w:p>
+        </w:tc>
+        <w:tc>
+          <w:tcPr>
+            <w:tcW w:type="dxa" w:w="2040"/>
+            <w:tcBorders>
+              <w:top w:val="single" w:color="C9D0DC" w:sz="4"/>
+              <w:left w:val="single" w:color="C9D0DC" w:sz="4"/>
+              <w:bottom w:val="single" w:color="C9D0DC" w:sz="4"/>
+              <w:right w:val="single" w:color="C9D0DC" w:sz="4"/>
+            </w:tcBorders>
+            <w:tcMar>
+              <w:top w:type="dxa" w:w="70"/>
+              <w:left w:type="dxa" w:w="100"/>
+              <w:bottom w:type="dxa" w:w="70"/>
+              <w:right w:type="dxa" w:w="100"/>
+            </w:tcMar>
+            <w:vAlign w:val="top"/>
+          </w:tcPr>
+          <w:p>
+            <w:pPr>
+              <w:spacing w:after="0" w:before="0" w:line="264"/>
+            </w:pPr>
+            <w:r>
+              <w:rPr>
+                <w:rFonts w:ascii="Arial" w:cs="Arial" w:eastAsia="Arial" w:hAnsi="Arial"/>
+                <w:sz w:val="19"/>
+                <w:szCs w:val="19"/>
+              </w:rPr>
+              <w:t xml:space="preserve"> </w:t>
+            </w:r>
+          </w:p>
+        </w:tc>
+      </w:tr>
+      <w:tr>
+        <w:trPr>
+          <w:cantSplit/>
+        </w:trPr>
+        <w:tc>
+          <w:tcPr>
+            <w:tcW w:type="dxa" w:w="860"/>
+            <w:tcBorders>
+              <w:top w:val="single" w:color="C9D0DC" w:sz="4"/>
+              <w:left w:val="single" w:color="C9D0DC" w:sz="4"/>
+              <w:bottom w:val="single" w:color="C9D0DC" w:sz="4"/>
+              <w:right w:val="single" w:color="C9D0DC" w:sz="4"/>
+            </w:tcBorders>
+            <w:tcMar>
+              <w:top w:type="dxa" w:w="70"/>
+              <w:left w:type="dxa" w:w="100"/>
+              <w:bottom w:type="dxa" w:w="70"/>
+              <w:right w:type="dxa" w:w="100"/>
+            </w:tcMar>
+            <w:vAlign w:val="top"/>
+          </w:tcPr>
+          <w:p>
+            <w:pPr>
+              <w:spacing w:after="0" w:before="0" w:line="264"/>
+            </w:pPr>
+            <w:r>
+              <w:rPr>
+                <w:rFonts w:ascii="Arial" w:cs="Arial" w:eastAsia="Arial" w:hAnsi="Arial"/>
+                <w:b/>
+                <w:bCs/>
+                <w:color w:val="5B6477"/>
+                <w:sz w:val="16"/>
+                <w:szCs w:val="16"/>
+              </w:rPr>
+              <w:t xml:space="preserve">AD-31</w:t>
+            </w:r>
+          </w:p>
+        </w:tc>
+        <w:tc>
+          <w:tcPr>
+            <w:tcW w:type="dxa" w:w="5480"/>
+            <w:tcBorders>
+              <w:top w:val="single" w:color="C9D0DC" w:sz="4"/>
+              <w:left w:val="single" w:color="C9D0DC" w:sz="4"/>
+              <w:bottom w:val="single" w:color="C9D0DC" w:sz="4"/>
+              <w:right w:val="single" w:color="C9D0DC" w:sz="4"/>
+            </w:tcBorders>
+            <w:tcMar>
+              <w:top w:type="dxa" w:w="70"/>
+              <w:left w:type="dxa" w:w="100"/>
+              <w:bottom w:type="dxa" w:w="70"/>
+              <w:right w:type="dxa" w:w="100"/>
+            </w:tcMar>
+            <w:vAlign w:val="top"/>
+          </w:tcPr>
+          <w:p>
+            <w:pPr>
+              <w:spacing w:after="40" w:before="0" w:line="264"/>
+            </w:pPr>
+            <w:r>
+              <w:rPr>
+                <w:rFonts w:ascii="Arial" w:cs="Arial" w:eastAsia="Arial" w:hAnsi="Arial"/>
+                <w:b/>
+                <w:bCs/>
+                <w:sz w:val="20"/>
+                <w:szCs w:val="20"/>
+              </w:rPr>
+              <w:t xml:space="preserve">Decide a shipping-charge change</w:t>
+            </w:r>
+          </w:p>
+          <w:p>
+            <w:pPr>
+              <w:spacing w:after="40" w:before="0" w:line="264"/>
+            </w:pPr>
+            <w:r>
+              <w:rPr>
+                <w:rFonts w:ascii="Arial" w:cs="Arial" w:eastAsia="Arial" w:hAnsi="Arial"/>
+                <w:i/>
+                <w:iCs/>
+                <w:color w:val="5B6477"/>
+                <w:sz w:val="15"/>
+                <w:szCs w:val="15"/>
+              </w:rPr>
+              <w:t xml:space="preserve">Flow F26 · Sale to a franchise with shipping to follow</w:t>
+            </w:r>
+          </w:p>
+          <w:p>
+            <w:pPr>
+              <w:spacing w:after="20" w:before="0" w:line="264"/>
+            </w:pPr>
+            <w:r>
+              <w:rPr>
+                <w:rFonts w:ascii="Arial" w:cs="Arial" w:eastAsia="Arial" w:hAnsi="Arial"/>
+                <w:color w:val="5B6477"/>
+                <w:sz w:val="19"/>
+                <w:szCs w:val="19"/>
+              </w:rPr>
+              <w:t xml:space="preserve">1.  </w:t>
+            </w:r>
+            <w:r>
+              <w:rPr>
+                <w:rFonts w:ascii="Arial" w:cs="Arial" w:eastAsia="Arial" w:hAnsi="Arial"/>
+                <w:sz w:val="19"/>
+                <w:szCs w:val="19"/>
+              </w:rPr>
+              <w:t xml:space="preserve">My Approvals → Franchise shipping charge → read the reason and the new amount (or the new date) → Approve, or Reject with a reason.</w:t>
+            </w:r>
+          </w:p>
+          <w:p>
+            <w:pPr>
+              <w:spacing w:after="0" w:before="60" w:line="264"/>
+            </w:pPr>
+            <w:r>
+              <w:rPr>
+                <w:rFonts w:ascii="Arial" w:cs="Arial" w:eastAsia="Arial" w:hAnsi="Arial"/>
+                <w:b/>
+                <w:bCs/>
+                <w:color w:val="0B1F3A"/>
+                <w:sz w:val="19"/>
+                <w:szCs w:val="19"/>
+              </w:rPr>
+              <w:t xml:space="preserve">You should see: </w:t>
+            </w:r>
+            <w:r>
+              <w:rPr>
+                <w:rFonts w:ascii="Arial" w:cs="Arial" w:eastAsia="Arial" w:hAnsi="Arial"/>
+                <w:sz w:val="19"/>
+                <w:szCs w:val="19"/>
+              </w:rPr>
+              <w:t xml:space="preserve">Approve: the franchise invoice changes by the difference and everyone involved is told. Reject: nothing changes and the Coordinator is told.</w:t>
             </w:r>
           </w:p>
         </w:tc>
@@ -9801,7 +10062,7 @@
                 <w:sz w:val="17"/>
                 <w:szCs w:val="17"/>
               </w:rPr>
-              <w:t xml:space="preserve">Passed (of 32)</w:t>
+              <w:t xml:space="preserve">Passed (of 33)</w:t>
             </w:r>
           </w:p>
         </w:tc>

</xml_diff>

<commit_message>
Replacement tickets (customer returns tied to the DR, returns to suppliers closed only by arrival); Marketing/BO pull-out docs and tests; larger JSON body limit for count sheets; guides, process note and acceptance tests updated
Co-Authored-By: Claude Sonnet 5.5 <noreply@anthropic.com>
Claude-Session: https://claude.ai/code/session_01611rAAsm4xgneCTG3N9mPf
</commit_message>
<xml_diff>
--- a/docs/acceptance-test/per-user/01-admin.docx
+++ b/docs/acceptance-test/per-user/01-admin.docx
@@ -117,7 +117,7 @@
           <w:sz w:val="18"/>
           <w:szCs w:val="18"/>
         </w:rPr>
-        <w:t xml:space="preserve">  ·  33 checks</w:t>
+        <w:t xml:space="preserve">  ·  35 checks</w:t>
       </w:r>
     </w:p>
     <w:tbl>
@@ -9859,6 +9859,512 @@
                 <w:szCs w:val="19"/>
               </w:rPr>
               <w:t xml:space="preserve">Approve: the franchise invoice changes by the difference and everyone involved is told. Reject: nothing changes and the Coordinator is told.</w:t>
+            </w:r>
+          </w:p>
+        </w:tc>
+        <w:tc>
+          <w:tcPr>
+            <w:tcW w:type="dxa" w:w="620"/>
+            <w:tcBorders>
+              <w:top w:val="single" w:color="C9D0DC" w:sz="4"/>
+              <w:left w:val="single" w:color="C9D0DC" w:sz="4"/>
+              <w:bottom w:val="single" w:color="C9D0DC" w:sz="4"/>
+              <w:right w:val="single" w:color="C9D0DC" w:sz="4"/>
+            </w:tcBorders>
+            <w:tcMar>
+              <w:top w:type="dxa" w:w="70"/>
+              <w:left w:type="dxa" w:w="100"/>
+              <w:bottom w:type="dxa" w:w="70"/>
+              <w:right w:type="dxa" w:w="100"/>
+            </w:tcMar>
+            <w:vAlign w:val="center"/>
+          </w:tcPr>
+          <w:p>
+            <w:pPr>
+              <w:spacing w:after="0" w:before="0" w:line="264"/>
+              <w:jc w:val="center"/>
+            </w:pPr>
+            <w:r>
+              <w:rPr>
+                <w:rFonts w:ascii="Arial" w:cs="Arial" w:eastAsia="Arial" w:hAnsi="Arial"/>
+                <w:sz w:val="30"/>
+                <w:szCs w:val="30"/>
+              </w:rPr>
+              <w:t xml:space="preserve">☐</w:t>
+            </w:r>
+          </w:p>
+        </w:tc>
+        <w:tc>
+          <w:tcPr>
+            <w:tcW w:type="dxa" w:w="620"/>
+            <w:tcBorders>
+              <w:top w:val="single" w:color="C9D0DC" w:sz="4"/>
+              <w:left w:val="single" w:color="C9D0DC" w:sz="4"/>
+              <w:bottom w:val="single" w:color="C9D0DC" w:sz="4"/>
+              <w:right w:val="single" w:color="C9D0DC" w:sz="4"/>
+            </w:tcBorders>
+            <w:tcMar>
+              <w:top w:type="dxa" w:w="70"/>
+              <w:left w:type="dxa" w:w="100"/>
+              <w:bottom w:type="dxa" w:w="70"/>
+              <w:right w:type="dxa" w:w="100"/>
+            </w:tcMar>
+            <w:vAlign w:val="center"/>
+          </w:tcPr>
+          <w:p>
+            <w:pPr>
+              <w:spacing w:after="0" w:before="0" w:line="264"/>
+              <w:jc w:val="center"/>
+            </w:pPr>
+            <w:r>
+              <w:rPr>
+                <w:rFonts w:ascii="Arial" w:cs="Arial" w:eastAsia="Arial" w:hAnsi="Arial"/>
+                <w:sz w:val="30"/>
+                <w:szCs w:val="30"/>
+              </w:rPr>
+              <w:t xml:space="preserve">☐</w:t>
+            </w:r>
+          </w:p>
+        </w:tc>
+        <w:tc>
+          <w:tcPr>
+            <w:tcW w:type="dxa" w:w="620"/>
+            <w:tcBorders>
+              <w:top w:val="single" w:color="C9D0DC" w:sz="4"/>
+              <w:left w:val="single" w:color="C9D0DC" w:sz="4"/>
+              <w:bottom w:val="single" w:color="C9D0DC" w:sz="4"/>
+              <w:right w:val="single" w:color="C9D0DC" w:sz="4"/>
+            </w:tcBorders>
+            <w:tcMar>
+              <w:top w:type="dxa" w:w="70"/>
+              <w:left w:type="dxa" w:w="100"/>
+              <w:bottom w:type="dxa" w:w="70"/>
+              <w:right w:type="dxa" w:w="100"/>
+            </w:tcMar>
+            <w:vAlign w:val="center"/>
+          </w:tcPr>
+          <w:p>
+            <w:pPr>
+              <w:spacing w:after="0" w:before="0" w:line="264"/>
+              <w:jc w:val="center"/>
+            </w:pPr>
+            <w:r>
+              <w:rPr>
+                <w:rFonts w:ascii="Arial" w:cs="Arial" w:eastAsia="Arial" w:hAnsi="Arial"/>
+                <w:sz w:val="30"/>
+                <w:szCs w:val="30"/>
+              </w:rPr>
+              <w:t xml:space="preserve">☐</w:t>
+            </w:r>
+          </w:p>
+        </w:tc>
+        <w:tc>
+          <w:tcPr>
+            <w:tcW w:type="dxa" w:w="2040"/>
+            <w:tcBorders>
+              <w:top w:val="single" w:color="C9D0DC" w:sz="4"/>
+              <w:left w:val="single" w:color="C9D0DC" w:sz="4"/>
+              <w:bottom w:val="single" w:color="C9D0DC" w:sz="4"/>
+              <w:right w:val="single" w:color="C9D0DC" w:sz="4"/>
+            </w:tcBorders>
+            <w:tcMar>
+              <w:top w:type="dxa" w:w="70"/>
+              <w:left w:type="dxa" w:w="100"/>
+              <w:bottom w:type="dxa" w:w="70"/>
+              <w:right w:type="dxa" w:w="100"/>
+            </w:tcMar>
+            <w:vAlign w:val="top"/>
+          </w:tcPr>
+          <w:p>
+            <w:pPr>
+              <w:spacing w:after="0" w:before="0" w:line="264"/>
+            </w:pPr>
+            <w:r>
+              <w:rPr>
+                <w:rFonts w:ascii="Arial" w:cs="Arial" w:eastAsia="Arial" w:hAnsi="Arial"/>
+                <w:sz w:val="19"/>
+                <w:szCs w:val="19"/>
+              </w:rPr>
+              <w:t xml:space="preserve"> </w:t>
+            </w:r>
+          </w:p>
+        </w:tc>
+      </w:tr>
+      <w:tr>
+        <w:trPr>
+          <w:cantSplit/>
+        </w:trPr>
+        <w:tc>
+          <w:tcPr>
+            <w:tcW w:type="dxa" w:w="860"/>
+            <w:tcBorders>
+              <w:top w:val="single" w:color="C9D0DC" w:sz="4"/>
+              <w:left w:val="single" w:color="C9D0DC" w:sz="4"/>
+              <w:bottom w:val="single" w:color="C9D0DC" w:sz="4"/>
+              <w:right w:val="single" w:color="C9D0DC" w:sz="4"/>
+            </w:tcBorders>
+            <w:tcMar>
+              <w:top w:type="dxa" w:w="70"/>
+              <w:left w:type="dxa" w:w="100"/>
+              <w:bottom w:type="dxa" w:w="70"/>
+              <w:right w:type="dxa" w:w="100"/>
+            </w:tcMar>
+            <w:vAlign w:val="top"/>
+          </w:tcPr>
+          <w:p>
+            <w:pPr>
+              <w:spacing w:after="0" w:before="0" w:line="264"/>
+            </w:pPr>
+            <w:r>
+              <w:rPr>
+                <w:rFonts w:ascii="Arial" w:cs="Arial" w:eastAsia="Arial" w:hAnsi="Arial"/>
+                <w:b/>
+                <w:bCs/>
+                <w:color w:val="5B6477"/>
+                <w:sz w:val="16"/>
+                <w:szCs w:val="16"/>
+              </w:rPr>
+              <w:t xml:space="preserve">AD-32</w:t>
+            </w:r>
+          </w:p>
+        </w:tc>
+        <w:tc>
+          <w:tcPr>
+            <w:tcW w:type="dxa" w:w="5480"/>
+            <w:tcBorders>
+              <w:top w:val="single" w:color="C9D0DC" w:sz="4"/>
+              <w:left w:val="single" w:color="C9D0DC" w:sz="4"/>
+              <w:bottom w:val="single" w:color="C9D0DC" w:sz="4"/>
+              <w:right w:val="single" w:color="C9D0DC" w:sz="4"/>
+            </w:tcBorders>
+            <w:tcMar>
+              <w:top w:type="dxa" w:w="70"/>
+              <w:left w:type="dxa" w:w="100"/>
+              <w:bottom w:type="dxa" w:w="70"/>
+              <w:right w:type="dxa" w:w="100"/>
+            </w:tcMar>
+            <w:vAlign w:val="top"/>
+          </w:tcPr>
+          <w:p>
+            <w:pPr>
+              <w:spacing w:after="40" w:before="0" w:line="264"/>
+            </w:pPr>
+            <w:r>
+              <w:rPr>
+                <w:rFonts w:ascii="Arial" w:cs="Arial" w:eastAsia="Arial" w:hAnsi="Arial"/>
+                <w:b/>
+                <w:bCs/>
+                <w:sz w:val="20"/>
+                <w:szCs w:val="20"/>
+              </w:rPr>
+              <w:t xml:space="preserve">Search the users</w:t>
+            </w:r>
+          </w:p>
+          <w:p>
+            <w:pPr>
+              <w:spacing w:after="20" w:before="0" w:line="264"/>
+            </w:pPr>
+            <w:r>
+              <w:rPr>
+                <w:rFonts w:ascii="Arial" w:cs="Arial" w:eastAsia="Arial" w:hAnsi="Arial"/>
+                <w:color w:val="5B6477"/>
+                <w:sz w:val="19"/>
+                <w:szCs w:val="19"/>
+              </w:rPr>
+              <w:t xml:space="preserve">1.  </w:t>
+            </w:r>
+            <w:r>
+              <w:rPr>
+                <w:rFonts w:ascii="Arial" w:cs="Arial" w:eastAsia="Arial" w:hAnsi="Arial"/>
+                <w:sz w:val="19"/>
+                <w:szCs w:val="19"/>
+              </w:rPr>
+              <w:t xml:space="preserve">Users &amp; Roles → type part of a name, a role or a branch in the search box.</w:t>
+            </w:r>
+          </w:p>
+          <w:p>
+            <w:pPr>
+              <w:spacing w:after="0" w:before="60" w:line="264"/>
+            </w:pPr>
+            <w:r>
+              <w:rPr>
+                <w:rFonts w:ascii="Arial" w:cs="Arial" w:eastAsia="Arial" w:hAnsi="Arial"/>
+                <w:b/>
+                <w:bCs/>
+                <w:color w:val="0B1F3A"/>
+                <w:sz w:val="19"/>
+                <w:szCs w:val="19"/>
+              </w:rPr>
+              <w:t xml:space="preserve">You should see: </w:t>
+            </w:r>
+            <w:r>
+              <w:rPr>
+                <w:rFonts w:ascii="Arial" w:cs="Arial" w:eastAsia="Arial" w:hAnsi="Arial"/>
+                <w:sz w:val="19"/>
+                <w:szCs w:val="19"/>
+              </w:rPr>
+              <w:t xml:space="preserve">The list narrows as you type; the count shows "x of y users".</w:t>
+            </w:r>
+          </w:p>
+        </w:tc>
+        <w:tc>
+          <w:tcPr>
+            <w:tcW w:type="dxa" w:w="620"/>
+            <w:tcBorders>
+              <w:top w:val="single" w:color="C9D0DC" w:sz="4"/>
+              <w:left w:val="single" w:color="C9D0DC" w:sz="4"/>
+              <w:bottom w:val="single" w:color="C9D0DC" w:sz="4"/>
+              <w:right w:val="single" w:color="C9D0DC" w:sz="4"/>
+            </w:tcBorders>
+            <w:tcMar>
+              <w:top w:type="dxa" w:w="70"/>
+              <w:left w:type="dxa" w:w="100"/>
+              <w:bottom w:type="dxa" w:w="70"/>
+              <w:right w:type="dxa" w:w="100"/>
+            </w:tcMar>
+            <w:vAlign w:val="center"/>
+          </w:tcPr>
+          <w:p>
+            <w:pPr>
+              <w:spacing w:after="0" w:before="0" w:line="264"/>
+              <w:jc w:val="center"/>
+            </w:pPr>
+            <w:r>
+              <w:rPr>
+                <w:rFonts w:ascii="Arial" w:cs="Arial" w:eastAsia="Arial" w:hAnsi="Arial"/>
+                <w:sz w:val="30"/>
+                <w:szCs w:val="30"/>
+              </w:rPr>
+              <w:t xml:space="preserve">☐</w:t>
+            </w:r>
+          </w:p>
+        </w:tc>
+        <w:tc>
+          <w:tcPr>
+            <w:tcW w:type="dxa" w:w="620"/>
+            <w:tcBorders>
+              <w:top w:val="single" w:color="C9D0DC" w:sz="4"/>
+              <w:left w:val="single" w:color="C9D0DC" w:sz="4"/>
+              <w:bottom w:val="single" w:color="C9D0DC" w:sz="4"/>
+              <w:right w:val="single" w:color="C9D0DC" w:sz="4"/>
+            </w:tcBorders>
+            <w:tcMar>
+              <w:top w:type="dxa" w:w="70"/>
+              <w:left w:type="dxa" w:w="100"/>
+              <w:bottom w:type="dxa" w:w="70"/>
+              <w:right w:type="dxa" w:w="100"/>
+            </w:tcMar>
+            <w:vAlign w:val="center"/>
+          </w:tcPr>
+          <w:p>
+            <w:pPr>
+              <w:spacing w:after="0" w:before="0" w:line="264"/>
+              <w:jc w:val="center"/>
+            </w:pPr>
+            <w:r>
+              <w:rPr>
+                <w:rFonts w:ascii="Arial" w:cs="Arial" w:eastAsia="Arial" w:hAnsi="Arial"/>
+                <w:sz w:val="30"/>
+                <w:szCs w:val="30"/>
+              </w:rPr>
+              <w:t xml:space="preserve">☐</w:t>
+            </w:r>
+          </w:p>
+        </w:tc>
+        <w:tc>
+          <w:tcPr>
+            <w:tcW w:type="dxa" w:w="620"/>
+            <w:tcBorders>
+              <w:top w:val="single" w:color="C9D0DC" w:sz="4"/>
+              <w:left w:val="single" w:color="C9D0DC" w:sz="4"/>
+              <w:bottom w:val="single" w:color="C9D0DC" w:sz="4"/>
+              <w:right w:val="single" w:color="C9D0DC" w:sz="4"/>
+            </w:tcBorders>
+            <w:tcMar>
+              <w:top w:type="dxa" w:w="70"/>
+              <w:left w:type="dxa" w:w="100"/>
+              <w:bottom w:type="dxa" w:w="70"/>
+              <w:right w:type="dxa" w:w="100"/>
+            </w:tcMar>
+            <w:vAlign w:val="center"/>
+          </w:tcPr>
+          <w:p>
+            <w:pPr>
+              <w:spacing w:after="0" w:before="0" w:line="264"/>
+              <w:jc w:val="center"/>
+            </w:pPr>
+            <w:r>
+              <w:rPr>
+                <w:rFonts w:ascii="Arial" w:cs="Arial" w:eastAsia="Arial" w:hAnsi="Arial"/>
+                <w:sz w:val="30"/>
+                <w:szCs w:val="30"/>
+              </w:rPr>
+              <w:t xml:space="preserve">☐</w:t>
+            </w:r>
+          </w:p>
+        </w:tc>
+        <w:tc>
+          <w:tcPr>
+            <w:tcW w:type="dxa" w:w="2040"/>
+            <w:tcBorders>
+              <w:top w:val="single" w:color="C9D0DC" w:sz="4"/>
+              <w:left w:val="single" w:color="C9D0DC" w:sz="4"/>
+              <w:bottom w:val="single" w:color="C9D0DC" w:sz="4"/>
+              <w:right w:val="single" w:color="C9D0DC" w:sz="4"/>
+            </w:tcBorders>
+            <w:tcMar>
+              <w:top w:type="dxa" w:w="70"/>
+              <w:left w:type="dxa" w:w="100"/>
+              <w:bottom w:type="dxa" w:w="70"/>
+              <w:right w:type="dxa" w:w="100"/>
+            </w:tcMar>
+            <w:vAlign w:val="top"/>
+          </w:tcPr>
+          <w:p>
+            <w:pPr>
+              <w:spacing w:after="0" w:before="0" w:line="264"/>
+            </w:pPr>
+            <w:r>
+              <w:rPr>
+                <w:rFonts w:ascii="Arial" w:cs="Arial" w:eastAsia="Arial" w:hAnsi="Arial"/>
+                <w:sz w:val="19"/>
+                <w:szCs w:val="19"/>
+              </w:rPr>
+              <w:t xml:space="preserve"> </w:t>
+            </w:r>
+          </w:p>
+        </w:tc>
+      </w:tr>
+      <w:tr>
+        <w:trPr>
+          <w:cantSplit/>
+        </w:trPr>
+        <w:tc>
+          <w:tcPr>
+            <w:tcW w:type="dxa" w:w="860"/>
+            <w:tcBorders>
+              <w:top w:val="single" w:color="C9D0DC" w:sz="4"/>
+              <w:left w:val="single" w:color="C9D0DC" w:sz="4"/>
+              <w:bottom w:val="single" w:color="C9D0DC" w:sz="4"/>
+              <w:right w:val="single" w:color="C9D0DC" w:sz="4"/>
+            </w:tcBorders>
+            <w:tcMar>
+              <w:top w:type="dxa" w:w="70"/>
+              <w:left w:type="dxa" w:w="100"/>
+              <w:bottom w:type="dxa" w:w="70"/>
+              <w:right w:type="dxa" w:w="100"/>
+            </w:tcMar>
+            <w:vAlign w:val="top"/>
+          </w:tcPr>
+          <w:p>
+            <w:pPr>
+              <w:spacing w:after="0" w:before="0" w:line="264"/>
+            </w:pPr>
+            <w:r>
+              <w:rPr>
+                <w:rFonts w:ascii="Arial" w:cs="Arial" w:eastAsia="Arial" w:hAnsi="Arial"/>
+                <w:b/>
+                <w:bCs/>
+                <w:color w:val="5B6477"/>
+                <w:sz w:val="16"/>
+                <w:szCs w:val="16"/>
+              </w:rPr>
+              <w:t xml:space="preserve">AD-33</w:t>
+            </w:r>
+          </w:p>
+        </w:tc>
+        <w:tc>
+          <w:tcPr>
+            <w:tcW w:type="dxa" w:w="5480"/>
+            <w:tcBorders>
+              <w:top w:val="single" w:color="C9D0DC" w:sz="4"/>
+              <w:left w:val="single" w:color="C9D0DC" w:sz="4"/>
+              <w:bottom w:val="single" w:color="C9D0DC" w:sz="4"/>
+              <w:right w:val="single" w:color="C9D0DC" w:sz="4"/>
+            </w:tcBorders>
+            <w:tcMar>
+              <w:top w:type="dxa" w:w="70"/>
+              <w:left w:type="dxa" w:w="100"/>
+              <w:bottom w:type="dxa" w:w="70"/>
+              <w:right w:type="dxa" w:w="100"/>
+            </w:tcMar>
+            <w:vAlign w:val="top"/>
+          </w:tcPr>
+          <w:p>
+            <w:pPr>
+              <w:spacing w:after="40" w:before="0" w:line="264"/>
+            </w:pPr>
+            <w:r>
+              <w:rPr>
+                <w:rFonts w:ascii="Arial" w:cs="Arial" w:eastAsia="Arial" w:hAnsi="Arial"/>
+                <w:b/>
+                <w:bCs/>
+                <w:sz w:val="20"/>
+                <w:szCs w:val="20"/>
+              </w:rPr>
+              <w:t xml:space="preserve">Notified of tickets and give-outs</w:t>
+            </w:r>
+          </w:p>
+          <w:p>
+            <w:pPr>
+              <w:spacing w:after="40" w:before="0" w:line="264"/>
+            </w:pPr>
+            <w:r>
+              <w:rPr>
+                <w:rFonts w:ascii="Arial" w:cs="Arial" w:eastAsia="Arial" w:hAnsi="Arial"/>
+                <w:i/>
+                <w:iCs/>
+                <w:color w:val="5B6477"/>
+                <w:sz w:val="15"/>
+                <w:szCs w:val="15"/>
+              </w:rPr>
+              <w:t xml:space="preserve">Flow F27 · Customer return and replacement ticket</w:t>
+            </w:r>
+          </w:p>
+          <w:p>
+            <w:pPr>
+              <w:spacing w:after="20" w:before="0" w:line="264"/>
+            </w:pPr>
+            <w:r>
+              <w:rPr>
+                <w:rFonts w:ascii="Arial" w:cs="Arial" w:eastAsia="Arial" w:hAnsi="Arial"/>
+                <w:color w:val="5B6477"/>
+                <w:sz w:val="19"/>
+                <w:szCs w:val="19"/>
+              </w:rPr>
+              <w:t xml:space="preserve">1.  </w:t>
+            </w:r>
+            <w:r>
+              <w:rPr>
+                <w:rFonts w:ascii="Arial" w:cs="Arial" w:eastAsia="Arial" w:hAnsi="Arial"/>
+                <w:sz w:val="19"/>
+                <w:szCs w:val="19"/>
+              </w:rPr>
+              <w:t xml:space="preserve">Open Notifications after a ticket or a marketing pull-out.</w:t>
+            </w:r>
+          </w:p>
+          <w:p>
+            <w:pPr>
+              <w:spacing w:after="0" w:before="60" w:line="264"/>
+            </w:pPr>
+            <w:r>
+              <w:rPr>
+                <w:rFonts w:ascii="Arial" w:cs="Arial" w:eastAsia="Arial" w:hAnsi="Arial"/>
+                <w:b/>
+                <w:bCs/>
+                <w:color w:val="0B1F3A"/>
+                <w:sz w:val="19"/>
+                <w:szCs w:val="19"/>
+              </w:rPr>
+              <w:t xml:space="preserve">You should see: </w:t>
+            </w:r>
+            <w:r>
+              <w:rPr>
+                <w:rFonts w:ascii="Arial" w:cs="Arial" w:eastAsia="Arial" w:hAnsi="Arial"/>
+                <w:sz w:val="19"/>
+                <w:szCs w:val="19"/>
+              </w:rPr>
+              <w:t xml:space="preserve">You are told at each step and may decide anything the Head Auditor decides.</w:t>
             </w:r>
           </w:p>
         </w:tc>
@@ -10062,7 +10568,7 @@
                 <w:sz w:val="17"/>
                 <w:szCs w:val="17"/>
               </w:rPr>
-              <w:t xml:space="preserve">Passed (of 33)</w:t>
+              <w:t xml:space="preserve">Passed (of 35)</w:t>
             </w:r>
           </w:p>
         </w:tc>

</xml_diff>

<commit_message>
Agent field work: outlets with contacts and pictures (Sales Manager approves, Owner told of changes), areas, sharing, itineraries with photo + GPS visit proof, shelf checks, claims, monitoring and scorecards, consignment maximums (agent and outlet, Owner approves); outlet tag on sales; notification search; warehouse expenses; guides and acceptance tests updated
Co-Authored-By: Claude Sonnet 5.5 <noreply@anthropic.com>
Claude-Session: https://claude.ai/code/session_01611rAAsm4xgneCTG3N9mPf
</commit_message>
<xml_diff>
--- a/docs/acceptance-test/per-user/01-admin.docx
+++ b/docs/acceptance-test/per-user/01-admin.docx
@@ -117,7 +117,7 @@
           <w:sz w:val="18"/>
           <w:szCs w:val="18"/>
         </w:rPr>
-        <w:t xml:space="preserve">  ·  35 checks</w:t>
+        <w:t xml:space="preserve">  ·  38 checks</w:t>
       </w:r>
     </w:p>
     <w:tbl>
@@ -10365,6 +10365,789 @@
                 <w:szCs w:val="19"/>
               </w:rPr>
               <w:t xml:space="preserve">You are told at each step and may decide anything the Head Auditor decides.</w:t>
+            </w:r>
+          </w:p>
+        </w:tc>
+        <w:tc>
+          <w:tcPr>
+            <w:tcW w:type="dxa" w:w="620"/>
+            <w:tcBorders>
+              <w:top w:val="single" w:color="C9D0DC" w:sz="4"/>
+              <w:left w:val="single" w:color="C9D0DC" w:sz="4"/>
+              <w:bottom w:val="single" w:color="C9D0DC" w:sz="4"/>
+              <w:right w:val="single" w:color="C9D0DC" w:sz="4"/>
+            </w:tcBorders>
+            <w:tcMar>
+              <w:top w:type="dxa" w:w="70"/>
+              <w:left w:type="dxa" w:w="100"/>
+              <w:bottom w:type="dxa" w:w="70"/>
+              <w:right w:type="dxa" w:w="100"/>
+            </w:tcMar>
+            <w:vAlign w:val="center"/>
+          </w:tcPr>
+          <w:p>
+            <w:pPr>
+              <w:spacing w:after="0" w:before="0" w:line="264"/>
+              <w:jc w:val="center"/>
+            </w:pPr>
+            <w:r>
+              <w:rPr>
+                <w:rFonts w:ascii="Arial" w:cs="Arial" w:eastAsia="Arial" w:hAnsi="Arial"/>
+                <w:sz w:val="30"/>
+                <w:szCs w:val="30"/>
+              </w:rPr>
+              <w:t xml:space="preserve">☐</w:t>
+            </w:r>
+          </w:p>
+        </w:tc>
+        <w:tc>
+          <w:tcPr>
+            <w:tcW w:type="dxa" w:w="620"/>
+            <w:tcBorders>
+              <w:top w:val="single" w:color="C9D0DC" w:sz="4"/>
+              <w:left w:val="single" w:color="C9D0DC" w:sz="4"/>
+              <w:bottom w:val="single" w:color="C9D0DC" w:sz="4"/>
+              <w:right w:val="single" w:color="C9D0DC" w:sz="4"/>
+            </w:tcBorders>
+            <w:tcMar>
+              <w:top w:type="dxa" w:w="70"/>
+              <w:left w:type="dxa" w:w="100"/>
+              <w:bottom w:type="dxa" w:w="70"/>
+              <w:right w:type="dxa" w:w="100"/>
+            </w:tcMar>
+            <w:vAlign w:val="center"/>
+          </w:tcPr>
+          <w:p>
+            <w:pPr>
+              <w:spacing w:after="0" w:before="0" w:line="264"/>
+              <w:jc w:val="center"/>
+            </w:pPr>
+            <w:r>
+              <w:rPr>
+                <w:rFonts w:ascii="Arial" w:cs="Arial" w:eastAsia="Arial" w:hAnsi="Arial"/>
+                <w:sz w:val="30"/>
+                <w:szCs w:val="30"/>
+              </w:rPr>
+              <w:t xml:space="preserve">☐</w:t>
+            </w:r>
+          </w:p>
+        </w:tc>
+        <w:tc>
+          <w:tcPr>
+            <w:tcW w:type="dxa" w:w="620"/>
+            <w:tcBorders>
+              <w:top w:val="single" w:color="C9D0DC" w:sz="4"/>
+              <w:left w:val="single" w:color="C9D0DC" w:sz="4"/>
+              <w:bottom w:val="single" w:color="C9D0DC" w:sz="4"/>
+              <w:right w:val="single" w:color="C9D0DC" w:sz="4"/>
+            </w:tcBorders>
+            <w:tcMar>
+              <w:top w:type="dxa" w:w="70"/>
+              <w:left w:type="dxa" w:w="100"/>
+              <w:bottom w:type="dxa" w:w="70"/>
+              <w:right w:type="dxa" w:w="100"/>
+            </w:tcMar>
+            <w:vAlign w:val="center"/>
+          </w:tcPr>
+          <w:p>
+            <w:pPr>
+              <w:spacing w:after="0" w:before="0" w:line="264"/>
+              <w:jc w:val="center"/>
+            </w:pPr>
+            <w:r>
+              <w:rPr>
+                <w:rFonts w:ascii="Arial" w:cs="Arial" w:eastAsia="Arial" w:hAnsi="Arial"/>
+                <w:sz w:val="30"/>
+                <w:szCs w:val="30"/>
+              </w:rPr>
+              <w:t xml:space="preserve">☐</w:t>
+            </w:r>
+          </w:p>
+        </w:tc>
+        <w:tc>
+          <w:tcPr>
+            <w:tcW w:type="dxa" w:w="2040"/>
+            <w:tcBorders>
+              <w:top w:val="single" w:color="C9D0DC" w:sz="4"/>
+              <w:left w:val="single" w:color="C9D0DC" w:sz="4"/>
+              <w:bottom w:val="single" w:color="C9D0DC" w:sz="4"/>
+              <w:right w:val="single" w:color="C9D0DC" w:sz="4"/>
+            </w:tcBorders>
+            <w:tcMar>
+              <w:top w:type="dxa" w:w="70"/>
+              <w:left w:type="dxa" w:w="100"/>
+              <w:bottom w:type="dxa" w:w="70"/>
+              <w:right w:type="dxa" w:w="100"/>
+            </w:tcMar>
+            <w:vAlign w:val="top"/>
+          </w:tcPr>
+          <w:p>
+            <w:pPr>
+              <w:spacing w:after="0" w:before="0" w:line="264"/>
+            </w:pPr>
+            <w:r>
+              <w:rPr>
+                <w:rFonts w:ascii="Arial" w:cs="Arial" w:eastAsia="Arial" w:hAnsi="Arial"/>
+                <w:sz w:val="19"/>
+                <w:szCs w:val="19"/>
+              </w:rPr>
+              <w:t xml:space="preserve"> </w:t>
+            </w:r>
+          </w:p>
+        </w:tc>
+      </w:tr>
+      <w:tr>
+        <w:trPr>
+          <w:cantSplit/>
+        </w:trPr>
+        <w:tc>
+          <w:tcPr>
+            <w:tcW w:type="dxa" w:w="860"/>
+            <w:tcBorders>
+              <w:top w:val="single" w:color="C9D0DC" w:sz="4"/>
+              <w:left w:val="single" w:color="C9D0DC" w:sz="4"/>
+              <w:bottom w:val="single" w:color="C9D0DC" w:sz="4"/>
+              <w:right w:val="single" w:color="C9D0DC" w:sz="4"/>
+            </w:tcBorders>
+            <w:tcMar>
+              <w:top w:type="dxa" w:w="70"/>
+              <w:left w:type="dxa" w:w="100"/>
+              <w:bottom w:type="dxa" w:w="70"/>
+              <w:right w:type="dxa" w:w="100"/>
+            </w:tcMar>
+            <w:vAlign w:val="top"/>
+          </w:tcPr>
+          <w:p>
+            <w:pPr>
+              <w:spacing w:after="0" w:before="0" w:line="264"/>
+            </w:pPr>
+            <w:r>
+              <w:rPr>
+                <w:rFonts w:ascii="Arial" w:cs="Arial" w:eastAsia="Arial" w:hAnsi="Arial"/>
+                <w:b/>
+                <w:bCs/>
+                <w:color w:val="5B6477"/>
+                <w:sz w:val="16"/>
+                <w:szCs w:val="16"/>
+              </w:rPr>
+              <w:t xml:space="preserve">AD-34</w:t>
+            </w:r>
+          </w:p>
+        </w:tc>
+        <w:tc>
+          <w:tcPr>
+            <w:tcW w:type="dxa" w:w="5480"/>
+            <w:tcBorders>
+              <w:top w:val="single" w:color="C9D0DC" w:sz="4"/>
+              <w:left w:val="single" w:color="C9D0DC" w:sz="4"/>
+              <w:bottom w:val="single" w:color="C9D0DC" w:sz="4"/>
+              <w:right w:val="single" w:color="C9D0DC" w:sz="4"/>
+            </w:tcBorders>
+            <w:tcMar>
+              <w:top w:type="dxa" w:w="70"/>
+              <w:left w:type="dxa" w:w="100"/>
+              <w:bottom w:type="dxa" w:w="70"/>
+              <w:right w:type="dxa" w:w="100"/>
+            </w:tcMar>
+            <w:vAlign w:val="top"/>
+          </w:tcPr>
+          <w:p>
+            <w:pPr>
+              <w:spacing w:after="40" w:before="0" w:line="264"/>
+            </w:pPr>
+            <w:r>
+              <w:rPr>
+                <w:rFonts w:ascii="Arial" w:cs="Arial" w:eastAsia="Arial" w:hAnsi="Arial"/>
+                <w:b/>
+                <w:bCs/>
+                <w:sz w:val="20"/>
+                <w:szCs w:val="20"/>
+              </w:rPr>
+              <w:t xml:space="preserve">Approve a consignment maximum</w:t>
+            </w:r>
+          </w:p>
+          <w:p>
+            <w:pPr>
+              <w:spacing w:after="40" w:before="0" w:line="264"/>
+            </w:pPr>
+            <w:r>
+              <w:rPr>
+                <w:rFonts w:ascii="Arial" w:cs="Arial" w:eastAsia="Arial" w:hAnsi="Arial"/>
+                <w:i/>
+                <w:iCs/>
+                <w:color w:val="5B6477"/>
+                <w:sz w:val="15"/>
+                <w:szCs w:val="15"/>
+              </w:rPr>
+              <w:t xml:space="preserve">Flow F31 · Agent field work: outlets, itineraries and consignment maximums</w:t>
+            </w:r>
+          </w:p>
+          <w:p>
+            <w:pPr>
+              <w:spacing w:after="20" w:before="0" w:line="264"/>
+            </w:pPr>
+            <w:r>
+              <w:rPr>
+                <w:rFonts w:ascii="Arial" w:cs="Arial" w:eastAsia="Arial" w:hAnsi="Arial"/>
+                <w:color w:val="5B6477"/>
+                <w:sz w:val="19"/>
+                <w:szCs w:val="19"/>
+              </w:rPr>
+              <w:t xml:space="preserve">1.  </w:t>
+            </w:r>
+            <w:r>
+              <w:rPr>
+                <w:rFonts w:ascii="Arial" w:cs="Arial" w:eastAsia="Arial" w:hAnsi="Arial"/>
+                <w:sz w:val="19"/>
+                <w:szCs w:val="19"/>
+              </w:rPr>
+              <w:t xml:space="preserve">My Approvals → Maximum consignment for an agent / outlet → Approve.</w:t>
+            </w:r>
+          </w:p>
+          <w:p>
+            <w:pPr>
+              <w:spacing w:after="0" w:before="60" w:line="264"/>
+            </w:pPr>
+            <w:r>
+              <w:rPr>
+                <w:rFonts w:ascii="Arial" w:cs="Arial" w:eastAsia="Arial" w:hAnsi="Arial"/>
+                <w:b/>
+                <w:bCs/>
+                <w:color w:val="0B1F3A"/>
+                <w:sz w:val="19"/>
+                <w:szCs w:val="19"/>
+              </w:rPr>
+              <w:t xml:space="preserve">You should see: </w:t>
+            </w:r>
+            <w:r>
+              <w:rPr>
+                <w:rFonts w:ascii="Arial" w:cs="Arial" w:eastAsia="Arial" w:hAnsi="Arial"/>
+                <w:sz w:val="19"/>
+                <w:szCs w:val="19"/>
+              </w:rPr>
+              <w:t xml:space="preserve">The Sales Manager and the agent are told. The next consignment is checked against it.</w:t>
+            </w:r>
+          </w:p>
+        </w:tc>
+        <w:tc>
+          <w:tcPr>
+            <w:tcW w:type="dxa" w:w="620"/>
+            <w:tcBorders>
+              <w:top w:val="single" w:color="C9D0DC" w:sz="4"/>
+              <w:left w:val="single" w:color="C9D0DC" w:sz="4"/>
+              <w:bottom w:val="single" w:color="C9D0DC" w:sz="4"/>
+              <w:right w:val="single" w:color="C9D0DC" w:sz="4"/>
+            </w:tcBorders>
+            <w:tcMar>
+              <w:top w:type="dxa" w:w="70"/>
+              <w:left w:type="dxa" w:w="100"/>
+              <w:bottom w:type="dxa" w:w="70"/>
+              <w:right w:type="dxa" w:w="100"/>
+            </w:tcMar>
+            <w:vAlign w:val="center"/>
+          </w:tcPr>
+          <w:p>
+            <w:pPr>
+              <w:spacing w:after="0" w:before="0" w:line="264"/>
+              <w:jc w:val="center"/>
+            </w:pPr>
+            <w:r>
+              <w:rPr>
+                <w:rFonts w:ascii="Arial" w:cs="Arial" w:eastAsia="Arial" w:hAnsi="Arial"/>
+                <w:sz w:val="30"/>
+                <w:szCs w:val="30"/>
+              </w:rPr>
+              <w:t xml:space="preserve">☐</w:t>
+            </w:r>
+          </w:p>
+        </w:tc>
+        <w:tc>
+          <w:tcPr>
+            <w:tcW w:type="dxa" w:w="620"/>
+            <w:tcBorders>
+              <w:top w:val="single" w:color="C9D0DC" w:sz="4"/>
+              <w:left w:val="single" w:color="C9D0DC" w:sz="4"/>
+              <w:bottom w:val="single" w:color="C9D0DC" w:sz="4"/>
+              <w:right w:val="single" w:color="C9D0DC" w:sz="4"/>
+            </w:tcBorders>
+            <w:tcMar>
+              <w:top w:type="dxa" w:w="70"/>
+              <w:left w:type="dxa" w:w="100"/>
+              <w:bottom w:type="dxa" w:w="70"/>
+              <w:right w:type="dxa" w:w="100"/>
+            </w:tcMar>
+            <w:vAlign w:val="center"/>
+          </w:tcPr>
+          <w:p>
+            <w:pPr>
+              <w:spacing w:after="0" w:before="0" w:line="264"/>
+              <w:jc w:val="center"/>
+            </w:pPr>
+            <w:r>
+              <w:rPr>
+                <w:rFonts w:ascii="Arial" w:cs="Arial" w:eastAsia="Arial" w:hAnsi="Arial"/>
+                <w:sz w:val="30"/>
+                <w:szCs w:val="30"/>
+              </w:rPr>
+              <w:t xml:space="preserve">☐</w:t>
+            </w:r>
+          </w:p>
+        </w:tc>
+        <w:tc>
+          <w:tcPr>
+            <w:tcW w:type="dxa" w:w="620"/>
+            <w:tcBorders>
+              <w:top w:val="single" w:color="C9D0DC" w:sz="4"/>
+              <w:left w:val="single" w:color="C9D0DC" w:sz="4"/>
+              <w:bottom w:val="single" w:color="C9D0DC" w:sz="4"/>
+              <w:right w:val="single" w:color="C9D0DC" w:sz="4"/>
+            </w:tcBorders>
+            <w:tcMar>
+              <w:top w:type="dxa" w:w="70"/>
+              <w:left w:type="dxa" w:w="100"/>
+              <w:bottom w:type="dxa" w:w="70"/>
+              <w:right w:type="dxa" w:w="100"/>
+            </w:tcMar>
+            <w:vAlign w:val="center"/>
+          </w:tcPr>
+          <w:p>
+            <w:pPr>
+              <w:spacing w:after="0" w:before="0" w:line="264"/>
+              <w:jc w:val="center"/>
+            </w:pPr>
+            <w:r>
+              <w:rPr>
+                <w:rFonts w:ascii="Arial" w:cs="Arial" w:eastAsia="Arial" w:hAnsi="Arial"/>
+                <w:sz w:val="30"/>
+                <w:szCs w:val="30"/>
+              </w:rPr>
+              <w:t xml:space="preserve">☐</w:t>
+            </w:r>
+          </w:p>
+        </w:tc>
+        <w:tc>
+          <w:tcPr>
+            <w:tcW w:type="dxa" w:w="2040"/>
+            <w:tcBorders>
+              <w:top w:val="single" w:color="C9D0DC" w:sz="4"/>
+              <w:left w:val="single" w:color="C9D0DC" w:sz="4"/>
+              <w:bottom w:val="single" w:color="C9D0DC" w:sz="4"/>
+              <w:right w:val="single" w:color="C9D0DC" w:sz="4"/>
+            </w:tcBorders>
+            <w:tcMar>
+              <w:top w:type="dxa" w:w="70"/>
+              <w:left w:type="dxa" w:w="100"/>
+              <w:bottom w:type="dxa" w:w="70"/>
+              <w:right w:type="dxa" w:w="100"/>
+            </w:tcMar>
+            <w:vAlign w:val="top"/>
+          </w:tcPr>
+          <w:p>
+            <w:pPr>
+              <w:spacing w:after="0" w:before="0" w:line="264"/>
+            </w:pPr>
+            <w:r>
+              <w:rPr>
+                <w:rFonts w:ascii="Arial" w:cs="Arial" w:eastAsia="Arial" w:hAnsi="Arial"/>
+                <w:sz w:val="19"/>
+                <w:szCs w:val="19"/>
+              </w:rPr>
+              <w:t xml:space="preserve"> </w:t>
+            </w:r>
+          </w:p>
+        </w:tc>
+      </w:tr>
+      <w:tr>
+        <w:trPr>
+          <w:cantSplit/>
+        </w:trPr>
+        <w:tc>
+          <w:tcPr>
+            <w:tcW w:type="dxa" w:w="860"/>
+            <w:tcBorders>
+              <w:top w:val="single" w:color="C9D0DC" w:sz="4"/>
+              <w:left w:val="single" w:color="C9D0DC" w:sz="4"/>
+              <w:bottom w:val="single" w:color="C9D0DC" w:sz="4"/>
+              <w:right w:val="single" w:color="C9D0DC" w:sz="4"/>
+            </w:tcBorders>
+            <w:tcMar>
+              <w:top w:type="dxa" w:w="70"/>
+              <w:left w:type="dxa" w:w="100"/>
+              <w:bottom w:type="dxa" w:w="70"/>
+              <w:right w:type="dxa" w:w="100"/>
+            </w:tcMar>
+            <w:vAlign w:val="top"/>
+          </w:tcPr>
+          <w:p>
+            <w:pPr>
+              <w:spacing w:after="0" w:before="0" w:line="264"/>
+            </w:pPr>
+            <w:r>
+              <w:rPr>
+                <w:rFonts w:ascii="Arial" w:cs="Arial" w:eastAsia="Arial" w:hAnsi="Arial"/>
+                <w:b/>
+                <w:bCs/>
+                <w:color w:val="5B6477"/>
+                <w:sz w:val="16"/>
+                <w:szCs w:val="16"/>
+              </w:rPr>
+              <w:t xml:space="preserve">AD-35</w:t>
+            </w:r>
+          </w:p>
+        </w:tc>
+        <w:tc>
+          <w:tcPr>
+            <w:tcW w:type="dxa" w:w="5480"/>
+            <w:tcBorders>
+              <w:top w:val="single" w:color="C9D0DC" w:sz="4"/>
+              <w:left w:val="single" w:color="C9D0DC" w:sz="4"/>
+              <w:bottom w:val="single" w:color="C9D0DC" w:sz="4"/>
+              <w:right w:val="single" w:color="C9D0DC" w:sz="4"/>
+            </w:tcBorders>
+            <w:tcMar>
+              <w:top w:type="dxa" w:w="70"/>
+              <w:left w:type="dxa" w:w="100"/>
+              <w:bottom w:type="dxa" w:w="70"/>
+              <w:right w:type="dxa" w:w="100"/>
+            </w:tcMar>
+            <w:vAlign w:val="top"/>
+          </w:tcPr>
+          <w:p>
+            <w:pPr>
+              <w:spacing w:after="40" w:before="0" w:line="264"/>
+            </w:pPr>
+            <w:r>
+              <w:rPr>
+                <w:rFonts w:ascii="Arial" w:cs="Arial" w:eastAsia="Arial" w:hAnsi="Arial"/>
+                <w:b/>
+                <w:bCs/>
+                <w:sz w:val="20"/>
+                <w:szCs w:val="20"/>
+              </w:rPr>
+              <w:t xml:space="preserve">Approve removal of an outlet</w:t>
+            </w:r>
+          </w:p>
+          <w:p>
+            <w:pPr>
+              <w:spacing w:after="40" w:before="0" w:line="264"/>
+            </w:pPr>
+            <w:r>
+              <w:rPr>
+                <w:rFonts w:ascii="Arial" w:cs="Arial" w:eastAsia="Arial" w:hAnsi="Arial"/>
+                <w:i/>
+                <w:iCs/>
+                <w:color w:val="5B6477"/>
+                <w:sz w:val="15"/>
+                <w:szCs w:val="15"/>
+              </w:rPr>
+              <w:t xml:space="preserve">Flow F31 · Agent field work: outlets, itineraries and consignment maximums</w:t>
+            </w:r>
+          </w:p>
+          <w:p>
+            <w:pPr>
+              <w:spacing w:after="20" w:before="0" w:line="264"/>
+            </w:pPr>
+            <w:r>
+              <w:rPr>
+                <w:rFonts w:ascii="Arial" w:cs="Arial" w:eastAsia="Arial" w:hAnsi="Arial"/>
+                <w:color w:val="5B6477"/>
+                <w:sz w:val="19"/>
+                <w:szCs w:val="19"/>
+              </w:rPr>
+              <w:t xml:space="preserve">1.  </w:t>
+            </w:r>
+            <w:r>
+              <w:rPr>
+                <w:rFonts w:ascii="Arial" w:cs="Arial" w:eastAsia="Arial" w:hAnsi="Arial"/>
+                <w:sz w:val="19"/>
+                <w:szCs w:val="19"/>
+              </w:rPr>
+              <w:t xml:space="preserve">My Approvals → Remove an outlet → Approve.</w:t>
+            </w:r>
+          </w:p>
+          <w:p>
+            <w:pPr>
+              <w:spacing w:after="0" w:before="60" w:line="264"/>
+            </w:pPr>
+            <w:r>
+              <w:rPr>
+                <w:rFonts w:ascii="Arial" w:cs="Arial" w:eastAsia="Arial" w:hAnsi="Arial"/>
+                <w:b/>
+                <w:bCs/>
+                <w:color w:val="0B1F3A"/>
+                <w:sz w:val="19"/>
+                <w:szCs w:val="19"/>
+              </w:rPr>
+              <w:t xml:space="preserve">You should see: </w:t>
+            </w:r>
+            <w:r>
+              <w:rPr>
+                <w:rFonts w:ascii="Arial" w:cs="Arial" w:eastAsia="Arial" w:hAnsi="Arial"/>
+                <w:sz w:val="19"/>
+                <w:szCs w:val="19"/>
+              </w:rPr>
+              <w:t xml:space="preserve">The outlet leaves the database; the Sales Manager and the agent are told.</w:t>
+            </w:r>
+          </w:p>
+        </w:tc>
+        <w:tc>
+          <w:tcPr>
+            <w:tcW w:type="dxa" w:w="620"/>
+            <w:tcBorders>
+              <w:top w:val="single" w:color="C9D0DC" w:sz="4"/>
+              <w:left w:val="single" w:color="C9D0DC" w:sz="4"/>
+              <w:bottom w:val="single" w:color="C9D0DC" w:sz="4"/>
+              <w:right w:val="single" w:color="C9D0DC" w:sz="4"/>
+            </w:tcBorders>
+            <w:tcMar>
+              <w:top w:type="dxa" w:w="70"/>
+              <w:left w:type="dxa" w:w="100"/>
+              <w:bottom w:type="dxa" w:w="70"/>
+              <w:right w:type="dxa" w:w="100"/>
+            </w:tcMar>
+            <w:vAlign w:val="center"/>
+          </w:tcPr>
+          <w:p>
+            <w:pPr>
+              <w:spacing w:after="0" w:before="0" w:line="264"/>
+              <w:jc w:val="center"/>
+            </w:pPr>
+            <w:r>
+              <w:rPr>
+                <w:rFonts w:ascii="Arial" w:cs="Arial" w:eastAsia="Arial" w:hAnsi="Arial"/>
+                <w:sz w:val="30"/>
+                <w:szCs w:val="30"/>
+              </w:rPr>
+              <w:t xml:space="preserve">☐</w:t>
+            </w:r>
+          </w:p>
+        </w:tc>
+        <w:tc>
+          <w:tcPr>
+            <w:tcW w:type="dxa" w:w="620"/>
+            <w:tcBorders>
+              <w:top w:val="single" w:color="C9D0DC" w:sz="4"/>
+              <w:left w:val="single" w:color="C9D0DC" w:sz="4"/>
+              <w:bottom w:val="single" w:color="C9D0DC" w:sz="4"/>
+              <w:right w:val="single" w:color="C9D0DC" w:sz="4"/>
+            </w:tcBorders>
+            <w:tcMar>
+              <w:top w:type="dxa" w:w="70"/>
+              <w:left w:type="dxa" w:w="100"/>
+              <w:bottom w:type="dxa" w:w="70"/>
+              <w:right w:type="dxa" w:w="100"/>
+            </w:tcMar>
+            <w:vAlign w:val="center"/>
+          </w:tcPr>
+          <w:p>
+            <w:pPr>
+              <w:spacing w:after="0" w:before="0" w:line="264"/>
+              <w:jc w:val="center"/>
+            </w:pPr>
+            <w:r>
+              <w:rPr>
+                <w:rFonts w:ascii="Arial" w:cs="Arial" w:eastAsia="Arial" w:hAnsi="Arial"/>
+                <w:sz w:val="30"/>
+                <w:szCs w:val="30"/>
+              </w:rPr>
+              <w:t xml:space="preserve">☐</w:t>
+            </w:r>
+          </w:p>
+        </w:tc>
+        <w:tc>
+          <w:tcPr>
+            <w:tcW w:type="dxa" w:w="620"/>
+            <w:tcBorders>
+              <w:top w:val="single" w:color="C9D0DC" w:sz="4"/>
+              <w:left w:val="single" w:color="C9D0DC" w:sz="4"/>
+              <w:bottom w:val="single" w:color="C9D0DC" w:sz="4"/>
+              <w:right w:val="single" w:color="C9D0DC" w:sz="4"/>
+            </w:tcBorders>
+            <w:tcMar>
+              <w:top w:type="dxa" w:w="70"/>
+              <w:left w:type="dxa" w:w="100"/>
+              <w:bottom w:type="dxa" w:w="70"/>
+              <w:right w:type="dxa" w:w="100"/>
+            </w:tcMar>
+            <w:vAlign w:val="center"/>
+          </w:tcPr>
+          <w:p>
+            <w:pPr>
+              <w:spacing w:after="0" w:before="0" w:line="264"/>
+              <w:jc w:val="center"/>
+            </w:pPr>
+            <w:r>
+              <w:rPr>
+                <w:rFonts w:ascii="Arial" w:cs="Arial" w:eastAsia="Arial" w:hAnsi="Arial"/>
+                <w:sz w:val="30"/>
+                <w:szCs w:val="30"/>
+              </w:rPr>
+              <w:t xml:space="preserve">☐</w:t>
+            </w:r>
+          </w:p>
+        </w:tc>
+        <w:tc>
+          <w:tcPr>
+            <w:tcW w:type="dxa" w:w="2040"/>
+            <w:tcBorders>
+              <w:top w:val="single" w:color="C9D0DC" w:sz="4"/>
+              <w:left w:val="single" w:color="C9D0DC" w:sz="4"/>
+              <w:bottom w:val="single" w:color="C9D0DC" w:sz="4"/>
+              <w:right w:val="single" w:color="C9D0DC" w:sz="4"/>
+            </w:tcBorders>
+            <w:tcMar>
+              <w:top w:type="dxa" w:w="70"/>
+              <w:left w:type="dxa" w:w="100"/>
+              <w:bottom w:type="dxa" w:w="70"/>
+              <w:right w:type="dxa" w:w="100"/>
+            </w:tcMar>
+            <w:vAlign w:val="top"/>
+          </w:tcPr>
+          <w:p>
+            <w:pPr>
+              <w:spacing w:after="0" w:before="0" w:line="264"/>
+            </w:pPr>
+            <w:r>
+              <w:rPr>
+                <w:rFonts w:ascii="Arial" w:cs="Arial" w:eastAsia="Arial" w:hAnsi="Arial"/>
+                <w:sz w:val="19"/>
+                <w:szCs w:val="19"/>
+              </w:rPr>
+              <w:t xml:space="preserve"> </w:t>
+            </w:r>
+          </w:p>
+        </w:tc>
+      </w:tr>
+      <w:tr>
+        <w:trPr>
+          <w:cantSplit/>
+        </w:trPr>
+        <w:tc>
+          <w:tcPr>
+            <w:tcW w:type="dxa" w:w="860"/>
+            <w:tcBorders>
+              <w:top w:val="single" w:color="C9D0DC" w:sz="4"/>
+              <w:left w:val="single" w:color="C9D0DC" w:sz="4"/>
+              <w:bottom w:val="single" w:color="C9D0DC" w:sz="4"/>
+              <w:right w:val="single" w:color="C9D0DC" w:sz="4"/>
+            </w:tcBorders>
+            <w:tcMar>
+              <w:top w:type="dxa" w:w="70"/>
+              <w:left w:type="dxa" w:w="100"/>
+              <w:bottom w:type="dxa" w:w="70"/>
+              <w:right w:type="dxa" w:w="100"/>
+            </w:tcMar>
+            <w:vAlign w:val="top"/>
+          </w:tcPr>
+          <w:p>
+            <w:pPr>
+              <w:spacing w:after="0" w:before="0" w:line="264"/>
+            </w:pPr>
+            <w:r>
+              <w:rPr>
+                <w:rFonts w:ascii="Arial" w:cs="Arial" w:eastAsia="Arial" w:hAnsi="Arial"/>
+                <w:b/>
+                <w:bCs/>
+                <w:color w:val="5B6477"/>
+                <w:sz w:val="16"/>
+                <w:szCs w:val="16"/>
+              </w:rPr>
+              <w:t xml:space="preserve">AD-36</w:t>
+            </w:r>
+          </w:p>
+        </w:tc>
+        <w:tc>
+          <w:tcPr>
+            <w:tcW w:type="dxa" w:w="5480"/>
+            <w:tcBorders>
+              <w:top w:val="single" w:color="C9D0DC" w:sz="4"/>
+              <w:left w:val="single" w:color="C9D0DC" w:sz="4"/>
+              <w:bottom w:val="single" w:color="C9D0DC" w:sz="4"/>
+              <w:right w:val="single" w:color="C9D0DC" w:sz="4"/>
+            </w:tcBorders>
+            <w:tcMar>
+              <w:top w:type="dxa" w:w="70"/>
+              <w:left w:type="dxa" w:w="100"/>
+              <w:bottom w:type="dxa" w:w="70"/>
+              <w:right w:type="dxa" w:w="100"/>
+            </w:tcMar>
+            <w:vAlign w:val="top"/>
+          </w:tcPr>
+          <w:p>
+            <w:pPr>
+              <w:spacing w:after="40" w:before="0" w:line="264"/>
+            </w:pPr>
+            <w:r>
+              <w:rPr>
+                <w:rFonts w:ascii="Arial" w:cs="Arial" w:eastAsia="Arial" w:hAnsi="Arial"/>
+                <w:b/>
+                <w:bCs/>
+                <w:sz w:val="20"/>
+                <w:szCs w:val="20"/>
+              </w:rPr>
+              <w:t xml:space="preserve">Notified of outlet changes</w:t>
+            </w:r>
+          </w:p>
+          <w:p>
+            <w:pPr>
+              <w:spacing w:after="40" w:before="0" w:line="264"/>
+            </w:pPr>
+            <w:r>
+              <w:rPr>
+                <w:rFonts w:ascii="Arial" w:cs="Arial" w:eastAsia="Arial" w:hAnsi="Arial"/>
+                <w:i/>
+                <w:iCs/>
+                <w:color w:val="5B6477"/>
+                <w:sz w:val="15"/>
+                <w:szCs w:val="15"/>
+              </w:rPr>
+              <w:t xml:space="preserve">Flow F31 · Agent field work: outlets, itineraries and consignment maximums</w:t>
+            </w:r>
+          </w:p>
+          <w:p>
+            <w:pPr>
+              <w:spacing w:after="20" w:before="0" w:line="264"/>
+            </w:pPr>
+            <w:r>
+              <w:rPr>
+                <w:rFonts w:ascii="Arial" w:cs="Arial" w:eastAsia="Arial" w:hAnsi="Arial"/>
+                <w:color w:val="5B6477"/>
+                <w:sz w:val="19"/>
+                <w:szCs w:val="19"/>
+              </w:rPr>
+              <w:t xml:space="preserve">1.  </w:t>
+            </w:r>
+            <w:r>
+              <w:rPr>
+                <w:rFonts w:ascii="Arial" w:cs="Arial" w:eastAsia="Arial" w:hAnsi="Arial"/>
+                <w:sz w:val="19"/>
+                <w:szCs w:val="19"/>
+              </w:rPr>
+              <w:t xml:space="preserve">Open Notifications after the Sales Manager approves a change, moves or shares an outlet.</w:t>
+            </w:r>
+          </w:p>
+          <w:p>
+            <w:pPr>
+              <w:spacing w:after="0" w:before="60" w:line="264"/>
+            </w:pPr>
+            <w:r>
+              <w:rPr>
+                <w:rFonts w:ascii="Arial" w:cs="Arial" w:eastAsia="Arial" w:hAnsi="Arial"/>
+                <w:b/>
+                <w:bCs/>
+                <w:color w:val="0B1F3A"/>
+                <w:sz w:val="19"/>
+                <w:szCs w:val="19"/>
+              </w:rPr>
+              <w:t xml:space="preserve">You should see: </w:t>
+            </w:r>
+            <w:r>
+              <w:rPr>
+                <w:rFonts w:ascii="Arial" w:cs="Arial" w:eastAsia="Arial" w:hAnsi="Arial"/>
+                <w:sz w:val="19"/>
+                <w:szCs w:val="19"/>
+              </w:rPr>
+              <w:t xml:space="preserve">Each change is listed with what changed (old → new) and who approved it.</w:t>
             </w:r>
           </w:p>
         </w:tc>
@@ -10568,7 +11351,7 @@
                 <w:sz w:val="17"/>
                 <w:szCs w:val="17"/>
               </w:rPr>
-              <w:t xml:space="preserve">Passed (of 35)</w:t>
+              <w:t xml:space="preserve">Passed (of 38)</w:t>
             </w:r>
           </w:p>
         </w:tc>

</xml_diff>

<commit_message>
Search in every list: search box on all tables from 6 rows; 6-Pack Card stickers given and cards redeemed searchable over a chosen period; guides and acceptance tests updated
Co-Authored-By: Claude Sonnet 5.5 <noreply@anthropic.com>
Claude-Session: https://claude.ai/code/session_01611rAAsm4xgneCTG3N9mPf
</commit_message>
<xml_diff>
--- a/docs/acceptance-test/per-user/01-admin.docx
+++ b/docs/acceptance-test/per-user/01-admin.docx
@@ -117,7 +117,7 @@
           <w:sz w:val="18"/>
           <w:szCs w:val="18"/>
         </w:rPr>
-        <w:t xml:space="preserve">  ·  38 checks</w:t>
+        <w:t xml:space="preserve">  ·  39 checks</w:t>
       </w:r>
     </w:p>
     <w:tbl>
@@ -1064,6 +1064,273 @@
                 <w:szCs w:val="19"/>
               </w:rPr>
               <w:t xml:space="preserve">My guide shows the steps for this role only. The picture guide opens with numbered red boxes.</w:t>
+            </w:r>
+          </w:p>
+        </w:tc>
+        <w:tc>
+          <w:tcPr>
+            <w:tcW w:type="dxa" w:w="620"/>
+            <w:tcBorders>
+              <w:top w:val="single" w:color="C9D0DC" w:sz="4"/>
+              <w:left w:val="single" w:color="C9D0DC" w:sz="4"/>
+              <w:bottom w:val="single" w:color="C9D0DC" w:sz="4"/>
+              <w:right w:val="single" w:color="C9D0DC" w:sz="4"/>
+            </w:tcBorders>
+            <w:tcMar>
+              <w:top w:type="dxa" w:w="70"/>
+              <w:left w:type="dxa" w:w="100"/>
+              <w:bottom w:type="dxa" w:w="70"/>
+              <w:right w:type="dxa" w:w="100"/>
+            </w:tcMar>
+            <w:vAlign w:val="center"/>
+          </w:tcPr>
+          <w:p>
+            <w:pPr>
+              <w:spacing w:after="0" w:before="0" w:line="264"/>
+              <w:jc w:val="center"/>
+            </w:pPr>
+            <w:r>
+              <w:rPr>
+                <w:rFonts w:ascii="Arial" w:cs="Arial" w:eastAsia="Arial" w:hAnsi="Arial"/>
+                <w:sz w:val="30"/>
+                <w:szCs w:val="30"/>
+              </w:rPr>
+              <w:t xml:space="preserve">☐</w:t>
+            </w:r>
+          </w:p>
+        </w:tc>
+        <w:tc>
+          <w:tcPr>
+            <w:tcW w:type="dxa" w:w="620"/>
+            <w:tcBorders>
+              <w:top w:val="single" w:color="C9D0DC" w:sz="4"/>
+              <w:left w:val="single" w:color="C9D0DC" w:sz="4"/>
+              <w:bottom w:val="single" w:color="C9D0DC" w:sz="4"/>
+              <w:right w:val="single" w:color="C9D0DC" w:sz="4"/>
+            </w:tcBorders>
+            <w:tcMar>
+              <w:top w:type="dxa" w:w="70"/>
+              <w:left w:type="dxa" w:w="100"/>
+              <w:bottom w:type="dxa" w:w="70"/>
+              <w:right w:type="dxa" w:w="100"/>
+            </w:tcMar>
+            <w:vAlign w:val="center"/>
+          </w:tcPr>
+          <w:p>
+            <w:pPr>
+              <w:spacing w:after="0" w:before="0" w:line="264"/>
+              <w:jc w:val="center"/>
+            </w:pPr>
+            <w:r>
+              <w:rPr>
+                <w:rFonts w:ascii="Arial" w:cs="Arial" w:eastAsia="Arial" w:hAnsi="Arial"/>
+                <w:sz w:val="30"/>
+                <w:szCs w:val="30"/>
+              </w:rPr>
+              <w:t xml:space="preserve">☐</w:t>
+            </w:r>
+          </w:p>
+        </w:tc>
+        <w:tc>
+          <w:tcPr>
+            <w:tcW w:type="dxa" w:w="620"/>
+            <w:tcBorders>
+              <w:top w:val="single" w:color="C9D0DC" w:sz="4"/>
+              <w:left w:val="single" w:color="C9D0DC" w:sz="4"/>
+              <w:bottom w:val="single" w:color="C9D0DC" w:sz="4"/>
+              <w:right w:val="single" w:color="C9D0DC" w:sz="4"/>
+            </w:tcBorders>
+            <w:tcMar>
+              <w:top w:type="dxa" w:w="70"/>
+              <w:left w:type="dxa" w:w="100"/>
+              <w:bottom w:type="dxa" w:w="70"/>
+              <w:right w:type="dxa" w:w="100"/>
+            </w:tcMar>
+            <w:vAlign w:val="center"/>
+          </w:tcPr>
+          <w:p>
+            <w:pPr>
+              <w:spacing w:after="0" w:before="0" w:line="264"/>
+              <w:jc w:val="center"/>
+            </w:pPr>
+            <w:r>
+              <w:rPr>
+                <w:rFonts w:ascii="Arial" w:cs="Arial" w:eastAsia="Arial" w:hAnsi="Arial"/>
+                <w:sz w:val="30"/>
+                <w:szCs w:val="30"/>
+              </w:rPr>
+              <w:t xml:space="preserve">☐</w:t>
+            </w:r>
+          </w:p>
+        </w:tc>
+        <w:tc>
+          <w:tcPr>
+            <w:tcW w:type="dxa" w:w="2040"/>
+            <w:tcBorders>
+              <w:top w:val="single" w:color="C9D0DC" w:sz="4"/>
+              <w:left w:val="single" w:color="C9D0DC" w:sz="4"/>
+              <w:bottom w:val="single" w:color="C9D0DC" w:sz="4"/>
+              <w:right w:val="single" w:color="C9D0DC" w:sz="4"/>
+            </w:tcBorders>
+            <w:tcMar>
+              <w:top w:type="dxa" w:w="70"/>
+              <w:left w:type="dxa" w:w="100"/>
+              <w:bottom w:type="dxa" w:w="70"/>
+              <w:right w:type="dxa" w:w="100"/>
+            </w:tcMar>
+            <w:vAlign w:val="top"/>
+          </w:tcPr>
+          <w:p>
+            <w:pPr>
+              <w:spacing w:after="0" w:before="0" w:line="264"/>
+            </w:pPr>
+            <w:r>
+              <w:rPr>
+                <w:rFonts w:ascii="Arial" w:cs="Arial" w:eastAsia="Arial" w:hAnsi="Arial"/>
+                <w:sz w:val="19"/>
+                <w:szCs w:val="19"/>
+              </w:rPr>
+              <w:t xml:space="preserve"> </w:t>
+            </w:r>
+          </w:p>
+        </w:tc>
+      </w:tr>
+      <w:tr>
+        <w:trPr>
+          <w:cantSplit/>
+        </w:trPr>
+        <w:tc>
+          <w:tcPr>
+            <w:tcW w:type="dxa" w:w="860"/>
+            <w:tcBorders>
+              <w:top w:val="single" w:color="C9D0DC" w:sz="4"/>
+              <w:left w:val="single" w:color="C9D0DC" w:sz="4"/>
+              <w:bottom w:val="single" w:color="C9D0DC" w:sz="4"/>
+              <w:right w:val="single" w:color="C9D0DC" w:sz="4"/>
+            </w:tcBorders>
+            <w:tcMar>
+              <w:top w:type="dxa" w:w="70"/>
+              <w:left w:type="dxa" w:w="100"/>
+              <w:bottom w:type="dxa" w:w="70"/>
+              <w:right w:type="dxa" w:w="100"/>
+            </w:tcMar>
+            <w:vAlign w:val="top"/>
+          </w:tcPr>
+          <w:p>
+            <w:pPr>
+              <w:spacing w:after="0" w:before="0" w:line="264"/>
+            </w:pPr>
+            <w:r>
+              <w:rPr>
+                <w:rFonts w:ascii="Arial" w:cs="Arial" w:eastAsia="Arial" w:hAnsi="Arial"/>
+                <w:b/>
+                <w:bCs/>
+                <w:color w:val="5B6477"/>
+                <w:sz w:val="16"/>
+                <w:szCs w:val="16"/>
+              </w:rPr>
+              <w:t xml:space="preserve">GEN-SRCH</w:t>
+            </w:r>
+          </w:p>
+        </w:tc>
+        <w:tc>
+          <w:tcPr>
+            <w:tcW w:type="dxa" w:w="5480"/>
+            <w:tcBorders>
+              <w:top w:val="single" w:color="C9D0DC" w:sz="4"/>
+              <w:left w:val="single" w:color="C9D0DC" w:sz="4"/>
+              <w:bottom w:val="single" w:color="C9D0DC" w:sz="4"/>
+              <w:right w:val="single" w:color="C9D0DC" w:sz="4"/>
+            </w:tcBorders>
+            <w:tcMar>
+              <w:top w:type="dxa" w:w="70"/>
+              <w:left w:type="dxa" w:w="100"/>
+              <w:bottom w:type="dxa" w:w="70"/>
+              <w:right w:type="dxa" w:w="100"/>
+            </w:tcMar>
+            <w:vAlign w:val="top"/>
+          </w:tcPr>
+          <w:p>
+            <w:pPr>
+              <w:spacing w:after="40" w:before="0" w:line="264"/>
+            </w:pPr>
+            <w:r>
+              <w:rPr>
+                <w:rFonts w:ascii="Arial" w:cs="Arial" w:eastAsia="Arial" w:hAnsi="Arial"/>
+                <w:b/>
+                <w:bCs/>
+                <w:sz w:val="20"/>
+                <w:szCs w:val="20"/>
+              </w:rPr>
+              <w:t xml:space="preserve">Search a list</w:t>
+            </w:r>
+          </w:p>
+          <w:p>
+            <w:pPr>
+              <w:spacing w:after="20" w:before="0" w:line="264"/>
+            </w:pPr>
+            <w:r>
+              <w:rPr>
+                <w:rFonts w:ascii="Arial" w:cs="Arial" w:eastAsia="Arial" w:hAnsi="Arial"/>
+                <w:color w:val="5B6477"/>
+                <w:sz w:val="19"/>
+                <w:szCs w:val="19"/>
+              </w:rPr>
+              <w:t xml:space="preserve">1.  </w:t>
+            </w:r>
+            <w:r>
+              <w:rPr>
+                <w:rFonts w:ascii="Arial" w:cs="Arial" w:eastAsia="Arial" w:hAnsi="Arial"/>
+                <w:sz w:val="19"/>
+                <w:szCs w:val="19"/>
+              </w:rPr>
+              <w:t xml:space="preserve">Open a list with six or more rows (for example Sales List, Cash Fund or Chart of Accounts).</w:t>
+            </w:r>
+          </w:p>
+          <w:p>
+            <w:pPr>
+              <w:spacing w:after="20" w:before="0" w:line="264"/>
+            </w:pPr>
+            <w:r>
+              <w:rPr>
+                <w:rFonts w:ascii="Arial" w:cs="Arial" w:eastAsia="Arial" w:hAnsi="Arial"/>
+                <w:color w:val="5B6477"/>
+                <w:sz w:val="19"/>
+                <w:szCs w:val="19"/>
+              </w:rPr>
+              <w:t xml:space="preserve">2.  </w:t>
+            </w:r>
+            <w:r>
+              <w:rPr>
+                <w:rFonts w:ascii="Arial" w:cs="Arial" w:eastAsia="Arial" w:hAnsi="Arial"/>
+                <w:sz w:val="19"/>
+                <w:szCs w:val="19"/>
+              </w:rPr>
+              <w:t xml:space="preserve">Type part of a name, number or product in Search this list.</w:t>
+            </w:r>
+          </w:p>
+          <w:p>
+            <w:pPr>
+              <w:spacing w:after="0" w:before="60" w:line="264"/>
+            </w:pPr>
+            <w:r>
+              <w:rPr>
+                <w:rFonts w:ascii="Arial" w:cs="Arial" w:eastAsia="Arial" w:hAnsi="Arial"/>
+                <w:b/>
+                <w:bCs/>
+                <w:color w:val="0B1F3A"/>
+                <w:sz w:val="19"/>
+                <w:szCs w:val="19"/>
+              </w:rPr>
+              <w:t xml:space="preserve">You should see: </w:t>
+            </w:r>
+            <w:r>
+              <w:rPr>
+                <w:rFonts w:ascii="Arial" w:cs="Arial" w:eastAsia="Arial" w:hAnsi="Arial"/>
+                <w:sz w:val="19"/>
+                <w:szCs w:val="19"/>
+              </w:rPr>
+              <w:t xml:space="preserve">Only rows that contain every word you typed are shown; clearing the box shows all rows again.</w:t>
             </w:r>
           </w:p>
         </w:tc>
@@ -11351,7 +11618,7 @@
                 <w:sz w:val="17"/>
                 <w:szCs w:val="17"/>
               </w:rPr>
-              <w:t xml:space="preserve">Passed (of 38)</w:t>
+              <w:t xml:space="preserve">Passed (of 39)</w:t>
             </w:r>
           </w:p>
         </w:tc>

</xml_diff>

<commit_message>
Wheysted members: QR card, counter lookup and tagging, customer member page, member list with favorites / frequency / segments, who bought an item, email and SMS campaigns; ideas list for the Owner; guides and acceptance tests updated
Co-Authored-By: Claude Sonnet 5.5 <noreply@anthropic.com>
Claude-Session: https://claude.ai/code/session_01611rAAsm4xgneCTG3N9mPf
</commit_message>
<xml_diff>
--- a/docs/acceptance-test/per-user/01-admin.docx
+++ b/docs/acceptance-test/per-user/01-admin.docx
@@ -117,7 +117,7 @@
           <w:sz w:val="18"/>
           <w:szCs w:val="18"/>
         </w:rPr>
-        <w:t xml:space="preserve">  ·  39 checks</w:t>
+        <w:t xml:space="preserve">  ·  40 checks</w:t>
       </w:r>
     </w:p>
     <w:tbl>
@@ -1331,6 +1331,295 @@
                 <w:szCs w:val="19"/>
               </w:rPr>
               <w:t xml:space="preserve">Only rows that contain every word you typed are shown; clearing the box shows all rows again.</w:t>
+            </w:r>
+          </w:p>
+        </w:tc>
+        <w:tc>
+          <w:tcPr>
+            <w:tcW w:type="dxa" w:w="620"/>
+            <w:tcBorders>
+              <w:top w:val="single" w:color="C9D0DC" w:sz="4"/>
+              <w:left w:val="single" w:color="C9D0DC" w:sz="4"/>
+              <w:bottom w:val="single" w:color="C9D0DC" w:sz="4"/>
+              <w:right w:val="single" w:color="C9D0DC" w:sz="4"/>
+            </w:tcBorders>
+            <w:tcMar>
+              <w:top w:type="dxa" w:w="70"/>
+              <w:left w:type="dxa" w:w="100"/>
+              <w:bottom w:type="dxa" w:w="70"/>
+              <w:right w:type="dxa" w:w="100"/>
+            </w:tcMar>
+            <w:vAlign w:val="center"/>
+          </w:tcPr>
+          <w:p>
+            <w:pPr>
+              <w:spacing w:after="0" w:before="0" w:line="264"/>
+              <w:jc w:val="center"/>
+            </w:pPr>
+            <w:r>
+              <w:rPr>
+                <w:rFonts w:ascii="Arial" w:cs="Arial" w:eastAsia="Arial" w:hAnsi="Arial"/>
+                <w:sz w:val="30"/>
+                <w:szCs w:val="30"/>
+              </w:rPr>
+              <w:t xml:space="preserve">☐</w:t>
+            </w:r>
+          </w:p>
+        </w:tc>
+        <w:tc>
+          <w:tcPr>
+            <w:tcW w:type="dxa" w:w="620"/>
+            <w:tcBorders>
+              <w:top w:val="single" w:color="C9D0DC" w:sz="4"/>
+              <w:left w:val="single" w:color="C9D0DC" w:sz="4"/>
+              <w:bottom w:val="single" w:color="C9D0DC" w:sz="4"/>
+              <w:right w:val="single" w:color="C9D0DC" w:sz="4"/>
+            </w:tcBorders>
+            <w:tcMar>
+              <w:top w:type="dxa" w:w="70"/>
+              <w:left w:type="dxa" w:w="100"/>
+              <w:bottom w:type="dxa" w:w="70"/>
+              <w:right w:type="dxa" w:w="100"/>
+            </w:tcMar>
+            <w:vAlign w:val="center"/>
+          </w:tcPr>
+          <w:p>
+            <w:pPr>
+              <w:spacing w:after="0" w:before="0" w:line="264"/>
+              <w:jc w:val="center"/>
+            </w:pPr>
+            <w:r>
+              <w:rPr>
+                <w:rFonts w:ascii="Arial" w:cs="Arial" w:eastAsia="Arial" w:hAnsi="Arial"/>
+                <w:sz w:val="30"/>
+                <w:szCs w:val="30"/>
+              </w:rPr>
+              <w:t xml:space="preserve">☐</w:t>
+            </w:r>
+          </w:p>
+        </w:tc>
+        <w:tc>
+          <w:tcPr>
+            <w:tcW w:type="dxa" w:w="620"/>
+            <w:tcBorders>
+              <w:top w:val="single" w:color="C9D0DC" w:sz="4"/>
+              <w:left w:val="single" w:color="C9D0DC" w:sz="4"/>
+              <w:bottom w:val="single" w:color="C9D0DC" w:sz="4"/>
+              <w:right w:val="single" w:color="C9D0DC" w:sz="4"/>
+            </w:tcBorders>
+            <w:tcMar>
+              <w:top w:type="dxa" w:w="70"/>
+              <w:left w:type="dxa" w:w="100"/>
+              <w:bottom w:type="dxa" w:w="70"/>
+              <w:right w:type="dxa" w:w="100"/>
+            </w:tcMar>
+            <w:vAlign w:val="center"/>
+          </w:tcPr>
+          <w:p>
+            <w:pPr>
+              <w:spacing w:after="0" w:before="0" w:line="264"/>
+              <w:jc w:val="center"/>
+            </w:pPr>
+            <w:r>
+              <w:rPr>
+                <w:rFonts w:ascii="Arial" w:cs="Arial" w:eastAsia="Arial" w:hAnsi="Arial"/>
+                <w:sz w:val="30"/>
+                <w:szCs w:val="30"/>
+              </w:rPr>
+              <w:t xml:space="preserve">☐</w:t>
+            </w:r>
+          </w:p>
+        </w:tc>
+        <w:tc>
+          <w:tcPr>
+            <w:tcW w:type="dxa" w:w="2040"/>
+            <w:tcBorders>
+              <w:top w:val="single" w:color="C9D0DC" w:sz="4"/>
+              <w:left w:val="single" w:color="C9D0DC" w:sz="4"/>
+              <w:bottom w:val="single" w:color="C9D0DC" w:sz="4"/>
+              <w:right w:val="single" w:color="C9D0DC" w:sz="4"/>
+            </w:tcBorders>
+            <w:tcMar>
+              <w:top w:type="dxa" w:w="70"/>
+              <w:left w:type="dxa" w:w="100"/>
+              <w:bottom w:type="dxa" w:w="70"/>
+              <w:right w:type="dxa" w:w="100"/>
+            </w:tcMar>
+            <w:vAlign w:val="top"/>
+          </w:tcPr>
+          <w:p>
+            <w:pPr>
+              <w:spacing w:after="0" w:before="0" w:line="264"/>
+            </w:pPr>
+            <w:r>
+              <w:rPr>
+                <w:rFonts w:ascii="Arial" w:cs="Arial" w:eastAsia="Arial" w:hAnsi="Arial"/>
+                <w:sz w:val="19"/>
+                <w:szCs w:val="19"/>
+              </w:rPr>
+              <w:t xml:space="preserve"> </w:t>
+            </w:r>
+          </w:p>
+        </w:tc>
+      </w:tr>
+      <w:tr>
+        <w:trPr>
+          <w:cantSplit/>
+        </w:trPr>
+        <w:tc>
+          <w:tcPr>
+            <w:tcW w:type="dxa" w:w="860"/>
+            <w:tcBorders>
+              <w:top w:val="single" w:color="C9D0DC" w:sz="4"/>
+              <w:left w:val="single" w:color="C9D0DC" w:sz="4"/>
+              <w:bottom w:val="single" w:color="C9D0DC" w:sz="4"/>
+              <w:right w:val="single" w:color="C9D0DC" w:sz="4"/>
+            </w:tcBorders>
+            <w:tcMar>
+              <w:top w:type="dxa" w:w="70"/>
+              <w:left w:type="dxa" w:w="100"/>
+              <w:bottom w:type="dxa" w:w="70"/>
+              <w:right w:type="dxa" w:w="100"/>
+            </w:tcMar>
+            <w:vAlign w:val="top"/>
+          </w:tcPr>
+          <w:p>
+            <w:pPr>
+              <w:spacing w:after="0" w:before="0" w:line="264"/>
+            </w:pPr>
+            <w:r>
+              <w:rPr>
+                <w:rFonts w:ascii="Arial" w:cs="Arial" w:eastAsia="Arial" w:hAnsi="Arial"/>
+                <w:b/>
+                <w:bCs/>
+                <w:color w:val="5B6477"/>
+                <w:sz w:val="16"/>
+                <w:szCs w:val="16"/>
+              </w:rPr>
+              <w:t xml:space="preserve">GEN-MEM</w:t>
+            </w:r>
+          </w:p>
+        </w:tc>
+        <w:tc>
+          <w:tcPr>
+            <w:tcW w:type="dxa" w:w="5480"/>
+            <w:tcBorders>
+              <w:top w:val="single" w:color="C9D0DC" w:sz="4"/>
+              <w:left w:val="single" w:color="C9D0DC" w:sz="4"/>
+              <w:bottom w:val="single" w:color="C9D0DC" w:sz="4"/>
+              <w:right w:val="single" w:color="C9D0DC" w:sz="4"/>
+            </w:tcBorders>
+            <w:tcMar>
+              <w:top w:type="dxa" w:w="70"/>
+              <w:left w:type="dxa" w:w="100"/>
+              <w:bottom w:type="dxa" w:w="70"/>
+              <w:right w:type="dxa" w:w="100"/>
+            </w:tcMar>
+            <w:vAlign w:val="top"/>
+          </w:tcPr>
+          <w:p>
+            <w:pPr>
+              <w:spacing w:after="40" w:before="0" w:line="264"/>
+            </w:pPr>
+            <w:r>
+              <w:rPr>
+                <w:rFonts w:ascii="Arial" w:cs="Arial" w:eastAsia="Arial" w:hAnsi="Arial"/>
+                <w:b/>
+                <w:bCs/>
+                <w:sz w:val="20"/>
+                <w:szCs w:val="20"/>
+              </w:rPr>
+              <w:t xml:space="preserve">Member page for customers (phone)</w:t>
+            </w:r>
+          </w:p>
+          <w:p>
+            <w:pPr>
+              <w:spacing w:after="20" w:before="0" w:line="264"/>
+            </w:pPr>
+            <w:r>
+              <w:rPr>
+                <w:rFonts w:ascii="Arial" w:cs="Arial" w:eastAsia="Arial" w:hAnsi="Arial"/>
+                <w:color w:val="5B6477"/>
+                <w:sz w:val="19"/>
+                <w:szCs w:val="19"/>
+              </w:rPr>
+              <w:t xml:space="preserve">1.  </w:t>
+            </w:r>
+            <w:r>
+              <w:rPr>
+                <w:rFonts w:ascii="Arial" w:cs="Arial" w:eastAsia="Arial" w:hAnsi="Arial"/>
+                <w:sz w:val="19"/>
+                <w:szCs w:val="19"/>
+              </w:rPr>
+              <w:t xml:space="preserve">Open /member on a phone.</w:t>
+            </w:r>
+          </w:p>
+          <w:p>
+            <w:pPr>
+              <w:spacing w:after="20" w:before="0" w:line="264"/>
+            </w:pPr>
+            <w:r>
+              <w:rPr>
+                <w:rFonts w:ascii="Arial" w:cs="Arial" w:eastAsia="Arial" w:hAnsi="Arial"/>
+                <w:color w:val="5B6477"/>
+                <w:sz w:val="19"/>
+                <w:szCs w:val="19"/>
+              </w:rPr>
+              <w:t xml:space="preserve">2.  </w:t>
+            </w:r>
+            <w:r>
+              <w:rPr>
+                <w:rFonts w:ascii="Arial" w:cs="Arial" w:eastAsia="Arial" w:hAnsi="Arial"/>
+                <w:sz w:val="19"/>
+                <w:szCs w:val="19"/>
+              </w:rPr>
+              <w:t xml:space="preserve">Become a member with your own mobile number, tick the agreement, create the account.</w:t>
+            </w:r>
+          </w:p>
+          <w:p>
+            <w:pPr>
+              <w:spacing w:after="20" w:before="0" w:line="264"/>
+            </w:pPr>
+            <w:r>
+              <w:rPr>
+                <w:rFonts w:ascii="Arial" w:cs="Arial" w:eastAsia="Arial" w:hAnsi="Arial"/>
+                <w:color w:val="5B6477"/>
+                <w:sz w:val="19"/>
+                <w:szCs w:val="19"/>
+              </w:rPr>
+              <w:t xml:space="preserve">3.  </w:t>
+            </w:r>
+            <w:r>
+              <w:rPr>
+                <w:rFonts w:ascii="Arial" w:cs="Arial" w:eastAsia="Arial" w:hAnsi="Arial"/>
+                <w:sz w:val="19"/>
+                <w:szCs w:val="19"/>
+              </w:rPr>
+              <w:t xml:space="preserve">My card → the QR code and member number. Ask the counter to tag a sale to you, then My purchases.</w:t>
+            </w:r>
+          </w:p>
+          <w:p>
+            <w:pPr>
+              <w:spacing w:after="0" w:before="60" w:line="264"/>
+            </w:pPr>
+            <w:r>
+              <w:rPr>
+                <w:rFonts w:ascii="Arial" w:cs="Arial" w:eastAsia="Arial" w:hAnsi="Arial"/>
+                <w:b/>
+                <w:bCs/>
+                <w:color w:val="0B1F3A"/>
+                <w:sz w:val="19"/>
+                <w:szCs w:val="19"/>
+              </w:rPr>
+              <w:t xml:space="preserve">You should see: </w:t>
+            </w:r>
+            <w:r>
+              <w:rPr>
+                <w:rFonts w:ascii="Arial" w:cs="Arial" w:eastAsia="Arial" w:hAnsi="Arial"/>
+                <w:sz w:val="19"/>
+                <w:szCs w:val="19"/>
+              </w:rPr>
+              <w:t xml:space="preserve">The QR card shows; after a tagged sale the purchase appears with its items. Sign out and in again with the mobile number and password.</w:t>
             </w:r>
           </w:p>
         </w:tc>
@@ -11618,7 +11907,7 @@
                 <w:sz w:val="17"/>
                 <w:szCs w:val="17"/>
               </w:rPr>
-              <w:t xml:space="preserve">Passed (of 39)</w:t>
+              <w:t xml:space="preserve">Passed (of 40)</w:t>
             </w:r>
           </w:p>
         </w:tc>

</xml_diff>

<commit_message>
Customer Service board (birthdays to the home store, restock due, regulars to win back) with results and reasons; promos issued by the Owner or Head Auditor to the branches or separately to the franchises, with memo, highlighted notice, dashboard strip and automatic promo price; guides, decisions, simulation steps and acceptance tests updated
Co-Authored-By: Claude Sonnet 5.5 <noreply@anthropic.com>
Claude-Session: https://claude.ai/code/session_01611rAAsm4xgneCTG3N9mPf
</commit_message>
<xml_diff>
--- a/docs/acceptance-test/per-user/01-admin.docx
+++ b/docs/acceptance-test/per-user/01-admin.docx
@@ -117,7 +117,7 @@
           <w:sz w:val="18"/>
           <w:szCs w:val="18"/>
         </w:rPr>
-        <w:t xml:space="preserve">  ·  40 checks</w:t>
+        <w:t xml:space="preserve">  ·  41 checks</w:t>
       </w:r>
     </w:p>
     <w:tbl>
@@ -11704,6 +11704,267 @@
                 <w:szCs w:val="19"/>
               </w:rPr>
               <w:t xml:space="preserve">Each change is listed with what changed (old → new) and who approved it.</w:t>
+            </w:r>
+          </w:p>
+        </w:tc>
+        <w:tc>
+          <w:tcPr>
+            <w:tcW w:type="dxa" w:w="620"/>
+            <w:tcBorders>
+              <w:top w:val="single" w:color="C9D0DC" w:sz="4"/>
+              <w:left w:val="single" w:color="C9D0DC" w:sz="4"/>
+              <w:bottom w:val="single" w:color="C9D0DC" w:sz="4"/>
+              <w:right w:val="single" w:color="C9D0DC" w:sz="4"/>
+            </w:tcBorders>
+            <w:tcMar>
+              <w:top w:type="dxa" w:w="70"/>
+              <w:left w:type="dxa" w:w="100"/>
+              <w:bottom w:type="dxa" w:w="70"/>
+              <w:right w:type="dxa" w:w="100"/>
+            </w:tcMar>
+            <w:vAlign w:val="center"/>
+          </w:tcPr>
+          <w:p>
+            <w:pPr>
+              <w:spacing w:after="0" w:before="0" w:line="264"/>
+              <w:jc w:val="center"/>
+            </w:pPr>
+            <w:r>
+              <w:rPr>
+                <w:rFonts w:ascii="Arial" w:cs="Arial" w:eastAsia="Arial" w:hAnsi="Arial"/>
+                <w:sz w:val="30"/>
+                <w:szCs w:val="30"/>
+              </w:rPr>
+              <w:t xml:space="preserve">☐</w:t>
+            </w:r>
+          </w:p>
+        </w:tc>
+        <w:tc>
+          <w:tcPr>
+            <w:tcW w:type="dxa" w:w="620"/>
+            <w:tcBorders>
+              <w:top w:val="single" w:color="C9D0DC" w:sz="4"/>
+              <w:left w:val="single" w:color="C9D0DC" w:sz="4"/>
+              <w:bottom w:val="single" w:color="C9D0DC" w:sz="4"/>
+              <w:right w:val="single" w:color="C9D0DC" w:sz="4"/>
+            </w:tcBorders>
+            <w:tcMar>
+              <w:top w:type="dxa" w:w="70"/>
+              <w:left w:type="dxa" w:w="100"/>
+              <w:bottom w:type="dxa" w:w="70"/>
+              <w:right w:type="dxa" w:w="100"/>
+            </w:tcMar>
+            <w:vAlign w:val="center"/>
+          </w:tcPr>
+          <w:p>
+            <w:pPr>
+              <w:spacing w:after="0" w:before="0" w:line="264"/>
+              <w:jc w:val="center"/>
+            </w:pPr>
+            <w:r>
+              <w:rPr>
+                <w:rFonts w:ascii="Arial" w:cs="Arial" w:eastAsia="Arial" w:hAnsi="Arial"/>
+                <w:sz w:val="30"/>
+                <w:szCs w:val="30"/>
+              </w:rPr>
+              <w:t xml:space="preserve">☐</w:t>
+            </w:r>
+          </w:p>
+        </w:tc>
+        <w:tc>
+          <w:tcPr>
+            <w:tcW w:type="dxa" w:w="620"/>
+            <w:tcBorders>
+              <w:top w:val="single" w:color="C9D0DC" w:sz="4"/>
+              <w:left w:val="single" w:color="C9D0DC" w:sz="4"/>
+              <w:bottom w:val="single" w:color="C9D0DC" w:sz="4"/>
+              <w:right w:val="single" w:color="C9D0DC" w:sz="4"/>
+            </w:tcBorders>
+            <w:tcMar>
+              <w:top w:type="dxa" w:w="70"/>
+              <w:left w:type="dxa" w:w="100"/>
+              <w:bottom w:type="dxa" w:w="70"/>
+              <w:right w:type="dxa" w:w="100"/>
+            </w:tcMar>
+            <w:vAlign w:val="center"/>
+          </w:tcPr>
+          <w:p>
+            <w:pPr>
+              <w:spacing w:after="0" w:before="0" w:line="264"/>
+              <w:jc w:val="center"/>
+            </w:pPr>
+            <w:r>
+              <w:rPr>
+                <w:rFonts w:ascii="Arial" w:cs="Arial" w:eastAsia="Arial" w:hAnsi="Arial"/>
+                <w:sz w:val="30"/>
+                <w:szCs w:val="30"/>
+              </w:rPr>
+              <w:t xml:space="preserve">☐</w:t>
+            </w:r>
+          </w:p>
+        </w:tc>
+        <w:tc>
+          <w:tcPr>
+            <w:tcW w:type="dxa" w:w="2040"/>
+            <w:tcBorders>
+              <w:top w:val="single" w:color="C9D0DC" w:sz="4"/>
+              <w:left w:val="single" w:color="C9D0DC" w:sz="4"/>
+              <w:bottom w:val="single" w:color="C9D0DC" w:sz="4"/>
+              <w:right w:val="single" w:color="C9D0DC" w:sz="4"/>
+            </w:tcBorders>
+            <w:tcMar>
+              <w:top w:type="dxa" w:w="70"/>
+              <w:left w:type="dxa" w:w="100"/>
+              <w:bottom w:type="dxa" w:w="70"/>
+              <w:right w:type="dxa" w:w="100"/>
+            </w:tcMar>
+            <w:vAlign w:val="top"/>
+          </w:tcPr>
+          <w:p>
+            <w:pPr>
+              <w:spacing w:after="0" w:before="0" w:line="264"/>
+            </w:pPr>
+            <w:r>
+              <w:rPr>
+                <w:rFonts w:ascii="Arial" w:cs="Arial" w:eastAsia="Arial" w:hAnsi="Arial"/>
+                <w:sz w:val="19"/>
+                <w:szCs w:val="19"/>
+              </w:rPr>
+              <w:t xml:space="preserve"> </w:t>
+            </w:r>
+          </w:p>
+        </w:tc>
+      </w:tr>
+      <w:tr>
+        <w:trPr>
+          <w:cantSplit/>
+        </w:trPr>
+        <w:tc>
+          <w:tcPr>
+            <w:tcW w:type="dxa" w:w="860"/>
+            <w:tcBorders>
+              <w:top w:val="single" w:color="C9D0DC" w:sz="4"/>
+              <w:left w:val="single" w:color="C9D0DC" w:sz="4"/>
+              <w:bottom w:val="single" w:color="C9D0DC" w:sz="4"/>
+              <w:right w:val="single" w:color="C9D0DC" w:sz="4"/>
+            </w:tcBorders>
+            <w:tcMar>
+              <w:top w:type="dxa" w:w="70"/>
+              <w:left w:type="dxa" w:w="100"/>
+              <w:bottom w:type="dxa" w:w="70"/>
+              <w:right w:type="dxa" w:w="100"/>
+            </w:tcMar>
+            <w:vAlign w:val="top"/>
+          </w:tcPr>
+          <w:p>
+            <w:pPr>
+              <w:spacing w:after="0" w:before="0" w:line="264"/>
+            </w:pPr>
+            <w:r>
+              <w:rPr>
+                <w:rFonts w:ascii="Arial" w:cs="Arial" w:eastAsia="Arial" w:hAnsi="Arial"/>
+                <w:b/>
+                <w:bCs/>
+                <w:color w:val="5B6477"/>
+                <w:sz w:val="16"/>
+                <w:szCs w:val="16"/>
+              </w:rPr>
+              <w:t xml:space="preserve">AD-37</w:t>
+            </w:r>
+          </w:p>
+        </w:tc>
+        <w:tc>
+          <w:tcPr>
+            <w:tcW w:type="dxa" w:w="5480"/>
+            <w:tcBorders>
+              <w:top w:val="single" w:color="C9D0DC" w:sz="4"/>
+              <w:left w:val="single" w:color="C9D0DC" w:sz="4"/>
+              <w:bottom w:val="single" w:color="C9D0DC" w:sz="4"/>
+              <w:right w:val="single" w:color="C9D0DC" w:sz="4"/>
+            </w:tcBorders>
+            <w:tcMar>
+              <w:top w:type="dxa" w:w="70"/>
+              <w:left w:type="dxa" w:w="100"/>
+              <w:bottom w:type="dxa" w:w="70"/>
+              <w:right w:type="dxa" w:w="100"/>
+            </w:tcMar>
+            <w:vAlign w:val="top"/>
+          </w:tcPr>
+          <w:p>
+            <w:pPr>
+              <w:spacing w:after="40" w:before="0" w:line="264"/>
+            </w:pPr>
+            <w:r>
+              <w:rPr>
+                <w:rFonts w:ascii="Arial" w:cs="Arial" w:eastAsia="Arial" w:hAnsi="Arial"/>
+                <w:b/>
+                <w:bCs/>
+                <w:sz w:val="20"/>
+                <w:szCs w:val="20"/>
+              </w:rPr>
+              <w:t xml:space="preserve">Issue a promo to the franchises</w:t>
+            </w:r>
+          </w:p>
+          <w:p>
+            <w:pPr>
+              <w:spacing w:after="40" w:before="0" w:line="264"/>
+            </w:pPr>
+            <w:r>
+              <w:rPr>
+                <w:rFonts w:ascii="Arial" w:cs="Arial" w:eastAsia="Arial" w:hAnsi="Arial"/>
+                <w:i/>
+                <w:iCs/>
+                <w:color w:val="5B6477"/>
+                <w:sz w:val="15"/>
+                <w:szCs w:val="15"/>
+              </w:rPr>
+              <w:t xml:space="preserve">Flow F34 · Customer Service: birthdays, restock due, results with reasons, and promos</w:t>
+            </w:r>
+          </w:p>
+          <w:p>
+            <w:pPr>
+              <w:spacing w:after="20" w:before="0" w:line="264"/>
+            </w:pPr>
+            <w:r>
+              <w:rPr>
+                <w:rFonts w:ascii="Arial" w:cs="Arial" w:eastAsia="Arial" w:hAnsi="Arial"/>
+                <w:color w:val="5B6477"/>
+                <w:sz w:val="19"/>
+                <w:szCs w:val="19"/>
+              </w:rPr>
+              <w:t xml:space="preserve">1.  </w:t>
+            </w:r>
+            <w:r>
+              <w:rPr>
+                <w:rFonts w:ascii="Arial" w:cs="Arial" w:eastAsia="Arial" w:hAnsi="Arial"/>
+                <w:sz w:val="19"/>
+                <w:szCs w:val="19"/>
+              </w:rPr>
+              <w:t xml:space="preserve">Promos → Issue it to Franchises only → fill in → Issue promo and send memo.</w:t>
+            </w:r>
+          </w:p>
+          <w:p>
+            <w:pPr>
+              <w:spacing w:after="0" w:before="60" w:line="264"/>
+            </w:pPr>
+            <w:r>
+              <w:rPr>
+                <w:rFonts w:ascii="Arial" w:cs="Arial" w:eastAsia="Arial" w:hAnsi="Arial"/>
+                <w:b/>
+                <w:bCs/>
+                <w:color w:val="0B1F3A"/>
+                <w:sz w:val="19"/>
+                <w:szCs w:val="19"/>
+              </w:rPr>
+              <w:t xml:space="preserve">You should see: </w:t>
+            </w:r>
+            <w:r>
+              <w:rPr>
+                <w:rFonts w:ascii="Arial" w:cs="Arial" w:eastAsia="Arial" w:hAnsi="Arial"/>
+                <w:sz w:val="19"/>
+                <w:szCs w:val="19"/>
+              </w:rPr>
+              <w:t xml:space="preserve">Franchise owners, franchise associates and the Franchise Coordinators get the memo and notice. Branch staff do not see it.</w:t>
             </w:r>
           </w:p>
         </w:tc>
@@ -11907,7 +12168,7 @@
                 <w:sz w:val="17"/>
                 <w:szCs w:val="17"/>
               </w:rPr>
-              <w:t xml:space="preserve">Passed (of 40)</w:t>
+              <w:t xml:space="preserve">Passed (of 41)</w:t>
             </w:r>
           </w:p>
         </w:tc>

</xml_diff>

<commit_message>
Restock and purchase orders: Head Auditor generates one PO per supplier with days of stock per branch, suggested transfers from existing stock and suggested order (all editable), Owner approval, supplier / internal / warehouse copies, branch notices and Restock Plan, delivery linked to the order; guides, decisions, simulation steps, acceptance tests and recommendations
Co-Authored-By: Claude Sonnet 5.5 <noreply@anthropic.com>
Claude-Session: https://claude.ai/code/session_01611rAAsm4xgneCTG3N9mPf
</commit_message>
<xml_diff>
--- a/docs/acceptance-test/per-user/01-admin.docx
+++ b/docs/acceptance-test/per-user/01-admin.docx
@@ -117,7 +117,7 @@
           <w:sz w:val="18"/>
           <w:szCs w:val="18"/>
         </w:rPr>
-        <w:t xml:space="preserve">  ·  41 checks</w:t>
+        <w:t xml:space="preserve">  ·  42 checks</w:t>
       </w:r>
     </w:p>
     <w:tbl>
@@ -11965,6 +11965,333 @@
                 <w:szCs w:val="19"/>
               </w:rPr>
               <w:t xml:space="preserve">Franchise owners, franchise associates and the Franchise Coordinators get the memo and notice. Branch staff do not see it.</w:t>
+            </w:r>
+          </w:p>
+        </w:tc>
+        <w:tc>
+          <w:tcPr>
+            <w:tcW w:type="dxa" w:w="620"/>
+            <w:tcBorders>
+              <w:top w:val="single" w:color="C9D0DC" w:sz="4"/>
+              <w:left w:val="single" w:color="C9D0DC" w:sz="4"/>
+              <w:bottom w:val="single" w:color="C9D0DC" w:sz="4"/>
+              <w:right w:val="single" w:color="C9D0DC" w:sz="4"/>
+            </w:tcBorders>
+            <w:tcMar>
+              <w:top w:type="dxa" w:w="70"/>
+              <w:left w:type="dxa" w:w="100"/>
+              <w:bottom w:type="dxa" w:w="70"/>
+              <w:right w:type="dxa" w:w="100"/>
+            </w:tcMar>
+            <w:vAlign w:val="center"/>
+          </w:tcPr>
+          <w:p>
+            <w:pPr>
+              <w:spacing w:after="0" w:before="0" w:line="264"/>
+              <w:jc w:val="center"/>
+            </w:pPr>
+            <w:r>
+              <w:rPr>
+                <w:rFonts w:ascii="Arial" w:cs="Arial" w:eastAsia="Arial" w:hAnsi="Arial"/>
+                <w:sz w:val="30"/>
+                <w:szCs w:val="30"/>
+              </w:rPr>
+              <w:t xml:space="preserve">☐</w:t>
+            </w:r>
+          </w:p>
+        </w:tc>
+        <w:tc>
+          <w:tcPr>
+            <w:tcW w:type="dxa" w:w="620"/>
+            <w:tcBorders>
+              <w:top w:val="single" w:color="C9D0DC" w:sz="4"/>
+              <w:left w:val="single" w:color="C9D0DC" w:sz="4"/>
+              <w:bottom w:val="single" w:color="C9D0DC" w:sz="4"/>
+              <w:right w:val="single" w:color="C9D0DC" w:sz="4"/>
+            </w:tcBorders>
+            <w:tcMar>
+              <w:top w:type="dxa" w:w="70"/>
+              <w:left w:type="dxa" w:w="100"/>
+              <w:bottom w:type="dxa" w:w="70"/>
+              <w:right w:type="dxa" w:w="100"/>
+            </w:tcMar>
+            <w:vAlign w:val="center"/>
+          </w:tcPr>
+          <w:p>
+            <w:pPr>
+              <w:spacing w:after="0" w:before="0" w:line="264"/>
+              <w:jc w:val="center"/>
+            </w:pPr>
+            <w:r>
+              <w:rPr>
+                <w:rFonts w:ascii="Arial" w:cs="Arial" w:eastAsia="Arial" w:hAnsi="Arial"/>
+                <w:sz w:val="30"/>
+                <w:szCs w:val="30"/>
+              </w:rPr>
+              <w:t xml:space="preserve">☐</w:t>
+            </w:r>
+          </w:p>
+        </w:tc>
+        <w:tc>
+          <w:tcPr>
+            <w:tcW w:type="dxa" w:w="620"/>
+            <w:tcBorders>
+              <w:top w:val="single" w:color="C9D0DC" w:sz="4"/>
+              <w:left w:val="single" w:color="C9D0DC" w:sz="4"/>
+              <w:bottom w:val="single" w:color="C9D0DC" w:sz="4"/>
+              <w:right w:val="single" w:color="C9D0DC" w:sz="4"/>
+            </w:tcBorders>
+            <w:tcMar>
+              <w:top w:type="dxa" w:w="70"/>
+              <w:left w:type="dxa" w:w="100"/>
+              <w:bottom w:type="dxa" w:w="70"/>
+              <w:right w:type="dxa" w:w="100"/>
+            </w:tcMar>
+            <w:vAlign w:val="center"/>
+          </w:tcPr>
+          <w:p>
+            <w:pPr>
+              <w:spacing w:after="0" w:before="0" w:line="264"/>
+              <w:jc w:val="center"/>
+            </w:pPr>
+            <w:r>
+              <w:rPr>
+                <w:rFonts w:ascii="Arial" w:cs="Arial" w:eastAsia="Arial" w:hAnsi="Arial"/>
+                <w:sz w:val="30"/>
+                <w:szCs w:val="30"/>
+              </w:rPr>
+              <w:t xml:space="preserve">☐</w:t>
+            </w:r>
+          </w:p>
+        </w:tc>
+        <w:tc>
+          <w:tcPr>
+            <w:tcW w:type="dxa" w:w="2040"/>
+            <w:tcBorders>
+              <w:top w:val="single" w:color="C9D0DC" w:sz="4"/>
+              <w:left w:val="single" w:color="C9D0DC" w:sz="4"/>
+              <w:bottom w:val="single" w:color="C9D0DC" w:sz="4"/>
+              <w:right w:val="single" w:color="C9D0DC" w:sz="4"/>
+            </w:tcBorders>
+            <w:tcMar>
+              <w:top w:type="dxa" w:w="70"/>
+              <w:left w:type="dxa" w:w="100"/>
+              <w:bottom w:type="dxa" w:w="70"/>
+              <w:right w:type="dxa" w:w="100"/>
+            </w:tcMar>
+            <w:vAlign w:val="top"/>
+          </w:tcPr>
+          <w:p>
+            <w:pPr>
+              <w:spacing w:after="0" w:before="0" w:line="264"/>
+            </w:pPr>
+            <w:r>
+              <w:rPr>
+                <w:rFonts w:ascii="Arial" w:cs="Arial" w:eastAsia="Arial" w:hAnsi="Arial"/>
+                <w:sz w:val="19"/>
+                <w:szCs w:val="19"/>
+              </w:rPr>
+              <w:t xml:space="preserve"> </w:t>
+            </w:r>
+          </w:p>
+        </w:tc>
+      </w:tr>
+      <w:tr>
+        <w:trPr>
+          <w:cantSplit/>
+        </w:trPr>
+        <w:tc>
+          <w:tcPr>
+            <w:tcW w:type="dxa" w:w="860"/>
+            <w:tcBorders>
+              <w:top w:val="single" w:color="C9D0DC" w:sz="4"/>
+              <w:left w:val="single" w:color="C9D0DC" w:sz="4"/>
+              <w:bottom w:val="single" w:color="C9D0DC" w:sz="4"/>
+              <w:right w:val="single" w:color="C9D0DC" w:sz="4"/>
+            </w:tcBorders>
+            <w:tcMar>
+              <w:top w:type="dxa" w:w="70"/>
+              <w:left w:type="dxa" w:w="100"/>
+              <w:bottom w:type="dxa" w:w="70"/>
+              <w:right w:type="dxa" w:w="100"/>
+            </w:tcMar>
+            <w:vAlign w:val="top"/>
+          </w:tcPr>
+          <w:p>
+            <w:pPr>
+              <w:spacing w:after="0" w:before="0" w:line="264"/>
+            </w:pPr>
+            <w:r>
+              <w:rPr>
+                <w:rFonts w:ascii="Arial" w:cs="Arial" w:eastAsia="Arial" w:hAnsi="Arial"/>
+                <w:b/>
+                <w:bCs/>
+                <w:color w:val="5B6477"/>
+                <w:sz w:val="16"/>
+                <w:szCs w:val="16"/>
+              </w:rPr>
+              <w:t xml:space="preserve">AD-PO</w:t>
+            </w:r>
+          </w:p>
+        </w:tc>
+        <w:tc>
+          <w:tcPr>
+            <w:tcW w:type="dxa" w:w="5480"/>
+            <w:tcBorders>
+              <w:top w:val="single" w:color="C9D0DC" w:sz="4"/>
+              <w:left w:val="single" w:color="C9D0DC" w:sz="4"/>
+              <w:bottom w:val="single" w:color="C9D0DC" w:sz="4"/>
+              <w:right w:val="single" w:color="C9D0DC" w:sz="4"/>
+            </w:tcBorders>
+            <w:tcMar>
+              <w:top w:type="dxa" w:w="70"/>
+              <w:left w:type="dxa" w:w="100"/>
+              <w:bottom w:type="dxa" w:w="70"/>
+              <w:right w:type="dxa" w:w="100"/>
+            </w:tcMar>
+            <w:vAlign w:val="top"/>
+          </w:tcPr>
+          <w:p>
+            <w:pPr>
+              <w:spacing w:after="40" w:before="0" w:line="264"/>
+            </w:pPr>
+            <w:r>
+              <w:rPr>
+                <w:rFonts w:ascii="Arial" w:cs="Arial" w:eastAsia="Arial" w:hAnsi="Arial"/>
+                <w:b/>
+                <w:bCs/>
+                <w:sz w:val="20"/>
+                <w:szCs w:val="20"/>
+              </w:rPr>
+              <w:t xml:space="preserve">Approve a purchase order and ask for the transfers</w:t>
+            </w:r>
+          </w:p>
+          <w:p>
+            <w:pPr>
+              <w:spacing w:after="40" w:before="0" w:line="264"/>
+            </w:pPr>
+            <w:r>
+              <w:rPr>
+                <w:rFonts w:ascii="Arial" w:cs="Arial" w:eastAsia="Arial" w:hAnsi="Arial"/>
+                <w:i/>
+                <w:iCs/>
+                <w:color w:val="5B6477"/>
+                <w:sz w:val="15"/>
+                <w:szCs w:val="15"/>
+              </w:rPr>
+              <w:t xml:space="preserve">Flow F36 · Restock request and purchase orders</w:t>
+            </w:r>
+          </w:p>
+          <w:p>
+            <w:pPr>
+              <w:spacing w:after="20" w:before="0" w:line="264"/>
+            </w:pPr>
+            <w:r>
+              <w:rPr>
+                <w:rFonts w:ascii="Arial" w:cs="Arial" w:eastAsia="Arial" w:hAnsi="Arial"/>
+                <w:color w:val="5B6477"/>
+                <w:sz w:val="19"/>
+                <w:szCs w:val="19"/>
+              </w:rPr>
+              <w:t xml:space="preserve">1.  </w:t>
+            </w:r>
+            <w:r>
+              <w:rPr>
+                <w:rFonts w:ascii="Arial" w:cs="Arial" w:eastAsia="Arial" w:hAnsi="Arial"/>
+                <w:sz w:val="19"/>
+                <w:szCs w:val="19"/>
+              </w:rPr>
+              <w:t xml:space="preserve">My Approvals → the purchase order (or Restock &amp; Purchase Orders → open it).</w:t>
+            </w:r>
+          </w:p>
+          <w:p>
+            <w:pPr>
+              <w:spacing w:after="20" w:before="0" w:line="264"/>
+            </w:pPr>
+            <w:r>
+              <w:rPr>
+                <w:rFonts w:ascii="Arial" w:cs="Arial" w:eastAsia="Arial" w:hAnsi="Arial"/>
+                <w:color w:val="5B6477"/>
+                <w:sz w:val="19"/>
+                <w:szCs w:val="19"/>
+              </w:rPr>
+              <w:t xml:space="preserve">2.  </w:t>
+            </w:r>
+            <w:r>
+              <w:rPr>
+                <w:rFonts w:ascii="Arial" w:cs="Arial" w:eastAsia="Arial" w:hAnsi="Arial"/>
+                <w:sz w:val="19"/>
+                <w:szCs w:val="19"/>
+              </w:rPr>
+              <w:t xml:space="preserve">Change a quantity if you wish → Approve.</w:t>
+            </w:r>
+          </w:p>
+          <w:p>
+            <w:pPr>
+              <w:spacing w:after="20" w:before="0" w:line="264"/>
+            </w:pPr>
+            <w:r>
+              <w:rPr>
+                <w:rFonts w:ascii="Arial" w:cs="Arial" w:eastAsia="Arial" w:hAnsi="Arial"/>
+                <w:color w:val="5B6477"/>
+                <w:sz w:val="19"/>
+                <w:szCs w:val="19"/>
+              </w:rPr>
+              <w:t xml:space="preserve">3.  </w:t>
+            </w:r>
+            <w:r>
+              <w:rPr>
+                <w:rFonts w:ascii="Arial" w:cs="Arial" w:eastAsia="Arial" w:hAnsi="Arial"/>
+                <w:sz w:val="19"/>
+                <w:szCs w:val="19"/>
+              </w:rPr>
+              <w:t xml:space="preserve">Press Ask the Head Auditor to make the transfers.</w:t>
+            </w:r>
+          </w:p>
+          <w:p>
+            <w:pPr>
+              <w:spacing w:after="20" w:before="0" w:line="264"/>
+            </w:pPr>
+            <w:r>
+              <w:rPr>
+                <w:rFonts w:ascii="Arial" w:cs="Arial" w:eastAsia="Arial" w:hAnsi="Arial"/>
+                <w:color w:val="5B6477"/>
+                <w:sz w:val="19"/>
+                <w:szCs w:val="19"/>
+              </w:rPr>
+              <w:t xml:space="preserve">4.  </w:t>
+            </w:r>
+            <w:r>
+              <w:rPr>
+                <w:rFonts w:ascii="Arial" w:cs="Arial" w:eastAsia="Arial" w:hAnsi="Arial"/>
+                <w:sz w:val="19"/>
+                <w:szCs w:val="19"/>
+              </w:rPr>
+              <w:t xml:space="preserve">Mark as sent to the supplier with an expected date.</w:t>
+            </w:r>
+          </w:p>
+          <w:p>
+            <w:pPr>
+              <w:spacing w:after="0" w:before="60" w:line="264"/>
+            </w:pPr>
+            <w:r>
+              <w:rPr>
+                <w:rFonts w:ascii="Arial" w:cs="Arial" w:eastAsia="Arial" w:hAnsi="Arial"/>
+                <w:b/>
+                <w:bCs/>
+                <w:color w:val="0B1F3A"/>
+                <w:sz w:val="19"/>
+                <w:szCs w:val="19"/>
+              </w:rPr>
+              <w:t xml:space="preserve">You should see: </w:t>
+            </w:r>
+            <w:r>
+              <w:rPr>
+                <w:rFonts w:ascii="Arial" w:cs="Arial" w:eastAsia="Arial" w:hAnsi="Arial"/>
+                <w:sz w:val="19"/>
+                <w:szCs w:val="19"/>
+              </w:rPr>
+              <w:t xml:space="preserve">The Head Auditor, the Warehouse In-Charge and the branches are notified. The order shows Sent with the expected date.</w:t>
             </w:r>
           </w:p>
         </w:tc>
@@ -12168,7 +12495,7 @@
                 <w:sz w:val="17"/>
                 <w:szCs w:val="17"/>
               </w:rPr>
-              <w:t xml:space="preserve">Passed (of 41)</w:t>
+              <w:t xml:space="preserve">Passed (of 42)</w:t>
             </w:r>
           </w:p>
         </w:tc>

</xml_diff>

<commit_message>
HR batch: numbered NTE to one employee (issue from an HR notice, employee reply, decision, print), memo to a specific employee, charge forms tell the branch, employee page (profile, staff ID number change with Owner approval, loans and cash advances, charges, notices), automatic staff numbers GWS-0001, editable government contributions per payroll line with contribution tables screen, employees import with blank numbers; guides, decisions, simulation steps and acceptance tests updated
Co-Authored-By: Claude Sonnet 5.5 <noreply@anthropic.com>
Claude-Session: https://claude.ai/code/session_01611rAAsm4xgneCTG3N9mPf
</commit_message>
<xml_diff>
--- a/docs/acceptance-test/per-user/01-admin.docx
+++ b/docs/acceptance-test/per-user/01-admin.docx
@@ -117,7 +117,7 @@
           <w:sz w:val="18"/>
           <w:szCs w:val="18"/>
         </w:rPr>
-        <w:t xml:space="preserve">  ·  42 checks</w:t>
+        <w:t xml:space="preserve">  ·  43 checks</w:t>
       </w:r>
     </w:p>
     <w:tbl>
@@ -12292,6 +12292,267 @@
                 <w:szCs w:val="19"/>
               </w:rPr>
               <w:t xml:space="preserve">The Head Auditor, the Warehouse In-Charge and the branches are notified. The order shows Sent with the expected date.</w:t>
+            </w:r>
+          </w:p>
+        </w:tc>
+        <w:tc>
+          <w:tcPr>
+            <w:tcW w:type="dxa" w:w="620"/>
+            <w:tcBorders>
+              <w:top w:val="single" w:color="C9D0DC" w:sz="4"/>
+              <w:left w:val="single" w:color="C9D0DC" w:sz="4"/>
+              <w:bottom w:val="single" w:color="C9D0DC" w:sz="4"/>
+              <w:right w:val="single" w:color="C9D0DC" w:sz="4"/>
+            </w:tcBorders>
+            <w:tcMar>
+              <w:top w:type="dxa" w:w="70"/>
+              <w:left w:type="dxa" w:w="100"/>
+              <w:bottom w:type="dxa" w:w="70"/>
+              <w:right w:type="dxa" w:w="100"/>
+            </w:tcMar>
+            <w:vAlign w:val="center"/>
+          </w:tcPr>
+          <w:p>
+            <w:pPr>
+              <w:spacing w:after="0" w:before="0" w:line="264"/>
+              <w:jc w:val="center"/>
+            </w:pPr>
+            <w:r>
+              <w:rPr>
+                <w:rFonts w:ascii="Arial" w:cs="Arial" w:eastAsia="Arial" w:hAnsi="Arial"/>
+                <w:sz w:val="30"/>
+                <w:szCs w:val="30"/>
+              </w:rPr>
+              <w:t xml:space="preserve">☐</w:t>
+            </w:r>
+          </w:p>
+        </w:tc>
+        <w:tc>
+          <w:tcPr>
+            <w:tcW w:type="dxa" w:w="620"/>
+            <w:tcBorders>
+              <w:top w:val="single" w:color="C9D0DC" w:sz="4"/>
+              <w:left w:val="single" w:color="C9D0DC" w:sz="4"/>
+              <w:bottom w:val="single" w:color="C9D0DC" w:sz="4"/>
+              <w:right w:val="single" w:color="C9D0DC" w:sz="4"/>
+            </w:tcBorders>
+            <w:tcMar>
+              <w:top w:type="dxa" w:w="70"/>
+              <w:left w:type="dxa" w:w="100"/>
+              <w:bottom w:type="dxa" w:w="70"/>
+              <w:right w:type="dxa" w:w="100"/>
+            </w:tcMar>
+            <w:vAlign w:val="center"/>
+          </w:tcPr>
+          <w:p>
+            <w:pPr>
+              <w:spacing w:after="0" w:before="0" w:line="264"/>
+              <w:jc w:val="center"/>
+            </w:pPr>
+            <w:r>
+              <w:rPr>
+                <w:rFonts w:ascii="Arial" w:cs="Arial" w:eastAsia="Arial" w:hAnsi="Arial"/>
+                <w:sz w:val="30"/>
+                <w:szCs w:val="30"/>
+              </w:rPr>
+              <w:t xml:space="preserve">☐</w:t>
+            </w:r>
+          </w:p>
+        </w:tc>
+        <w:tc>
+          <w:tcPr>
+            <w:tcW w:type="dxa" w:w="620"/>
+            <w:tcBorders>
+              <w:top w:val="single" w:color="C9D0DC" w:sz="4"/>
+              <w:left w:val="single" w:color="C9D0DC" w:sz="4"/>
+              <w:bottom w:val="single" w:color="C9D0DC" w:sz="4"/>
+              <w:right w:val="single" w:color="C9D0DC" w:sz="4"/>
+            </w:tcBorders>
+            <w:tcMar>
+              <w:top w:type="dxa" w:w="70"/>
+              <w:left w:type="dxa" w:w="100"/>
+              <w:bottom w:type="dxa" w:w="70"/>
+              <w:right w:type="dxa" w:w="100"/>
+            </w:tcMar>
+            <w:vAlign w:val="center"/>
+          </w:tcPr>
+          <w:p>
+            <w:pPr>
+              <w:spacing w:after="0" w:before="0" w:line="264"/>
+              <w:jc w:val="center"/>
+            </w:pPr>
+            <w:r>
+              <w:rPr>
+                <w:rFonts w:ascii="Arial" w:cs="Arial" w:eastAsia="Arial" w:hAnsi="Arial"/>
+                <w:sz w:val="30"/>
+                <w:szCs w:val="30"/>
+              </w:rPr>
+              <w:t xml:space="preserve">☐</w:t>
+            </w:r>
+          </w:p>
+        </w:tc>
+        <w:tc>
+          <w:tcPr>
+            <w:tcW w:type="dxa" w:w="2040"/>
+            <w:tcBorders>
+              <w:top w:val="single" w:color="C9D0DC" w:sz="4"/>
+              <w:left w:val="single" w:color="C9D0DC" w:sz="4"/>
+              <w:bottom w:val="single" w:color="C9D0DC" w:sz="4"/>
+              <w:right w:val="single" w:color="C9D0DC" w:sz="4"/>
+            </w:tcBorders>
+            <w:tcMar>
+              <w:top w:type="dxa" w:w="70"/>
+              <w:left w:type="dxa" w:w="100"/>
+              <w:bottom w:type="dxa" w:w="70"/>
+              <w:right w:type="dxa" w:w="100"/>
+            </w:tcMar>
+            <w:vAlign w:val="top"/>
+          </w:tcPr>
+          <w:p>
+            <w:pPr>
+              <w:spacing w:after="0" w:before="0" w:line="264"/>
+            </w:pPr>
+            <w:r>
+              <w:rPr>
+                <w:rFonts w:ascii="Arial" w:cs="Arial" w:eastAsia="Arial" w:hAnsi="Arial"/>
+                <w:sz w:val="19"/>
+                <w:szCs w:val="19"/>
+              </w:rPr>
+              <w:t xml:space="preserve"> </w:t>
+            </w:r>
+          </w:p>
+        </w:tc>
+      </w:tr>
+      <w:tr>
+        <w:trPr>
+          <w:cantSplit/>
+        </w:trPr>
+        <w:tc>
+          <w:tcPr>
+            <w:tcW w:type="dxa" w:w="860"/>
+            <w:tcBorders>
+              <w:top w:val="single" w:color="C9D0DC" w:sz="4"/>
+              <w:left w:val="single" w:color="C9D0DC" w:sz="4"/>
+              <w:bottom w:val="single" w:color="C9D0DC" w:sz="4"/>
+              <w:right w:val="single" w:color="C9D0DC" w:sz="4"/>
+            </w:tcBorders>
+            <w:tcMar>
+              <w:top w:type="dxa" w:w="70"/>
+              <w:left w:type="dxa" w:w="100"/>
+              <w:bottom w:type="dxa" w:w="70"/>
+              <w:right w:type="dxa" w:w="100"/>
+            </w:tcMar>
+            <w:vAlign w:val="top"/>
+          </w:tcPr>
+          <w:p>
+            <w:pPr>
+              <w:spacing w:after="0" w:before="0" w:line="264"/>
+            </w:pPr>
+            <w:r>
+              <w:rPr>
+                <w:rFonts w:ascii="Arial" w:cs="Arial" w:eastAsia="Arial" w:hAnsi="Arial"/>
+                <w:b/>
+                <w:bCs/>
+                <w:color w:val="5B6477"/>
+                <w:sz w:val="16"/>
+                <w:szCs w:val="16"/>
+              </w:rPr>
+              <w:t xml:space="preserve">AD-ID</w:t>
+            </w:r>
+          </w:p>
+        </w:tc>
+        <w:tc>
+          <w:tcPr>
+            <w:tcW w:type="dxa" w:w="5480"/>
+            <w:tcBorders>
+              <w:top w:val="single" w:color="C9D0DC" w:sz="4"/>
+              <w:left w:val="single" w:color="C9D0DC" w:sz="4"/>
+              <w:bottom w:val="single" w:color="C9D0DC" w:sz="4"/>
+              <w:right w:val="single" w:color="C9D0DC" w:sz="4"/>
+            </w:tcBorders>
+            <w:tcMar>
+              <w:top w:type="dxa" w:w="70"/>
+              <w:left w:type="dxa" w:w="100"/>
+              <w:bottom w:type="dxa" w:w="70"/>
+              <w:right w:type="dxa" w:w="100"/>
+            </w:tcMar>
+            <w:vAlign w:val="top"/>
+          </w:tcPr>
+          <w:p>
+            <w:pPr>
+              <w:spacing w:after="40" w:before="0" w:line="264"/>
+            </w:pPr>
+            <w:r>
+              <w:rPr>
+                <w:rFonts w:ascii="Arial" w:cs="Arial" w:eastAsia="Arial" w:hAnsi="Arial"/>
+                <w:b/>
+                <w:bCs/>
+                <w:sz w:val="20"/>
+                <w:szCs w:val="20"/>
+              </w:rPr>
+              <w:t xml:space="preserve">Approve a staff ID number change</w:t>
+            </w:r>
+          </w:p>
+          <w:p>
+            <w:pPr>
+              <w:spacing w:after="40" w:before="0" w:line="264"/>
+            </w:pPr>
+            <w:r>
+              <w:rPr>
+                <w:rFonts w:ascii="Arial" w:cs="Arial" w:eastAsia="Arial" w:hAnsi="Arial"/>
+                <w:i/>
+                <w:iCs/>
+                <w:color w:val="5B6477"/>
+                <w:sz w:val="15"/>
+                <w:szCs w:val="15"/>
+              </w:rPr>
+              <w:t xml:space="preserve">Flow F44 · HR: NTE, memo to an employee, employee page, contributions</w:t>
+            </w:r>
+          </w:p>
+          <w:p>
+            <w:pPr>
+              <w:spacing w:after="20" w:before="0" w:line="264"/>
+            </w:pPr>
+            <w:r>
+              <w:rPr>
+                <w:rFonts w:ascii="Arial" w:cs="Arial" w:eastAsia="Arial" w:hAnsi="Arial"/>
+                <w:color w:val="5B6477"/>
+                <w:sz w:val="19"/>
+                <w:szCs w:val="19"/>
+              </w:rPr>
+              <w:t xml:space="preserve">1.  </w:t>
+            </w:r>
+            <w:r>
+              <w:rPr>
+                <w:rFonts w:ascii="Arial" w:cs="Arial" w:eastAsia="Arial" w:hAnsi="Arial"/>
+                <w:sz w:val="19"/>
+                <w:szCs w:val="19"/>
+              </w:rPr>
+              <w:t xml:space="preserve">My Approvals → Staff ID number change → read the old and new number and the reason → Approve.</w:t>
+            </w:r>
+          </w:p>
+          <w:p>
+            <w:pPr>
+              <w:spacing w:after="0" w:before="60" w:line="264"/>
+            </w:pPr>
+            <w:r>
+              <w:rPr>
+                <w:rFonts w:ascii="Arial" w:cs="Arial" w:eastAsia="Arial" w:hAnsi="Arial"/>
+                <w:b/>
+                <w:bCs/>
+                <w:color w:val="0B1F3A"/>
+                <w:sz w:val="19"/>
+                <w:szCs w:val="19"/>
+              </w:rPr>
+              <w:t xml:space="preserve">You should see: </w:t>
+            </w:r>
+            <w:r>
+              <w:rPr>
+                <w:rFonts w:ascii="Arial" w:cs="Arial" w:eastAsia="Arial" w:hAnsi="Arial"/>
+                <w:sz w:val="19"/>
+                <w:szCs w:val="19"/>
+              </w:rPr>
+              <w:t xml:space="preserve">The staff ID and the login Company ID of that employee change. A number used by someone else is refused.</w:t>
             </w:r>
           </w:p>
         </w:tc>
@@ -12495,7 +12756,7 @@
                 <w:sz w:val="17"/>
                 <w:szCs w:val="17"/>
               </w:rPr>
-              <w:t xml:space="preserve">Passed (of 42)</w:t>
+              <w:t xml:space="preserve">Passed (of 43)</w:t>
             </w:r>
           </w:p>
         </w:tc>

</xml_diff>

<commit_message>
HR batch 2: names and positions through the Owner (several names at once, edits of name / position / branch / basic wait for approval), name with position in every picker, notices (late deposit, count discrepancy, transfer difference, post-close edit) notify HR and prepare a DRAFT NTE with a Create NTE button on the notification, dashboard card Waiting for HR and actions in HR Notices, charge forms linked to what caused them (automatic source list, Linked to in list and detail); guides, decisions, simulation steps and acceptance tests updated
Co-Authored-By: Claude Sonnet 5.5 <noreply@anthropic.com>
Claude-Session: https://claude.ai/code/session_01611rAAsm4xgneCTG3N9mPf
</commit_message>
<xml_diff>
--- a/docs/acceptance-test/per-user/01-admin.docx
+++ b/docs/acceptance-test/per-user/01-admin.docx
@@ -117,7 +117,7 @@
           <w:sz w:val="18"/>
           <w:szCs w:val="18"/>
         </w:rPr>
-        <w:t xml:space="preserve">  ·  43 checks</w:t>
+        <w:t xml:space="preserve">  ·  44 checks</w:t>
       </w:r>
     </w:p>
     <w:tbl>
@@ -12553,6 +12553,267 @@
                 <w:szCs w:val="19"/>
               </w:rPr>
               <w:t xml:space="preserve">The staff ID and the login Company ID of that employee change. A number used by someone else is refused.</w:t>
+            </w:r>
+          </w:p>
+        </w:tc>
+        <w:tc>
+          <w:tcPr>
+            <w:tcW w:type="dxa" w:w="620"/>
+            <w:tcBorders>
+              <w:top w:val="single" w:color="C9D0DC" w:sz="4"/>
+              <w:left w:val="single" w:color="C9D0DC" w:sz="4"/>
+              <w:bottom w:val="single" w:color="C9D0DC" w:sz="4"/>
+              <w:right w:val="single" w:color="C9D0DC" w:sz="4"/>
+            </w:tcBorders>
+            <w:tcMar>
+              <w:top w:type="dxa" w:w="70"/>
+              <w:left w:type="dxa" w:w="100"/>
+              <w:bottom w:type="dxa" w:w="70"/>
+              <w:right w:type="dxa" w:w="100"/>
+            </w:tcMar>
+            <w:vAlign w:val="center"/>
+          </w:tcPr>
+          <w:p>
+            <w:pPr>
+              <w:spacing w:after="0" w:before="0" w:line="264"/>
+              <w:jc w:val="center"/>
+            </w:pPr>
+            <w:r>
+              <w:rPr>
+                <w:rFonts w:ascii="Arial" w:cs="Arial" w:eastAsia="Arial" w:hAnsi="Arial"/>
+                <w:sz w:val="30"/>
+                <w:szCs w:val="30"/>
+              </w:rPr>
+              <w:t xml:space="preserve">☐</w:t>
+            </w:r>
+          </w:p>
+        </w:tc>
+        <w:tc>
+          <w:tcPr>
+            <w:tcW w:type="dxa" w:w="620"/>
+            <w:tcBorders>
+              <w:top w:val="single" w:color="C9D0DC" w:sz="4"/>
+              <w:left w:val="single" w:color="C9D0DC" w:sz="4"/>
+              <w:bottom w:val="single" w:color="C9D0DC" w:sz="4"/>
+              <w:right w:val="single" w:color="C9D0DC" w:sz="4"/>
+            </w:tcBorders>
+            <w:tcMar>
+              <w:top w:type="dxa" w:w="70"/>
+              <w:left w:type="dxa" w:w="100"/>
+              <w:bottom w:type="dxa" w:w="70"/>
+              <w:right w:type="dxa" w:w="100"/>
+            </w:tcMar>
+            <w:vAlign w:val="center"/>
+          </w:tcPr>
+          <w:p>
+            <w:pPr>
+              <w:spacing w:after="0" w:before="0" w:line="264"/>
+              <w:jc w:val="center"/>
+            </w:pPr>
+            <w:r>
+              <w:rPr>
+                <w:rFonts w:ascii="Arial" w:cs="Arial" w:eastAsia="Arial" w:hAnsi="Arial"/>
+                <w:sz w:val="30"/>
+                <w:szCs w:val="30"/>
+              </w:rPr>
+              <w:t xml:space="preserve">☐</w:t>
+            </w:r>
+          </w:p>
+        </w:tc>
+        <w:tc>
+          <w:tcPr>
+            <w:tcW w:type="dxa" w:w="620"/>
+            <w:tcBorders>
+              <w:top w:val="single" w:color="C9D0DC" w:sz="4"/>
+              <w:left w:val="single" w:color="C9D0DC" w:sz="4"/>
+              <w:bottom w:val="single" w:color="C9D0DC" w:sz="4"/>
+              <w:right w:val="single" w:color="C9D0DC" w:sz="4"/>
+            </w:tcBorders>
+            <w:tcMar>
+              <w:top w:type="dxa" w:w="70"/>
+              <w:left w:type="dxa" w:w="100"/>
+              <w:bottom w:type="dxa" w:w="70"/>
+              <w:right w:type="dxa" w:w="100"/>
+            </w:tcMar>
+            <w:vAlign w:val="center"/>
+          </w:tcPr>
+          <w:p>
+            <w:pPr>
+              <w:spacing w:after="0" w:before="0" w:line="264"/>
+              <w:jc w:val="center"/>
+            </w:pPr>
+            <w:r>
+              <w:rPr>
+                <w:rFonts w:ascii="Arial" w:cs="Arial" w:eastAsia="Arial" w:hAnsi="Arial"/>
+                <w:sz w:val="30"/>
+                <w:szCs w:val="30"/>
+              </w:rPr>
+              <w:t xml:space="preserve">☐</w:t>
+            </w:r>
+          </w:p>
+        </w:tc>
+        <w:tc>
+          <w:tcPr>
+            <w:tcW w:type="dxa" w:w="2040"/>
+            <w:tcBorders>
+              <w:top w:val="single" w:color="C9D0DC" w:sz="4"/>
+              <w:left w:val="single" w:color="C9D0DC" w:sz="4"/>
+              <w:bottom w:val="single" w:color="C9D0DC" w:sz="4"/>
+              <w:right w:val="single" w:color="C9D0DC" w:sz="4"/>
+            </w:tcBorders>
+            <w:tcMar>
+              <w:top w:type="dxa" w:w="70"/>
+              <w:left w:type="dxa" w:w="100"/>
+              <w:bottom w:type="dxa" w:w="70"/>
+              <w:right w:type="dxa" w:w="100"/>
+            </w:tcMar>
+            <w:vAlign w:val="top"/>
+          </w:tcPr>
+          <w:p>
+            <w:pPr>
+              <w:spacing w:after="0" w:before="0" w:line="264"/>
+            </w:pPr>
+            <w:r>
+              <w:rPr>
+                <w:rFonts w:ascii="Arial" w:cs="Arial" w:eastAsia="Arial" w:hAnsi="Arial"/>
+                <w:sz w:val="19"/>
+                <w:szCs w:val="19"/>
+              </w:rPr>
+              <w:t xml:space="preserve"> </w:t>
+            </w:r>
+          </w:p>
+        </w:tc>
+      </w:tr>
+      <w:tr>
+        <w:trPr>
+          <w:cantSplit/>
+        </w:trPr>
+        <w:tc>
+          <w:tcPr>
+            <w:tcW w:type="dxa" w:w="860"/>
+            <w:tcBorders>
+              <w:top w:val="single" w:color="C9D0DC" w:sz="4"/>
+              <w:left w:val="single" w:color="C9D0DC" w:sz="4"/>
+              <w:bottom w:val="single" w:color="C9D0DC" w:sz="4"/>
+              <w:right w:val="single" w:color="C9D0DC" w:sz="4"/>
+            </w:tcBorders>
+            <w:tcMar>
+              <w:top w:type="dxa" w:w="70"/>
+              <w:left w:type="dxa" w:w="100"/>
+              <w:bottom w:type="dxa" w:w="70"/>
+              <w:right w:type="dxa" w:w="100"/>
+            </w:tcMar>
+            <w:vAlign w:val="top"/>
+          </w:tcPr>
+          <w:p>
+            <w:pPr>
+              <w:spacing w:after="0" w:before="0" w:line="264"/>
+            </w:pPr>
+            <w:r>
+              <w:rPr>
+                <w:rFonts w:ascii="Arial" w:cs="Arial" w:eastAsia="Arial" w:hAnsi="Arial"/>
+                <w:b/>
+                <w:bCs/>
+                <w:color w:val="5B6477"/>
+                <w:sz w:val="16"/>
+                <w:szCs w:val="16"/>
+              </w:rPr>
+              <w:t xml:space="preserve">AD-NAM</w:t>
+            </w:r>
+          </w:p>
+        </w:tc>
+        <w:tc>
+          <w:tcPr>
+            <w:tcW w:type="dxa" w:w="5480"/>
+            <w:tcBorders>
+              <w:top w:val="single" w:color="C9D0DC" w:sz="4"/>
+              <w:left w:val="single" w:color="C9D0DC" w:sz="4"/>
+              <w:bottom w:val="single" w:color="C9D0DC" w:sz="4"/>
+              <w:right w:val="single" w:color="C9D0DC" w:sz="4"/>
+            </w:tcBorders>
+            <w:tcMar>
+              <w:top w:type="dxa" w:w="70"/>
+              <w:left w:type="dxa" w:w="100"/>
+              <w:bottom w:type="dxa" w:w="70"/>
+              <w:right w:type="dxa" w:w="100"/>
+            </w:tcMar>
+            <w:vAlign w:val="top"/>
+          </w:tcPr>
+          <w:p>
+            <w:pPr>
+              <w:spacing w:after="40" w:before="0" w:line="264"/>
+            </w:pPr>
+            <w:r>
+              <w:rPr>
+                <w:rFonts w:ascii="Arial" w:cs="Arial" w:eastAsia="Arial" w:hAnsi="Arial"/>
+                <w:b/>
+                <w:bCs/>
+                <w:sz w:val="20"/>
+                <w:szCs w:val="20"/>
+              </w:rPr>
+              <w:t xml:space="preserve">Approve HR's names and edits</w:t>
+            </w:r>
+          </w:p>
+          <w:p>
+            <w:pPr>
+              <w:spacing w:after="40" w:before="0" w:line="264"/>
+            </w:pPr>
+            <w:r>
+              <w:rPr>
+                <w:rFonts w:ascii="Arial" w:cs="Arial" w:eastAsia="Arial" w:hAnsi="Arial"/>
+                <w:i/>
+                <w:iCs/>
+                <w:color w:val="5B6477"/>
+                <w:sz w:val="15"/>
+                <w:szCs w:val="15"/>
+              </w:rPr>
+              <w:t xml:space="preserve">Flow F45 · HR: owner-approved names, draft NTE from notices, charge links</w:t>
+            </w:r>
+          </w:p>
+          <w:p>
+            <w:pPr>
+              <w:spacing w:after="20" w:before="0" w:line="264"/>
+            </w:pPr>
+            <w:r>
+              <w:rPr>
+                <w:rFonts w:ascii="Arial" w:cs="Arial" w:eastAsia="Arial" w:hAnsi="Arial"/>
+                <w:color w:val="5B6477"/>
+                <w:sz w:val="19"/>
+                <w:szCs w:val="19"/>
+              </w:rPr>
+              <w:t xml:space="preserve">1.  </w:t>
+            </w:r>
+            <w:r>
+              <w:rPr>
+                <w:rFonts w:ascii="Arial" w:cs="Arial" w:eastAsia="Arial" w:hAnsi="Arial"/>
+                <w:sz w:val="19"/>
+                <w:szCs w:val="19"/>
+              </w:rPr>
+              <w:t xml:space="preserve">My Approvals → New employees (several names) / Employee change → read old → new → Approve.</w:t>
+            </w:r>
+          </w:p>
+          <w:p>
+            <w:pPr>
+              <w:spacing w:after="0" w:before="60" w:line="264"/>
+            </w:pPr>
+            <w:r>
+              <w:rPr>
+                <w:rFonts w:ascii="Arial" w:cs="Arial" w:eastAsia="Arial" w:hAnsi="Arial"/>
+                <w:b/>
+                <w:bCs/>
+                <w:color w:val="0B1F3A"/>
+                <w:sz w:val="19"/>
+                <w:szCs w:val="19"/>
+              </w:rPr>
+              <w:t xml:space="preserve">You should see: </w:t>
+            </w:r>
+            <w:r>
+              <w:rPr>
+                <w:rFonts w:ascii="Arial" w:cs="Arial" w:eastAsia="Arial" w:hAnsi="Arial"/>
+                <w:sz w:val="19"/>
+                <w:szCs w:val="19"/>
+              </w:rPr>
+              <w:t xml:space="preserve">The employees are created with their numbers (or the change is applied and the login name follows). Your own edit applies at once.</w:t>
             </w:r>
           </w:p>
         </w:tc>
@@ -12756,7 +13017,7 @@
                 <w:sz w:val="17"/>
                 <w:szCs w:val="17"/>
               </w:rPr>
-              <w:t xml:space="preserve">Passed (of 43)</w:t>
+              <w:t xml:space="preserve">Passed (of 44)</w:t>
             </w:r>
           </w:p>
         </w:tc>

</xml_diff>

<commit_message>
Warehouse cash funds (Office and Franchise) kept by the warehouse associate and in-charge, tied to franchise DRs (franchise cash shipping payment into the fund, courier expense linked to the DR, shipping block on the DR page), expense fund picker and branch picker so the warehouse associate can pay from the cash fund, sales associate at the warehouse keeps no fund, Accounting top-up; Dashboard menu search; Stock on Hand quantity per flavor and per expiry as labelled rows; pnpm reset-password; guides, decisions, simulation steps and acceptance tests (flow F47) updated
Co-Authored-By: Claude Sonnet 5.5 <noreply@anthropic.com>
Claude-Session: https://claude.ai/code/session_01611rAAsm4xgneCTG3N9mPf
</commit_message>
<xml_diff>
--- a/docs/acceptance-test/per-user/01-admin.docx
+++ b/docs/acceptance-test/per-user/01-admin.docx
@@ -117,7 +117,7 @@
           <w:sz w:val="18"/>
           <w:szCs w:val="18"/>
         </w:rPr>
-        <w:t xml:space="preserve">  ·  44 checks</w:t>
+        <w:t xml:space="preserve">  ·  46 checks</w:t>
       </w:r>
     </w:p>
     <w:tbl>
@@ -1785,7 +1785,7 @@
                 <w:sz w:val="16"/>
                 <w:szCs w:val="16"/>
               </w:rPr>
-              <w:t xml:space="preserve">AD-01</w:t>
+              <w:t xml:space="preserve">CM-SRCH</w:t>
             </w:r>
           </w:p>
         </w:tc>
@@ -1818,7 +1818,7 @@
                 <w:sz w:val="20"/>
                 <w:szCs w:val="20"/>
               </w:rPr>
-              <w:t xml:space="preserve">Owner dashboard</w:t>
+              <w:t xml:space="preserve">Dashboard search and Stock on Hand layout</w:t>
             </w:r>
           </w:p>
           <w:p>
@@ -1840,7 +1840,29 @@
                 <w:sz w:val="19"/>
                 <w:szCs w:val="19"/>
               </w:rPr>
-              <w:t xml:space="preserve">Open the Dashboard.</w:t>
+              <w:t xml:space="preserve">Dashboard → type part of a screen name in the search box.</w:t>
+            </w:r>
+          </w:p>
+          <w:p>
+            <w:pPr>
+              <w:spacing w:after="20" w:before="0" w:line="264"/>
+            </w:pPr>
+            <w:r>
+              <w:rPr>
+                <w:rFonts w:ascii="Arial" w:cs="Arial" w:eastAsia="Arial" w:hAnsi="Arial"/>
+                <w:color w:val="5B6477"/>
+                <w:sz w:val="19"/>
+                <w:szCs w:val="19"/>
+              </w:rPr>
+              <w:t xml:space="preserve">2.  </w:t>
+            </w:r>
+            <w:r>
+              <w:rPr>
+                <w:rFonts w:ascii="Arial" w:cs="Arial" w:eastAsia="Arial" w:hAnsi="Arial"/>
+                <w:sz w:val="19"/>
+                <w:szCs w:val="19"/>
+              </w:rPr>
+              <w:t xml:space="preserve">Stock on Hand → look at an item with several flavors or expiry dates (if your account sees stock).</w:t>
             </w:r>
           </w:p>
           <w:p>
@@ -1864,7 +1886,7 @@
                 <w:sz w:val="19"/>
                 <w:szCs w:val="19"/>
               </w:rPr>
-              <w:t xml:space="preserve">Cash on hand per branch, branches without today's Daily Sales Report, open discrepancies and price updates (with cost) are shown.</w:t>
+              <w:t xml:space="preserve">The matching screens are listed. Flavors and expiry dates are shown as labelled rows with their quantity.</w:t>
             </w:r>
           </w:p>
         </w:tc>
@@ -2030,7 +2052,7 @@
                 <w:sz w:val="16"/>
                 <w:szCs w:val="16"/>
               </w:rPr>
-              <w:t xml:space="preserve">AD-02</w:t>
+              <w:t xml:space="preserve">AD-01</w:t>
             </w:r>
           </w:p>
         </w:tc>
@@ -2063,23 +2085,7 @@
                 <w:sz w:val="20"/>
                 <w:szCs w:val="20"/>
               </w:rPr>
-              <w:t xml:space="preserve">Approve a special price</w:t>
-            </w:r>
-          </w:p>
-          <w:p>
-            <w:pPr>
-              <w:spacing w:after="40" w:before="0" w:line="264"/>
-            </w:pPr>
-            <w:r>
-              <w:rPr>
-                <w:rFonts w:ascii="Arial" w:cs="Arial" w:eastAsia="Arial" w:hAnsi="Arial"/>
-                <w:i/>
-                <w:iCs/>
-                <w:color w:val="5B6477"/>
-                <w:sz w:val="15"/>
-                <w:szCs w:val="15"/>
-              </w:rPr>
-              <w:t xml:space="preserve">Flow F4 · Selling and special prices</w:t>
+              <w:t xml:space="preserve">Owner dashboard</w:t>
             </w:r>
           </w:p>
           <w:p>
@@ -2101,51 +2107,7 @@
                 <w:sz w:val="19"/>
                 <w:szCs w:val="19"/>
               </w:rPr>
-              <w:t xml:space="preserve">My Approvals → Special price.</w:t>
-            </w:r>
-          </w:p>
-          <w:p>
-            <w:pPr>
-              <w:spacing w:after="20" w:before="0" w:line="264"/>
-            </w:pPr>
-            <w:r>
-              <w:rPr>
-                <w:rFonts w:ascii="Arial" w:cs="Arial" w:eastAsia="Arial" w:hAnsi="Arial"/>
-                <w:color w:val="5B6477"/>
-                <w:sz w:val="19"/>
-                <w:szCs w:val="19"/>
-              </w:rPr>
-              <w:t xml:space="preserve">2.  </w:t>
-            </w:r>
-            <w:r>
-              <w:rPr>
-                <w:rFonts w:ascii="Arial" w:cs="Arial" w:eastAsia="Arial" w:hAnsi="Arial"/>
-                <w:sz w:val="19"/>
-                <w:szCs w:val="19"/>
-              </w:rPr>
-              <w:t xml:space="preserve">Expand it and check tier price, sold price, discount % and margin.</w:t>
-            </w:r>
-          </w:p>
-          <w:p>
-            <w:pPr>
-              <w:spacing w:after="20" w:before="0" w:line="264"/>
-            </w:pPr>
-            <w:r>
-              <w:rPr>
-                <w:rFonts w:ascii="Arial" w:cs="Arial" w:eastAsia="Arial" w:hAnsi="Arial"/>
-                <w:color w:val="5B6477"/>
-                <w:sz w:val="19"/>
-                <w:szCs w:val="19"/>
-              </w:rPr>
-              <w:t xml:space="preserve">3.  </w:t>
-            </w:r>
-            <w:r>
-              <w:rPr>
-                <w:rFonts w:ascii="Arial" w:cs="Arial" w:eastAsia="Arial" w:hAnsi="Arial"/>
-                <w:sz w:val="19"/>
-                <w:szCs w:val="19"/>
-              </w:rPr>
-              <w:t xml:space="preserve">Approve.</w:t>
+              <w:t xml:space="preserve">Open the Dashboard.</w:t>
             </w:r>
           </w:p>
           <w:p>
@@ -2169,7 +2131,7 @@
                 <w:sz w:val="19"/>
                 <w:szCs w:val="19"/>
               </w:rPr>
-              <w:t xml:space="preserve">Only the Owner sees cost and margin. The sale stays as recorded and the approval leaves the list.</w:t>
+              <w:t xml:space="preserve">Cash on hand per branch, branches without today's Daily Sales Report, open discrepancies and price updates (with cost) are shown.</w:t>
             </w:r>
           </w:p>
         </w:tc>
@@ -2335,7 +2297,7 @@
                 <w:sz w:val="16"/>
                 <w:szCs w:val="16"/>
               </w:rPr>
-              <w:t xml:space="preserve">AD-03</w:t>
+              <w:t xml:space="preserve">AD-02</w:t>
             </w:r>
           </w:p>
         </w:tc>
@@ -2368,7 +2330,7 @@
                 <w:sz w:val="20"/>
                 <w:szCs w:val="20"/>
               </w:rPr>
-              <w:t xml:space="preserve">Approve a transfer to a franchise</w:t>
+              <w:t xml:space="preserve">Approve a special price</w:t>
             </w:r>
           </w:p>
           <w:p>
@@ -2384,7 +2346,7 @@
                 <w:sz w:val="15"/>
                 <w:szCs w:val="15"/>
               </w:rPr>
-              <w:t xml:space="preserve">Flow F9 · Stock to a franchise</w:t>
+              <w:t xml:space="preserve">Flow F4 · Selling and special prices</w:t>
             </w:r>
           </w:p>
           <w:p>
@@ -2406,7 +2368,7 @@
                 <w:sz w:val="19"/>
                 <w:szCs w:val="19"/>
               </w:rPr>
-              <w:t xml:space="preserve">My Approvals → the pull-out to Mayon.</w:t>
+              <w:t xml:space="preserve">My Approvals → Special price.</w:t>
             </w:r>
           </w:p>
           <w:p>
@@ -2428,6 +2390,28 @@
                 <w:sz w:val="19"/>
                 <w:szCs w:val="19"/>
               </w:rPr>
+              <w:t xml:space="preserve">Expand it and check tier price, sold price, discount % and margin.</w:t>
+            </w:r>
+          </w:p>
+          <w:p>
+            <w:pPr>
+              <w:spacing w:after="20" w:before="0" w:line="264"/>
+            </w:pPr>
+            <w:r>
+              <w:rPr>
+                <w:rFonts w:ascii="Arial" w:cs="Arial" w:eastAsia="Arial" w:hAnsi="Arial"/>
+                <w:color w:val="5B6477"/>
+                <w:sz w:val="19"/>
+                <w:szCs w:val="19"/>
+              </w:rPr>
+              <w:t xml:space="preserve">3.  </w:t>
+            </w:r>
+            <w:r>
+              <w:rPr>
+                <w:rFonts w:ascii="Arial" w:cs="Arial" w:eastAsia="Arial" w:hAnsi="Arial"/>
+                <w:sz w:val="19"/>
+                <w:szCs w:val="19"/>
+              </w:rPr>
               <w:t xml:space="preserve">Approve.</w:t>
             </w:r>
           </w:p>
@@ -2452,7 +2436,7 @@
                 <w:sz w:val="19"/>
                 <w:szCs w:val="19"/>
               </w:rPr>
-              <w:t xml:space="preserve">Stock is in transit to Mayon. The franchise can now confirm it.</w:t>
+              <w:t xml:space="preserve">Only the Owner sees cost and margin. The sale stays as recorded and the approval leaves the list.</w:t>
             </w:r>
           </w:p>
         </w:tc>
@@ -2618,7 +2602,7 @@
                 <w:sz w:val="16"/>
                 <w:szCs w:val="16"/>
               </w:rPr>
-              <w:t xml:space="preserve">AD-04</w:t>
+              <w:t xml:space="preserve">AD-03</w:t>
             </w:r>
           </w:p>
         </w:tc>
@@ -2651,7 +2635,7 @@
                 <w:sz w:val="20"/>
                 <w:szCs w:val="20"/>
               </w:rPr>
-              <w:t xml:space="preserve">Approve new master data</w:t>
+              <w:t xml:space="preserve">Approve a transfer to a franchise</w:t>
             </w:r>
           </w:p>
           <w:p>
@@ -2667,7 +2651,7 @@
                 <w:sz w:val="15"/>
                 <w:szCs w:val="15"/>
               </w:rPr>
-              <w:t xml:space="preserve">Flow F12 · New employee to payroll</w:t>
+              <w:t xml:space="preserve">Flow F9 · Stock to a franchise</w:t>
             </w:r>
           </w:p>
           <w:p>
@@ -2689,7 +2673,7 @@
                 <w:sz w:val="19"/>
                 <w:szCs w:val="19"/>
               </w:rPr>
-              <w:t xml:space="preserve">My Approvals → New master data.</w:t>
+              <w:t xml:space="preserve">My Approvals → the pull-out to Mayon.</w:t>
             </w:r>
           </w:p>
           <w:p>
@@ -2711,7 +2695,7 @@
                 <w:sz w:val="19"/>
                 <w:szCs w:val="19"/>
               </w:rPr>
-              <w:t xml:space="preserve">Approve the product from the Head Auditor, and the employee and user account from HR.</w:t>
+              <w:t xml:space="preserve">Approve.</w:t>
             </w:r>
           </w:p>
           <w:p>
@@ -2735,7 +2719,7 @@
                 <w:sz w:val="19"/>
                 <w:szCs w:val="19"/>
               </w:rPr>
-              <w:t xml:space="preserve">Each record is created and the person who entered it is notified.</w:t>
+              <w:t xml:space="preserve">Stock is in transit to Mayon. The franchise can now confirm it.</w:t>
             </w:r>
           </w:p>
         </w:tc>
@@ -2901,7 +2885,7 @@
                 <w:sz w:val="16"/>
                 <w:szCs w:val="16"/>
               </w:rPr>
-              <w:t xml:space="preserve">AD-05</w:t>
+              <w:t xml:space="preserve">AD-04</w:t>
             </w:r>
           </w:p>
         </w:tc>
@@ -2934,7 +2918,7 @@
                 <w:sz w:val="20"/>
                 <w:szCs w:val="20"/>
               </w:rPr>
-              <w:t xml:space="preserve">Decide a disputed transfer difference</w:t>
+              <w:t xml:space="preserve">Approve new master data</w:t>
             </w:r>
           </w:p>
           <w:p>
@@ -2950,7 +2934,7 @@
                 <w:sz w:val="15"/>
                 <w:szCs w:val="15"/>
               </w:rPr>
-              <w:t xml:space="preserve">Flow F3 · Transfer received with a different quantity</w:t>
+              <w:t xml:space="preserve">Flow F12 · New employee to payroll</w:t>
             </w:r>
           </w:p>
           <w:p>
@@ -2972,7 +2956,7 @@
                 <w:sz w:val="19"/>
                 <w:szCs w:val="19"/>
               </w:rPr>
-              <w:t xml:space="preserve">Open the transfer the sending branch disagreed with (or did not answer in 2 days).</w:t>
+              <w:t xml:space="preserve">My Approvals → New master data.</w:t>
             </w:r>
           </w:p>
           <w:p>
@@ -2994,7 +2978,7 @@
                 <w:sz w:val="19"/>
                 <w:szCs w:val="19"/>
               </w:rPr>
-              <w:t xml:space="preserve">Choose one: the difference stands, received after all, lost as a company expense, or lost and charged to staff.</w:t>
+              <w:t xml:space="preserve">Approve the product from the Head Auditor, and the employee and user account from HR.</w:t>
             </w:r>
           </w:p>
           <w:p>
@@ -3018,7 +3002,7 @@
                 <w:sz w:val="19"/>
                 <w:szCs w:val="19"/>
               </w:rPr>
-              <w:t xml:space="preserve">'Difference stands' makes the -002 form back to the sender. 'Charged to staff' makes a charge form for HR. The transfer page shows the outcome.</w:t>
+              <w:t xml:space="preserve">Each record is created and the person who entered it is notified.</w:t>
             </w:r>
           </w:p>
         </w:tc>
@@ -3184,7 +3168,7 @@
                 <w:sz w:val="16"/>
                 <w:szCs w:val="16"/>
               </w:rPr>
-              <w:t xml:space="preserve">AD-06</w:t>
+              <w:t xml:space="preserve">AD-05</w:t>
             </w:r>
           </w:p>
         </w:tc>
@@ -3217,7 +3201,7 @@
                 <w:sz w:val="20"/>
                 <w:szCs w:val="20"/>
               </w:rPr>
-              <w:t xml:space="preserve">Approve sales targets</w:t>
+              <w:t xml:space="preserve">Decide a disputed transfer difference</w:t>
             </w:r>
           </w:p>
           <w:p>
@@ -3233,7 +3217,7 @@
                 <w:sz w:val="15"/>
                 <w:szCs w:val="15"/>
               </w:rPr>
-              <w:t xml:space="preserve">Flow F10 · Sales targets</w:t>
+              <w:t xml:space="preserve">Flow F3 · Transfer received with a different quantity</w:t>
             </w:r>
           </w:p>
           <w:p>
@@ -3255,7 +3239,7 @@
                 <w:sz w:val="19"/>
                 <w:szCs w:val="19"/>
               </w:rPr>
-              <w:t xml:space="preserve">My Approvals → Sales target (West Ave and Jerick Quinto).</w:t>
+              <w:t xml:space="preserve">Open the transfer the sending branch disagreed with (or did not answer in 2 days).</w:t>
             </w:r>
           </w:p>
           <w:p>
@@ -3277,7 +3261,7 @@
                 <w:sz w:val="19"/>
                 <w:szCs w:val="19"/>
               </w:rPr>
-              <w:t xml:space="preserve">Approve both.</w:t>
+              <w:t xml:space="preserve">Choose one: the difference stands, received after all, lost as a company expense, or lost and charged to staff.</w:t>
             </w:r>
           </w:p>
           <w:p>
@@ -3301,7 +3285,7 @@
                 <w:sz w:val="19"/>
                 <w:szCs w:val="19"/>
               </w:rPr>
-              <w:t xml:space="preserve">The targets show as approved on Sales Targets. A newer approved target replaces the old one.</w:t>
+              <w:t xml:space="preserve">'Difference stands' makes the -002 form back to the sender. 'Charged to staff' makes a charge form for HR. The transfer page shows the outcome.</w:t>
             </w:r>
           </w:p>
         </w:tc>
@@ -3467,7 +3451,7 @@
                 <w:sz w:val="16"/>
                 <w:szCs w:val="16"/>
               </w:rPr>
-              <w:t xml:space="preserve">AD-07</w:t>
+              <w:t xml:space="preserve">AD-06</w:t>
             </w:r>
           </w:p>
         </w:tc>
@@ -3500,7 +3484,7 @@
                 <w:sz w:val="20"/>
                 <w:szCs w:val="20"/>
               </w:rPr>
-              <w:t xml:space="preserve">Approve more days to deposit cash</w:t>
+              <w:t xml:space="preserve">Approve sales targets</w:t>
             </w:r>
           </w:p>
           <w:p>
@@ -3516,7 +3500,7 @@
                 <w:sz w:val="15"/>
                 <w:szCs w:val="15"/>
               </w:rPr>
-              <w:t xml:space="preserve">Flow F6 · Cash, daily close and deposit</w:t>
+              <w:t xml:space="preserve">Flow F10 · Sales targets</w:t>
             </w:r>
           </w:p>
           <w:p>
@@ -3538,7 +3522,7 @@
                 <w:sz w:val="19"/>
                 <w:szCs w:val="19"/>
               </w:rPr>
-              <w:t xml:space="preserve">My Approvals → the branch's extension request.</w:t>
+              <w:t xml:space="preserve">My Approvals → Sales target (West Ave and Jerick Quinto).</w:t>
             </w:r>
           </w:p>
           <w:p>
@@ -3560,7 +3544,7 @@
                 <w:sz w:val="19"/>
                 <w:szCs w:val="19"/>
               </w:rPr>
-              <w:t xml:space="preserve">Approve (the Head Auditor must also approve).</w:t>
+              <w:t xml:space="preserve">Approve both.</w:t>
             </w:r>
           </w:p>
           <w:p>
@@ -3584,7 +3568,7 @@
                 <w:sz w:val="19"/>
                 <w:szCs w:val="19"/>
               </w:rPr>
-              <w:t xml:space="preserve">The new deposit date applies only after both approvals.</w:t>
+              <w:t xml:space="preserve">The targets show as approved on Sales Targets. A newer approved target replaces the old one.</w:t>
             </w:r>
           </w:p>
         </w:tc>
@@ -3750,7 +3734,7 @@
                 <w:sz w:val="16"/>
                 <w:szCs w:val="16"/>
               </w:rPr>
-              <w:t xml:space="preserve">AD-08</w:t>
+              <w:t xml:space="preserve">AD-07</w:t>
             </w:r>
           </w:p>
         </w:tc>
@@ -3783,7 +3767,7 @@
                 <w:sz w:val="20"/>
                 <w:szCs w:val="20"/>
               </w:rPr>
-              <w:t xml:space="preserve">Approve a period lock</w:t>
+              <w:t xml:space="preserve">Approve more days to deposit cash</w:t>
             </w:r>
           </w:p>
           <w:p>
@@ -3799,7 +3783,7 @@
                 <w:sz w:val="15"/>
                 <w:szCs w:val="15"/>
               </w:rPr>
-              <w:t xml:space="preserve">Flow F13 · Month-end lock</w:t>
+              <w:t xml:space="preserve">Flow F6 · Cash, daily close and deposit</w:t>
             </w:r>
           </w:p>
           <w:p>
@@ -3821,7 +3805,7 @@
                 <w:sz w:val="19"/>
                 <w:szCs w:val="19"/>
               </w:rPr>
-              <w:t xml:space="preserve">My Approvals → Period lock requested by the Accounting Head.</w:t>
+              <w:t xml:space="preserve">My Approvals → the branch's extension request.</w:t>
             </w:r>
           </w:p>
           <w:p>
@@ -3843,7 +3827,7 @@
                 <w:sz w:val="19"/>
                 <w:szCs w:val="19"/>
               </w:rPr>
-              <w:t xml:space="preserve">Approve.</w:t>
+              <w:t xml:space="preserve">Approve (the Head Auditor must also approve).</w:t>
             </w:r>
           </w:p>
           <w:p>
@@ -3867,7 +3851,7 @@
                 <w:sz w:val="19"/>
                 <w:szCs w:val="19"/>
               </w:rPr>
-              <w:t xml:space="preserve">The period is locked. Journal edits in that period are refused.</w:t>
+              <w:t xml:space="preserve">The new deposit date applies only after both approvals.</w:t>
             </w:r>
           </w:p>
         </w:tc>
@@ -4033,7 +4017,7 @@
                 <w:sz w:val="16"/>
                 <w:szCs w:val="16"/>
               </w:rPr>
-              <w:t xml:space="preserve">AD-09</w:t>
+              <w:t xml:space="preserve">AD-08</w:t>
             </w:r>
           </w:p>
         </w:tc>
@@ -4066,7 +4050,7 @@
                 <w:sz w:val="20"/>
                 <w:szCs w:val="20"/>
               </w:rPr>
-              <w:t xml:space="preserve">Approve a cost change</w:t>
+              <w:t xml:space="preserve">Approve a period lock</w:t>
             </w:r>
           </w:p>
           <w:p>
@@ -4082,7 +4066,7 @@
                 <w:sz w:val="15"/>
                 <w:szCs w:val="15"/>
               </w:rPr>
-              <w:t xml:space="preserve">Flow F14 · Products and cost</w:t>
+              <w:t xml:space="preserve">Flow F13 · Month-end lock</w:t>
             </w:r>
           </w:p>
           <w:p>
@@ -4104,7 +4088,7 @@
                 <w:sz w:val="19"/>
                 <w:szCs w:val="19"/>
               </w:rPr>
-              <w:t xml:space="preserve">My Approvals → cost change typed by the Head Auditor.</w:t>
+              <w:t xml:space="preserve">My Approvals → Period lock requested by the Accounting Head.</w:t>
             </w:r>
           </w:p>
           <w:p>
@@ -4150,7 +4134,7 @@
                 <w:sz w:val="19"/>
                 <w:szCs w:val="19"/>
               </w:rPr>
-              <w:t xml:space="preserve">The new cost applies from the effective date. The roles that see cost are notified.</w:t>
+              <w:t xml:space="preserve">The period is locked. Journal edits in that period are refused.</w:t>
             </w:r>
           </w:p>
         </w:tc>
@@ -4316,7 +4300,7 @@
                 <w:sz w:val="16"/>
                 <w:szCs w:val="16"/>
               </w:rPr>
-              <w:t xml:space="preserve">AD-10</w:t>
+              <w:t xml:space="preserve">AD-09</w:t>
             </w:r>
           </w:p>
         </w:tc>
@@ -4349,7 +4333,23 @@
                 <w:sz w:val="20"/>
                 <w:szCs w:val="20"/>
               </w:rPr>
-              <w:t xml:space="preserve">Approve a consignment</w:t>
+              <w:t xml:space="preserve">Approve a cost change</w:t>
+            </w:r>
+          </w:p>
+          <w:p>
+            <w:pPr>
+              <w:spacing w:after="40" w:before="0" w:line="264"/>
+            </w:pPr>
+            <w:r>
+              <w:rPr>
+                <w:rFonts w:ascii="Arial" w:cs="Arial" w:eastAsia="Arial" w:hAnsi="Arial"/>
+                <w:i/>
+                <w:iCs/>
+                <w:color w:val="5B6477"/>
+                <w:sz w:val="15"/>
+                <w:szCs w:val="15"/>
+              </w:rPr>
+              <w:t xml:space="preserve">Flow F14 · Products and cost</w:t>
             </w:r>
           </w:p>
           <w:p>
@@ -4371,7 +4371,7 @@
                 <w:sz w:val="19"/>
                 <w:szCs w:val="19"/>
               </w:rPr>
-              <w:t xml:space="preserve">My Approvals → consignment already checked by the auditor or In-Charge.</w:t>
+              <w:t xml:space="preserve">My Approvals → cost change typed by the Head Auditor.</w:t>
             </w:r>
           </w:p>
           <w:p>
@@ -4417,7 +4417,7 @@
                 <w:sz w:val="19"/>
                 <w:szCs w:val="19"/>
               </w:rPr>
-              <w:t xml:space="preserve">The stock leaves the branch only after this approval.</w:t>
+              <w:t xml:space="preserve">The new cost applies from the effective date. The roles that see cost are notified.</w:t>
             </w:r>
           </w:p>
         </w:tc>
@@ -4583,7 +4583,7 @@
                 <w:sz w:val="16"/>
                 <w:szCs w:val="16"/>
               </w:rPr>
-              <w:t xml:space="preserve">AD-11</w:t>
+              <w:t xml:space="preserve">AD-10</w:t>
             </w:r>
           </w:p>
         </w:tc>
@@ -4616,7 +4616,7 @@
                 <w:sz w:val="20"/>
                 <w:szCs w:val="20"/>
               </w:rPr>
-              <w:t xml:space="preserve">Create a user</w:t>
+              <w:t xml:space="preserve">Approve a consignment</w:t>
             </w:r>
           </w:p>
           <w:p>
@@ -4638,7 +4638,7 @@
                 <w:sz w:val="19"/>
                 <w:szCs w:val="19"/>
               </w:rPr>
-              <w:t xml:space="preserve">Users &amp; Roles → New user: full name, company ID, role, temporary password, branch → Create.</w:t>
+              <w:t xml:space="preserve">My Approvals → consignment already checked by the auditor or In-Charge.</w:t>
             </w:r>
           </w:p>
           <w:p>
@@ -4660,7 +4660,7 @@
                 <w:sz w:val="19"/>
                 <w:szCs w:val="19"/>
               </w:rPr>
-              <w:t xml:space="preserve">Sign in as that user in another browser, then sign in to the same account in a third window.</w:t>
+              <w:t xml:space="preserve">Approve.</w:t>
             </w:r>
           </w:p>
           <w:p>
@@ -4684,7 +4684,7 @@
                 <w:sz w:val="19"/>
                 <w:szCs w:val="19"/>
               </w:rPr>
-              <w:t xml:space="preserve">The new user must set a password and accept the statement. The first window is signed out with a message.</w:t>
+              <w:t xml:space="preserve">The stock leaves the branch only after this approval.</w:t>
             </w:r>
           </w:p>
         </w:tc>
@@ -4850,7 +4850,7 @@
                 <w:sz w:val="16"/>
                 <w:szCs w:val="16"/>
               </w:rPr>
-              <w:t xml:space="preserve">AD-12</w:t>
+              <w:t xml:space="preserve">AD-11</w:t>
             </w:r>
           </w:p>
         </w:tc>
@@ -4883,7 +4883,7 @@
                 <w:sz w:val="20"/>
                 <w:szCs w:val="20"/>
               </w:rPr>
-              <w:t xml:space="preserve">Custom permissions</w:t>
+              <w:t xml:space="preserve">Create a user</w:t>
             </w:r>
           </w:p>
           <w:p>
@@ -4905,7 +4905,29 @@
                 <w:sz w:val="19"/>
                 <w:szCs w:val="19"/>
               </w:rPr>
-              <w:t xml:space="preserve">Users &amp; Roles → custom.user → tick a few permissions → Save overrides.</w:t>
+              <w:t xml:space="preserve">Users &amp; Roles → New user: full name, company ID, role, temporary password, branch → Create.</w:t>
+            </w:r>
+          </w:p>
+          <w:p>
+            <w:pPr>
+              <w:spacing w:after="20" w:before="0" w:line="264"/>
+            </w:pPr>
+            <w:r>
+              <w:rPr>
+                <w:rFonts w:ascii="Arial" w:cs="Arial" w:eastAsia="Arial" w:hAnsi="Arial"/>
+                <w:color w:val="5B6477"/>
+                <w:sz w:val="19"/>
+                <w:szCs w:val="19"/>
+              </w:rPr>
+              <w:t xml:space="preserve">2.  </w:t>
+            </w:r>
+            <w:r>
+              <w:rPr>
+                <w:rFonts w:ascii="Arial" w:cs="Arial" w:eastAsia="Arial" w:hAnsi="Arial"/>
+                <w:sz w:val="19"/>
+                <w:szCs w:val="19"/>
+              </w:rPr>
+              <w:t xml:space="preserve">Sign in as that user in another browser, then sign in to the same account in a third window.</w:t>
             </w:r>
           </w:p>
           <w:p>
@@ -4929,7 +4951,7 @@
                 <w:sz w:val="19"/>
                 <w:szCs w:val="19"/>
               </w:rPr>
-              <w:t xml:space="preserve">custom.user sees only those screens.</w:t>
+              <w:t xml:space="preserve">The new user must set a password and accept the statement. The first window is signed out with a message.</w:t>
             </w:r>
           </w:p>
         </w:tc>
@@ -5095,7 +5117,7 @@
                 <w:sz w:val="16"/>
                 <w:szCs w:val="16"/>
               </w:rPr>
-              <w:t xml:space="preserve">AD-13</w:t>
+              <w:t xml:space="preserve">AD-12</w:t>
             </w:r>
           </w:p>
         </w:tc>
@@ -5128,7 +5150,7 @@
                 <w:sz w:val="20"/>
                 <w:szCs w:val="20"/>
               </w:rPr>
-              <w:t xml:space="preserve">Delete and archive</w:t>
+              <w:t xml:space="preserve">Custom permissions</w:t>
             </w:r>
           </w:p>
           <w:p>
@@ -5150,29 +5172,7 @@
                 <w:sz w:val="19"/>
                 <w:szCs w:val="19"/>
               </w:rPr>
-              <w:t xml:space="preserve">Products → delete a product never used.</w:t>
-            </w:r>
-          </w:p>
-          <w:p>
-            <w:pPr>
-              <w:spacing w:after="20" w:before="0" w:line="264"/>
-            </w:pPr>
-            <w:r>
-              <w:rPr>
-                <w:rFonts w:ascii="Arial" w:cs="Arial" w:eastAsia="Arial" w:hAnsi="Arial"/>
-                <w:color w:val="5B6477"/>
-                <w:sz w:val="19"/>
-                <w:szCs w:val="19"/>
-              </w:rPr>
-              <w:t xml:space="preserve">2.  </w:t>
-            </w:r>
-            <w:r>
-              <w:rPr>
-                <w:rFonts w:ascii="Arial" w:cs="Arial" w:eastAsia="Arial" w:hAnsi="Arial"/>
-                <w:sz w:val="19"/>
-                <w:szCs w:val="19"/>
-              </w:rPr>
-              <w:t xml:space="preserve">Try to delete a product that was sold.</w:t>
+              <w:t xml:space="preserve">Users &amp; Roles → custom.user → tick a few permissions → Save overrides.</w:t>
             </w:r>
           </w:p>
           <w:p>
@@ -5196,7 +5196,7 @@
                 <w:sz w:val="19"/>
                 <w:szCs w:val="19"/>
               </w:rPr>
-              <w:t xml:space="preserve">The unused product is removed. The sold one is archived instead.</w:t>
+              <w:t xml:space="preserve">custom.user sees only those screens.</w:t>
             </w:r>
           </w:p>
         </w:tc>
@@ -5362,7 +5362,7 @@
                 <w:sz w:val="16"/>
                 <w:szCs w:val="16"/>
               </w:rPr>
-              <w:t xml:space="preserve">AD-14</w:t>
+              <w:t xml:space="preserve">AD-13</w:t>
             </w:r>
           </w:p>
         </w:tc>
@@ -5395,7 +5395,7 @@
                 <w:sz w:val="20"/>
                 <w:szCs w:val="20"/>
               </w:rPr>
-              <w:t xml:space="preserve">Letterhead and logo</w:t>
+              <w:t xml:space="preserve">Delete and archive</w:t>
             </w:r>
           </w:p>
           <w:p>
@@ -5417,7 +5417,7 @@
                 <w:sz w:val="19"/>
                 <w:szCs w:val="19"/>
               </w:rPr>
-              <w:t xml:space="preserve">Settings → Company letterhead → Save details.</w:t>
+              <w:t xml:space="preserve">Products → delete a product never used.</w:t>
             </w:r>
           </w:p>
           <w:p>
@@ -5439,29 +5439,7 @@
                 <w:sz w:val="19"/>
                 <w:szCs w:val="19"/>
               </w:rPr>
-              <w:t xml:space="preserve">Upload a logo, remove the background, Use this logo.</w:t>
-            </w:r>
-          </w:p>
-          <w:p>
-            <w:pPr>
-              <w:spacing w:after="20" w:before="0" w:line="264"/>
-            </w:pPr>
-            <w:r>
-              <w:rPr>
-                <w:rFonts w:ascii="Arial" w:cs="Arial" w:eastAsia="Arial" w:hAnsi="Arial"/>
-                <w:color w:val="5B6477"/>
-                <w:sz w:val="19"/>
-                <w:szCs w:val="19"/>
-              </w:rPr>
-              <w:t xml:space="preserve">3.  </w:t>
-            </w:r>
-            <w:r>
-              <w:rPr>
-                <w:rFonts w:ascii="Arial" w:cs="Arial" w:eastAsia="Arial" w:hAnsi="Arial"/>
-                <w:sz w:val="19"/>
-                <w:szCs w:val="19"/>
-              </w:rPr>
-              <w:t xml:space="preserve">Print any form.</w:t>
+              <w:t xml:space="preserve">Try to delete a product that was sold.</w:t>
             </w:r>
           </w:p>
           <w:p>
@@ -5485,7 +5463,7 @@
                 <w:sz w:val="19"/>
                 <w:szCs w:val="19"/>
               </w:rPr>
-              <w:t xml:space="preserve">The letterhead and logo appear on the printed form, the sign-in page and the menu.</w:t>
+              <w:t xml:space="preserve">The unused product is removed. The sold one is archived instead.</w:t>
             </w:r>
           </w:p>
         </w:tc>
@@ -5651,7 +5629,7 @@
                 <w:sz w:val="16"/>
                 <w:szCs w:val="16"/>
               </w:rPr>
-              <w:t xml:space="preserve">AD-15</w:t>
+              <w:t xml:space="preserve">AD-14</w:t>
             </w:r>
           </w:p>
         </w:tc>
@@ -5684,23 +5662,7 @@
                 <w:sz w:val="20"/>
                 <w:szCs w:val="20"/>
               </w:rPr>
-              <w:t xml:space="preserve">HR referral of repeated transfer differences</w:t>
-            </w:r>
-          </w:p>
-          <w:p>
-            <w:pPr>
-              <w:spacing w:after="40" w:before="0" w:line="264"/>
-            </w:pPr>
-            <w:r>
-              <w:rPr>
-                <w:rFonts w:ascii="Arial" w:cs="Arial" w:eastAsia="Arial" w:hAnsi="Arial"/>
-                <w:i/>
-                <w:iCs/>
-                <w:color w:val="5B6477"/>
-                <w:sz w:val="15"/>
-                <w:szCs w:val="15"/>
-              </w:rPr>
-              <w:t xml:space="preserve">Flow F3 · Transfer received with a different quantity</w:t>
+              <w:t xml:space="preserve">Letterhead and logo</w:t>
             </w:r>
           </w:p>
           <w:p>
@@ -5722,7 +5684,51 @@
                 <w:sz w:val="19"/>
                 <w:szCs w:val="19"/>
               </w:rPr>
-              <w:t xml:space="preserve">After HR presses Refer to the Owner, open the notification.</w:t>
+              <w:t xml:space="preserve">Settings → Company letterhead → Save details.</w:t>
+            </w:r>
+          </w:p>
+          <w:p>
+            <w:pPr>
+              <w:spacing w:after="20" w:before="0" w:line="264"/>
+            </w:pPr>
+            <w:r>
+              <w:rPr>
+                <w:rFonts w:ascii="Arial" w:cs="Arial" w:eastAsia="Arial" w:hAnsi="Arial"/>
+                <w:color w:val="5B6477"/>
+                <w:sz w:val="19"/>
+                <w:szCs w:val="19"/>
+              </w:rPr>
+              <w:t xml:space="preserve">2.  </w:t>
+            </w:r>
+            <w:r>
+              <w:rPr>
+                <w:rFonts w:ascii="Arial" w:cs="Arial" w:eastAsia="Arial" w:hAnsi="Arial"/>
+                <w:sz w:val="19"/>
+                <w:szCs w:val="19"/>
+              </w:rPr>
+              <w:t xml:space="preserve">Upload a logo, remove the background, Use this logo.</w:t>
+            </w:r>
+          </w:p>
+          <w:p>
+            <w:pPr>
+              <w:spacing w:after="20" w:before="0" w:line="264"/>
+            </w:pPr>
+            <w:r>
+              <w:rPr>
+                <w:rFonts w:ascii="Arial" w:cs="Arial" w:eastAsia="Arial" w:hAnsi="Arial"/>
+                <w:color w:val="5B6477"/>
+                <w:sz w:val="19"/>
+                <w:szCs w:val="19"/>
+              </w:rPr>
+              <w:t xml:space="preserve">3.  </w:t>
+            </w:r>
+            <w:r>
+              <w:rPr>
+                <w:rFonts w:ascii="Arial" w:cs="Arial" w:eastAsia="Arial" w:hAnsi="Arial"/>
+                <w:sz w:val="19"/>
+                <w:szCs w:val="19"/>
+              </w:rPr>
+              <w:t xml:space="preserve">Print any form.</w:t>
             </w:r>
           </w:p>
           <w:p>
@@ -5746,7 +5752,7 @@
                 <w:sz w:val="19"/>
                 <w:szCs w:val="19"/>
               </w:rPr>
-              <w:t xml:space="preserve">The notice shows the staff member, the transfers and the count in 30 days.</w:t>
+              <w:t xml:space="preserve">The letterhead and logo appear on the printed form, the sign-in page and the menu.</w:t>
             </w:r>
           </w:p>
         </w:tc>
@@ -5912,7 +5918,7 @@
                 <w:sz w:val="16"/>
                 <w:szCs w:val="16"/>
               </w:rPr>
-              <w:t xml:space="preserve">AD-16</w:t>
+              <w:t xml:space="preserve">AD-15</w:t>
             </w:r>
           </w:p>
         </w:tc>
@@ -5945,7 +5951,23 @@
                 <w:sz w:val="20"/>
                 <w:szCs w:val="20"/>
               </w:rPr>
-              <w:t xml:space="preserve">Reports with profit</w:t>
+              <w:t xml:space="preserve">HR referral of repeated transfer differences</w:t>
+            </w:r>
+          </w:p>
+          <w:p>
+            <w:pPr>
+              <w:spacing w:after="40" w:before="0" w:line="264"/>
+            </w:pPr>
+            <w:r>
+              <w:rPr>
+                <w:rFonts w:ascii="Arial" w:cs="Arial" w:eastAsia="Arial" w:hAnsi="Arial"/>
+                <w:i/>
+                <w:iCs/>
+                <w:color w:val="5B6477"/>
+                <w:sz w:val="15"/>
+                <w:szCs w:val="15"/>
+              </w:rPr>
+              <w:t xml:space="preserve">Flow F3 · Transfer received with a different quantity</w:t>
             </w:r>
           </w:p>
           <w:p>
@@ -5967,73 +5989,7 @@
                 <w:sz w:val="19"/>
                 <w:szCs w:val="19"/>
               </w:rPr>
-              <w:t xml:space="preserve">Reports → Sales Report: All branches, This month → Excel.</w:t>
-            </w:r>
-          </w:p>
-          <w:p>
-            <w:pPr>
-              <w:spacing w:after="20" w:before="0" w:line="264"/>
-            </w:pPr>
-            <w:r>
-              <w:rPr>
-                <w:rFonts w:ascii="Arial" w:cs="Arial" w:eastAsia="Arial" w:hAnsi="Arial"/>
-                <w:color w:val="5B6477"/>
-                <w:sz w:val="19"/>
-                <w:szCs w:val="19"/>
-              </w:rPr>
-              <w:t xml:space="preserve">2.  </w:t>
-            </w:r>
-            <w:r>
-              <w:rPr>
-                <w:rFonts w:ascii="Arial" w:cs="Arial" w:eastAsia="Arial" w:hAnsi="Arial"/>
-                <w:sz w:val="19"/>
-                <w:szCs w:val="19"/>
-              </w:rPr>
-              <w:t xml:space="preserve">Sales Graphs.</w:t>
-            </w:r>
-          </w:p>
-          <w:p>
-            <w:pPr>
-              <w:spacing w:after="20" w:before="0" w:line="264"/>
-            </w:pPr>
-            <w:r>
-              <w:rPr>
-                <w:rFonts w:ascii="Arial" w:cs="Arial" w:eastAsia="Arial" w:hAnsi="Arial"/>
-                <w:color w:val="5B6477"/>
-                <w:sz w:val="19"/>
-                <w:szCs w:val="19"/>
-              </w:rPr>
-              <w:t xml:space="preserve">3.  </w:t>
-            </w:r>
-            <w:r>
-              <w:rPr>
-                <w:rFonts w:ascii="Arial" w:cs="Arial" w:eastAsia="Arial" w:hAnsi="Arial"/>
-                <w:sz w:val="19"/>
-                <w:szCs w:val="19"/>
-              </w:rPr>
-              <w:t xml:space="preserve">Financial Statements.</w:t>
-            </w:r>
-          </w:p>
-          <w:p>
-            <w:pPr>
-              <w:spacing w:after="20" w:before="0" w:line="264"/>
-            </w:pPr>
-            <w:r>
-              <w:rPr>
-                <w:rFonts w:ascii="Arial" w:cs="Arial" w:eastAsia="Arial" w:hAnsi="Arial"/>
-                <w:color w:val="5B6477"/>
-                <w:sz w:val="19"/>
-                <w:szCs w:val="19"/>
-              </w:rPr>
-              <w:t xml:space="preserve">4.  </w:t>
-            </w:r>
-            <w:r>
-              <w:rPr>
-                <w:rFonts w:ascii="Arial" w:cs="Arial" w:eastAsia="Arial" w:hAnsi="Arial"/>
-                <w:sz w:val="19"/>
-                <w:szCs w:val="19"/>
-              </w:rPr>
-              <w:t xml:space="preserve">E-commerce → All platforms: profit report.</w:t>
+              <w:t xml:space="preserve">After HR presses Refer to the Owner, open the notification.</w:t>
             </w:r>
           </w:p>
           <w:p>
@@ -6057,7 +6013,7 @@
                 <w:sz w:val="19"/>
                 <w:szCs w:val="19"/>
               </w:rPr>
-              <w:t xml:space="preserve">Gross profit is shown. Graphs show each branch in its own colour. The balance sheet 'Should be 0' row is 0.</w:t>
+              <w:t xml:space="preserve">The notice shows the staff member, the transfers and the count in 30 days.</w:t>
             </w:r>
           </w:p>
         </w:tc>
@@ -6223,7 +6179,7 @@
                 <w:sz w:val="16"/>
                 <w:szCs w:val="16"/>
               </w:rPr>
-              <w:t xml:space="preserve">AD-17</w:t>
+              <w:t xml:space="preserve">AD-16</w:t>
             </w:r>
           </w:p>
         </w:tc>
@@ -6256,7 +6212,7 @@
                 <w:sz w:val="20"/>
                 <w:szCs w:val="20"/>
               </w:rPr>
-              <w:t xml:space="preserve">Approve many at once</w:t>
+              <w:t xml:space="preserve">Reports with profit</w:t>
             </w:r>
           </w:p>
           <w:p>
@@ -6278,7 +6234,73 @@
                 <w:sz w:val="19"/>
                 <w:szCs w:val="19"/>
               </w:rPr>
-              <w:t xml:space="preserve">My Approvals → tick several → Approve selected.</w:t>
+              <w:t xml:space="preserve">Reports → Sales Report: All branches, This month → Excel.</w:t>
+            </w:r>
+          </w:p>
+          <w:p>
+            <w:pPr>
+              <w:spacing w:after="20" w:before="0" w:line="264"/>
+            </w:pPr>
+            <w:r>
+              <w:rPr>
+                <w:rFonts w:ascii="Arial" w:cs="Arial" w:eastAsia="Arial" w:hAnsi="Arial"/>
+                <w:color w:val="5B6477"/>
+                <w:sz w:val="19"/>
+                <w:szCs w:val="19"/>
+              </w:rPr>
+              <w:t xml:space="preserve">2.  </w:t>
+            </w:r>
+            <w:r>
+              <w:rPr>
+                <w:rFonts w:ascii="Arial" w:cs="Arial" w:eastAsia="Arial" w:hAnsi="Arial"/>
+                <w:sz w:val="19"/>
+                <w:szCs w:val="19"/>
+              </w:rPr>
+              <w:t xml:space="preserve">Sales Graphs.</w:t>
+            </w:r>
+          </w:p>
+          <w:p>
+            <w:pPr>
+              <w:spacing w:after="20" w:before="0" w:line="264"/>
+            </w:pPr>
+            <w:r>
+              <w:rPr>
+                <w:rFonts w:ascii="Arial" w:cs="Arial" w:eastAsia="Arial" w:hAnsi="Arial"/>
+                <w:color w:val="5B6477"/>
+                <w:sz w:val="19"/>
+                <w:szCs w:val="19"/>
+              </w:rPr>
+              <w:t xml:space="preserve">3.  </w:t>
+            </w:r>
+            <w:r>
+              <w:rPr>
+                <w:rFonts w:ascii="Arial" w:cs="Arial" w:eastAsia="Arial" w:hAnsi="Arial"/>
+                <w:sz w:val="19"/>
+                <w:szCs w:val="19"/>
+              </w:rPr>
+              <w:t xml:space="preserve">Financial Statements.</w:t>
+            </w:r>
+          </w:p>
+          <w:p>
+            <w:pPr>
+              <w:spacing w:after="20" w:before="0" w:line="264"/>
+            </w:pPr>
+            <w:r>
+              <w:rPr>
+                <w:rFonts w:ascii="Arial" w:cs="Arial" w:eastAsia="Arial" w:hAnsi="Arial"/>
+                <w:color w:val="5B6477"/>
+                <w:sz w:val="19"/>
+                <w:szCs w:val="19"/>
+              </w:rPr>
+              <w:t xml:space="preserve">4.  </w:t>
+            </w:r>
+            <w:r>
+              <w:rPr>
+                <w:rFonts w:ascii="Arial" w:cs="Arial" w:eastAsia="Arial" w:hAnsi="Arial"/>
+                <w:sz w:val="19"/>
+                <w:szCs w:val="19"/>
+              </w:rPr>
+              <w:t xml:space="preserve">E-commerce → All platforms: profit report.</w:t>
             </w:r>
           </w:p>
           <w:p>
@@ -6302,7 +6324,7 @@
                 <w:sz w:val="19"/>
                 <w:szCs w:val="19"/>
               </w:rPr>
-              <w:t xml:space="preserve">All ticked items are approved together.</w:t>
+              <w:t xml:space="preserve">Gross profit is shown. Graphs show each branch in its own colour. The balance sheet 'Should be 0' row is 0.</w:t>
             </w:r>
           </w:p>
         </w:tc>
@@ -6468,7 +6490,7 @@
                 <w:sz w:val="16"/>
                 <w:szCs w:val="16"/>
               </w:rPr>
-              <w:t xml:space="preserve">AD-18</w:t>
+              <w:t xml:space="preserve">AD-17</w:t>
             </w:r>
           </w:p>
         </w:tc>
@@ -6501,23 +6523,7 @@
                 <w:sz w:val="20"/>
                 <w:szCs w:val="20"/>
               </w:rPr>
-              <w:t xml:space="preserve">Approve opening AR with Tick all</w:t>
-            </w:r>
-          </w:p>
-          <w:p>
-            <w:pPr>
-              <w:spacing w:after="40" w:before="0" w:line="264"/>
-            </w:pPr>
-            <w:r>
-              <w:rPr>
-                <w:rFonts w:ascii="Arial" w:cs="Arial" w:eastAsia="Arial" w:hAnsi="Arial"/>
-                <w:i/>
-                <w:iCs/>
-                <w:color w:val="5B6477"/>
-                <w:sz w:val="15"/>
-                <w:szCs w:val="15"/>
-              </w:rPr>
-              <w:t xml:space="preserve">Flow F17 · Opening AR from before GWS-ERP</w:t>
+              <w:t xml:space="preserve">Approve many at once</w:t>
             </w:r>
           </w:p>
           <w:p>
@@ -6539,51 +6545,7 @@
                 <w:sz w:val="19"/>
                 <w:szCs w:val="19"/>
               </w:rPr>
-              <w:t xml:space="preserve">My Approvals → Opening AR (before GWS-ERP).</w:t>
-            </w:r>
-          </w:p>
-          <w:p>
-            <w:pPr>
-              <w:spacing w:after="20" w:before="0" w:line="264"/>
-            </w:pPr>
-            <w:r>
-              <w:rPr>
-                <w:rFonts w:ascii="Arial" w:cs="Arial" w:eastAsia="Arial" w:hAnsi="Arial"/>
-                <w:color w:val="5B6477"/>
-                <w:sz w:val="19"/>
-                <w:szCs w:val="19"/>
-              </w:rPr>
-              <w:t xml:space="preserve">2.  </w:t>
-            </w:r>
-            <w:r>
-              <w:rPr>
-                <w:rFonts w:ascii="Arial" w:cs="Arial" w:eastAsia="Arial" w:hAnsi="Arial"/>
-                <w:sz w:val="19"/>
-                <w:szCs w:val="19"/>
-              </w:rPr>
-              <w:t xml:space="preserve">Check branch, customer, DR/SI and amount.</w:t>
-            </w:r>
-          </w:p>
-          <w:p>
-            <w:pPr>
-              <w:spacing w:after="20" w:before="0" w:line="264"/>
-            </w:pPr>
-            <w:r>
-              <w:rPr>
-                <w:rFonts w:ascii="Arial" w:cs="Arial" w:eastAsia="Arial" w:hAnsi="Arial"/>
-                <w:color w:val="5B6477"/>
-                <w:sz w:val="19"/>
-                <w:szCs w:val="19"/>
-              </w:rPr>
-              <w:t xml:space="preserve">3.  </w:t>
-            </w:r>
-            <w:r>
-              <w:rPr>
-                <w:rFonts w:ascii="Arial" w:cs="Arial" w:eastAsia="Arial" w:hAnsi="Arial"/>
-                <w:sz w:val="19"/>
-                <w:szCs w:val="19"/>
-              </w:rPr>
-              <w:t xml:space="preserve">Tick all → Approve all; reject one with a reason.</w:t>
+              <w:t xml:space="preserve">My Approvals → tick several → Approve selected.</w:t>
             </w:r>
           </w:p>
           <w:p>
@@ -6607,7 +6569,7 @@
                 <w:sz w:val="19"/>
                 <w:szCs w:val="19"/>
               </w:rPr>
-              <w:t xml:space="preserve">Each approved entry appears in that branch's AR &amp; Collections and the branch is notified. The rejected one shows your reason to Accounting.</w:t>
+              <w:t xml:space="preserve">All ticked items are approved together.</w:t>
             </w:r>
           </w:p>
         </w:tc>
@@ -6773,7 +6735,7 @@
                 <w:sz w:val="16"/>
                 <w:szCs w:val="16"/>
               </w:rPr>
-              <w:t xml:space="preserve">AD-19</w:t>
+              <w:t xml:space="preserve">AD-18</w:t>
             </w:r>
           </w:p>
         </w:tc>
@@ -6806,7 +6768,23 @@
                 <w:sz w:val="20"/>
                 <w:szCs w:val="20"/>
               </w:rPr>
-              <w:t xml:space="preserve">Transfers per branch; franchises marked</w:t>
+              <w:t xml:space="preserve">Approve opening AR with Tick all</w:t>
+            </w:r>
+          </w:p>
+          <w:p>
+            <w:pPr>
+              <w:spacing w:after="40" w:before="0" w:line="264"/>
+            </w:pPr>
+            <w:r>
+              <w:rPr>
+                <w:rFonts w:ascii="Arial" w:cs="Arial" w:eastAsia="Arial" w:hAnsi="Arial"/>
+                <w:i/>
+                <w:iCs/>
+                <w:color w:val="5B6477"/>
+                <w:sz w:val="15"/>
+                <w:szCs w:val="15"/>
+              </w:rPr>
+              <w:t xml:space="preserve">Flow F17 · Opening AR from before GWS-ERP</w:t>
             </w:r>
           </w:p>
           <w:p>
@@ -6828,7 +6806,7 @@
                 <w:sz w:val="19"/>
                 <w:szCs w:val="19"/>
               </w:rPr>
-              <w:t xml:space="preserve">Transfers &amp; Pull-outs → Branches → tick Mayon (franchise) → Done.</w:t>
+              <w:t xml:space="preserve">My Approvals → Opening AR (before GWS-ERP).</w:t>
             </w:r>
           </w:p>
           <w:p>
@@ -6850,7 +6828,7 @@
                 <w:sz w:val="19"/>
                 <w:szCs w:val="19"/>
               </w:rPr>
-              <w:t xml:space="preserve">View → Incoming (Transfer-In).</w:t>
+              <w:t xml:space="preserve">Check branch, customer, DR/SI and amount.</w:t>
             </w:r>
           </w:p>
           <w:p>
@@ -6872,7 +6850,7 @@
                 <w:sz w:val="19"/>
                 <w:szCs w:val="19"/>
               </w:rPr>
-              <w:t xml:space="preserve">Open any branch list (Stock on Hand, Inventory Reports).</w:t>
+              <w:t xml:space="preserve">Tick all → Approve all; reject one with a reason.</w:t>
             </w:r>
           </w:p>
           <w:p>
@@ -6896,7 +6874,7 @@
                 <w:sz w:val="19"/>
                 <w:szCs w:val="19"/>
               </w:rPr>
-              <w:t xml:space="preserve">Only Mayon's transfers show, then only what Mayon received. Every list shows '(franchise)' beside franchise names.</w:t>
+              <w:t xml:space="preserve">Each approved entry appears in that branch's AR &amp; Collections and the branch is notified. The rejected one shows your reason to Accounting.</w:t>
             </w:r>
           </w:p>
         </w:tc>
@@ -7062,7 +7040,7 @@
                 <w:sz w:val="16"/>
                 <w:szCs w:val="16"/>
               </w:rPr>
-              <w:t xml:space="preserve">AD-20</w:t>
+              <w:t xml:space="preserve">AD-19</w:t>
             </w:r>
           </w:p>
         </w:tc>
@@ -7095,23 +7073,7 @@
                 <w:sz w:val="20"/>
                 <w:szCs w:val="20"/>
               </w:rPr>
-              <w:t xml:space="preserve">Approve anything as the Owner</w:t>
-            </w:r>
-          </w:p>
-          <w:p>
-            <w:pPr>
-              <w:spacing w:after="40" w:before="0" w:line="264"/>
-            </w:pPr>
-            <w:r>
-              <w:rPr>
-                <w:rFonts w:ascii="Arial" w:cs="Arial" w:eastAsia="Arial" w:hAnsi="Arial"/>
-                <w:i/>
-                <w:iCs/>
-                <w:color w:val="5B6477"/>
-                <w:sz w:val="15"/>
-                <w:szCs w:val="15"/>
-              </w:rPr>
-              <w:t xml:space="preserve">Flow F18 · Flavors, expiry and the Owner's approval</w:t>
+              <w:t xml:space="preserve">Transfers per branch; franchises marked</w:t>
             </w:r>
           </w:p>
           <w:p>
@@ -7133,7 +7095,7 @@
                 <w:sz w:val="19"/>
                 <w:szCs w:val="19"/>
               </w:rPr>
-              <w:t xml:space="preserve">My Approvals → tick Show everything waiting.</w:t>
+              <w:t xml:space="preserve">Transfers &amp; Pull-outs → Branches → tick Mayon (franchise) → Done.</w:t>
             </w:r>
           </w:p>
           <w:p>
@@ -7155,7 +7117,29 @@
                 <w:sz w:val="19"/>
                 <w:szCs w:val="19"/>
               </w:rPr>
-              <w:t xml:space="preserve">Approve an internal transfer that is waiting for the auditors.</w:t>
+              <w:t xml:space="preserve">View → Incoming (Transfer-In).</w:t>
+            </w:r>
+          </w:p>
+          <w:p>
+            <w:pPr>
+              <w:spacing w:after="20" w:before="0" w:line="264"/>
+            </w:pPr>
+            <w:r>
+              <w:rPr>
+                <w:rFonts w:ascii="Arial" w:cs="Arial" w:eastAsia="Arial" w:hAnsi="Arial"/>
+                <w:color w:val="5B6477"/>
+                <w:sz w:val="19"/>
+                <w:szCs w:val="19"/>
+              </w:rPr>
+              <w:t xml:space="preserve">3.  </w:t>
+            </w:r>
+            <w:r>
+              <w:rPr>
+                <w:rFonts w:ascii="Arial" w:cs="Arial" w:eastAsia="Arial" w:hAnsi="Arial"/>
+                <w:sz w:val="19"/>
+                <w:szCs w:val="19"/>
+              </w:rPr>
+              <w:t xml:space="preserve">Open any branch list (Stock on Hand, Inventory Reports).</w:t>
             </w:r>
           </w:p>
           <w:p>
@@ -7179,7 +7163,7 @@
                 <w:sz w:val="19"/>
                 <w:szCs w:val="19"/>
               </w:rPr>
-              <w:t xml:space="preserve">It is approved at once. The workflow shows 'Owner (final)'. The dashboard shows how many more are waiting with others.</w:t>
+              <w:t xml:space="preserve">Only Mayon's transfers show, then only what Mayon received. Every list shows '(franchise)' beside franchise names.</w:t>
             </w:r>
           </w:p>
         </w:tc>
@@ -7345,7 +7329,7 @@
                 <w:sz w:val="16"/>
                 <w:szCs w:val="16"/>
               </w:rPr>
-              <w:t xml:space="preserve">AD-21</w:t>
+              <w:t xml:space="preserve">AD-20</w:t>
             </w:r>
           </w:p>
         </w:tc>
@@ -7378,7 +7362,7 @@
                 <w:sz w:val="20"/>
                 <w:szCs w:val="20"/>
               </w:rPr>
-              <w:t xml:space="preserve">Approve an agent incentive</w:t>
+              <w:t xml:space="preserve">Approve anything as the Owner</w:t>
             </w:r>
           </w:p>
           <w:p>
@@ -7394,7 +7378,7 @@
                 <w:sz w:val="15"/>
                 <w:szCs w:val="15"/>
               </w:rPr>
-              <w:t xml:space="preserve">Flow F19 · Agent incentive</w:t>
+              <w:t xml:space="preserve">Flow F18 · Flavors, expiry and the Owner's approval</w:t>
             </w:r>
           </w:p>
           <w:p>
@@ -7416,7 +7400,29 @@
                 <w:sz w:val="19"/>
                 <w:szCs w:val="19"/>
               </w:rPr>
-              <w:t xml:space="preserve">After the Accounting Associate and Head approve, My Approvals → Agent incentive → Approve.</w:t>
+              <w:t xml:space="preserve">My Approvals → tick Show everything waiting.</w:t>
+            </w:r>
+          </w:p>
+          <w:p>
+            <w:pPr>
+              <w:spacing w:after="20" w:before="0" w:line="264"/>
+            </w:pPr>
+            <w:r>
+              <w:rPr>
+                <w:rFonts w:ascii="Arial" w:cs="Arial" w:eastAsia="Arial" w:hAnsi="Arial"/>
+                <w:color w:val="5B6477"/>
+                <w:sz w:val="19"/>
+                <w:szCs w:val="19"/>
+              </w:rPr>
+              <w:t xml:space="preserve">2.  </w:t>
+            </w:r>
+            <w:r>
+              <w:rPr>
+                <w:rFonts w:ascii="Arial" w:cs="Arial" w:eastAsia="Arial" w:hAnsi="Arial"/>
+                <w:sz w:val="19"/>
+                <w:szCs w:val="19"/>
+              </w:rPr>
+              <w:t xml:space="preserve">Approve an internal transfer that is waiting for the auditors.</w:t>
             </w:r>
           </w:p>
           <w:p>
@@ -7440,7 +7446,7 @@
                 <w:sz w:val="19"/>
                 <w:szCs w:val="19"/>
               </w:rPr>
-              <w:t xml:space="preserve">The release form number (AI-…) is made and HR is notified.</w:t>
+              <w:t xml:space="preserve">It is approved at once. The workflow shows 'Owner (final)'. The dashboard shows how many more are waiting with others.</w:t>
             </w:r>
           </w:p>
         </w:tc>
@@ -7606,7 +7612,7 @@
                 <w:sz w:val="16"/>
                 <w:szCs w:val="16"/>
               </w:rPr>
-              <w:t xml:space="preserve">AD-22</w:t>
+              <w:t xml:space="preserve">AD-21</w:t>
             </w:r>
           </w:p>
         </w:tc>
@@ -7639,7 +7645,7 @@
                 <w:sz w:val="20"/>
                 <w:szCs w:val="20"/>
               </w:rPr>
-              <w:t xml:space="preserve">Credit-card and e-commerce prices</w:t>
+              <w:t xml:space="preserve">Approve an agent incentive</w:t>
             </w:r>
           </w:p>
           <w:p>
@@ -7655,7 +7661,7 @@
                 <w:sz w:val="15"/>
                 <w:szCs w:val="15"/>
               </w:rPr>
-              <w:t xml:space="preserve">Flow F11 · E-commerce order to payout</w:t>
+              <w:t xml:space="preserve">Flow F19 · Agent incentive</w:t>
             </w:r>
           </w:p>
           <w:p>
@@ -7677,73 +7683,7 @@
                 <w:sz w:val="19"/>
                 <w:szCs w:val="19"/>
               </w:rPr>
-              <w:t xml:space="preserve">Open E-com &amp; Card Prices.</w:t>
-            </w:r>
-          </w:p>
-          <w:p>
-            <w:pPr>
-              <w:spacing w:after="20" w:before="0" w:line="264"/>
-            </w:pPr>
-            <w:r>
-              <w:rPr>
-                <w:rFonts w:ascii="Arial" w:cs="Arial" w:eastAsia="Arial" w:hAnsi="Arial"/>
-                <w:color w:val="5B6477"/>
-                <w:sz w:val="19"/>
-                <w:szCs w:val="19"/>
-              </w:rPr>
-              <w:t xml:space="preserve">2.  </w:t>
-            </w:r>
-            <w:r>
-              <w:rPr>
-                <w:rFonts w:ascii="Arial" w:cs="Arial" w:eastAsia="Arial" w:hAnsi="Arial"/>
-                <w:sz w:val="19"/>
-                <w:szCs w:val="19"/>
-              </w:rPr>
-              <w:t xml:space="preserve">Set the Card fee % (4) and choose SRP ÷ (1 − %) → Save prices.</w:t>
-            </w:r>
-          </w:p>
-          <w:p>
-            <w:pPr>
-              <w:spacing w:after="20" w:before="0" w:line="264"/>
-            </w:pPr>
-            <w:r>
-              <w:rPr>
-                <w:rFonts w:ascii="Arial" w:cs="Arial" w:eastAsia="Arial" w:hAnsi="Arial"/>
-                <w:color w:val="5B6477"/>
-                <w:sz w:val="19"/>
-                <w:szCs w:val="19"/>
-              </w:rPr>
-              <w:t xml:space="preserve">3.  </w:t>
-            </w:r>
-            <w:r>
-              <w:rPr>
-                <w:rFonts w:ascii="Arial" w:cs="Arial" w:eastAsia="Arial" w:hAnsi="Arial"/>
-                <w:sz w:val="19"/>
-                <w:szCs w:val="19"/>
-              </w:rPr>
-              <w:t xml:space="preserve">Change one TikTok, one Shopee and one Lazada price → Save prices. Or import the masterlist (.xlsx).</w:t>
-            </w:r>
-          </w:p>
-          <w:p>
-            <w:pPr>
-              <w:spacing w:after="20" w:before="0" w:line="264"/>
-            </w:pPr>
-            <w:r>
-              <w:rPr>
-                <w:rFonts w:ascii="Arial" w:cs="Arial" w:eastAsia="Arial" w:hAnsi="Arial"/>
-                <w:color w:val="5B6477"/>
-                <w:sz w:val="19"/>
-                <w:szCs w:val="19"/>
-              </w:rPr>
-              <w:t xml:space="preserve">4.  </w:t>
-            </w:r>
-            <w:r>
-              <w:rPr>
-                <w:rFonts w:ascii="Arial" w:cs="Arial" w:eastAsia="Arial" w:hAnsi="Arial"/>
-                <w:sz w:val="19"/>
-                <w:szCs w:val="19"/>
-              </w:rPr>
-              <w:t xml:space="preserve">Open New Sale as a sales account and pay one item by credit card.</w:t>
+              <w:t xml:space="preserve">After the Accounting Associate and Head approve, My Approvals → Agent incentive → Approve.</w:t>
             </w:r>
           </w:p>
           <w:p>
@@ -7767,7 +7707,7 @@
                 <w:sz w:val="19"/>
                 <w:szCs w:val="19"/>
               </w:rPr>
-              <w:t xml:space="preserve">Prices keep their centavos (no rounding). The card sale uses the credit-card price; a platform sale uses that platform price list.</w:t>
+              <w:t xml:space="preserve">The release form number (AI-…) is made and HR is notified.</w:t>
             </w:r>
           </w:p>
         </w:tc>
@@ -7933,7 +7873,7 @@
                 <w:sz w:val="16"/>
                 <w:szCs w:val="16"/>
               </w:rPr>
-              <w:t xml:space="preserve">AD-23</w:t>
+              <w:t xml:space="preserve">AD-22</w:t>
             </w:r>
           </w:p>
         </w:tc>
@@ -7966,7 +7906,7 @@
                 <w:sz w:val="20"/>
                 <w:szCs w:val="20"/>
               </w:rPr>
-              <w:t xml:space="preserve">Franchise AR: extension and waiving charges</w:t>
+              <w:t xml:space="preserve">Credit-card and e-commerce prices</w:t>
             </w:r>
           </w:p>
           <w:p>
@@ -7982,7 +7922,7 @@
                 <w:sz w:val="15"/>
                 <w:szCs w:val="15"/>
               </w:rPr>
-              <w:t xml:space="preserve">Flow F21 · Franchise AR: penalty, extension, payment</w:t>
+              <w:t xml:space="preserve">Flow F11 · E-commerce order to payout</w:t>
             </w:r>
           </w:p>
           <w:p>
@@ -8004,7 +7944,7 @@
                 <w:sz w:val="19"/>
                 <w:szCs w:val="19"/>
               </w:rPr>
-              <w:t xml:space="preserve">Open Franchise AR → a franchise with an overdue invoice.</w:t>
+              <w:t xml:space="preserve">Open E-com &amp; Card Prices.</w:t>
             </w:r>
           </w:p>
           <w:p>
@@ -8026,7 +7966,7 @@
                 <w:sz w:val="19"/>
                 <w:szCs w:val="19"/>
               </w:rPr>
-              <w:t xml:space="preserve">Read the penalty (2% once) and interest (0.1% a day) and the total due today.</w:t>
+              <w:t xml:space="preserve">Set the Card fee % (4) and choose SRP ÷ (1 − %) → Save prices.</w:t>
             </w:r>
           </w:p>
           <w:p>
@@ -8048,7 +7988,7 @@
                 <w:sz w:val="19"/>
                 <w:szCs w:val="19"/>
               </w:rPr>
-              <w:t xml:space="preserve">Open My Approvals → Franchise AR extension → read the reason → Approve (or Reject with a reason).</w:t>
+              <w:t xml:space="preserve">Change one TikTok, one Shopee and one Lazada price → Save prices. Or import the masterlist (.xlsx).</w:t>
             </w:r>
           </w:p>
           <w:p>
@@ -8070,7 +8010,7 @@
                 <w:sz w:val="19"/>
                 <w:szCs w:val="19"/>
               </w:rPr>
-              <w:t xml:space="preserve">On the invoice press Waive charges, type an amount and a reason.</w:t>
+              <w:t xml:space="preserve">Open New Sale as a sales account and pay one item by credit card.</w:t>
             </w:r>
           </w:p>
           <w:p>
@@ -8094,7 +8034,7 @@
                 <w:sz w:val="19"/>
                 <w:szCs w:val="19"/>
               </w:rPr>
-              <w:t xml:space="preserve">The new due date applies from the approved request. Penalty and interest are recalculated and the waiver is recorded with your name. Accounting, the auditors, the Franchise Coordinators and the franchise owner are told.</w:t>
+              <w:t xml:space="preserve">Prices keep their centavos (no rounding). The card sale uses the credit-card price; a platform sale uses that platform price list.</w:t>
             </w:r>
           </w:p>
         </w:tc>
@@ -8260,7 +8200,7 @@
                 <w:sz w:val="16"/>
                 <w:szCs w:val="16"/>
               </w:rPr>
-              <w:t xml:space="preserve">AD-24</w:t>
+              <w:t xml:space="preserve">AD-23</w:t>
             </w:r>
           </w:p>
         </w:tc>
@@ -8293,7 +8233,7 @@
                 <w:sz w:val="20"/>
                 <w:szCs w:val="20"/>
               </w:rPr>
-              <w:t xml:space="preserve">6-Pack Card override request</w:t>
+              <w:t xml:space="preserve">Franchise AR: extension and waiving charges</w:t>
             </w:r>
           </w:p>
           <w:p>
@@ -8309,7 +8249,7 @@
                 <w:sz w:val="15"/>
                 <w:szCs w:val="15"/>
               </w:rPr>
-              <w:t xml:space="preserve">Flow F23 · 6-Pack Card and the override</w:t>
+              <w:t xml:space="preserve">Flow F21 · Franchise AR: penalty, extension, payment</w:t>
             </w:r>
           </w:p>
           <w:p>
@@ -8331,7 +8271,7 @@
                 <w:sz w:val="19"/>
                 <w:szCs w:val="19"/>
               </w:rPr>
-              <w:t xml:space="preserve">Open My Approvals → 6-Pack Card override sent by the Head Auditor.</w:t>
+              <w:t xml:space="preserve">Open Franchise AR → a franchise with an overdue invoice.</w:t>
             </w:r>
           </w:p>
           <w:p>
@@ -8353,7 +8293,51 @@
                 <w:sz w:val="19"/>
                 <w:szCs w:val="19"/>
               </w:rPr>
-              <w:t xml:space="preserve">Read the branch, what is known about the customer and the reason → Approve.</w:t>
+              <w:t xml:space="preserve">Read the penalty (2% once) and interest (0.1% a day) and the total due today.</w:t>
+            </w:r>
+          </w:p>
+          <w:p>
+            <w:pPr>
+              <w:spacing w:after="20" w:before="0" w:line="264"/>
+            </w:pPr>
+            <w:r>
+              <w:rPr>
+                <w:rFonts w:ascii="Arial" w:cs="Arial" w:eastAsia="Arial" w:hAnsi="Arial"/>
+                <w:color w:val="5B6477"/>
+                <w:sz w:val="19"/>
+                <w:szCs w:val="19"/>
+              </w:rPr>
+              <w:t xml:space="preserve">3.  </w:t>
+            </w:r>
+            <w:r>
+              <w:rPr>
+                <w:rFonts w:ascii="Arial" w:cs="Arial" w:eastAsia="Arial" w:hAnsi="Arial"/>
+                <w:sz w:val="19"/>
+                <w:szCs w:val="19"/>
+              </w:rPr>
+              <w:t xml:space="preserve">Open My Approvals → Franchise AR extension → read the reason → Approve (or Reject with a reason).</w:t>
+            </w:r>
+          </w:p>
+          <w:p>
+            <w:pPr>
+              <w:spacing w:after="20" w:before="0" w:line="264"/>
+            </w:pPr>
+            <w:r>
+              <w:rPr>
+                <w:rFonts w:ascii="Arial" w:cs="Arial" w:eastAsia="Arial" w:hAnsi="Arial"/>
+                <w:color w:val="5B6477"/>
+                <w:sz w:val="19"/>
+                <w:szCs w:val="19"/>
+              </w:rPr>
+              <w:t xml:space="preserve">4.  </w:t>
+            </w:r>
+            <w:r>
+              <w:rPr>
+                <w:rFonts w:ascii="Arial" w:cs="Arial" w:eastAsia="Arial" w:hAnsi="Arial"/>
+                <w:sz w:val="19"/>
+                <w:szCs w:val="19"/>
+              </w:rPr>
+              <w:t xml:space="preserve">On the invoice press Waive charges, type an amount and a reason.</w:t>
             </w:r>
           </w:p>
           <w:p>
@@ -8377,7 +8361,7 @@
                 <w:sz w:val="19"/>
                 <w:szCs w:val="19"/>
               </w:rPr>
-              <w:t xml:space="preserve">The card is booked as usual (₱300 expense for the branch) and marked as an override. Rejecting needs a reason.</w:t>
+              <w:t xml:space="preserve">The new due date applies from the approved request. Penalty and interest are recalculated and the waiver is recorded with your name. Accounting, the auditors, the Franchise Coordinators and the franchise owner are told.</w:t>
             </w:r>
           </w:p>
         </w:tc>
@@ -8543,7 +8527,7 @@
                 <w:sz w:val="16"/>
                 <w:szCs w:val="16"/>
               </w:rPr>
-              <w:t xml:space="preserve">AD-25</w:t>
+              <w:t xml:space="preserve">AD-24</w:t>
             </w:r>
           </w:p>
         </w:tc>
@@ -8576,7 +8560,7 @@
                 <w:sz w:val="20"/>
                 <w:szCs w:val="20"/>
               </w:rPr>
-              <w:t xml:space="preserve">E-commerce margin analysis and ad expenses</w:t>
+              <w:t xml:space="preserve">6-Pack Card override request</w:t>
             </w:r>
           </w:p>
           <w:p>
@@ -8592,7 +8576,7 @@
                 <w:sz w:val="15"/>
                 <w:szCs w:val="15"/>
               </w:rPr>
-              <w:t xml:space="preserve">Flow F11 · E-commerce order to payout</w:t>
+              <w:t xml:space="preserve">Flow F23 · 6-Pack Card and the override</w:t>
             </w:r>
           </w:p>
           <w:p>
@@ -8614,7 +8598,7 @@
                 <w:sz w:val="19"/>
                 <w:szCs w:val="19"/>
               </w:rPr>
-              <w:t xml:space="preserve">Open E-com Margin Analysis → choose a month and platform.</w:t>
+              <w:t xml:space="preserve">Open My Approvals → 6-Pack Card override sent by the Head Auditor.</w:t>
             </w:r>
           </w:p>
           <w:p>
@@ -8636,51 +8620,7 @@
                 <w:sz w:val="19"/>
                 <w:szCs w:val="19"/>
               </w:rPr>
-              <w:t xml:space="preserve">Read Where the money goes (gross sales, platform fees, shipping, withholding tax, cost, contribution, margin).</w:t>
-            </w:r>
-          </w:p>
-          <w:p>
-            <w:pPr>
-              <w:spacing w:after="20" w:before="0" w:line="264"/>
-            </w:pPr>
-            <w:r>
-              <w:rPr>
-                <w:rFonts w:ascii="Arial" w:cs="Arial" w:eastAsia="Arial" w:hAnsi="Arial"/>
-                <w:color w:val="5B6477"/>
-                <w:sz w:val="19"/>
-                <w:szCs w:val="19"/>
-              </w:rPr>
-              <w:t xml:space="preserve">3.  </w:t>
-            </w:r>
-            <w:r>
-              <w:rPr>
-                <w:rFonts w:ascii="Arial" w:cs="Arial" w:eastAsia="Arial" w:hAnsi="Arial"/>
-                <w:sz w:val="19"/>
-                <w:szCs w:val="19"/>
-              </w:rPr>
-              <w:t xml:space="preserve">Press Add ad expense, type the platform, amount, reference and paid from → save.</w:t>
-            </w:r>
-          </w:p>
-          <w:p>
-            <w:pPr>
-              <w:spacing w:after="20" w:before="0" w:line="264"/>
-            </w:pPr>
-            <w:r>
-              <w:rPr>
-                <w:rFonts w:ascii="Arial" w:cs="Arial" w:eastAsia="Arial" w:hAnsi="Arial"/>
-                <w:color w:val="5B6477"/>
-                <w:sz w:val="19"/>
-                <w:szCs w:val="19"/>
-              </w:rPr>
-              <w:t xml:space="preserve">4.  </w:t>
-            </w:r>
-            <w:r>
-              <w:rPr>
-                <w:rFonts w:ascii="Arial" w:cs="Arial" w:eastAsia="Arial" w:hAnsi="Arial"/>
-                <w:sz w:val="19"/>
-                <w:szCs w:val="19"/>
-              </w:rPr>
-              <w:t xml:space="preserve">Type a Target margin % and read Is the pricing right? and the Price for target.</w:t>
+              <w:t xml:space="preserve">Read the branch, what is known about the customer and the reason → Approve.</w:t>
             </w:r>
           </w:p>
           <w:p>
@@ -8704,7 +8644,7 @@
                 <w:sz w:val="19"/>
                 <w:szCs w:val="19"/>
               </w:rPr>
-              <w:t xml:space="preserve">The ad expense is booked as advertising expense and reduces the contribution and margin at once. The suggested price for the target margin is shown, with each product.</w:t>
+              <w:t xml:space="preserve">The card is booked as usual (₱300 expense for the branch) and marked as an override. Rejecting needs a reason.</w:t>
             </w:r>
           </w:p>
         </w:tc>
@@ -8870,7 +8810,7 @@
                 <w:sz w:val="16"/>
                 <w:szCs w:val="16"/>
               </w:rPr>
-              <w:t xml:space="preserve">AD-26</w:t>
+              <w:t xml:space="preserve">AD-25</w:t>
             </w:r>
           </w:p>
         </w:tc>
@@ -8903,7 +8843,7 @@
                 <w:sz w:val="20"/>
                 <w:szCs w:val="20"/>
               </w:rPr>
-              <w:t xml:space="preserve">Write a memorandum as the Owner</w:t>
+              <w:t xml:space="preserve">E-commerce margin analysis and ad expenses</w:t>
             </w:r>
           </w:p>
           <w:p>
@@ -8919,7 +8859,7 @@
                 <w:sz w:val="15"/>
                 <w:szCs w:val="15"/>
               </w:rPr>
-              <w:t xml:space="preserve">Flow F24 · Memorandum</w:t>
+              <w:t xml:space="preserve">Flow F11 · E-commerce order to payout</w:t>
             </w:r>
           </w:p>
           <w:p>
@@ -8941,7 +8881,7 @@
                 <w:sz w:val="19"/>
                 <w:szCs w:val="19"/>
               </w:rPr>
-              <w:t xml:space="preserve">Open Memorandums → Write a memo.</w:t>
+              <w:t xml:space="preserve">Open E-com Margin Analysis → choose a month and platform.</w:t>
             </w:r>
           </w:p>
           <w:p>
@@ -8963,7 +8903,7 @@
                 <w:sz w:val="19"/>
                 <w:szCs w:val="19"/>
               </w:rPr>
-              <w:t xml:space="preserve">Choose Who it is for (for example franchise owners), type RE, the memo, add a table if wanted.</w:t>
+              <w:t xml:space="preserve">Read Where the money goes (gross sales, platform fees, shipping, withholding tax, cost, contribution, margin).</w:t>
             </w:r>
           </w:p>
           <w:p>
@@ -8985,7 +8925,7 @@
                 <w:sz w:val="19"/>
                 <w:szCs w:val="19"/>
               </w:rPr>
-              <w:t xml:space="preserve">Check the signers: AL MARVIN VINLUAN (President) and MICAH VINLUAN (Manager) must already be there. Add one more signer → Issue the memo.</w:t>
+              <w:t xml:space="preserve">Press Add ad expense, type the platform, amount, reference and paid from → save.</w:t>
             </w:r>
           </w:p>
           <w:p>
@@ -9007,7 +8947,7 @@
                 <w:sz w:val="19"/>
                 <w:szCs w:val="19"/>
               </w:rPr>
-              <w:t xml:space="preserve">Press Print / download PDF.</w:t>
+              <w:t xml:space="preserve">Type a Target margin % and read Is the pricing right? and the Price for target.</w:t>
             </w:r>
           </w:p>
           <w:p>
@@ -9031,7 +8971,7 @@
                 <w:sz w:val="19"/>
                 <w:szCs w:val="19"/>
               </w:rPr>
-              <w:t xml:space="preserve">The memo is numbered by itself (for example 2026-Q4-001) and printed on the letterhead. Everyone addressed gets a notice.</w:t>
+              <w:t xml:space="preserve">The ad expense is booked as advertising expense and reduces the contribution and margin at once. The suggested price for the target margin is shown, with each product.</w:t>
             </w:r>
           </w:p>
         </w:tc>
@@ -9197,7 +9137,7 @@
                 <w:sz w:val="16"/>
                 <w:szCs w:val="16"/>
               </w:rPr>
-              <w:t xml:space="preserve">AD-27</w:t>
+              <w:t xml:space="preserve">AD-26</w:t>
             </w:r>
           </w:p>
         </w:tc>
@@ -9230,7 +9170,23 @@
                 <w:sz w:val="20"/>
                 <w:szCs w:val="20"/>
               </w:rPr>
-              <w:t xml:space="preserve">Add an employee or user and HR is told</w:t>
+              <w:t xml:space="preserve">Write a memorandum as the Owner</w:t>
+            </w:r>
+          </w:p>
+          <w:p>
+            <w:pPr>
+              <w:spacing w:after="40" w:before="0" w:line="264"/>
+            </w:pPr>
+            <w:r>
+              <w:rPr>
+                <w:rFonts w:ascii="Arial" w:cs="Arial" w:eastAsia="Arial" w:hAnsi="Arial"/>
+                <w:i/>
+                <w:iCs/>
+                <w:color w:val="5B6477"/>
+                <w:sz w:val="15"/>
+                <w:szCs w:val="15"/>
+              </w:rPr>
+              <w:t xml:space="preserve">Flow F24 · Memorandum</w:t>
             </w:r>
           </w:p>
           <w:p>
@@ -9252,7 +9208,7 @@
                 <w:sz w:val="19"/>
                 <w:szCs w:val="19"/>
               </w:rPr>
-              <w:t xml:space="preserve">Open Users &amp; Roles → New user (or Employees → Add) and save.</w:t>
+              <w:t xml:space="preserve">Open Memorandums → Write a memo.</w:t>
             </w:r>
           </w:p>
           <w:p>
@@ -9274,7 +9230,51 @@
                 <w:sz w:val="19"/>
                 <w:szCs w:val="19"/>
               </w:rPr>
-              <w:t xml:space="preserve">Sign in as hr.staff and open Notifications.</w:t>
+              <w:t xml:space="preserve">Choose Who it is for (for example franchise owners), type RE, the memo, add a table if wanted.</w:t>
+            </w:r>
+          </w:p>
+          <w:p>
+            <w:pPr>
+              <w:spacing w:after="20" w:before="0" w:line="264"/>
+            </w:pPr>
+            <w:r>
+              <w:rPr>
+                <w:rFonts w:ascii="Arial" w:cs="Arial" w:eastAsia="Arial" w:hAnsi="Arial"/>
+                <w:color w:val="5B6477"/>
+                <w:sz w:val="19"/>
+                <w:szCs w:val="19"/>
+              </w:rPr>
+              <w:t xml:space="preserve">3.  </w:t>
+            </w:r>
+            <w:r>
+              <w:rPr>
+                <w:rFonts w:ascii="Arial" w:cs="Arial" w:eastAsia="Arial" w:hAnsi="Arial"/>
+                <w:sz w:val="19"/>
+                <w:szCs w:val="19"/>
+              </w:rPr>
+              <w:t xml:space="preserve">Check the signers: AL MARVIN VINLUAN (President) and MICAH VINLUAN (Manager) must already be there. Add one more signer → Issue the memo.</w:t>
+            </w:r>
+          </w:p>
+          <w:p>
+            <w:pPr>
+              <w:spacing w:after="20" w:before="0" w:line="264"/>
+            </w:pPr>
+            <w:r>
+              <w:rPr>
+                <w:rFonts w:ascii="Arial" w:cs="Arial" w:eastAsia="Arial" w:hAnsi="Arial"/>
+                <w:color w:val="5B6477"/>
+                <w:sz w:val="19"/>
+                <w:szCs w:val="19"/>
+              </w:rPr>
+              <w:t xml:space="preserve">4.  </w:t>
+            </w:r>
+            <w:r>
+              <w:rPr>
+                <w:rFonts w:ascii="Arial" w:cs="Arial" w:eastAsia="Arial" w:hAnsi="Arial"/>
+                <w:sz w:val="19"/>
+                <w:szCs w:val="19"/>
+              </w:rPr>
+              <w:t xml:space="preserve">Press Print / download PDF.</w:t>
             </w:r>
           </w:p>
           <w:p>
@@ -9298,7 +9298,7 @@
                 <w:sz w:val="19"/>
                 <w:szCs w:val="19"/>
               </w:rPr>
-              <w:t xml:space="preserve">HR has a notice naming the new user or employee and who added them.</w:t>
+              <w:t xml:space="preserve">The memo is numbered by itself (for example 2026-Q4-001) and printed on the letterhead. Everyone addressed gets a notice.</w:t>
             </w:r>
           </w:p>
         </w:tc>
@@ -9464,7 +9464,7 @@
                 <w:sz w:val="16"/>
                 <w:szCs w:val="16"/>
               </w:rPr>
-              <w:t xml:space="preserve">AD-28</w:t>
+              <w:t xml:space="preserve">AD-27</w:t>
             </w:r>
           </w:p>
         </w:tc>
@@ -9497,23 +9497,7 @@
                 <w:sz w:val="20"/>
                 <w:szCs w:val="20"/>
               </w:rPr>
-              <w:t xml:space="preserve">Approve a deposit slip check as the Owner</w:t>
-            </w:r>
-          </w:p>
-          <w:p>
-            <w:pPr>
-              <w:spacing w:after="40" w:before="0" w:line="264"/>
-            </w:pPr>
-            <w:r>
-              <w:rPr>
-                <w:rFonts w:ascii="Arial" w:cs="Arial" w:eastAsia="Arial" w:hAnsi="Arial"/>
-                <w:i/>
-                <w:iCs/>
-                <w:color w:val="5B6477"/>
-                <w:sz w:val="15"/>
-                <w:szCs w:val="15"/>
-              </w:rPr>
-              <w:t xml:space="preserve">Flow F22 · Cash deposit slip and its two checks</w:t>
+              <w:t xml:space="preserve">Add an employee or user and HR is told</w:t>
             </w:r>
           </w:p>
           <w:p>
@@ -9535,7 +9519,7 @@
                 <w:sz w:val="19"/>
                 <w:szCs w:val="19"/>
               </w:rPr>
-              <w:t xml:space="preserve">Open My Approvals → Cash deposit slip (audit or accounting).</w:t>
+              <w:t xml:space="preserve">Open Users &amp; Roles → New user (or Employees → Add) and save.</w:t>
             </w:r>
           </w:p>
           <w:p>
@@ -9557,7 +9541,7 @@
                 <w:sz w:val="19"/>
                 <w:szCs w:val="19"/>
               </w:rPr>
-              <w:t xml:space="preserve">Open the slip, compare amount, bank and date → Approve (or Reject with a reason).</w:t>
+              <w:t xml:space="preserve">Sign in as hr.staff and open Notifications.</w:t>
             </w:r>
           </w:p>
           <w:p>
@@ -9581,7 +9565,7 @@
                 <w:sz w:val="19"/>
                 <w:szCs w:val="19"/>
               </w:rPr>
-              <w:t xml:space="preserve">The Owner may decide in place of the Audit or Accounting Associate. The decision is recorded with your name.</w:t>
+              <w:t xml:space="preserve">HR has a notice naming the new user or employee and who added them.</w:t>
             </w:r>
           </w:p>
         </w:tc>
@@ -9747,7 +9731,7 @@
                 <w:sz w:val="16"/>
                 <w:szCs w:val="16"/>
               </w:rPr>
-              <w:t xml:space="preserve">AD-29</w:t>
+              <w:t xml:space="preserve">AD-28</w:t>
             </w:r>
           </w:p>
         </w:tc>
@@ -9780,7 +9764,7 @@
                 <w:sz w:val="20"/>
                 <w:szCs w:val="20"/>
               </w:rPr>
-              <w:t xml:space="preserve">Waybill report</w:t>
+              <w:t xml:space="preserve">Approve a deposit slip check as the Owner</w:t>
             </w:r>
           </w:p>
           <w:p>
@@ -9796,7 +9780,7 @@
                 <w:sz w:val="15"/>
                 <w:szCs w:val="15"/>
               </w:rPr>
-              <w:t xml:space="preserve">Flow F25 · Waybills to e-commerce report</w:t>
+              <w:t xml:space="preserve">Flow F22 · Cash deposit slip and its two checks</w:t>
             </w:r>
           </w:p>
           <w:p>
@@ -9818,7 +9802,7 @@
                 <w:sz w:val="19"/>
                 <w:szCs w:val="19"/>
               </w:rPr>
-              <w:t xml:space="preserve">Open Waybill Report → upload the TikTok / Shopee / Lazada label PDFs.</w:t>
+              <w:t xml:space="preserve">Open My Approvals → Cash deposit slip (audit or accounting).</w:t>
             </w:r>
           </w:p>
           <w:p>
@@ -9840,7 +9824,7 @@
                 <w:sz w:val="19"/>
                 <w:szCs w:val="19"/>
               </w:rPr>
-              <w:t xml:space="preserve">Choose the product for each → Confirm. Read SRP, platform fees and order income. Press Download Excel.</w:t>
+              <w:t xml:space="preserve">Open the slip, compare amount, bank and date → Approve (or Reject with a reason).</w:t>
             </w:r>
           </w:p>
           <w:p>
@@ -9864,7 +9848,7 @@
                 <w:sz w:val="19"/>
                 <w:szCs w:val="19"/>
               </w:rPr>
-              <w:t xml:space="preserve">SRP comes from the platform price list with centavos. Fees use the rates under Platform fee rates used. The same platform and weight is filled in next time.</w:t>
+              <w:t xml:space="preserve">The Owner may decide in place of the Audit or Accounting Associate. The decision is recorded with your name.</w:t>
             </w:r>
           </w:p>
         </w:tc>
@@ -10030,7 +10014,7 @@
                 <w:sz w:val="16"/>
                 <w:szCs w:val="16"/>
               </w:rPr>
-              <w:t xml:space="preserve">AD-30</w:t>
+              <w:t xml:space="preserve">AD-29</w:t>
             </w:r>
           </w:p>
         </w:tc>
@@ -10063,7 +10047,23 @@
                 <w:sz w:val="20"/>
                 <w:szCs w:val="20"/>
               </w:rPr>
-              <w:t xml:space="preserve">Change your own password</w:t>
+              <w:t xml:space="preserve">Waybill report</w:t>
+            </w:r>
+          </w:p>
+          <w:p>
+            <w:pPr>
+              <w:spacing w:after="40" w:before="0" w:line="264"/>
+            </w:pPr>
+            <w:r>
+              <w:rPr>
+                <w:rFonts w:ascii="Arial" w:cs="Arial" w:eastAsia="Arial" w:hAnsi="Arial"/>
+                <w:i/>
+                <w:iCs/>
+                <w:color w:val="5B6477"/>
+                <w:sz w:val="15"/>
+                <w:szCs w:val="15"/>
+              </w:rPr>
+              <w:t xml:space="preserve">Flow F25 · Waybills to e-commerce report</w:t>
             </w:r>
           </w:p>
           <w:p>
@@ -10085,7 +10085,7 @@
                 <w:sz w:val="19"/>
                 <w:szCs w:val="19"/>
               </w:rPr>
-              <w:t xml:space="preserve">Press the key icon at the top right (Change my password).</w:t>
+              <w:t xml:space="preserve">Open Waybill Report → upload the TikTok / Shopee / Lazada label PDFs.</w:t>
             </w:r>
           </w:p>
           <w:p>
@@ -10107,29 +10107,7 @@
                 <w:sz w:val="19"/>
                 <w:szCs w:val="19"/>
               </w:rPr>
-              <w:t xml:space="preserve">Type the current password and a new one of 10 or more characters, twice → Change password.</w:t>
-            </w:r>
-          </w:p>
-          <w:p>
-            <w:pPr>
-              <w:spacing w:after="20" w:before="0" w:line="264"/>
-            </w:pPr>
-            <w:r>
-              <w:rPr>
-                <w:rFonts w:ascii="Arial" w:cs="Arial" w:eastAsia="Arial" w:hAnsi="Arial"/>
-                <w:color w:val="5B6477"/>
-                <w:sz w:val="19"/>
-                <w:szCs w:val="19"/>
-              </w:rPr>
-              <w:t xml:space="preserve">3.  </w:t>
-            </w:r>
-            <w:r>
-              <w:rPr>
-                <w:rFonts w:ascii="Arial" w:cs="Arial" w:eastAsia="Arial" w:hAnsi="Arial"/>
-                <w:sz w:val="19"/>
-                <w:szCs w:val="19"/>
-              </w:rPr>
-              <w:t xml:space="preserve">Sign out and sign in again with the new password. Then change it back to ChangeMe!2026 for the next tester.</w:t>
+              <w:t xml:space="preserve">Choose the product for each → Confirm. Read SRP, platform fees and order income. Press Download Excel.</w:t>
             </w:r>
           </w:p>
           <w:p>
@@ -10153,7 +10131,7 @@
                 <w:sz w:val="19"/>
                 <w:szCs w:val="19"/>
               </w:rPr>
-              <w:t xml:space="preserve">The new password works. Nobody else can see it. HR receives a notice that you changed it (not the password).</w:t>
+              <w:t xml:space="preserve">SRP comes from the platform price list with centavos. Fees use the rates under Platform fee rates used. The same platform and weight is filled in next time.</w:t>
             </w:r>
           </w:p>
         </w:tc>
@@ -10319,7 +10297,7 @@
                 <w:sz w:val="16"/>
                 <w:szCs w:val="16"/>
               </w:rPr>
-              <w:t xml:space="preserve">AD-31</w:t>
+              <w:t xml:space="preserve">AD-30</w:t>
             </w:r>
           </w:p>
         </w:tc>
@@ -10352,23 +10330,7 @@
                 <w:sz w:val="20"/>
                 <w:szCs w:val="20"/>
               </w:rPr>
-              <w:t xml:space="preserve">Decide a shipping-charge change</w:t>
-            </w:r>
-          </w:p>
-          <w:p>
-            <w:pPr>
-              <w:spacing w:after="40" w:before="0" w:line="264"/>
-            </w:pPr>
-            <w:r>
-              <w:rPr>
-                <w:rFonts w:ascii="Arial" w:cs="Arial" w:eastAsia="Arial" w:hAnsi="Arial"/>
-                <w:i/>
-                <w:iCs/>
-                <w:color w:val="5B6477"/>
-                <w:sz w:val="15"/>
-                <w:szCs w:val="15"/>
-              </w:rPr>
-              <w:t xml:space="preserve">Flow F26 · Sale to a franchise with shipping to follow</w:t>
+              <w:t xml:space="preserve">Change your own password</w:t>
             </w:r>
           </w:p>
           <w:p>
@@ -10390,7 +10352,51 @@
                 <w:sz w:val="19"/>
                 <w:szCs w:val="19"/>
               </w:rPr>
-              <w:t xml:space="preserve">My Approvals → Franchise shipping charge → read the reason and the new amount (or the new date) → Approve, or Reject with a reason.</w:t>
+              <w:t xml:space="preserve">Press the key icon at the top right (Change my password).</w:t>
+            </w:r>
+          </w:p>
+          <w:p>
+            <w:pPr>
+              <w:spacing w:after="20" w:before="0" w:line="264"/>
+            </w:pPr>
+            <w:r>
+              <w:rPr>
+                <w:rFonts w:ascii="Arial" w:cs="Arial" w:eastAsia="Arial" w:hAnsi="Arial"/>
+                <w:color w:val="5B6477"/>
+                <w:sz w:val="19"/>
+                <w:szCs w:val="19"/>
+              </w:rPr>
+              <w:t xml:space="preserve">2.  </w:t>
+            </w:r>
+            <w:r>
+              <w:rPr>
+                <w:rFonts w:ascii="Arial" w:cs="Arial" w:eastAsia="Arial" w:hAnsi="Arial"/>
+                <w:sz w:val="19"/>
+                <w:szCs w:val="19"/>
+              </w:rPr>
+              <w:t xml:space="preserve">Type the current password and a new one of 10 or more characters, twice → Change password.</w:t>
+            </w:r>
+          </w:p>
+          <w:p>
+            <w:pPr>
+              <w:spacing w:after="20" w:before="0" w:line="264"/>
+            </w:pPr>
+            <w:r>
+              <w:rPr>
+                <w:rFonts w:ascii="Arial" w:cs="Arial" w:eastAsia="Arial" w:hAnsi="Arial"/>
+                <w:color w:val="5B6477"/>
+                <w:sz w:val="19"/>
+                <w:szCs w:val="19"/>
+              </w:rPr>
+              <w:t xml:space="preserve">3.  </w:t>
+            </w:r>
+            <w:r>
+              <w:rPr>
+                <w:rFonts w:ascii="Arial" w:cs="Arial" w:eastAsia="Arial" w:hAnsi="Arial"/>
+                <w:sz w:val="19"/>
+                <w:szCs w:val="19"/>
+              </w:rPr>
+              <w:t xml:space="preserve">Sign out and sign in again with the new password. Then change it back to ChangeMe!2026 for the next tester.</w:t>
             </w:r>
           </w:p>
           <w:p>
@@ -10414,7 +10420,7 @@
                 <w:sz w:val="19"/>
                 <w:szCs w:val="19"/>
               </w:rPr>
-              <w:t xml:space="preserve">Approve: the franchise invoice changes by the difference and everyone involved is told. Reject: nothing changes and the Coordinator is told.</w:t>
+              <w:t xml:space="preserve">The new password works. Nobody else can see it. HR receives a notice that you changed it (not the password).</w:t>
             </w:r>
           </w:p>
         </w:tc>
@@ -10580,7 +10586,7 @@
                 <w:sz w:val="16"/>
                 <w:szCs w:val="16"/>
               </w:rPr>
-              <w:t xml:space="preserve">AD-32</w:t>
+              <w:t xml:space="preserve">AD-31</w:t>
             </w:r>
           </w:p>
         </w:tc>
@@ -10613,7 +10619,23 @@
                 <w:sz w:val="20"/>
                 <w:szCs w:val="20"/>
               </w:rPr>
-              <w:t xml:space="preserve">Search the users</w:t>
+              <w:t xml:space="preserve">Decide a shipping-charge change</w:t>
+            </w:r>
+          </w:p>
+          <w:p>
+            <w:pPr>
+              <w:spacing w:after="40" w:before="0" w:line="264"/>
+            </w:pPr>
+            <w:r>
+              <w:rPr>
+                <w:rFonts w:ascii="Arial" w:cs="Arial" w:eastAsia="Arial" w:hAnsi="Arial"/>
+                <w:i/>
+                <w:iCs/>
+                <w:color w:val="5B6477"/>
+                <w:sz w:val="15"/>
+                <w:szCs w:val="15"/>
+              </w:rPr>
+              <w:t xml:space="preserve">Flow F26 · Sale to a franchise with shipping to follow</w:t>
             </w:r>
           </w:p>
           <w:p>
@@ -10635,7 +10657,7 @@
                 <w:sz w:val="19"/>
                 <w:szCs w:val="19"/>
               </w:rPr>
-              <w:t xml:space="preserve">Users &amp; Roles → type part of a name, a role or a branch in the search box.</w:t>
+              <w:t xml:space="preserve">My Approvals → Franchise shipping charge → read the reason and the new amount (or the new date) → Approve, or Reject with a reason.</w:t>
             </w:r>
           </w:p>
           <w:p>
@@ -10659,7 +10681,7 @@
                 <w:sz w:val="19"/>
                 <w:szCs w:val="19"/>
               </w:rPr>
-              <w:t xml:space="preserve">The list narrows as you type; the count shows "x of y users".</w:t>
+              <w:t xml:space="preserve">Approve: the franchise invoice changes by the difference and everyone involved is told. Reject: nothing changes and the Coordinator is told.</w:t>
             </w:r>
           </w:p>
         </w:tc>
@@ -10825,7 +10847,7 @@
                 <w:sz w:val="16"/>
                 <w:szCs w:val="16"/>
               </w:rPr>
-              <w:t xml:space="preserve">AD-33</w:t>
+              <w:t xml:space="preserve">AD-32</w:t>
             </w:r>
           </w:p>
         </w:tc>
@@ -10858,23 +10880,7 @@
                 <w:sz w:val="20"/>
                 <w:szCs w:val="20"/>
               </w:rPr>
-              <w:t xml:space="preserve">Notified of tickets and give-outs</w:t>
-            </w:r>
-          </w:p>
-          <w:p>
-            <w:pPr>
-              <w:spacing w:after="40" w:before="0" w:line="264"/>
-            </w:pPr>
-            <w:r>
-              <w:rPr>
-                <w:rFonts w:ascii="Arial" w:cs="Arial" w:eastAsia="Arial" w:hAnsi="Arial"/>
-                <w:i/>
-                <w:iCs/>
-                <w:color w:val="5B6477"/>
-                <w:sz w:val="15"/>
-                <w:szCs w:val="15"/>
-              </w:rPr>
-              <w:t xml:space="preserve">Flow F27 · Customer return and replacement ticket</w:t>
+              <w:t xml:space="preserve">Search the users</w:t>
             </w:r>
           </w:p>
           <w:p>
@@ -10896,7 +10902,7 @@
                 <w:sz w:val="19"/>
                 <w:szCs w:val="19"/>
               </w:rPr>
-              <w:t xml:space="preserve">Open Notifications after a ticket or a marketing pull-out.</w:t>
+              <w:t xml:space="preserve">Users &amp; Roles → type part of a name, a role or a branch in the search box.</w:t>
             </w:r>
           </w:p>
           <w:p>
@@ -10920,7 +10926,7 @@
                 <w:sz w:val="19"/>
                 <w:szCs w:val="19"/>
               </w:rPr>
-              <w:t xml:space="preserve">You are told at each step and may decide anything the Head Auditor decides.</w:t>
+              <w:t xml:space="preserve">The list narrows as you type; the count shows "x of y users".</w:t>
             </w:r>
           </w:p>
         </w:tc>
@@ -11086,7 +11092,7 @@
                 <w:sz w:val="16"/>
                 <w:szCs w:val="16"/>
               </w:rPr>
-              <w:t xml:space="preserve">AD-34</w:t>
+              <w:t xml:space="preserve">AD-33</w:t>
             </w:r>
           </w:p>
         </w:tc>
@@ -11119,7 +11125,7 @@
                 <w:sz w:val="20"/>
                 <w:szCs w:val="20"/>
               </w:rPr>
-              <w:t xml:space="preserve">Approve a consignment maximum</w:t>
+              <w:t xml:space="preserve">Notified of tickets and give-outs</w:t>
             </w:r>
           </w:p>
           <w:p>
@@ -11135,7 +11141,7 @@
                 <w:sz w:val="15"/>
                 <w:szCs w:val="15"/>
               </w:rPr>
-              <w:t xml:space="preserve">Flow F31 · Agent field work: outlets, itineraries and consignment maximums</w:t>
+              <w:t xml:space="preserve">Flow F27 · Customer return and replacement ticket</w:t>
             </w:r>
           </w:p>
           <w:p>
@@ -11157,7 +11163,7 @@
                 <w:sz w:val="19"/>
                 <w:szCs w:val="19"/>
               </w:rPr>
-              <w:t xml:space="preserve">My Approvals → Maximum consignment for an agent / outlet → Approve.</w:t>
+              <w:t xml:space="preserve">Open Notifications after a ticket or a marketing pull-out.</w:t>
             </w:r>
           </w:p>
           <w:p>
@@ -11181,7 +11187,7 @@
                 <w:sz w:val="19"/>
                 <w:szCs w:val="19"/>
               </w:rPr>
-              <w:t xml:space="preserve">The Sales Manager and the agent are told. The next consignment is checked against it.</w:t>
+              <w:t xml:space="preserve">You are told at each step and may decide anything the Head Auditor decides.</w:t>
             </w:r>
           </w:p>
         </w:tc>
@@ -11347,7 +11353,7 @@
                 <w:sz w:val="16"/>
                 <w:szCs w:val="16"/>
               </w:rPr>
-              <w:t xml:space="preserve">AD-35</w:t>
+              <w:t xml:space="preserve">AD-34</w:t>
             </w:r>
           </w:p>
         </w:tc>
@@ -11380,7 +11386,7 @@
                 <w:sz w:val="20"/>
                 <w:szCs w:val="20"/>
               </w:rPr>
-              <w:t xml:space="preserve">Approve removal of an outlet</w:t>
+              <w:t xml:space="preserve">Approve a consignment maximum</w:t>
             </w:r>
           </w:p>
           <w:p>
@@ -11418,7 +11424,7 @@
                 <w:sz w:val="19"/>
                 <w:szCs w:val="19"/>
               </w:rPr>
-              <w:t xml:space="preserve">My Approvals → Remove an outlet → Approve.</w:t>
+              <w:t xml:space="preserve">My Approvals → Maximum consignment for an agent / outlet → Approve.</w:t>
             </w:r>
           </w:p>
           <w:p>
@@ -11442,7 +11448,7 @@
                 <w:sz w:val="19"/>
                 <w:szCs w:val="19"/>
               </w:rPr>
-              <w:t xml:space="preserve">The outlet leaves the database; the Sales Manager and the agent are told.</w:t>
+              <w:t xml:space="preserve">The Sales Manager and the agent are told. The next consignment is checked against it.</w:t>
             </w:r>
           </w:p>
         </w:tc>
@@ -11608,7 +11614,7 @@
                 <w:sz w:val="16"/>
                 <w:szCs w:val="16"/>
               </w:rPr>
-              <w:t xml:space="preserve">AD-36</w:t>
+              <w:t xml:space="preserve">AD-35</w:t>
             </w:r>
           </w:p>
         </w:tc>
@@ -11641,7 +11647,7 @@
                 <w:sz w:val="20"/>
                 <w:szCs w:val="20"/>
               </w:rPr>
-              <w:t xml:space="preserve">Notified of outlet changes</w:t>
+              <w:t xml:space="preserve">Approve removal of an outlet</w:t>
             </w:r>
           </w:p>
           <w:p>
@@ -11679,7 +11685,7 @@
                 <w:sz w:val="19"/>
                 <w:szCs w:val="19"/>
               </w:rPr>
-              <w:t xml:space="preserve">Open Notifications after the Sales Manager approves a change, moves or shares an outlet.</w:t>
+              <w:t xml:space="preserve">My Approvals → Remove an outlet → Approve.</w:t>
             </w:r>
           </w:p>
           <w:p>
@@ -11703,7 +11709,7 @@
                 <w:sz w:val="19"/>
                 <w:szCs w:val="19"/>
               </w:rPr>
-              <w:t xml:space="preserve">Each change is listed with what changed (old → new) and who approved it.</w:t>
+              <w:t xml:space="preserve">The outlet leaves the database; the Sales Manager and the agent are told.</w:t>
             </w:r>
           </w:p>
         </w:tc>
@@ -11869,7 +11875,7 @@
                 <w:sz w:val="16"/>
                 <w:szCs w:val="16"/>
               </w:rPr>
-              <w:t xml:space="preserve">AD-37</w:t>
+              <w:t xml:space="preserve">AD-36</w:t>
             </w:r>
           </w:p>
         </w:tc>
@@ -11902,7 +11908,7 @@
                 <w:sz w:val="20"/>
                 <w:szCs w:val="20"/>
               </w:rPr>
-              <w:t xml:space="preserve">Issue a promo to the franchises</w:t>
+              <w:t xml:space="preserve">Notified of outlet changes</w:t>
             </w:r>
           </w:p>
           <w:p>
@@ -11918,7 +11924,7 @@
                 <w:sz w:val="15"/>
                 <w:szCs w:val="15"/>
               </w:rPr>
-              <w:t xml:space="preserve">Flow F34 · Customer Service: birthdays, restock due, results with reasons, and promos</w:t>
+              <w:t xml:space="preserve">Flow F31 · Agent field work: outlets, itineraries and consignment maximums</w:t>
             </w:r>
           </w:p>
           <w:p>
@@ -11940,7 +11946,7 @@
                 <w:sz w:val="19"/>
                 <w:szCs w:val="19"/>
               </w:rPr>
-              <w:t xml:space="preserve">Promos → Issue it to Franchises only → fill in → Issue promo and send memo.</w:t>
+              <w:t xml:space="preserve">Open Notifications after the Sales Manager approves a change, moves or shares an outlet.</w:t>
             </w:r>
           </w:p>
           <w:p>
@@ -11964,7 +11970,7 @@
                 <w:sz w:val="19"/>
                 <w:szCs w:val="19"/>
               </w:rPr>
-              <w:t xml:space="preserve">Franchise owners, franchise associates and the Franchise Coordinators get the memo and notice. Branch staff do not see it.</w:t>
+              <w:t xml:space="preserve">Each change is listed with what changed (old → new) and who approved it.</w:t>
             </w:r>
           </w:p>
         </w:tc>
@@ -12130,7 +12136,7 @@
                 <w:sz w:val="16"/>
                 <w:szCs w:val="16"/>
               </w:rPr>
-              <w:t xml:space="preserve">AD-PO</w:t>
+              <w:t xml:space="preserve">AD-37</w:t>
             </w:r>
           </w:p>
         </w:tc>
@@ -12163,7 +12169,7 @@
                 <w:sz w:val="20"/>
                 <w:szCs w:val="20"/>
               </w:rPr>
-              <w:t xml:space="preserve">Approve a purchase order and ask for the transfers</w:t>
+              <w:t xml:space="preserve">Issue a promo to the franchises</w:t>
             </w:r>
           </w:p>
           <w:p>
@@ -12179,7 +12185,7 @@
                 <w:sz w:val="15"/>
                 <w:szCs w:val="15"/>
               </w:rPr>
-              <w:t xml:space="preserve">Flow F36 · Restock request and purchase orders</w:t>
+              <w:t xml:space="preserve">Flow F34 · Customer Service: birthdays, restock due, results with reasons, and promos</w:t>
             </w:r>
           </w:p>
           <w:p>
@@ -12201,73 +12207,7 @@
                 <w:sz w:val="19"/>
                 <w:szCs w:val="19"/>
               </w:rPr>
-              <w:t xml:space="preserve">My Approvals → the purchase order (or Restock &amp; Purchase Orders → open it).</w:t>
-            </w:r>
-          </w:p>
-          <w:p>
-            <w:pPr>
-              <w:spacing w:after="20" w:before="0" w:line="264"/>
-            </w:pPr>
-            <w:r>
-              <w:rPr>
-                <w:rFonts w:ascii="Arial" w:cs="Arial" w:eastAsia="Arial" w:hAnsi="Arial"/>
-                <w:color w:val="5B6477"/>
-                <w:sz w:val="19"/>
-                <w:szCs w:val="19"/>
-              </w:rPr>
-              <w:t xml:space="preserve">2.  </w:t>
-            </w:r>
-            <w:r>
-              <w:rPr>
-                <w:rFonts w:ascii="Arial" w:cs="Arial" w:eastAsia="Arial" w:hAnsi="Arial"/>
-                <w:sz w:val="19"/>
-                <w:szCs w:val="19"/>
-              </w:rPr>
-              <w:t xml:space="preserve">Change a quantity if you wish → Approve.</w:t>
-            </w:r>
-          </w:p>
-          <w:p>
-            <w:pPr>
-              <w:spacing w:after="20" w:before="0" w:line="264"/>
-            </w:pPr>
-            <w:r>
-              <w:rPr>
-                <w:rFonts w:ascii="Arial" w:cs="Arial" w:eastAsia="Arial" w:hAnsi="Arial"/>
-                <w:color w:val="5B6477"/>
-                <w:sz w:val="19"/>
-                <w:szCs w:val="19"/>
-              </w:rPr>
-              <w:t xml:space="preserve">3.  </w:t>
-            </w:r>
-            <w:r>
-              <w:rPr>
-                <w:rFonts w:ascii="Arial" w:cs="Arial" w:eastAsia="Arial" w:hAnsi="Arial"/>
-                <w:sz w:val="19"/>
-                <w:szCs w:val="19"/>
-              </w:rPr>
-              <w:t xml:space="preserve">Press Ask the Head Auditor to make the transfers.</w:t>
-            </w:r>
-          </w:p>
-          <w:p>
-            <w:pPr>
-              <w:spacing w:after="20" w:before="0" w:line="264"/>
-            </w:pPr>
-            <w:r>
-              <w:rPr>
-                <w:rFonts w:ascii="Arial" w:cs="Arial" w:eastAsia="Arial" w:hAnsi="Arial"/>
-                <w:color w:val="5B6477"/>
-                <w:sz w:val="19"/>
-                <w:szCs w:val="19"/>
-              </w:rPr>
-              <w:t xml:space="preserve">4.  </w:t>
-            </w:r>
-            <w:r>
-              <w:rPr>
-                <w:rFonts w:ascii="Arial" w:cs="Arial" w:eastAsia="Arial" w:hAnsi="Arial"/>
-                <w:sz w:val="19"/>
-                <w:szCs w:val="19"/>
-              </w:rPr>
-              <w:t xml:space="preserve">Mark as sent to the supplier with an expected date.</w:t>
+              <w:t xml:space="preserve">Promos → Issue it to Franchises only → fill in → Issue promo and send memo.</w:t>
             </w:r>
           </w:p>
           <w:p>
@@ -12291,7 +12231,7 @@
                 <w:sz w:val="19"/>
                 <w:szCs w:val="19"/>
               </w:rPr>
-              <w:t xml:space="preserve">The Head Auditor, the Warehouse In-Charge and the branches are notified. The order shows Sent with the expected date.</w:t>
+              <w:t xml:space="preserve">Franchise owners, franchise associates and the Franchise Coordinators get the memo and notice. Branch staff do not see it.</w:t>
             </w:r>
           </w:p>
         </w:tc>
@@ -12457,7 +12397,7 @@
                 <w:sz w:val="16"/>
                 <w:szCs w:val="16"/>
               </w:rPr>
-              <w:t xml:space="preserve">AD-ID</w:t>
+              <w:t xml:space="preserve">AD-PO</w:t>
             </w:r>
           </w:p>
         </w:tc>
@@ -12490,7 +12430,7 @@
                 <w:sz w:val="20"/>
                 <w:szCs w:val="20"/>
               </w:rPr>
-              <w:t xml:space="preserve">Approve a staff ID number change</w:t>
+              <w:t xml:space="preserve">Approve a purchase order and ask for the transfers</w:t>
             </w:r>
           </w:p>
           <w:p>
@@ -12506,7 +12446,7 @@
                 <w:sz w:val="15"/>
                 <w:szCs w:val="15"/>
               </w:rPr>
-              <w:t xml:space="preserve">Flow F44 · HR: NTE, memo to an employee, employee page, contributions</w:t>
+              <w:t xml:space="preserve">Flow F36 · Restock request and purchase orders</w:t>
             </w:r>
           </w:p>
           <w:p>
@@ -12528,7 +12468,73 @@
                 <w:sz w:val="19"/>
                 <w:szCs w:val="19"/>
               </w:rPr>
-              <w:t xml:space="preserve">My Approvals → Staff ID number change → read the old and new number and the reason → Approve.</w:t>
+              <w:t xml:space="preserve">My Approvals → the purchase order (or Restock &amp; Purchase Orders → open it).</w:t>
+            </w:r>
+          </w:p>
+          <w:p>
+            <w:pPr>
+              <w:spacing w:after="20" w:before="0" w:line="264"/>
+            </w:pPr>
+            <w:r>
+              <w:rPr>
+                <w:rFonts w:ascii="Arial" w:cs="Arial" w:eastAsia="Arial" w:hAnsi="Arial"/>
+                <w:color w:val="5B6477"/>
+                <w:sz w:val="19"/>
+                <w:szCs w:val="19"/>
+              </w:rPr>
+              <w:t xml:space="preserve">2.  </w:t>
+            </w:r>
+            <w:r>
+              <w:rPr>
+                <w:rFonts w:ascii="Arial" w:cs="Arial" w:eastAsia="Arial" w:hAnsi="Arial"/>
+                <w:sz w:val="19"/>
+                <w:szCs w:val="19"/>
+              </w:rPr>
+              <w:t xml:space="preserve">Change a quantity if you wish → Approve.</w:t>
+            </w:r>
+          </w:p>
+          <w:p>
+            <w:pPr>
+              <w:spacing w:after="20" w:before="0" w:line="264"/>
+            </w:pPr>
+            <w:r>
+              <w:rPr>
+                <w:rFonts w:ascii="Arial" w:cs="Arial" w:eastAsia="Arial" w:hAnsi="Arial"/>
+                <w:color w:val="5B6477"/>
+                <w:sz w:val="19"/>
+                <w:szCs w:val="19"/>
+              </w:rPr>
+              <w:t xml:space="preserve">3.  </w:t>
+            </w:r>
+            <w:r>
+              <w:rPr>
+                <w:rFonts w:ascii="Arial" w:cs="Arial" w:eastAsia="Arial" w:hAnsi="Arial"/>
+                <w:sz w:val="19"/>
+                <w:szCs w:val="19"/>
+              </w:rPr>
+              <w:t xml:space="preserve">Press Ask the Head Auditor to make the transfers.</w:t>
+            </w:r>
+          </w:p>
+          <w:p>
+            <w:pPr>
+              <w:spacing w:after="20" w:before="0" w:line="264"/>
+            </w:pPr>
+            <w:r>
+              <w:rPr>
+                <w:rFonts w:ascii="Arial" w:cs="Arial" w:eastAsia="Arial" w:hAnsi="Arial"/>
+                <w:color w:val="5B6477"/>
+                <w:sz w:val="19"/>
+                <w:szCs w:val="19"/>
+              </w:rPr>
+              <w:t xml:space="preserve">4.  </w:t>
+            </w:r>
+            <w:r>
+              <w:rPr>
+                <w:rFonts w:ascii="Arial" w:cs="Arial" w:eastAsia="Arial" w:hAnsi="Arial"/>
+                <w:sz w:val="19"/>
+                <w:szCs w:val="19"/>
+              </w:rPr>
+              <w:t xml:space="preserve">Mark as sent to the supplier with an expected date.</w:t>
             </w:r>
           </w:p>
           <w:p>
@@ -12552,7 +12558,7 @@
                 <w:sz w:val="19"/>
                 <w:szCs w:val="19"/>
               </w:rPr>
-              <w:t xml:space="preserve">The staff ID and the login Company ID of that employee change. A number used by someone else is refused.</w:t>
+              <w:t xml:space="preserve">The Head Auditor, the Warehouse In-Charge and the branches are notified. The order shows Sent with the expected date.</w:t>
             </w:r>
           </w:p>
         </w:tc>
@@ -12718,7 +12724,7 @@
                 <w:sz w:val="16"/>
                 <w:szCs w:val="16"/>
               </w:rPr>
-              <w:t xml:space="preserve">AD-NAM</w:t>
+              <w:t xml:space="preserve">AD-ID</w:t>
             </w:r>
           </w:p>
         </w:tc>
@@ -12751,7 +12757,7 @@
                 <w:sz w:val="20"/>
                 <w:szCs w:val="20"/>
               </w:rPr>
-              <w:t xml:space="preserve">Approve HR's names and edits</w:t>
+              <w:t xml:space="preserve">Approve a staff ID number change</w:t>
             </w:r>
           </w:p>
           <w:p>
@@ -12767,6 +12773,267 @@
                 <w:sz w:val="15"/>
                 <w:szCs w:val="15"/>
               </w:rPr>
+              <w:t xml:space="preserve">Flow F44 · HR: NTE, memo to an employee, employee page, contributions</w:t>
+            </w:r>
+          </w:p>
+          <w:p>
+            <w:pPr>
+              <w:spacing w:after="20" w:before="0" w:line="264"/>
+            </w:pPr>
+            <w:r>
+              <w:rPr>
+                <w:rFonts w:ascii="Arial" w:cs="Arial" w:eastAsia="Arial" w:hAnsi="Arial"/>
+                <w:color w:val="5B6477"/>
+                <w:sz w:val="19"/>
+                <w:szCs w:val="19"/>
+              </w:rPr>
+              <w:t xml:space="preserve">1.  </w:t>
+            </w:r>
+            <w:r>
+              <w:rPr>
+                <w:rFonts w:ascii="Arial" w:cs="Arial" w:eastAsia="Arial" w:hAnsi="Arial"/>
+                <w:sz w:val="19"/>
+                <w:szCs w:val="19"/>
+              </w:rPr>
+              <w:t xml:space="preserve">My Approvals → Staff ID number change → read the old and new number and the reason → Approve.</w:t>
+            </w:r>
+          </w:p>
+          <w:p>
+            <w:pPr>
+              <w:spacing w:after="0" w:before="60" w:line="264"/>
+            </w:pPr>
+            <w:r>
+              <w:rPr>
+                <w:rFonts w:ascii="Arial" w:cs="Arial" w:eastAsia="Arial" w:hAnsi="Arial"/>
+                <w:b/>
+                <w:bCs/>
+                <w:color w:val="0B1F3A"/>
+                <w:sz w:val="19"/>
+                <w:szCs w:val="19"/>
+              </w:rPr>
+              <w:t xml:space="preserve">You should see: </w:t>
+            </w:r>
+            <w:r>
+              <w:rPr>
+                <w:rFonts w:ascii="Arial" w:cs="Arial" w:eastAsia="Arial" w:hAnsi="Arial"/>
+                <w:sz w:val="19"/>
+                <w:szCs w:val="19"/>
+              </w:rPr>
+              <w:t xml:space="preserve">The staff ID and the login Company ID of that employee change. A number used by someone else is refused.</w:t>
+            </w:r>
+          </w:p>
+        </w:tc>
+        <w:tc>
+          <w:tcPr>
+            <w:tcW w:type="dxa" w:w="620"/>
+            <w:tcBorders>
+              <w:top w:val="single" w:color="C9D0DC" w:sz="4"/>
+              <w:left w:val="single" w:color="C9D0DC" w:sz="4"/>
+              <w:bottom w:val="single" w:color="C9D0DC" w:sz="4"/>
+              <w:right w:val="single" w:color="C9D0DC" w:sz="4"/>
+            </w:tcBorders>
+            <w:tcMar>
+              <w:top w:type="dxa" w:w="70"/>
+              <w:left w:type="dxa" w:w="100"/>
+              <w:bottom w:type="dxa" w:w="70"/>
+              <w:right w:type="dxa" w:w="100"/>
+            </w:tcMar>
+            <w:vAlign w:val="center"/>
+          </w:tcPr>
+          <w:p>
+            <w:pPr>
+              <w:spacing w:after="0" w:before="0" w:line="264"/>
+              <w:jc w:val="center"/>
+            </w:pPr>
+            <w:r>
+              <w:rPr>
+                <w:rFonts w:ascii="Arial" w:cs="Arial" w:eastAsia="Arial" w:hAnsi="Arial"/>
+                <w:sz w:val="30"/>
+                <w:szCs w:val="30"/>
+              </w:rPr>
+              <w:t xml:space="preserve">☐</w:t>
+            </w:r>
+          </w:p>
+        </w:tc>
+        <w:tc>
+          <w:tcPr>
+            <w:tcW w:type="dxa" w:w="620"/>
+            <w:tcBorders>
+              <w:top w:val="single" w:color="C9D0DC" w:sz="4"/>
+              <w:left w:val="single" w:color="C9D0DC" w:sz="4"/>
+              <w:bottom w:val="single" w:color="C9D0DC" w:sz="4"/>
+              <w:right w:val="single" w:color="C9D0DC" w:sz="4"/>
+            </w:tcBorders>
+            <w:tcMar>
+              <w:top w:type="dxa" w:w="70"/>
+              <w:left w:type="dxa" w:w="100"/>
+              <w:bottom w:type="dxa" w:w="70"/>
+              <w:right w:type="dxa" w:w="100"/>
+            </w:tcMar>
+            <w:vAlign w:val="center"/>
+          </w:tcPr>
+          <w:p>
+            <w:pPr>
+              <w:spacing w:after="0" w:before="0" w:line="264"/>
+              <w:jc w:val="center"/>
+            </w:pPr>
+            <w:r>
+              <w:rPr>
+                <w:rFonts w:ascii="Arial" w:cs="Arial" w:eastAsia="Arial" w:hAnsi="Arial"/>
+                <w:sz w:val="30"/>
+                <w:szCs w:val="30"/>
+              </w:rPr>
+              <w:t xml:space="preserve">☐</w:t>
+            </w:r>
+          </w:p>
+        </w:tc>
+        <w:tc>
+          <w:tcPr>
+            <w:tcW w:type="dxa" w:w="620"/>
+            <w:tcBorders>
+              <w:top w:val="single" w:color="C9D0DC" w:sz="4"/>
+              <w:left w:val="single" w:color="C9D0DC" w:sz="4"/>
+              <w:bottom w:val="single" w:color="C9D0DC" w:sz="4"/>
+              <w:right w:val="single" w:color="C9D0DC" w:sz="4"/>
+            </w:tcBorders>
+            <w:tcMar>
+              <w:top w:type="dxa" w:w="70"/>
+              <w:left w:type="dxa" w:w="100"/>
+              <w:bottom w:type="dxa" w:w="70"/>
+              <w:right w:type="dxa" w:w="100"/>
+            </w:tcMar>
+            <w:vAlign w:val="center"/>
+          </w:tcPr>
+          <w:p>
+            <w:pPr>
+              <w:spacing w:after="0" w:before="0" w:line="264"/>
+              <w:jc w:val="center"/>
+            </w:pPr>
+            <w:r>
+              <w:rPr>
+                <w:rFonts w:ascii="Arial" w:cs="Arial" w:eastAsia="Arial" w:hAnsi="Arial"/>
+                <w:sz w:val="30"/>
+                <w:szCs w:val="30"/>
+              </w:rPr>
+              <w:t xml:space="preserve">☐</w:t>
+            </w:r>
+          </w:p>
+        </w:tc>
+        <w:tc>
+          <w:tcPr>
+            <w:tcW w:type="dxa" w:w="2040"/>
+            <w:tcBorders>
+              <w:top w:val="single" w:color="C9D0DC" w:sz="4"/>
+              <w:left w:val="single" w:color="C9D0DC" w:sz="4"/>
+              <w:bottom w:val="single" w:color="C9D0DC" w:sz="4"/>
+              <w:right w:val="single" w:color="C9D0DC" w:sz="4"/>
+            </w:tcBorders>
+            <w:tcMar>
+              <w:top w:type="dxa" w:w="70"/>
+              <w:left w:type="dxa" w:w="100"/>
+              <w:bottom w:type="dxa" w:w="70"/>
+              <w:right w:type="dxa" w:w="100"/>
+            </w:tcMar>
+            <w:vAlign w:val="top"/>
+          </w:tcPr>
+          <w:p>
+            <w:pPr>
+              <w:spacing w:after="0" w:before="0" w:line="264"/>
+            </w:pPr>
+            <w:r>
+              <w:rPr>
+                <w:rFonts w:ascii="Arial" w:cs="Arial" w:eastAsia="Arial" w:hAnsi="Arial"/>
+                <w:sz w:val="19"/>
+                <w:szCs w:val="19"/>
+              </w:rPr>
+              <w:t xml:space="preserve"> </w:t>
+            </w:r>
+          </w:p>
+        </w:tc>
+      </w:tr>
+      <w:tr>
+        <w:trPr>
+          <w:cantSplit/>
+        </w:trPr>
+        <w:tc>
+          <w:tcPr>
+            <w:tcW w:type="dxa" w:w="860"/>
+            <w:tcBorders>
+              <w:top w:val="single" w:color="C9D0DC" w:sz="4"/>
+              <w:left w:val="single" w:color="C9D0DC" w:sz="4"/>
+              <w:bottom w:val="single" w:color="C9D0DC" w:sz="4"/>
+              <w:right w:val="single" w:color="C9D0DC" w:sz="4"/>
+            </w:tcBorders>
+            <w:tcMar>
+              <w:top w:type="dxa" w:w="70"/>
+              <w:left w:type="dxa" w:w="100"/>
+              <w:bottom w:type="dxa" w:w="70"/>
+              <w:right w:type="dxa" w:w="100"/>
+            </w:tcMar>
+            <w:vAlign w:val="top"/>
+          </w:tcPr>
+          <w:p>
+            <w:pPr>
+              <w:spacing w:after="0" w:before="0" w:line="264"/>
+            </w:pPr>
+            <w:r>
+              <w:rPr>
+                <w:rFonts w:ascii="Arial" w:cs="Arial" w:eastAsia="Arial" w:hAnsi="Arial"/>
+                <w:b/>
+                <w:bCs/>
+                <w:color w:val="5B6477"/>
+                <w:sz w:val="16"/>
+                <w:szCs w:val="16"/>
+              </w:rPr>
+              <w:t xml:space="preserve">AD-NAM</w:t>
+            </w:r>
+          </w:p>
+        </w:tc>
+        <w:tc>
+          <w:tcPr>
+            <w:tcW w:type="dxa" w:w="5480"/>
+            <w:tcBorders>
+              <w:top w:val="single" w:color="C9D0DC" w:sz="4"/>
+              <w:left w:val="single" w:color="C9D0DC" w:sz="4"/>
+              <w:bottom w:val="single" w:color="C9D0DC" w:sz="4"/>
+              <w:right w:val="single" w:color="C9D0DC" w:sz="4"/>
+            </w:tcBorders>
+            <w:tcMar>
+              <w:top w:type="dxa" w:w="70"/>
+              <w:left w:type="dxa" w:w="100"/>
+              <w:bottom w:type="dxa" w:w="70"/>
+              <w:right w:type="dxa" w:w="100"/>
+            </w:tcMar>
+            <w:vAlign w:val="top"/>
+          </w:tcPr>
+          <w:p>
+            <w:pPr>
+              <w:spacing w:after="40" w:before="0" w:line="264"/>
+            </w:pPr>
+            <w:r>
+              <w:rPr>
+                <w:rFonts w:ascii="Arial" w:cs="Arial" w:eastAsia="Arial" w:hAnsi="Arial"/>
+                <w:b/>
+                <w:bCs/>
+                <w:sz w:val="20"/>
+                <w:szCs w:val="20"/>
+              </w:rPr>
+              <w:t xml:space="preserve">Approve HR's names and edits</w:t>
+            </w:r>
+          </w:p>
+          <w:p>
+            <w:pPr>
+              <w:spacing w:after="40" w:before="0" w:line="264"/>
+            </w:pPr>
+            <w:r>
+              <w:rPr>
+                <w:rFonts w:ascii="Arial" w:cs="Arial" w:eastAsia="Arial" w:hAnsi="Arial"/>
+                <w:i/>
+                <w:iCs/>
+                <w:color w:val="5B6477"/>
+                <w:sz w:val="15"/>
+                <w:szCs w:val="15"/>
+              </w:rPr>
               <w:t xml:space="preserve">Flow F45 · HR: owner-approved names, draft NTE from notices, charge links</w:t>
             </w:r>
           </w:p>
@@ -12814,6 +13081,267 @@
                 <w:szCs w:val="19"/>
               </w:rPr>
               <w:t xml:space="preserve">The employees are created with their numbers (or the change is applied and the login name follows). Your own edit applies at once.</w:t>
+            </w:r>
+          </w:p>
+        </w:tc>
+        <w:tc>
+          <w:tcPr>
+            <w:tcW w:type="dxa" w:w="620"/>
+            <w:tcBorders>
+              <w:top w:val="single" w:color="C9D0DC" w:sz="4"/>
+              <w:left w:val="single" w:color="C9D0DC" w:sz="4"/>
+              <w:bottom w:val="single" w:color="C9D0DC" w:sz="4"/>
+              <w:right w:val="single" w:color="C9D0DC" w:sz="4"/>
+            </w:tcBorders>
+            <w:tcMar>
+              <w:top w:type="dxa" w:w="70"/>
+              <w:left w:type="dxa" w:w="100"/>
+              <w:bottom w:type="dxa" w:w="70"/>
+              <w:right w:type="dxa" w:w="100"/>
+            </w:tcMar>
+            <w:vAlign w:val="center"/>
+          </w:tcPr>
+          <w:p>
+            <w:pPr>
+              <w:spacing w:after="0" w:before="0" w:line="264"/>
+              <w:jc w:val="center"/>
+            </w:pPr>
+            <w:r>
+              <w:rPr>
+                <w:rFonts w:ascii="Arial" w:cs="Arial" w:eastAsia="Arial" w:hAnsi="Arial"/>
+                <w:sz w:val="30"/>
+                <w:szCs w:val="30"/>
+              </w:rPr>
+              <w:t xml:space="preserve">☐</w:t>
+            </w:r>
+          </w:p>
+        </w:tc>
+        <w:tc>
+          <w:tcPr>
+            <w:tcW w:type="dxa" w:w="620"/>
+            <w:tcBorders>
+              <w:top w:val="single" w:color="C9D0DC" w:sz="4"/>
+              <w:left w:val="single" w:color="C9D0DC" w:sz="4"/>
+              <w:bottom w:val="single" w:color="C9D0DC" w:sz="4"/>
+              <w:right w:val="single" w:color="C9D0DC" w:sz="4"/>
+            </w:tcBorders>
+            <w:tcMar>
+              <w:top w:type="dxa" w:w="70"/>
+              <w:left w:type="dxa" w:w="100"/>
+              <w:bottom w:type="dxa" w:w="70"/>
+              <w:right w:type="dxa" w:w="100"/>
+            </w:tcMar>
+            <w:vAlign w:val="center"/>
+          </w:tcPr>
+          <w:p>
+            <w:pPr>
+              <w:spacing w:after="0" w:before="0" w:line="264"/>
+              <w:jc w:val="center"/>
+            </w:pPr>
+            <w:r>
+              <w:rPr>
+                <w:rFonts w:ascii="Arial" w:cs="Arial" w:eastAsia="Arial" w:hAnsi="Arial"/>
+                <w:sz w:val="30"/>
+                <w:szCs w:val="30"/>
+              </w:rPr>
+              <w:t xml:space="preserve">☐</w:t>
+            </w:r>
+          </w:p>
+        </w:tc>
+        <w:tc>
+          <w:tcPr>
+            <w:tcW w:type="dxa" w:w="620"/>
+            <w:tcBorders>
+              <w:top w:val="single" w:color="C9D0DC" w:sz="4"/>
+              <w:left w:val="single" w:color="C9D0DC" w:sz="4"/>
+              <w:bottom w:val="single" w:color="C9D0DC" w:sz="4"/>
+              <w:right w:val="single" w:color="C9D0DC" w:sz="4"/>
+            </w:tcBorders>
+            <w:tcMar>
+              <w:top w:type="dxa" w:w="70"/>
+              <w:left w:type="dxa" w:w="100"/>
+              <w:bottom w:type="dxa" w:w="70"/>
+              <w:right w:type="dxa" w:w="100"/>
+            </w:tcMar>
+            <w:vAlign w:val="center"/>
+          </w:tcPr>
+          <w:p>
+            <w:pPr>
+              <w:spacing w:after="0" w:before="0" w:line="264"/>
+              <w:jc w:val="center"/>
+            </w:pPr>
+            <w:r>
+              <w:rPr>
+                <w:rFonts w:ascii="Arial" w:cs="Arial" w:eastAsia="Arial" w:hAnsi="Arial"/>
+                <w:sz w:val="30"/>
+                <w:szCs w:val="30"/>
+              </w:rPr>
+              <w:t xml:space="preserve">☐</w:t>
+            </w:r>
+          </w:p>
+        </w:tc>
+        <w:tc>
+          <w:tcPr>
+            <w:tcW w:type="dxa" w:w="2040"/>
+            <w:tcBorders>
+              <w:top w:val="single" w:color="C9D0DC" w:sz="4"/>
+              <w:left w:val="single" w:color="C9D0DC" w:sz="4"/>
+              <w:bottom w:val="single" w:color="C9D0DC" w:sz="4"/>
+              <w:right w:val="single" w:color="C9D0DC" w:sz="4"/>
+            </w:tcBorders>
+            <w:tcMar>
+              <w:top w:type="dxa" w:w="70"/>
+              <w:left w:type="dxa" w:w="100"/>
+              <w:bottom w:type="dxa" w:w="70"/>
+              <w:right w:type="dxa" w:w="100"/>
+            </w:tcMar>
+            <w:vAlign w:val="top"/>
+          </w:tcPr>
+          <w:p>
+            <w:pPr>
+              <w:spacing w:after="0" w:before="0" w:line="264"/>
+            </w:pPr>
+            <w:r>
+              <w:rPr>
+                <w:rFonts w:ascii="Arial" w:cs="Arial" w:eastAsia="Arial" w:hAnsi="Arial"/>
+                <w:sz w:val="19"/>
+                <w:szCs w:val="19"/>
+              </w:rPr>
+              <w:t xml:space="preserve"> </w:t>
+            </w:r>
+          </w:p>
+        </w:tc>
+      </w:tr>
+      <w:tr>
+        <w:trPr>
+          <w:cantSplit/>
+        </w:trPr>
+        <w:tc>
+          <w:tcPr>
+            <w:tcW w:type="dxa" w:w="860"/>
+            <w:tcBorders>
+              <w:top w:val="single" w:color="C9D0DC" w:sz="4"/>
+              <w:left w:val="single" w:color="C9D0DC" w:sz="4"/>
+              <w:bottom w:val="single" w:color="C9D0DC" w:sz="4"/>
+              <w:right w:val="single" w:color="C9D0DC" w:sz="4"/>
+            </w:tcBorders>
+            <w:tcMar>
+              <w:top w:type="dxa" w:w="70"/>
+              <w:left w:type="dxa" w:w="100"/>
+              <w:bottom w:type="dxa" w:w="70"/>
+              <w:right w:type="dxa" w:w="100"/>
+            </w:tcMar>
+            <w:vAlign w:val="top"/>
+          </w:tcPr>
+          <w:p>
+            <w:pPr>
+              <w:spacing w:after="0" w:before="0" w:line="264"/>
+            </w:pPr>
+            <w:r>
+              <w:rPr>
+                <w:rFonts w:ascii="Arial" w:cs="Arial" w:eastAsia="Arial" w:hAnsi="Arial"/>
+                <w:b/>
+                <w:bCs/>
+                <w:color w:val="5B6477"/>
+                <w:sz w:val="16"/>
+                <w:szCs w:val="16"/>
+              </w:rPr>
+              <w:t xml:space="preserve">AD-SRCH</w:t>
+            </w:r>
+          </w:p>
+        </w:tc>
+        <w:tc>
+          <w:tcPr>
+            <w:tcW w:type="dxa" w:w="5480"/>
+            <w:tcBorders>
+              <w:top w:val="single" w:color="C9D0DC" w:sz="4"/>
+              <w:left w:val="single" w:color="C9D0DC" w:sz="4"/>
+              <w:bottom w:val="single" w:color="C9D0DC" w:sz="4"/>
+              <w:right w:val="single" w:color="C9D0DC" w:sz="4"/>
+            </w:tcBorders>
+            <w:tcMar>
+              <w:top w:type="dxa" w:w="70"/>
+              <w:left w:type="dxa" w:w="100"/>
+              <w:bottom w:type="dxa" w:w="70"/>
+              <w:right w:type="dxa" w:w="100"/>
+            </w:tcMar>
+            <w:vAlign w:val="top"/>
+          </w:tcPr>
+          <w:p>
+            <w:pPr>
+              <w:spacing w:after="40" w:before="0" w:line="264"/>
+            </w:pPr>
+            <w:r>
+              <w:rPr>
+                <w:rFonts w:ascii="Arial" w:cs="Arial" w:eastAsia="Arial" w:hAnsi="Arial"/>
+                <w:b/>
+                <w:bCs/>
+                <w:sz w:val="20"/>
+                <w:szCs w:val="20"/>
+              </w:rPr>
+              <w:t xml:space="preserve">Search the menu on the Dashboard</w:t>
+            </w:r>
+          </w:p>
+          <w:p>
+            <w:pPr>
+              <w:spacing w:after="40" w:before="0" w:line="264"/>
+            </w:pPr>
+            <w:r>
+              <w:rPr>
+                <w:rFonts w:ascii="Arial" w:cs="Arial" w:eastAsia="Arial" w:hAnsi="Arial"/>
+                <w:i/>
+                <w:iCs/>
+                <w:color w:val="5B6477"/>
+                <w:sz w:val="15"/>
+                <w:szCs w:val="15"/>
+              </w:rPr>
+              <w:t xml:space="preserve">Flow F47 · Warehouse cash funds tied to franchise DRs</w:t>
+            </w:r>
+          </w:p>
+          <w:p>
+            <w:pPr>
+              <w:spacing w:after="20" w:before="0" w:line="264"/>
+            </w:pPr>
+            <w:r>
+              <w:rPr>
+                <w:rFonts w:ascii="Arial" w:cs="Arial" w:eastAsia="Arial" w:hAnsi="Arial"/>
+                <w:color w:val="5B6477"/>
+                <w:sz w:val="19"/>
+                <w:szCs w:val="19"/>
+              </w:rPr>
+              <w:t xml:space="preserve">1.  </w:t>
+            </w:r>
+            <w:r>
+              <w:rPr>
+                <w:rFonts w:ascii="Arial" w:cs="Arial" w:eastAsia="Arial" w:hAnsi="Arial"/>
+                <w:sz w:val="19"/>
+                <w:szCs w:val="19"/>
+              </w:rPr>
+              <w:t xml:space="preserve">Dashboard → type cash in the search box → press Enter.</w:t>
+            </w:r>
+          </w:p>
+          <w:p>
+            <w:pPr>
+              <w:spacing w:after="0" w:before="60" w:line="264"/>
+            </w:pPr>
+            <w:r>
+              <w:rPr>
+                <w:rFonts w:ascii="Arial" w:cs="Arial" w:eastAsia="Arial" w:hAnsi="Arial"/>
+                <w:b/>
+                <w:bCs/>
+                <w:color w:val="0B1F3A"/>
+                <w:sz w:val="19"/>
+                <w:szCs w:val="19"/>
+              </w:rPr>
+              <w:t xml:space="preserve">You should see: </w:t>
+            </w:r>
+            <w:r>
+              <w:rPr>
+                <w:rFonts w:ascii="Arial" w:cs="Arial" w:eastAsia="Arial" w:hAnsi="Arial"/>
+                <w:sz w:val="19"/>
+                <w:szCs w:val="19"/>
+              </w:rPr>
+              <w:t xml:space="preserve">Petty Cash Fund and Expenses are listed (only screens you may open); Enter opens the first.</w:t>
             </w:r>
           </w:p>
         </w:tc>
@@ -13017,7 +13545,7 @@
                 <w:sz w:val="17"/>
                 <w:szCs w:val="17"/>
               </w:rPr>
-              <w:t xml:space="preserve">Passed (of 44)</w:t>
+              <w:t xml:space="preserve">Passed (of 46)</w:t>
             </w:r>
           </w:p>
         </w:tc>

</xml_diff>